<commit_message>
Added Headers and Double Spacing
</commit_message>
<xml_diff>
--- a/The Nexus of Macroeconomic Policy Quality on Inflation.docx
+++ b/The Nexus of Macroeconomic Policy Quality on Inflation.docx
@@ -6,40 +6,66 @@
       <w:r>
         <w:br/>
       </w:r>
+    </w:p>
+    <w:p/>
+    <w:p/>
+    <w:p/>
+    <w:p/>
+    <w:p/>
+    <w:p/>
+    <w:p/>
+    <w:p>
       <w:r>
         <w:br/>
       </w:r>
     </w:p>
     <w:p>
+      <w:pPr>
+        <w:jc w:val="center"/>
+      </w:pPr>
       <w:r>
         <w:rPr>
           <w:b/>
           <w:bCs/>
         </w:rPr>
-        <w:t>The Nexus of Macroeconomic Policy Quality on Inflation: An Examination on Government Regulation and Its Effect on Inflation</w:t>
-      </w:r>
-    </w:p>
-    <w:p>
+        <w:t>The Nexus of Macroeconomic Policy Quality on Inflation: An Examination on Government Regulation and Its Effect on</w:t>
+      </w:r>
+      <w:r>
+        <w:rPr>
+          <w:b/>
+          <w:bCs/>
+        </w:rPr>
+        <w:t xml:space="preserve"> Consumers</w:t>
+      </w:r>
+    </w:p>
+    <w:p>
+      <w:pPr>
+        <w:jc w:val="center"/>
+      </w:pPr>
       <w:r>
         <w:t>Joseph Russoniello</w:t>
       </w:r>
     </w:p>
     <w:p>
+      <w:pPr>
+        <w:jc w:val="center"/>
+      </w:pPr>
       <w:r>
         <w:t>Boston University</w:t>
       </w:r>
     </w:p>
     <w:p>
-      <w:r>
-        <w:t xml:space="preserve">Professor Stacy </w:t>
-      </w:r>
-      <w:proofErr w:type="spellStart"/>
-      <w:r>
-        <w:t>Gelsheimer</w:t>
-      </w:r>
-      <w:proofErr w:type="spellEnd"/>
-    </w:p>
-    <w:p>
+      <w:pPr>
+        <w:jc w:val="center"/>
+      </w:pPr>
+      <w:r>
+        <w:t>Professor Stacy Gelsheimer</w:t>
+      </w:r>
+    </w:p>
+    <w:p>
+      <w:pPr>
+        <w:jc w:val="center"/>
+      </w:pPr>
       <w:r>
         <w:t>4/27/2025</w:t>
       </w:r>
@@ -73,22 +99,26 @@
       </w:r>
     </w:p>
     <w:p>
-      <w:r>
-        <w:t xml:space="preserve">This paper investigates the relationship between the quality of a nation's macroeconomic policy, as measured by the World Bank's CPIA Macroeconomic Management Index, and its annual inflation rate. Using a panel dataset of </w:t>
+      <w:pPr>
+        <w:spacing w:line="480" w:lineRule="auto"/>
+        <w:jc w:val="both"/>
+      </w:pPr>
+      <w:r>
+        <w:t xml:space="preserve">This paper investigates the relationship between the quality of a nation's macroeconomic policy, as measured by the World Bank's CPIA Macroeconomic Management Index, and its annual inflation rate. Using a panel dataset of 75 countries from 2005 to 2016, we estimate several fixed effects models to examine this relationship while </w:t>
       </w:r>
       <w:proofErr w:type="gramStart"/>
       <w:r>
-        <w:t>75</w:t>
+        <w:t>controlling for</w:t>
       </w:r>
       <w:proofErr w:type="gramEnd"/>
       <w:r>
-        <w:t xml:space="preserve"> countries from 2005 to 2016, we estimate several fixed effects models to examine this relationship while controlling for credit conditions, export volumes, and broader measures of institutional and financial development. Results indicate that while higher macroeconomic policy ratings are associated with lower inflation rates, this relationship is moderated by a country's export volume. Furthermore, macroeconomic policy quality only achieves statistical significance when accounting for domestic financial sector credit growth and broader structural factors such as social equity, debt management, and property rights protections. These findings suggest that macroeconomic policy effectiveness is deeply intertwined with a nation's financial, social, and institutional development.</w:t>
+        <w:t xml:space="preserve"> credit conditions, export volumes, and broader measures of institutional and financial development. Results indicate that while higher macroeconomic policy ratings are associated with lower inflation rates, this relationship is moderated by a country's export volume. Furthermore, macroeconomic policy quality only achieves statistical significance when accounting for domestic financial sector credit growth and broader structural factors such as social equity, debt management, and property rights protections. These findings suggest that macroeconomic policy effectiveness is deeply intertwined with a nation's financial, social, and institutional development.</w:t>
       </w:r>
     </w:p>
     <w:p>
       <w:r>
         <w:pict w14:anchorId="3FF7B5A3">
-          <v:rect id="_x0000_i1031" style="width:0;height:1.5pt" o:hralign="center" o:hrstd="t" o:hr="t" fillcolor="#a0a0a0" stroked="f"/>
+          <v:rect id="_x0000_i1025" style="width:0;height:1.5pt" o:hralign="center" o:hrstd="t" o:hr="t" fillcolor="#a0a0a0" stroked="f"/>
         </w:pict>
       </w:r>
     </w:p>
@@ -122,21 +152,19 @@
     </w:p>
     <w:p>
       <w:pPr>
+        <w:spacing w:line="480" w:lineRule="auto"/>
         <w:ind w:firstLine="720"/>
-      </w:pPr>
-      <w:r>
-        <w:t xml:space="preserve">The global economic landscape has recently been shaped by a resurgence of inflation, reaching levels not seen in several decades across many developed nations within the </w:t>
-      </w:r>
-      <w:r>
-        <w:t>Organization</w:t>
-      </w:r>
-      <w:r>
-        <w:t xml:space="preserve"> for Economic Co-operation and Development (OECD). This inflationary surge has escalated living costs, disproportionately burdening lower-income populations. Inflation's impact transcends economics, fueling civil unrest and political instability, with significant consequences for national governance. These dynamics necessitate a nuanced understanding of the underlying drivers of inflation, especially the role of macroeconomic management.</w:t>
-      </w:r>
-    </w:p>
-    <w:p>
-      <w:pPr>
+        <w:jc w:val="both"/>
+      </w:pPr>
+      <w:r>
+        <w:t>The global economic landscape has recently been shaped by a resurgence of inflation, reaching levels not seen in several decades across many developed nations within the Organization for Economic Co-operation and Development (OECD). This inflationary surge has escalated living costs, disproportionately burdening lower-income populations. Inflation's impact transcends economics, fueling civil unrest and political instability, with significant consequences for national governance. These dynamics necessitate a nuanced understanding of the underlying drivers of inflation, especially the role of macroeconomic management.</w:t>
+      </w:r>
+    </w:p>
+    <w:p>
+      <w:pPr>
+        <w:spacing w:line="480" w:lineRule="auto"/>
         <w:ind w:firstLine="720"/>
+        <w:jc w:val="both"/>
       </w:pPr>
       <w:r>
         <w:t xml:space="preserve">Political outcomes are increasingly sensitive to inflationary trends. In countries like the United States, inflation has emerged as a primary concern for voters, influencing electoral outcomes and reshaping policy debates. Voter dissatisfaction linked to sustained inflation, even as rates stabilize, underscores the profound political </w:t>
@@ -150,7 +178,9 @@
     </w:p>
     <w:p>
       <w:pPr>
+        <w:spacing w:line="480" w:lineRule="auto"/>
         <w:ind w:firstLine="720"/>
+        <w:jc w:val="both"/>
       </w:pPr>
       <w:r>
         <w:t>Given inflation's pivotal role in economic and political arenas, this paper examines whether a country's quality of macroeconomic management</w:t>
@@ -171,9 +201,6 @@
     <w:p>
       <w:pPr>
         <w:jc w:val="center"/>
-        <w:pPrChange w:id="0" w:author="Joseph Russoniello" w:date="2025-04-27T15:29:00Z" w16du:dateUtc="2025-04-27T19:29:00Z">
-          <w:pPr/>
-        </w:pPrChange>
       </w:pPr>
       <w:r>
         <w:rPr>
@@ -185,26 +212,16 @@
     </w:p>
     <w:p>
       <w:pPr>
+        <w:spacing w:line="480" w:lineRule="auto"/>
         <w:ind w:firstLine="720"/>
-      </w:pPr>
-      <w:r>
-        <w:t>Economic theory and empirical research identify several pathways through which macroeconomic quality shapes inflation. The Phillips curve posits a relationship between output and inflation, with faster GDP growth or lower unemployment leading to upward price pressures (Phillips, 1958; Friedman, 1968). Empirical findings (</w:t>
-      </w:r>
-      <w:proofErr w:type="spellStart"/>
-      <w:r>
-        <w:t>Coibion</w:t>
-      </w:r>
-      <w:proofErr w:type="spellEnd"/>
-      <w:r>
-        <w:t xml:space="preserve"> &amp; </w:t>
-      </w:r>
-      <w:proofErr w:type="spellStart"/>
-      <w:r>
-        <w:t>Gorodnichenko</w:t>
-      </w:r>
-      <w:proofErr w:type="spellEnd"/>
-      <w:r>
-        <w:t xml:space="preserve">, 2015) confirm that demand-side pressures intensify inflation, </w:t>
+        <w:jc w:val="both"/>
+      </w:pPr>
+      <w:r>
+        <w:t xml:space="preserve">Economic theory and empirical research identify several pathways through which macroeconomic quality shapes inflation. The Phillips curve posits a relationship between </w:t>
+      </w:r>
+      <w:r>
+        <w:lastRenderedPageBreak/>
+        <w:t xml:space="preserve">output and inflation, with faster GDP growth or lower unemployment leading to upward price pressures (Phillips, 1958; Friedman, 1968). Empirical findings (Coibion &amp; Gorodnichenko, 2015) confirm that demand-side pressures intensify inflation, </w:t>
       </w:r>
       <w:r>
         <w:t xml:space="preserve">potentially </w:t>
@@ -215,23 +232,19 @@
     </w:p>
     <w:p>
       <w:pPr>
+        <w:spacing w:line="480" w:lineRule="auto"/>
         <w:ind w:firstLine="720"/>
-      </w:pPr>
-      <w:r>
-        <w:t xml:space="preserve">Income levels, proxied by GDP per capita, also modulate inflation dynamics. Developed economies tend to exhibit stable, low inflation rates, whereas developing nations often experience greater volatility (Ha, Kose, &amp; </w:t>
-      </w:r>
-      <w:proofErr w:type="spellStart"/>
-      <w:r>
-        <w:t>Ohnsorge</w:t>
-      </w:r>
-      <w:proofErr w:type="spellEnd"/>
-      <w:r>
-        <w:t>, 2019). Credit growth similarly plays a vital role; rapid financial expansion can fuel demand and thus inflation (Choi &amp; Cook, 2018).</w:t>
-      </w:r>
-    </w:p>
-    <w:p>
-      <w:pPr>
+        <w:jc w:val="both"/>
+      </w:pPr>
+      <w:r>
+        <w:t>Income levels, proxied by GDP per capita, also modulate inflation dynamics. Developed economies tend to exhibit stable, low inflation rates, whereas developing nations often experience greater volatility (Ha, Kose, &amp; Ohnsorge, 2019). Credit growth similarly plays a vital role; rapid financial expansion can fuel demand and thus inflation (Choi &amp; Cook, 2018).</w:t>
+      </w:r>
+    </w:p>
+    <w:p>
+      <w:pPr>
+        <w:spacing w:line="480" w:lineRule="auto"/>
         <w:ind w:firstLine="720"/>
+        <w:jc w:val="both"/>
       </w:pPr>
       <w:r>
         <w:t>Lastly, e</w:t>
@@ -243,16 +256,14 @@
         <w:t xml:space="preserve">help </w:t>
       </w:r>
       <w:r>
-        <w:t xml:space="preserve">stabilize </w:t>
-      </w:r>
-      <w:r>
-        <w:lastRenderedPageBreak/>
-        <w:t>inflation (Mishkin, 2007), whereas corruption and weak institutions exacerbate volatility (Mujahid, 2021). Infrastructure deficiencies, by creating supply bottlenecks, can further destabilize prices (Straub, 2011).</w:t>
-      </w:r>
-    </w:p>
-    <w:p>
-      <w:pPr>
+        <w:t>stabilize inflation (Mishkin, 2007), whereas corruption and weak institutions exacerbate volatility (Mujahid, 2021). Infrastructure deficiencies, by creating supply bottlenecks, can further destabilize prices (Straub, 2011).</w:t>
+      </w:r>
+    </w:p>
+    <w:p>
+      <w:pPr>
+        <w:spacing w:line="480" w:lineRule="auto"/>
         <w:ind w:firstLine="720"/>
+        <w:jc w:val="both"/>
       </w:pPr>
       <w:r>
         <w:t xml:space="preserve">Thus, </w:t>
@@ -296,6 +307,7 @@
           <w:b/>
           <w:bCs/>
         </w:rPr>
+        <w:lastRenderedPageBreak/>
         <w:t>Data Description</w:t>
       </w:r>
     </w:p>
@@ -449,7 +461,6 @@
             <w:hideMark/>
           </w:tcPr>
           <w:p>
-            <w:proofErr w:type="spellStart"/>
             <w:r>
               <w:rPr>
                 <w:i/>
@@ -457,7 +468,6 @@
               </w:rPr>
               <w:t>CPIA_Avg</w:t>
             </w:r>
-            <w:proofErr w:type="spellEnd"/>
           </w:p>
         </w:tc>
         <w:tc>
@@ -608,65 +618,64 @@
     <w:p/>
     <w:p>
       <w:pPr>
+        <w:spacing w:line="480" w:lineRule="auto"/>
         <w:ind w:firstLine="720"/>
-      </w:pPr>
-      <w:r>
-        <w:t xml:space="preserve">This research employs panel data collected at the country-year level between 2005 and 2016 to examine the relationship between macroeconomic policy quality and inflation rates. The dataset contains a total of 922 observations, covering </w:t>
+        <w:jc w:val="both"/>
+      </w:pPr>
+      <w:r>
+        <w:t>This research employs panel data collected at the country-year level between 2005 and 2016 to examine the relationship between macroeconomic policy quality and inflation rates. The dataset contains a total of 922 observations, covering 75 countries across a diverse range of economic, institutional, and developmental contexts. Each observation corresponds to a unique country-year pair, ensuring temporal and cross-sectional variability essential for robust fixed-effects analysis.</w:t>
+      </w:r>
+    </w:p>
+    <w:p>
+      <w:pPr>
+        <w:spacing w:line="480" w:lineRule="auto"/>
+        <w:ind w:firstLine="720"/>
+        <w:jc w:val="both"/>
+      </w:pPr>
+      <w:r>
+        <w:t xml:space="preserve">The primary dataset is the World Bank’s Country Policy and Institutional Assessment (CPIA) database. The CPIA provides ratings across several dimensions of governance and economic management. This paper </w:t>
+      </w:r>
+      <w:r>
+        <w:t>focuses</w:t>
+      </w:r>
+      <w:r>
+        <w:t xml:space="preserve"> on the quality of macroeconomic policy formulation and implementation. The key independent variable, the CPIA Macroeconomic Management Rating, is drawn directly from this database and evaluated on a standardized scale ranging from 1 to 6.</w:t>
+      </w:r>
+    </w:p>
+    <w:p>
+      <w:pPr>
+        <w:spacing w:line="480" w:lineRule="auto"/>
+        <w:ind w:firstLine="720"/>
+        <w:jc w:val="both"/>
+      </w:pPr>
+      <w:r>
+        <w:lastRenderedPageBreak/>
+        <w:t>In addition to the macroeconomic policy quality measure, several control variables are incorporated to account for potential omitted variable bias. Export volume data, used to capture a country's exposure to global trade shocks, is obtained from the World Bank’s Development Indicators. Domestic credit to the private sector, expressed as a percentage of GDP, is included as a measure of financial sector development and liquidity conditions, drawn from the same source.</w:t>
+      </w:r>
+    </w:p>
+    <w:p>
+      <w:pPr>
+        <w:spacing w:line="480" w:lineRule="auto"/>
+        <w:ind w:firstLine="720"/>
+        <w:jc w:val="both"/>
+      </w:pPr>
+      <w:r>
+        <w:t xml:space="preserve">A composite indicator, the CPIA Average Rating, is created by calculating the </w:t>
       </w:r>
       <w:proofErr w:type="gramStart"/>
       <w:r>
-        <w:t>75</w:t>
+        <w:t>mean</w:t>
       </w:r>
       <w:proofErr w:type="gramEnd"/>
       <w:r>
-        <w:t xml:space="preserve"> countries across a diverse range of economic, institutional, and developmental contexts. Each observation corresponds to a unique country-year pair, ensuring temporal and cross-sectional variability essential for robust fixed-effects analysis.</w:t>
-      </w:r>
-    </w:p>
-    <w:p>
-      <w:pPr>
+        <w:t xml:space="preserve"> of five critical CPIA sub-scores: economic management, financial sector development, social inclusion and equity, property rights and rule-based governance, and social protection. This custom variable captures broader institutional quality and policy coherence beyond macroeconomic management alone.</w:t>
+      </w:r>
+    </w:p>
+    <w:p>
+      <w:pPr>
+        <w:spacing w:line="480" w:lineRule="auto"/>
         <w:ind w:firstLine="720"/>
-      </w:pPr>
-      <w:r>
-        <w:t xml:space="preserve">The primary dataset is the World Bank’s Country Policy and Institutional Assessment (CPIA) database. The CPIA provides ratings across several dimensions of governance and economic management. This paper </w:t>
-      </w:r>
-      <w:r>
-        <w:t>focuses</w:t>
-      </w:r>
-      <w:r>
-        <w:t xml:space="preserve"> on the quality of macroeconomic policy formulation and implementation. The key independent variable, the </w:t>
-      </w:r>
-      <w:r>
-        <w:lastRenderedPageBreak/>
-        <w:t>CPIA Macroeconomic Management Rating, is drawn directly from this database and evaluated on a standardized scale ranging from 1 to 6.</w:t>
-      </w:r>
-    </w:p>
-    <w:p>
-      <w:pPr>
-        <w:ind w:firstLine="720"/>
-      </w:pPr>
-      <w:r>
-        <w:t>In addition to the macroeconomic policy quality measure, several control variables are incorporated to account for potential omitted variable bias. Export volume data, used to capture a country's exposure to global trade shocks, is obtained from the World Bank’s Development Indicators. Domestic credit to the private sector, expressed as a percentage of GDP, is included as a measure of financial sector development and liquidity conditions, drawn from the same source.</w:t>
-      </w:r>
-    </w:p>
-    <w:p>
-      <w:pPr>
-        <w:ind w:firstLine="720"/>
-      </w:pPr>
-      <w:r>
-        <w:t xml:space="preserve">A composite indicator, the CPIA Average Rating, is created by calculating the </w:t>
-      </w:r>
-      <w:proofErr w:type="gramStart"/>
-      <w:r>
-        <w:t>mean</w:t>
-      </w:r>
-      <w:proofErr w:type="gramEnd"/>
-      <w:r>
-        <w:t xml:space="preserve"> of five critical CPIA sub-scores: economic management, financial sector development, social inclusion and equity, property rights and rule-based governance, and social protection. This custom variable captures broader institutional quality and policy coherence beyond macroeconomic management alone.</w:t>
-      </w:r>
-    </w:p>
-    <w:p>
-      <w:pPr>
-        <w:ind w:firstLine="720"/>
+        <w:jc w:val="both"/>
       </w:pPr>
       <w:r>
         <w:t>Together, the dataset integrates key themes such as governance quality, financial market development, trade openness, and social inclusion. These themes reflect the complex, multifaceted drivers of inflation and economic stability across countries. The diversity of the dataset ensures a comprehensive analysis of inflation outcomes across different institutional and economic environments, allowing for nuanced insights into the interplay between macroeconomic management and broader development structures.</w:t>
@@ -754,7 +763,6 @@
             <w:hideMark/>
           </w:tcPr>
           <w:p>
-            <w:proofErr w:type="spellStart"/>
             <w:r>
               <w:rPr>
                 <w:b/>
@@ -763,7 +771,6 @@
               </w:rPr>
               <w:t>Obs</w:t>
             </w:r>
-            <w:proofErr w:type="spellEnd"/>
           </w:p>
         </w:tc>
         <w:tc>
@@ -1047,6 +1054,7 @@
                 <w:i/>
                 <w:iCs/>
               </w:rPr>
+              <w:lastRenderedPageBreak/>
               <w:t>Macro</w:t>
             </w:r>
           </w:p>
@@ -1330,7 +1338,6 @@
             <w:hideMark/>
           </w:tcPr>
           <w:p>
-            <w:proofErr w:type="spellStart"/>
             <w:r>
               <w:rPr>
                 <w:i/>
@@ -1338,7 +1345,6 @@
               </w:rPr>
               <w:t>CPIA_Avg</w:t>
             </w:r>
-            <w:proofErr w:type="spellEnd"/>
           </w:p>
         </w:tc>
         <w:tc>
@@ -1625,7 +1631,6 @@
           <w:b/>
           <w:bCs/>
         </w:rPr>
-        <w:lastRenderedPageBreak/>
         <w:t>Empirical Model Specification</w:t>
       </w:r>
     </w:p>
@@ -1646,18 +1651,20 @@
     </w:p>
     <w:p>
       <w:pPr>
+        <w:spacing w:line="480" w:lineRule="auto"/>
         <w:ind w:firstLine="720"/>
-      </w:pPr>
-      <w:r>
-        <w:t xml:space="preserve">We employ a fixed-effects linear model with the clustered panel data framework, operationalized through an ordinary least squares (OLS) strategy. The model to be estimated is articulated as </w:t>
-      </w:r>
-      <w:proofErr w:type="gramStart"/>
-      <w:r>
-        <w:t>follows</w:t>
-      </w:r>
-      <w:proofErr w:type="gramEnd"/>
-    </w:p>
-    <w:p>
+        <w:jc w:val="both"/>
+      </w:pPr>
+      <w:r>
+        <w:t>We employ a fixed-effects linear model with the clustered panel data framework, operationalized through an ordinary least squares (OLS) strategy. The model to be estimated is articulated as follows</w:t>
+      </w:r>
+    </w:p>
+    <w:p>
+      <w:pPr>
+        <w:spacing w:line="480" w:lineRule="auto"/>
+        <w:ind w:firstLine="720"/>
+        <w:jc w:val="center"/>
+      </w:pPr>
       <m:oMath>
         <m:r>
           <w:rPr>
@@ -1670,7 +1677,6 @@
             <m:ctrlPr>
               <w:rPr>
                 <w:rFonts w:ascii="Cambria Math" w:hAnsi="Cambria Math"/>
-                <w:i/>
               </w:rPr>
             </m:ctrlPr>
           </m:sSubPr>
@@ -1692,6 +1698,9 @@
           </m:sub>
         </m:sSub>
         <m:r>
+          <m:rPr>
+            <m:sty m:val="p"/>
+          </m:rPr>
           <w:rPr>
             <w:rFonts w:ascii="Cambria Math" w:hAnsi="Cambria Math"/>
           </w:rPr>
@@ -1702,7 +1711,6 @@
             <m:ctrlPr>
               <w:rPr>
                 <w:rFonts w:ascii="Cambria Math" w:hAnsi="Cambria Math"/>
-                <w:i/>
               </w:rPr>
             </m:ctrlPr>
           </m:sSubPr>
@@ -1716,6 +1724,9 @@
           </m:e>
           <m:sub>
             <m:r>
+              <m:rPr>
+                <m:sty m:val="p"/>
+              </m:rPr>
               <w:rPr>
                 <w:rFonts w:ascii="Cambria Math" w:hAnsi="Cambria Math"/>
               </w:rPr>
@@ -1724,6 +1735,9 @@
           </m:sub>
         </m:sSub>
         <m:r>
+          <m:rPr>
+            <m:sty m:val="p"/>
+          </m:rPr>
           <w:rPr>
             <w:rFonts w:ascii="Cambria Math" w:hAnsi="Cambria Math"/>
           </w:rPr>
@@ -1734,7 +1748,6 @@
             <m:ctrlPr>
               <w:rPr>
                 <w:rFonts w:ascii="Cambria Math" w:hAnsi="Cambria Math"/>
-                <w:i/>
               </w:rPr>
             </m:ctrlPr>
           </m:sSubPr>
@@ -1748,6 +1761,9 @@
           </m:e>
           <m:sub>
             <m:r>
+              <m:rPr>
+                <m:sty m:val="p"/>
+              </m:rPr>
               <w:rPr>
                 <w:rFonts w:ascii="Cambria Math" w:hAnsi="Cambria Math"/>
               </w:rPr>
@@ -1766,7 +1782,6 @@
             <m:ctrlPr>
               <w:rPr>
                 <w:rFonts w:ascii="Cambria Math" w:hAnsi="Cambria Math"/>
-                <w:i/>
               </w:rPr>
             </m:ctrlPr>
           </m:sSubPr>
@@ -1788,6 +1803,9 @@
           </m:sub>
         </m:sSub>
         <m:r>
+          <m:rPr>
+            <m:sty m:val="p"/>
+          </m:rPr>
           <w:rPr>
             <w:rFonts w:ascii="Cambria Math" w:hAnsi="Cambria Math"/>
           </w:rPr>
@@ -1798,7 +1816,6 @@
             <m:ctrlPr>
               <w:rPr>
                 <w:rFonts w:ascii="Cambria Math" w:hAnsi="Cambria Math"/>
-                <w:i/>
               </w:rPr>
             </m:ctrlPr>
           </m:sSubPr>
@@ -1812,6 +1829,9 @@
           </m:e>
           <m:sub>
             <m:r>
+              <m:rPr>
+                <m:sty m:val="p"/>
+              </m:rPr>
               <w:rPr>
                 <w:rFonts w:ascii="Cambria Math" w:hAnsi="Cambria Math"/>
               </w:rPr>
@@ -1830,7 +1850,6 @@
             <m:ctrlPr>
               <w:rPr>
                 <w:rFonts w:ascii="Cambria Math" w:hAnsi="Cambria Math"/>
-                <w:i/>
               </w:rPr>
             </m:ctrlPr>
           </m:sSubPr>
@@ -1852,6 +1871,9 @@
           </m:sub>
         </m:sSub>
         <m:r>
+          <m:rPr>
+            <m:sty m:val="p"/>
+          </m:rPr>
           <w:rPr>
             <w:rFonts w:ascii="Cambria Math" w:hAnsi="Cambria Math"/>
           </w:rPr>
@@ -1862,7 +1884,6 @@
             <m:ctrlPr>
               <w:rPr>
                 <w:rFonts w:ascii="Cambria Math" w:hAnsi="Cambria Math"/>
-                <w:i/>
               </w:rPr>
             </m:ctrlPr>
           </m:sSubPr>
@@ -1876,6 +1897,9 @@
           </m:e>
           <m:sub>
             <m:r>
+              <m:rPr>
+                <m:sty m:val="p"/>
+              </m:rPr>
               <w:rPr>
                 <w:rFonts w:ascii="Cambria Math" w:hAnsi="Cambria Math"/>
               </w:rPr>
@@ -1894,7 +1918,6 @@
             <m:ctrlPr>
               <w:rPr>
                 <w:rFonts w:ascii="Cambria Math" w:hAnsi="Cambria Math"/>
-                <w:i/>
               </w:rPr>
             </m:ctrlPr>
           </m:sSubPr>
@@ -1916,17 +1939,25 @@
           </m:sub>
         </m:sSub>
         <m:r>
+          <m:rPr>
+            <m:sty m:val="p"/>
+          </m:rPr>
           <w:rPr>
             <w:rFonts w:ascii="Cambria Math" w:hAnsi="Cambria Math"/>
           </w:rPr>
-          <m:t>×Expor</m:t>
+          <m:t>×</m:t>
+        </m:r>
+        <m:r>
+          <w:rPr>
+            <w:rFonts w:ascii="Cambria Math" w:hAnsi="Cambria Math"/>
+          </w:rPr>
+          <m:t>Expor</m:t>
         </m:r>
         <m:sSub>
           <m:sSubPr>
             <m:ctrlPr>
               <w:rPr>
                 <w:rFonts w:ascii="Cambria Math" w:hAnsi="Cambria Math"/>
-                <w:i/>
               </w:rPr>
             </m:ctrlPr>
           </m:sSubPr>
@@ -1948,6 +1979,9 @@
           </m:sub>
         </m:sSub>
         <m:r>
+          <m:rPr>
+            <m:sty m:val="p"/>
+          </m:rPr>
           <w:rPr>
             <w:rFonts w:ascii="Cambria Math" w:hAnsi="Cambria Math"/>
           </w:rPr>
@@ -1958,7 +1992,6 @@
             <m:ctrlPr>
               <w:rPr>
                 <w:rFonts w:ascii="Cambria Math" w:hAnsi="Cambria Math"/>
-                <w:i/>
               </w:rPr>
             </m:ctrlPr>
           </m:sSubPr>
@@ -1972,6 +2005,9 @@
           </m:e>
           <m:sub>
             <m:r>
+              <m:rPr>
+                <m:sty m:val="p"/>
+              </m:rPr>
               <w:rPr>
                 <w:rFonts w:ascii="Cambria Math" w:hAnsi="Cambria Math"/>
               </w:rPr>
@@ -1983,14 +2019,28 @@
           <w:rPr>
             <w:rFonts w:ascii="Cambria Math" w:hAnsi="Cambria Math"/>
           </w:rPr>
-          <m:t>CPI Av</m:t>
+          <m:t>CPI</m:t>
+        </m:r>
+        <m:r>
+          <m:rPr>
+            <m:sty m:val="p"/>
+          </m:rPr>
+          <w:rPr>
+            <w:rFonts w:ascii="Cambria Math" w:hAnsi="Cambria Math"/>
+          </w:rPr>
+          <m:t xml:space="preserve"> </m:t>
+        </m:r>
+        <m:r>
+          <w:rPr>
+            <w:rFonts w:ascii="Cambria Math" w:hAnsi="Cambria Math"/>
+          </w:rPr>
+          <m:t>Av</m:t>
         </m:r>
         <m:sSub>
           <m:sSubPr>
             <m:ctrlPr>
               <w:rPr>
                 <w:rFonts w:ascii="Cambria Math" w:hAnsi="Cambria Math"/>
-                <w:i/>
               </w:rPr>
             </m:ctrlPr>
           </m:sSubPr>
@@ -2012,28 +2062,27 @@
           </m:sub>
         </m:sSub>
         <m:r>
+          <m:rPr>
+            <m:sty m:val="p"/>
+          </m:rPr>
           <w:rPr>
             <w:rFonts w:ascii="Cambria Math" w:hAnsi="Cambria Math"/>
           </w:rPr>
-          <m:t>+</m:t>
-        </m:r>
-        <m:r>
-          <w:rPr>
-            <w:rFonts w:ascii="Cambria Math" w:hAnsi="Cambria Math"/>
-          </w:rPr>
-          <m:t xml:space="preserve">                           </m:t>
+          <m:t xml:space="preserve">+ </m:t>
         </m:r>
         <m:sSub>
           <m:sSubPr>
             <m:ctrlPr>
               <w:rPr>
                 <w:rFonts w:ascii="Cambria Math" w:hAnsi="Cambria Math"/>
-                <w:i/>
               </w:rPr>
             </m:ctrlPr>
           </m:sSubPr>
           <m:e>
             <m:r>
+              <m:rPr>
+                <m:sty m:val="p"/>
+              </m:rPr>
               <w:rPr>
                 <w:rFonts w:ascii="Cambria Math" w:hAnsi="Cambria Math"/>
               </w:rPr>
@@ -2042,6 +2091,9 @@
           </m:e>
           <m:sub>
             <m:r>
+              <m:rPr>
+                <m:sty m:val="p"/>
+              </m:rPr>
               <w:rPr>
                 <w:rFonts w:ascii="Cambria Math" w:hAnsi="Cambria Math"/>
               </w:rPr>
@@ -2060,7 +2112,6 @@
             <m:ctrlPr>
               <w:rPr>
                 <w:rFonts w:ascii="Cambria Math" w:hAnsi="Cambria Math"/>
-                <w:i/>
               </w:rPr>
             </m:ctrlPr>
           </m:sSubPr>
@@ -2082,8 +2133,11 @@
           </m:sub>
         </m:sSub>
         <m:r>
+          <m:rPr>
+            <m:sty m:val="p"/>
+          </m:rPr>
           <w:rPr>
-            <w:rFonts w:ascii="Cambria Math" w:eastAsiaTheme="minorEastAsia" w:hAnsi="Cambria Math"/>
+            <w:rFonts w:ascii="Cambria Math" w:hAnsi="Cambria Math"/>
           </w:rPr>
           <m:t>+</m:t>
         </m:r>
@@ -2091,15 +2145,14 @@
           <m:sSubPr>
             <m:ctrlPr>
               <w:rPr>
-                <w:rFonts w:ascii="Cambria Math" w:eastAsiaTheme="minorEastAsia" w:hAnsi="Cambria Math"/>
-                <w:i/>
+                <w:rFonts w:ascii="Cambria Math" w:hAnsi="Cambria Math"/>
               </w:rPr>
             </m:ctrlPr>
           </m:sSubPr>
           <m:e>
             <m:r>
               <w:rPr>
-                <w:rFonts w:ascii="Cambria Math" w:eastAsiaTheme="minorEastAsia" w:hAnsi="Cambria Math"/>
+                <w:rFonts w:ascii="Cambria Math" w:hAnsi="Cambria Math"/>
               </w:rPr>
               <m:t>α</m:t>
             </m:r>
@@ -2107,15 +2160,18 @@
           <m:sub>
             <m:r>
               <w:rPr>
-                <w:rFonts w:ascii="Cambria Math" w:eastAsiaTheme="minorEastAsia" w:hAnsi="Cambria Math"/>
+                <w:rFonts w:ascii="Cambria Math" w:hAnsi="Cambria Math"/>
               </w:rPr>
               <m:t>i</m:t>
             </m:r>
           </m:sub>
         </m:sSub>
         <m:r>
+          <m:rPr>
+            <m:sty m:val="p"/>
+          </m:rPr>
           <w:rPr>
-            <w:rFonts w:ascii="Cambria Math" w:eastAsiaTheme="minorEastAsia" w:hAnsi="Cambria Math"/>
+            <w:rFonts w:ascii="Cambria Math" w:hAnsi="Cambria Math"/>
           </w:rPr>
           <m:t>+</m:t>
         </m:r>
@@ -2123,15 +2179,14 @@
           <m:sSubPr>
             <m:ctrlPr>
               <w:rPr>
-                <w:rFonts w:ascii="Cambria Math" w:eastAsiaTheme="minorEastAsia" w:hAnsi="Cambria Math"/>
-                <w:i/>
+                <w:rFonts w:ascii="Cambria Math" w:hAnsi="Cambria Math"/>
               </w:rPr>
             </m:ctrlPr>
           </m:sSubPr>
           <m:e>
             <m:r>
               <w:rPr>
-                <w:rFonts w:ascii="Cambria Math" w:eastAsiaTheme="minorEastAsia" w:hAnsi="Cambria Math"/>
+                <w:rFonts w:ascii="Cambria Math" w:hAnsi="Cambria Math"/>
               </w:rPr>
               <m:t>γ</m:t>
             </m:r>
@@ -2139,15 +2194,18 @@
           <m:sub>
             <m:r>
               <w:rPr>
-                <w:rFonts w:ascii="Cambria Math" w:eastAsiaTheme="minorEastAsia" w:hAnsi="Cambria Math"/>
+                <w:rFonts w:ascii="Cambria Math" w:hAnsi="Cambria Math"/>
               </w:rPr>
               <m:t>t</m:t>
             </m:r>
           </m:sub>
         </m:sSub>
         <m:r>
+          <m:rPr>
+            <m:sty m:val="p"/>
+          </m:rPr>
           <w:rPr>
-            <w:rFonts w:ascii="Cambria Math" w:eastAsiaTheme="minorEastAsia" w:hAnsi="Cambria Math"/>
+            <w:rFonts w:ascii="Cambria Math" w:hAnsi="Cambria Math"/>
           </w:rPr>
           <m:t>+</m:t>
         </m:r>
@@ -2155,15 +2213,14 @@
           <m:sSubPr>
             <m:ctrlPr>
               <w:rPr>
-                <w:rFonts w:ascii="Cambria Math" w:eastAsiaTheme="minorEastAsia" w:hAnsi="Cambria Math"/>
-                <w:i/>
+                <w:rFonts w:ascii="Cambria Math" w:hAnsi="Cambria Math"/>
               </w:rPr>
             </m:ctrlPr>
           </m:sSubPr>
           <m:e>
             <m:r>
               <w:rPr>
-                <w:rFonts w:ascii="Cambria Math" w:eastAsiaTheme="minorEastAsia" w:hAnsi="Cambria Math"/>
+                <w:rFonts w:ascii="Cambria Math" w:hAnsi="Cambria Math"/>
               </w:rPr>
               <m:t>ϵ</m:t>
             </m:r>
@@ -2171,7 +2228,7 @@
           <m:sub>
             <m:r>
               <w:rPr>
-                <w:rFonts w:ascii="Cambria Math" w:eastAsiaTheme="minorEastAsia" w:hAnsi="Cambria Math"/>
+                <w:rFonts w:ascii="Cambria Math" w:hAnsi="Cambria Math"/>
               </w:rPr>
               <m:t>it</m:t>
             </m:r>
@@ -2184,9 +2241,9 @@
     </w:p>
     <w:p>
       <w:pPr>
-        <w:rPr>
-          <w:rFonts w:eastAsiaTheme="minorEastAsia"/>
-        </w:rPr>
+        <w:spacing w:line="480" w:lineRule="auto"/>
+        <w:ind w:firstLine="720"/>
+        <w:jc w:val="both"/>
       </w:pPr>
       <w:r>
         <w:t xml:space="preserve">Where </w:t>
@@ -2203,7 +2260,6 @@
             <m:ctrlPr>
               <w:rPr>
                 <w:rFonts w:ascii="Cambria Math" w:hAnsi="Cambria Math"/>
-                <w:i/>
               </w:rPr>
             </m:ctrlPr>
           </m:sSubPr>
@@ -2226,55 +2282,40 @@
         </m:sSub>
       </m:oMath>
       <w:r>
-        <w:rPr>
-          <w:rFonts w:eastAsiaTheme="minorEastAsia"/>
-        </w:rPr>
         <w:t xml:space="preserve"> represents the inflation in consumer prices for</w:t>
       </w:r>
       <w:r>
-        <w:rPr>
-          <w:rFonts w:eastAsiaTheme="minorEastAsia"/>
-        </w:rPr>
         <w:t xml:space="preserve"> </w:t>
       </w:r>
       <w:r>
-        <w:rPr>
-          <w:rFonts w:eastAsiaTheme="minorEastAsia"/>
-        </w:rPr>
         <w:t xml:space="preserve">country </w:t>
       </w:r>
       <m:oMath>
         <m:r>
           <w:rPr>
-            <w:rFonts w:ascii="Cambria Math" w:eastAsiaTheme="minorEastAsia" w:hAnsi="Cambria Math"/>
+            <w:rFonts w:ascii="Cambria Math" w:hAnsi="Cambria Math"/>
           </w:rPr>
           <m:t>i</m:t>
         </m:r>
       </m:oMath>
       <w:r>
-        <w:rPr>
-          <w:rFonts w:eastAsiaTheme="minorEastAsia"/>
-        </w:rPr>
         <w:t xml:space="preserve"> at time </w:t>
       </w:r>
       <m:oMath>
         <m:r>
           <w:rPr>
-            <w:rFonts w:ascii="Cambria Math" w:eastAsiaTheme="minorEastAsia" w:hAnsi="Cambria Math"/>
+            <w:rFonts w:ascii="Cambria Math" w:hAnsi="Cambria Math"/>
           </w:rPr>
           <m:t>t</m:t>
         </m:r>
       </m:oMath>
       <w:r>
-        <w:rPr>
-          <w:rFonts w:eastAsiaTheme="minorEastAsia"/>
-        </w:rPr>
         <w:t xml:space="preserve">. The model uses </w:t>
       </w:r>
       <m:oMath>
         <m:r>
           <w:rPr>
-            <w:rFonts w:ascii="Cambria Math" w:eastAsiaTheme="minorEastAsia" w:hAnsi="Cambria Math"/>
+            <w:rFonts w:ascii="Cambria Math" w:hAnsi="Cambria Math"/>
           </w:rPr>
           <m:t>Macr</m:t>
         </m:r>
@@ -2282,15 +2323,14 @@
           <m:sSubPr>
             <m:ctrlPr>
               <w:rPr>
-                <w:rFonts w:ascii="Cambria Math" w:eastAsiaTheme="minorEastAsia" w:hAnsi="Cambria Math"/>
-                <w:i/>
+                <w:rFonts w:ascii="Cambria Math" w:hAnsi="Cambria Math"/>
               </w:rPr>
             </m:ctrlPr>
           </m:sSubPr>
           <m:e>
             <m:r>
               <w:rPr>
-                <w:rFonts w:ascii="Cambria Math" w:eastAsiaTheme="minorEastAsia" w:hAnsi="Cambria Math"/>
+                <w:rFonts w:ascii="Cambria Math" w:hAnsi="Cambria Math"/>
               </w:rPr>
               <m:t>o</m:t>
             </m:r>
@@ -2298,7 +2338,7 @@
           <m:sub>
             <m:r>
               <w:rPr>
-                <w:rFonts w:ascii="Cambria Math" w:eastAsiaTheme="minorEastAsia" w:hAnsi="Cambria Math"/>
+                <w:rFonts w:ascii="Cambria Math" w:hAnsi="Cambria Math"/>
               </w:rPr>
               <m:t>it</m:t>
             </m:r>
@@ -2306,15 +2346,12 @@
         </m:sSub>
       </m:oMath>
       <w:r>
-        <w:rPr>
-          <w:rFonts w:eastAsiaTheme="minorEastAsia"/>
-        </w:rPr>
         <w:t xml:space="preserve"> as its primary explanatory variable, and a proposed interaction term  </w:t>
       </w:r>
       <m:oMath>
         <m:r>
           <w:rPr>
-            <w:rFonts w:ascii="Cambria Math" w:eastAsiaTheme="minorEastAsia" w:hAnsi="Cambria Math"/>
+            <w:rFonts w:ascii="Cambria Math" w:hAnsi="Cambria Math"/>
           </w:rPr>
           <m:t>Macr</m:t>
         </m:r>
@@ -2322,15 +2359,14 @@
           <m:sSubPr>
             <m:ctrlPr>
               <w:rPr>
-                <w:rFonts w:ascii="Cambria Math" w:eastAsiaTheme="minorEastAsia" w:hAnsi="Cambria Math"/>
-                <w:i/>
+                <w:rFonts w:ascii="Cambria Math" w:hAnsi="Cambria Math"/>
               </w:rPr>
             </m:ctrlPr>
           </m:sSubPr>
           <m:e>
             <m:r>
               <w:rPr>
-                <w:rFonts w:ascii="Cambria Math" w:eastAsiaTheme="minorEastAsia" w:hAnsi="Cambria Math"/>
+                <w:rFonts w:ascii="Cambria Math" w:hAnsi="Cambria Math"/>
               </w:rPr>
               <m:t>o</m:t>
             </m:r>
@@ -2338,55 +2374,24 @@
           <m:sub>
             <m:r>
               <w:rPr>
-                <w:rFonts w:ascii="Cambria Math" w:eastAsiaTheme="minorEastAsia" w:hAnsi="Cambria Math"/>
+                <w:rFonts w:ascii="Cambria Math" w:hAnsi="Cambria Math"/>
               </w:rPr>
               <m:t>it</m:t>
             </m:r>
           </m:sub>
         </m:sSub>
         <m:r>
+          <m:rPr>
+            <m:sty m:val="p"/>
+          </m:rPr>
           <w:rPr>
-            <w:rFonts w:ascii="Cambria Math" w:eastAsiaTheme="minorEastAsia" w:hAnsi="Cambria Math"/>
+            <w:rFonts w:ascii="Cambria Math" w:hAnsi="Cambria Math"/>
           </w:rPr>
-          <m:t>×Expor</m:t>
+          <m:t>×</m:t>
         </m:r>
-        <m:sSub>
-          <m:sSubPr>
-            <m:ctrlPr>
-              <w:rPr>
-                <w:rFonts w:ascii="Cambria Math" w:eastAsiaTheme="minorEastAsia" w:hAnsi="Cambria Math"/>
-                <w:i/>
-              </w:rPr>
-            </m:ctrlPr>
-          </m:sSubPr>
-          <m:e>
-            <m:r>
-              <w:rPr>
-                <w:rFonts w:ascii="Cambria Math" w:eastAsiaTheme="minorEastAsia" w:hAnsi="Cambria Math"/>
-              </w:rPr>
-              <m:t>t</m:t>
-            </m:r>
-          </m:e>
-          <m:sub>
-            <m:r>
-              <w:rPr>
-                <w:rFonts w:ascii="Cambria Math" w:eastAsiaTheme="minorEastAsia" w:hAnsi="Cambria Math"/>
-              </w:rPr>
-              <m:t>it</m:t>
-            </m:r>
-          </m:sub>
-        </m:sSub>
-      </m:oMath>
-      <w:r>
-        <w:rPr>
-          <w:rFonts w:eastAsiaTheme="minorEastAsia"/>
-        </w:rPr>
-        <w:t xml:space="preserve">, control variables </w:t>
-      </w:r>
-      <m:oMath>
         <m:r>
           <w:rPr>
-            <w:rFonts w:ascii="Cambria Math" w:eastAsiaTheme="minorEastAsia" w:hAnsi="Cambria Math"/>
+            <w:rFonts w:ascii="Cambria Math" w:hAnsi="Cambria Math"/>
           </w:rPr>
           <m:t>Expor</m:t>
         </m:r>
@@ -2394,15 +2399,14 @@
           <m:sSubPr>
             <m:ctrlPr>
               <w:rPr>
-                <w:rFonts w:ascii="Cambria Math" w:eastAsiaTheme="minorEastAsia" w:hAnsi="Cambria Math"/>
-                <w:i/>
+                <w:rFonts w:ascii="Cambria Math" w:hAnsi="Cambria Math"/>
               </w:rPr>
             </m:ctrlPr>
           </m:sSubPr>
           <m:e>
             <m:r>
               <w:rPr>
-                <w:rFonts w:ascii="Cambria Math" w:eastAsiaTheme="minorEastAsia" w:hAnsi="Cambria Math"/>
+                <w:rFonts w:ascii="Cambria Math" w:hAnsi="Cambria Math"/>
               </w:rPr>
               <m:t>t</m:t>
             </m:r>
@@ -2410,7 +2414,7 @@
           <m:sub>
             <m:r>
               <w:rPr>
-                <w:rFonts w:ascii="Cambria Math" w:eastAsiaTheme="minorEastAsia" w:hAnsi="Cambria Math"/>
+                <w:rFonts w:ascii="Cambria Math" w:hAnsi="Cambria Math"/>
               </w:rPr>
               <m:t>it</m:t>
             </m:r>
@@ -2418,15 +2422,48 @@
         </m:sSub>
       </m:oMath>
       <w:r>
-        <w:rPr>
-          <w:rFonts w:eastAsiaTheme="minorEastAsia"/>
-        </w:rPr>
-        <w:t xml:space="preserve">, </w:t>
+        <w:t xml:space="preserve">, control variables </w:t>
       </w:r>
       <m:oMath>
         <m:r>
           <w:rPr>
-            <w:rFonts w:ascii="Cambria Math" w:eastAsiaTheme="minorEastAsia" w:hAnsi="Cambria Math"/>
+            <w:rFonts w:ascii="Cambria Math" w:hAnsi="Cambria Math"/>
+          </w:rPr>
+          <m:t>Expor</m:t>
+        </m:r>
+        <m:sSub>
+          <m:sSubPr>
+            <m:ctrlPr>
+              <w:rPr>
+                <w:rFonts w:ascii="Cambria Math" w:hAnsi="Cambria Math"/>
+              </w:rPr>
+            </m:ctrlPr>
+          </m:sSubPr>
+          <m:e>
+            <m:r>
+              <w:rPr>
+                <w:rFonts w:ascii="Cambria Math" w:hAnsi="Cambria Math"/>
+              </w:rPr>
+              <m:t>t</m:t>
+            </m:r>
+          </m:e>
+          <m:sub>
+            <m:r>
+              <w:rPr>
+                <w:rFonts w:ascii="Cambria Math" w:hAnsi="Cambria Math"/>
+              </w:rPr>
+              <m:t>it</m:t>
+            </m:r>
+          </m:sub>
+        </m:sSub>
+      </m:oMath>
+      <w:r>
+        <w:t xml:space="preserve">, </w:t>
+      </w:r>
+      <m:oMath>
+        <m:r>
+          <w:rPr>
+            <w:rFonts w:ascii="Cambria Math" w:hAnsi="Cambria Math"/>
           </w:rPr>
           <m:t>Credi</m:t>
         </m:r>
@@ -2434,15 +2471,14 @@
           <m:sSubPr>
             <m:ctrlPr>
               <w:rPr>
-                <w:rFonts w:ascii="Cambria Math" w:eastAsiaTheme="minorEastAsia" w:hAnsi="Cambria Math"/>
-                <w:i/>
+                <w:rFonts w:ascii="Cambria Math" w:hAnsi="Cambria Math"/>
               </w:rPr>
             </m:ctrlPr>
           </m:sSubPr>
           <m:e>
             <m:r>
               <w:rPr>
-                <w:rFonts w:ascii="Cambria Math" w:eastAsiaTheme="minorEastAsia" w:hAnsi="Cambria Math"/>
+                <w:rFonts w:ascii="Cambria Math" w:hAnsi="Cambria Math"/>
               </w:rPr>
               <m:t>t</m:t>
             </m:r>
@@ -2450,7 +2486,7 @@
           <m:sub>
             <m:r>
               <w:rPr>
-                <w:rFonts w:ascii="Cambria Math" w:eastAsiaTheme="minorEastAsia" w:hAnsi="Cambria Math"/>
+                <w:rFonts w:ascii="Cambria Math" w:hAnsi="Cambria Math"/>
               </w:rPr>
               <m:t>it</m:t>
             </m:r>
@@ -2458,31 +2494,42 @@
         </m:sSub>
       </m:oMath>
       <w:r>
-        <w:rPr>
-          <w:rFonts w:eastAsiaTheme="minorEastAsia"/>
-        </w:rPr>
         <w:t>,</w:t>
       </w:r>
       <m:oMath>
         <m:r>
           <w:rPr>
-            <w:rFonts w:ascii="Cambria Math" w:eastAsiaTheme="minorEastAsia" w:hAnsi="Cambria Math"/>
+            <w:rFonts w:ascii="Cambria Math" w:hAnsi="Cambria Math"/>
           </w:rPr>
-          <m:t>CPI Av</m:t>
+          <m:t>CPI</m:t>
+        </m:r>
+        <m:r>
+          <m:rPr>
+            <m:sty m:val="p"/>
+          </m:rPr>
+          <w:rPr>
+            <w:rFonts w:ascii="Cambria Math" w:hAnsi="Cambria Math"/>
+          </w:rPr>
+          <m:t xml:space="preserve"> </m:t>
+        </m:r>
+        <m:r>
+          <w:rPr>
+            <w:rFonts w:ascii="Cambria Math" w:hAnsi="Cambria Math"/>
+          </w:rPr>
+          <m:t>Av</m:t>
         </m:r>
         <m:sSub>
           <m:sSubPr>
             <m:ctrlPr>
               <w:rPr>
-                <w:rFonts w:ascii="Cambria Math" w:eastAsiaTheme="minorEastAsia" w:hAnsi="Cambria Math"/>
-                <w:i/>
+                <w:rFonts w:ascii="Cambria Math" w:hAnsi="Cambria Math"/>
               </w:rPr>
             </m:ctrlPr>
           </m:sSubPr>
           <m:e>
             <m:r>
               <w:rPr>
-                <w:rFonts w:ascii="Cambria Math" w:eastAsiaTheme="minorEastAsia" w:hAnsi="Cambria Math"/>
+                <w:rFonts w:ascii="Cambria Math" w:hAnsi="Cambria Math"/>
               </w:rPr>
               <m:t>g</m:t>
             </m:r>
@@ -2490,7 +2537,7 @@
           <m:sub>
             <m:r>
               <w:rPr>
-                <w:rFonts w:ascii="Cambria Math" w:eastAsiaTheme="minorEastAsia" w:hAnsi="Cambria Math"/>
+                <w:rFonts w:ascii="Cambria Math" w:hAnsi="Cambria Math"/>
               </w:rPr>
               <m:t>it</m:t>
             </m:r>
@@ -2498,9 +2545,6 @@
         </m:sSub>
       </m:oMath>
       <w:r>
-        <w:rPr>
-          <w:rFonts w:eastAsiaTheme="minorEastAsia"/>
-        </w:rPr>
         <w:t xml:space="preserve">, and  representing the other cluster control variables we use element fixed-effects </w:t>
       </w:r>
       <m:oMath>
@@ -2508,15 +2552,14 @@
           <m:sSubPr>
             <m:ctrlPr>
               <w:rPr>
-                <w:rFonts w:ascii="Cambria Math" w:eastAsiaTheme="minorEastAsia" w:hAnsi="Cambria Math"/>
-                <w:i/>
+                <w:rFonts w:ascii="Cambria Math" w:hAnsi="Cambria Math"/>
               </w:rPr>
             </m:ctrlPr>
           </m:sSubPr>
           <m:e>
             <m:r>
               <w:rPr>
-                <w:rFonts w:ascii="Cambria Math" w:eastAsiaTheme="minorEastAsia" w:hAnsi="Cambria Math"/>
+                <w:rFonts w:ascii="Cambria Math" w:hAnsi="Cambria Math"/>
               </w:rPr>
               <m:t>α</m:t>
             </m:r>
@@ -2524,7 +2567,7 @@
           <m:sub>
             <m:r>
               <w:rPr>
-                <w:rFonts w:ascii="Cambria Math" w:eastAsiaTheme="minorEastAsia" w:hAnsi="Cambria Math"/>
+                <w:rFonts w:ascii="Cambria Math" w:hAnsi="Cambria Math"/>
               </w:rPr>
               <m:t>i</m:t>
             </m:r>
@@ -2532,9 +2575,6 @@
         </m:sSub>
       </m:oMath>
       <w:r>
-        <w:rPr>
-          <w:rFonts w:eastAsiaTheme="minorEastAsia"/>
-        </w:rPr>
         <w:t xml:space="preserve">, time fixed-effects </w:t>
       </w:r>
       <m:oMath>
@@ -2542,15 +2582,14 @@
           <m:sSubPr>
             <m:ctrlPr>
               <w:rPr>
-                <w:rFonts w:ascii="Cambria Math" w:eastAsiaTheme="minorEastAsia" w:hAnsi="Cambria Math"/>
-                <w:i/>
+                <w:rFonts w:ascii="Cambria Math" w:hAnsi="Cambria Math"/>
               </w:rPr>
             </m:ctrlPr>
           </m:sSubPr>
           <m:e>
             <m:r>
               <w:rPr>
-                <w:rFonts w:ascii="Cambria Math" w:eastAsiaTheme="minorEastAsia" w:hAnsi="Cambria Math"/>
+                <w:rFonts w:ascii="Cambria Math" w:hAnsi="Cambria Math"/>
               </w:rPr>
               <m:t>γ</m:t>
             </m:r>
@@ -2558,7 +2597,7 @@
           <m:sub>
             <m:r>
               <w:rPr>
-                <w:rFonts w:ascii="Cambria Math" w:eastAsiaTheme="minorEastAsia" w:hAnsi="Cambria Math"/>
+                <w:rFonts w:ascii="Cambria Math" w:hAnsi="Cambria Math"/>
               </w:rPr>
               <m:t>t</m:t>
             </m:r>
@@ -2566,9 +2605,6 @@
         </m:sSub>
       </m:oMath>
       <w:r>
-        <w:rPr>
-          <w:rFonts w:eastAsiaTheme="minorEastAsia"/>
-        </w:rPr>
         <w:t xml:space="preserve"> and an error term </w:t>
       </w:r>
       <m:oMath>
@@ -2576,15 +2612,14 @@
           <m:sSubPr>
             <m:ctrlPr>
               <w:rPr>
-                <w:rFonts w:ascii="Cambria Math" w:eastAsiaTheme="minorEastAsia" w:hAnsi="Cambria Math"/>
-                <w:i/>
+                <w:rFonts w:ascii="Cambria Math" w:hAnsi="Cambria Math"/>
               </w:rPr>
             </m:ctrlPr>
           </m:sSubPr>
           <m:e>
             <m:r>
               <w:rPr>
-                <w:rFonts w:ascii="Cambria Math" w:eastAsiaTheme="minorEastAsia" w:hAnsi="Cambria Math"/>
+                <w:rFonts w:ascii="Cambria Math" w:hAnsi="Cambria Math"/>
               </w:rPr>
               <m:t>ϵ</m:t>
             </m:r>
@@ -2592,7 +2627,7 @@
           <m:sub>
             <m:r>
               <w:rPr>
-                <w:rFonts w:ascii="Cambria Math" w:eastAsiaTheme="minorEastAsia" w:hAnsi="Cambria Math"/>
+                <w:rFonts w:ascii="Cambria Math" w:hAnsi="Cambria Math"/>
               </w:rPr>
               <m:t>it</m:t>
             </m:r>
@@ -2602,15 +2637,11 @@
     </w:p>
     <w:p>
       <w:pPr>
+        <w:spacing w:line="480" w:lineRule="auto"/>
         <w:ind w:firstLine="720"/>
-        <w:rPr>
-          <w:rFonts w:eastAsiaTheme="minorEastAsia"/>
-        </w:rPr>
-      </w:pPr>
-      <w:r>
-        <w:rPr>
-          <w:rFonts w:eastAsiaTheme="minorEastAsia"/>
-        </w:rPr>
+        <w:jc w:val="both"/>
+      </w:pPr>
+      <w:r>
         <w:t xml:space="preserve">We expect the sign of the coefficient </w:t>
       </w:r>
       <m:oMath>
@@ -2618,23 +2649,25 @@
           <m:sSubPr>
             <m:ctrlPr>
               <w:rPr>
-                <w:rFonts w:ascii="Cambria Math" w:eastAsiaTheme="minorEastAsia" w:hAnsi="Cambria Math"/>
-                <w:i/>
+                <w:rFonts w:ascii="Cambria Math" w:hAnsi="Cambria Math"/>
               </w:rPr>
             </m:ctrlPr>
           </m:sSubPr>
           <m:e>
             <m:r>
               <w:rPr>
-                <w:rFonts w:ascii="Cambria Math" w:eastAsiaTheme="minorEastAsia" w:hAnsi="Cambria Math"/>
-              </w:rPr>
-              <m:t>B</m:t>
+                <w:rFonts w:ascii="Cambria Math" w:hAnsi="Cambria Math"/>
+              </w:rPr>
+              <m:t>β</m:t>
             </m:r>
           </m:e>
           <m:sub>
             <m:r>
-              <w:rPr>
-                <w:rFonts w:ascii="Cambria Math" w:eastAsiaTheme="minorEastAsia" w:hAnsi="Cambria Math"/>
+              <m:rPr>
+                <m:sty m:val="p"/>
+              </m:rPr>
+              <w:rPr>
+                <w:rFonts w:ascii="Cambria Math" w:hAnsi="Cambria Math"/>
               </w:rPr>
               <m:t>1</m:t>
             </m:r>
@@ -2642,42 +2675,20 @@
         </m:sSub>
       </m:oMath>
       <w:r>
-        <w:rPr>
-          <w:rFonts w:eastAsiaTheme="minorEastAsia"/>
-        </w:rPr>
-        <w:t xml:space="preserve"> to be negative</w:t>
-      </w:r>
-      <w:proofErr w:type="gramStart"/>
-      <w:r>
-        <w:rPr>
-          <w:rFonts w:eastAsiaTheme="minorEastAsia"/>
-        </w:rPr>
-        <w:t xml:space="preserve">.  </w:t>
-      </w:r>
-      <w:proofErr w:type="gramEnd"/>
-      <w:r>
-        <w:rPr>
-          <w:rFonts w:eastAsiaTheme="minorEastAsia"/>
-        </w:rPr>
-        <w:t xml:space="preserve">Effective macroeconomic management strengthens a country's ability to stabilize prices by anchoring inflation expectations, maintaining fiscal discipline, and mitigating demand-side pressures. Countries with higher macroeconomic policy ratings are </w:t>
-      </w:r>
-      <w:r>
-        <w:rPr>
-          <w:rFonts w:eastAsiaTheme="minorEastAsia"/>
-        </w:rPr>
+        <w:t xml:space="preserve"> to be negative.  </w:t>
+      </w:r>
+      <w:r>
+        <w:t xml:space="preserve">Effective macroeconomic management strengthens a country's ability to stabilize prices by anchoring inflation expectations, maintaining fiscal discipline, and mitigating demand-side pressures. </w:t>
+      </w:r>
+      <w:r>
+        <w:lastRenderedPageBreak/>
+        <w:t xml:space="preserve">Countries with higher macroeconomic policy ratings are </w:t>
+      </w:r>
+      <w:r>
         <w:t>characterized</w:t>
       </w:r>
       <w:r>
-        <w:rPr>
-          <w:rFonts w:eastAsiaTheme="minorEastAsia"/>
-        </w:rPr>
-        <w:t xml:space="preserve"> by stronger institutional frameworks and more credible policy environments, both of which are associated with lower inflation volatility.</w:t>
-      </w:r>
-      <w:r>
-        <w:rPr>
-          <w:rFonts w:eastAsiaTheme="minorEastAsia"/>
-        </w:rPr>
-        <w:t xml:space="preserve"> As well, aligns with public expectation that strong macroeconomic policy can help curb the impacts of inflation.</w:t>
+        <w:t xml:space="preserve"> by stronger institutional frameworks and more credible policy environments, both of which are associated with lower inflation volatility. As well, aligns with public expectation that strong macroeconomic policy can help curb the impacts of inflation.</w:t>
       </w:r>
     </w:p>
     <w:p>
@@ -2706,20 +2717,21 @@
     </w:p>
     <w:p>
       <w:pPr>
+        <w:spacing w:line="480" w:lineRule="auto"/>
         <w:ind w:firstLine="720"/>
+        <w:jc w:val="both"/>
       </w:pPr>
       <w:r>
         <w:t xml:space="preserve">The primary explanatory variable of interest in this study is </w:t>
       </w:r>
       <w:r>
-        <w:rPr>
-          <w:b/>
-          <w:bCs/>
-        </w:rPr>
         <w:t>CPIA Macroeconomic Management Rating (Macro)</w:t>
       </w:r>
       <w:r>
-        <w:t xml:space="preserve">, a continuous measure of macroeconomic policy quality on a standardized 1–6 scale. Its inclusion in the model is based on both theoretical motivation and empirical performance. Across all estimated models, Macro consistently demonstrates strong statistical significance at the 1% level. For instance, in the preferred interaction model (Column 2 of Table </w:t>
+        <w:t xml:space="preserve">, </w:t>
+      </w:r>
+      <w:r>
+        <w:t xml:space="preserve">a continuous measure of macroeconomic policy quality on a standardized 1–6 scale. Its inclusion in the model is based on both theoretical motivation and empirical performance. Across all estimated models, Macro consistently demonstrates strong statistical significance at the 1% level. For instance, in the preferred interaction model (Column 2 of Table </w:t>
       </w:r>
       <w:r>
         <w:t>3</w:t>
@@ -2730,7 +2742,9 @@
     </w:p>
     <w:p>
       <w:pPr>
+        <w:spacing w:line="480" w:lineRule="auto"/>
         <w:ind w:firstLine="720"/>
+        <w:jc w:val="both"/>
       </w:pPr>
       <w:r>
         <w:rPr>
@@ -2740,48 +2754,28 @@
         <w:t>Export Volume</w:t>
       </w:r>
       <w:r>
-        <w:t xml:space="preserve"> (Export) is included both as an independent control and as part of an interaction term with Macro. The rationale stems from the potential influence of external trade shocks on domestic inflation dynamics. While Export alone is marginally significant </w:t>
+        <w:t xml:space="preserve"> (Export) is included both as an independent control and as part of an interaction term with Macro. The rationale stems from the potential influence of external trade shocks on domestic inflation dynamics. While Export alone is marginally significant in the final model (p&lt;0.1), the interaction term (Macro × Export) achieves statistical significance at the 10% level (coefficient = 0.00792; p&lt;0.1). This significance justifies its </w:t>
       </w:r>
       <w:r>
         <w:lastRenderedPageBreak/>
-        <w:t>in the final model (p&lt;0.1), the interaction term (Macro × Export) achieves statistical significance at the 10% level (coefficient = 0.00792; p&lt;0.1). This significance justifies its inclusion, allowing the analysis to capture how macroeconomic policy effectiveness may vary based on a country's degree of integration into global markets.</w:t>
-      </w:r>
-    </w:p>
-    <w:p>
-      <w:pPr>
+        <w:t>inclusion, allowing the analysis to capture how macroeconomic policy effectiveness may vary based on a country's degree of integration into global markets.</w:t>
+      </w:r>
+    </w:p>
+    <w:p>
+      <w:pPr>
+        <w:spacing w:line="480" w:lineRule="auto"/>
         <w:ind w:firstLine="720"/>
-      </w:pPr>
-      <w:r>
-        <w:t>CPIA Average Rating (</w:t>
-      </w:r>
-      <w:proofErr w:type="spellStart"/>
-      <w:r>
-        <w:t>CPIA_Avg</w:t>
-      </w:r>
-      <w:proofErr w:type="spellEnd"/>
-      <w:r>
-        <w:t xml:space="preserve">), a custom composite measure of broader institutional quality, is included to control for the potential confounding influence of a country’s financial sector development, property rights protections, and social inclusion efforts. Although </w:t>
-      </w:r>
-      <w:proofErr w:type="spellStart"/>
-      <w:r>
-        <w:t>CPIA_Avg</w:t>
-      </w:r>
-      <w:proofErr w:type="spellEnd"/>
-      <w:r>
-        <w:t xml:space="preserve"> exhibits only marginal statistical significance (p&lt;0.1) in the interaction model, its inclusion is critical. Omitting </w:t>
-      </w:r>
-      <w:proofErr w:type="spellStart"/>
-      <w:r>
-        <w:t>CPIA_Avg</w:t>
-      </w:r>
-      <w:proofErr w:type="spellEnd"/>
-      <w:r>
-        <w:t xml:space="preserve"> leads to substantial omitted variable bias, shifting the estimated effect of Macro significantly and reducing its interpretability. Its presence ensures that the estimated relationship between macroeconomic management and inflation is not conflated with broader governance quality effects.</w:t>
-      </w:r>
-    </w:p>
-    <w:p>
-      <w:pPr>
+        <w:jc w:val="both"/>
+      </w:pPr>
+      <w:r>
+        <w:t>CPIA Average Rating (CPIA_Avg), a custom composite measure of broader institutional quality, is included to control for the potential confounding influence of a country’s financial sector development, property rights protections, and social inclusion efforts. Although CPIA_Avg exhibits only marginal statistical significance (p&lt;0.1) in the interaction model, its inclusion is critical. Omitting CPIA_Avg leads to substantial omitted variable bias, shifting the estimated effect of Macro significantly and reducing its interpretability. Its presence ensures that the estimated relationship between macroeconomic management and inflation is not conflated with broader governance quality effects.</w:t>
+      </w:r>
+    </w:p>
+    <w:p>
+      <w:pPr>
+        <w:spacing w:line="480" w:lineRule="auto"/>
         <w:ind w:firstLine="720"/>
+        <w:jc w:val="both"/>
       </w:pPr>
       <w:r>
         <w:t>Domestic Credit to Private Sector (Credit Financial), expressed as a percentage of GDP, is incorporated to account for liquidity conditions and credit market dynamics, which the literature identifies as important determinants of inflation. This variable demonstrates consistent statistical significance at the 1% level across all specifications (e.g., -0.0741; p&lt;0.01 in Column 2), further validating its inclusion.</w:t>
@@ -2789,38 +2783,22 @@
     </w:p>
     <w:p>
       <w:pPr>
+        <w:spacing w:line="480" w:lineRule="auto"/>
         <w:ind w:firstLine="720"/>
-      </w:pPr>
-      <w:r>
-        <w:t xml:space="preserve">In evaluating potential omitted variables, we systematically </w:t>
-      </w:r>
-      <w:proofErr w:type="gramStart"/>
-      <w:r>
-        <w:t>tested</w:t>
-      </w:r>
-      <w:proofErr w:type="gramEnd"/>
-      <w:r>
-        <w:t xml:space="preserve"> several additional controls across multiple specifications. These included GDP per capita growth, real GDP levels, depth of credit information systems, electricity access rates (as a proxy for infrastructure quality), and levels of informal payments (as a proxy for corruption). Models including </w:t>
-      </w:r>
-      <w:r>
-        <w:rPr>
-          <w:b/>
-          <w:bCs/>
-        </w:rPr>
-        <w:t>GDP growth</w:t>
-      </w:r>
-      <w:r>
-        <w:t xml:space="preserve"> and </w:t>
-      </w:r>
-      <w:r>
-        <w:rPr>
-          <w:b/>
-          <w:bCs/>
-        </w:rPr>
-        <w:t>GDP constant dollars</w:t>
-      </w:r>
-      <w:r>
-        <w:t xml:space="preserve"> did not yield any meaningful change in the Macro coefficient and were therefore excluded. Including </w:t>
+        <w:jc w:val="both"/>
+      </w:pPr>
+      <w:r>
+        <w:t xml:space="preserve">In evaluating potential omitted variables, we systematically tested several additional controls across multiple specifications. These included GDP per capita growth, real GDP levels, depth of credit information systems, electricity access rates (as a proxy for infrastructure quality), and levels of informal payments (as a proxy for corruption). Models including </w:t>
+      </w:r>
+      <w:r>
+        <w:t>GDP growth and GDP constant dollars</w:t>
+      </w:r>
+      <w:r>
+        <w:t xml:space="preserve"> did not yield any meaningful change in the </w:t>
+      </w:r>
+      <w:r>
+        <w:lastRenderedPageBreak/>
+        <w:t xml:space="preserve">Macro coefficient and were therefore excluded. Including </w:t>
       </w:r>
       <w:r>
         <w:rPr>
@@ -2830,15 +2808,7 @@
         <w:t>depth of credit</w:t>
       </w:r>
       <w:r>
-        <w:t xml:space="preserve"> introduced slight changes but </w:t>
-      </w:r>
-      <w:proofErr w:type="gramStart"/>
-      <w:r>
-        <w:t>substantially reduced</w:t>
-      </w:r>
-      <w:proofErr w:type="gramEnd"/>
-      <w:r>
-        <w:t xml:space="preserve"> the number of observations, undermining estimation robustness. Similarly, including </w:t>
+        <w:t xml:space="preserve"> introduced slight changes but substantially reduced the number of observations, undermining estimation robustness. Similarly, including </w:t>
       </w:r>
       <w:r>
         <w:rPr>
@@ -2858,55 +2828,66 @@
         <w:t>informal payments</w:t>
       </w:r>
       <w:r>
-        <w:t xml:space="preserve"> did not produce statistically significant shifts in the key coefficients, nor did they meet the threshold of moving the estimated coefficient on Macro by more than one standard error. As such, these variables were </w:t>
+        <w:t xml:space="preserve"> did not produce statistically significant shifts in the key coefficients, nor did they meet the threshold of moving the estimated coefficient on Macro by more than one standard error. As such, these variables were ultimately omitted from the final model to preserve sample size and model parsimony.</w:t>
+      </w:r>
+    </w:p>
+    <w:p>
+      <w:pPr>
+        <w:spacing w:line="480" w:lineRule="auto"/>
+        <w:ind w:firstLine="720"/>
+        <w:jc w:val="both"/>
+      </w:pPr>
+      <w:commentRangeStart w:id="0"/>
+      <w:r>
+        <w:t xml:space="preserve">Additionally, the possibility of nonlinearities was considered by estimating models with quadratic terms and log-linear transformations. However, none of these alternative specifications improved model </w:t>
       </w:r>
       <w:proofErr w:type="gramStart"/>
       <w:r>
-        <w:t>ultimately omitted</w:t>
+        <w:t>fit</w:t>
       </w:r>
       <w:proofErr w:type="gramEnd"/>
       <w:r>
-        <w:t xml:space="preserve"> from the final model to preserve sample size and model parsimony.</w:t>
-      </w:r>
-    </w:p>
-    <w:p>
-      <w:pPr>
-        <w:ind w:firstLine="720"/>
-      </w:pPr>
-      <w:commentRangeStart w:id="1"/>
-      <w:r>
-        <w:t xml:space="preserve">Additionally, the possibility of nonlinearities was considered by estimating models with quadratic terms and log-linear transformations. However, none of these alternative specifications improved model </w:t>
-      </w:r>
-      <w:proofErr w:type="gramStart"/>
-      <w:r>
-        <w:t>fit</w:t>
-      </w:r>
-      <w:proofErr w:type="gramEnd"/>
-      <w:r>
         <w:t>, as assessed by adjusted R-squared values and statistical significance tests. Consequently, a linear specification with an interaction term between Macro and Export was selected as the most theoretically coherent and empirically robust model for this analysis.</w:t>
       </w:r>
-      <w:commentRangeEnd w:id="1"/>
+      <w:commentRangeEnd w:id="0"/>
       <w:r>
         <w:rPr>
           <w:rStyle w:val="CommentReference"/>
         </w:rPr>
-        <w:commentReference w:id="1"/>
-      </w:r>
-    </w:p>
-    <w:p>
-      <w:pPr>
+        <w:commentReference w:id="0"/>
+      </w:r>
+    </w:p>
+    <w:p>
+      <w:pPr>
+        <w:spacing w:line="480" w:lineRule="auto"/>
         <w:ind w:firstLine="720"/>
+        <w:jc w:val="both"/>
+      </w:pPr>
+      <w:r>
+        <w:t>Overall, the included variables have been carefully selected based on a combination of statistical significance, theoretical justification, and a thorough assessment of potential omitted variable bias. This ensures that the final model provides a rigorous and interpretable estimate of the relationship between macroeconomic policy quality and inflation outcomes across countries.</w:t>
+      </w:r>
+    </w:p>
+    <w:p>
+      <w:pPr>
+        <w:jc w:val="center"/>
+      </w:pPr>
+    </w:p>
+    <w:p>
+      <w:pPr>
+        <w:jc w:val="center"/>
+      </w:pPr>
+    </w:p>
+    <w:p>
+      <w:pPr>
+        <w:jc w:val="center"/>
+      </w:pPr>
+    </w:p>
+    <w:p>
+      <w:pPr>
+        <w:jc w:val="center"/>
       </w:pPr>
       <w:r>
         <w:lastRenderedPageBreak/>
-        <w:t>Overall, the included variables have been carefully selected based on a combination of statistical significance, theoretical justification, and a thorough assessment of potential omitted variable bias. This ensures that the final model provides a rigorous and interpretable estimate of the relationship between macroeconomic policy quality and inflation outcomes across countries.</w:t>
-      </w:r>
-    </w:p>
-    <w:p>
-      <w:pPr>
-        <w:jc w:val="center"/>
-      </w:pPr>
-      <w:r>
         <w:t>Table 3: - Estimates of Macroeconomic Rating: Effect on Change in Inflation across countries and time</w:t>
       </w:r>
     </w:p>
@@ -2928,12 +2909,6 @@
         <w:gridCol w:w="1584"/>
       </w:tblGrid>
       <w:tr>
-        <w:tblPrEx>
-          <w:tblCellMar>
-            <w:top w:w="0" w:type="dxa"/>
-            <w:bottom w:w="0" w:type="dxa"/>
-          </w:tblCellMar>
-        </w:tblPrEx>
         <w:trPr>
           <w:jc w:val="center"/>
         </w:trPr>
@@ -3059,12 +3034,6 @@
         </w:tc>
       </w:tr>
       <w:tr>
-        <w:tblPrEx>
-          <w:tblCellMar>
-            <w:top w:w="0" w:type="dxa"/>
-            <w:bottom w:w="0" w:type="dxa"/>
-          </w:tblCellMar>
-        </w:tblPrEx>
         <w:trPr>
           <w:jc w:val="center"/>
         </w:trPr>
@@ -3197,12 +3166,6 @@
         </w:tc>
       </w:tr>
       <w:tr>
-        <w:tblPrEx>
-          <w:tblCellMar>
-            <w:top w:w="0" w:type="dxa"/>
-            <w:bottom w:w="0" w:type="dxa"/>
-          </w:tblCellMar>
-        </w:tblPrEx>
         <w:trPr>
           <w:jc w:val="center"/>
         </w:trPr>
@@ -3307,12 +3270,6 @@
         </w:tc>
       </w:tr>
       <w:tr>
-        <w:tblPrEx>
-          <w:tblCellMar>
-            <w:top w:w="0" w:type="dxa"/>
-            <w:bottom w:w="0" w:type="dxa"/>
-          </w:tblCellMar>
-        </w:tblPrEx>
         <w:trPr>
           <w:jc w:val="center"/>
         </w:trPr>
@@ -3338,7 +3295,6 @@
                 <w:kern w:val="0"/>
               </w:rPr>
             </w:pPr>
-            <w:proofErr w:type="spellStart"/>
             <w:r>
               <w:rPr>
                 <w:rFonts w:ascii="Times New Roman" w:hAnsi="Times New Roman" w:cs="Times New Roman"/>
@@ -3346,7 +3302,6 @@
               </w:rPr>
               <w:t>cpia_macro_rating</w:t>
             </w:r>
-            <w:proofErr w:type="spellEnd"/>
           </w:p>
         </w:tc>
         <w:tc>
@@ -3447,12 +3402,6 @@
         </w:tc>
       </w:tr>
       <w:tr>
-        <w:tblPrEx>
-          <w:tblCellMar>
-            <w:top w:w="0" w:type="dxa"/>
-            <w:bottom w:w="0" w:type="dxa"/>
-          </w:tblCellMar>
-        </w:tblPrEx>
         <w:trPr>
           <w:jc w:val="center"/>
         </w:trPr>
@@ -3578,12 +3527,6 @@
         </w:tc>
       </w:tr>
       <w:tr>
-        <w:tblPrEx>
-          <w:tblCellMar>
-            <w:top w:w="0" w:type="dxa"/>
-            <w:bottom w:w="0" w:type="dxa"/>
-          </w:tblCellMar>
-        </w:tblPrEx>
         <w:trPr>
           <w:jc w:val="center"/>
         </w:trPr>
@@ -3609,7 +3552,6 @@
                 <w:kern w:val="0"/>
               </w:rPr>
             </w:pPr>
-            <w:proofErr w:type="spellStart"/>
             <w:r>
               <w:rPr>
                 <w:rFonts w:ascii="Times New Roman" w:hAnsi="Times New Roman" w:cs="Times New Roman"/>
@@ -3617,7 +3559,6 @@
               </w:rPr>
               <w:t>export_volume</w:t>
             </w:r>
-            <w:proofErr w:type="spellEnd"/>
           </w:p>
         </w:tc>
         <w:tc>
@@ -3718,12 +3659,6 @@
         </w:tc>
       </w:tr>
       <w:tr>
-        <w:tblPrEx>
-          <w:tblCellMar>
-            <w:top w:w="0" w:type="dxa"/>
-            <w:bottom w:w="0" w:type="dxa"/>
-          </w:tblCellMar>
-        </w:tblPrEx>
         <w:trPr>
           <w:jc w:val="center"/>
         </w:trPr>
@@ -3849,12 +3784,6 @@
         </w:tc>
       </w:tr>
       <w:tr>
-        <w:tblPrEx>
-          <w:tblCellMar>
-            <w:top w:w="0" w:type="dxa"/>
-            <w:bottom w:w="0" w:type="dxa"/>
-          </w:tblCellMar>
-        </w:tblPrEx>
         <w:trPr>
           <w:jc w:val="center"/>
         </w:trPr>
@@ -3880,7 +3809,6 @@
                 <w:kern w:val="0"/>
               </w:rPr>
             </w:pPr>
-            <w:proofErr w:type="spellStart"/>
             <w:r>
               <w:rPr>
                 <w:rFonts w:ascii="Times New Roman" w:hAnsi="Times New Roman" w:cs="Times New Roman"/>
@@ -3888,7 +3816,6 @@
               </w:rPr>
               <w:t>cpia_avg_rating</w:t>
             </w:r>
-            <w:proofErr w:type="spellEnd"/>
           </w:p>
         </w:tc>
         <w:tc>
@@ -3982,12 +3909,6 @@
         </w:tc>
       </w:tr>
       <w:tr>
-        <w:tblPrEx>
-          <w:tblCellMar>
-            <w:top w:w="0" w:type="dxa"/>
-            <w:bottom w:w="0" w:type="dxa"/>
-          </w:tblCellMar>
-        </w:tblPrEx>
         <w:trPr>
           <w:jc w:val="center"/>
         </w:trPr>
@@ -4106,12 +4027,6 @@
         </w:tc>
       </w:tr>
       <w:tr>
-        <w:tblPrEx>
-          <w:tblCellMar>
-            <w:top w:w="0" w:type="dxa"/>
-            <w:bottom w:w="0" w:type="dxa"/>
-          </w:tblCellMar>
-        </w:tblPrEx>
         <w:trPr>
           <w:jc w:val="center"/>
         </w:trPr>
@@ -4137,7 +4052,6 @@
                 <w:kern w:val="0"/>
               </w:rPr>
             </w:pPr>
-            <w:proofErr w:type="spellStart"/>
             <w:r>
               <w:rPr>
                 <w:rFonts w:ascii="Times New Roman" w:hAnsi="Times New Roman" w:cs="Times New Roman"/>
@@ -4145,7 +4059,6 @@
               </w:rPr>
               <w:t>dmstc_crdt_financial</w:t>
             </w:r>
-            <w:proofErr w:type="spellEnd"/>
           </w:p>
         </w:tc>
         <w:tc>
@@ -4239,12 +4152,6 @@
         </w:tc>
       </w:tr>
       <w:tr>
-        <w:tblPrEx>
-          <w:tblCellMar>
-            <w:top w:w="0" w:type="dxa"/>
-            <w:bottom w:w="0" w:type="dxa"/>
-          </w:tblCellMar>
-        </w:tblPrEx>
         <w:trPr>
           <w:jc w:val="center"/>
         </w:trPr>
@@ -4363,12 +4270,6 @@
         </w:tc>
       </w:tr>
       <w:tr>
-        <w:tblPrEx>
-          <w:tblCellMar>
-            <w:top w:w="0" w:type="dxa"/>
-            <w:bottom w:w="0" w:type="dxa"/>
-          </w:tblCellMar>
-        </w:tblPrEx>
         <w:trPr>
           <w:jc w:val="center"/>
         </w:trPr>
@@ -4394,7 +4295,6 @@
                 <w:kern w:val="0"/>
               </w:rPr>
             </w:pPr>
-            <w:proofErr w:type="spellStart"/>
             <w:r>
               <w:rPr>
                 <w:rFonts w:ascii="Times New Roman" w:hAnsi="Times New Roman" w:cs="Times New Roman"/>
@@ -4418,7 +4318,6 @@
               </w:rPr>
               <w:t>_volume</w:t>
             </w:r>
-            <w:proofErr w:type="spellEnd"/>
           </w:p>
         </w:tc>
         <w:tc>
@@ -4512,12 +4411,6 @@
         </w:tc>
       </w:tr>
       <w:tr>
-        <w:tblPrEx>
-          <w:tblCellMar>
-            <w:top w:w="0" w:type="dxa"/>
-            <w:bottom w:w="0" w:type="dxa"/>
-          </w:tblCellMar>
-        </w:tblPrEx>
         <w:trPr>
           <w:jc w:val="center"/>
         </w:trPr>
@@ -4636,12 +4529,6 @@
         </w:tc>
       </w:tr>
       <w:tr>
-        <w:tblPrEx>
-          <w:tblCellMar>
-            <w:top w:w="0" w:type="dxa"/>
-            <w:bottom w:w="0" w:type="dxa"/>
-          </w:tblCellMar>
-        </w:tblPrEx>
         <w:trPr>
           <w:jc w:val="center"/>
         </w:trPr>
@@ -4774,12 +4661,6 @@
         </w:tc>
       </w:tr>
       <w:tr>
-        <w:tblPrEx>
-          <w:tblCellMar>
-            <w:top w:w="0" w:type="dxa"/>
-            <w:bottom w:w="0" w:type="dxa"/>
-          </w:tblCellMar>
-        </w:tblPrEx>
         <w:trPr>
           <w:jc w:val="center"/>
         </w:trPr>
@@ -4905,12 +4786,6 @@
         </w:tc>
       </w:tr>
       <w:tr>
-        <w:tblPrEx>
-          <w:tblCellMar>
-            <w:top w:w="0" w:type="dxa"/>
-            <w:bottom w:w="0" w:type="dxa"/>
-          </w:tblCellMar>
-        </w:tblPrEx>
         <w:trPr>
           <w:jc w:val="center"/>
         </w:trPr>
@@ -5015,12 +4890,6 @@
         </w:tc>
       </w:tr>
       <w:tr>
-        <w:tblPrEx>
-          <w:tblCellMar>
-            <w:top w:w="0" w:type="dxa"/>
-            <w:bottom w:w="0" w:type="dxa"/>
-          </w:tblCellMar>
-        </w:tblPrEx>
         <w:trPr>
           <w:jc w:val="center"/>
         </w:trPr>
@@ -5153,12 +5022,6 @@
         </w:tc>
       </w:tr>
       <w:tr>
-        <w:tblPrEx>
-          <w:tblCellMar>
-            <w:top w:w="0" w:type="dxa"/>
-            <w:bottom w:w="0" w:type="dxa"/>
-          </w:tblCellMar>
-        </w:tblPrEx>
         <w:trPr>
           <w:jc w:val="center"/>
         </w:trPr>
@@ -5304,10 +5167,6 @@
           <w:tblBorders>
             <w:bottom w:val="single" w:sz="6" w:space="0" w:color="auto"/>
           </w:tblBorders>
-          <w:tblCellMar>
-            <w:top w:w="0" w:type="dxa"/>
-            <w:bottom w:w="0" w:type="dxa"/>
-          </w:tblCellMar>
         </w:tblPrEx>
         <w:trPr>
           <w:jc w:val="center"/>
@@ -5498,7 +5357,9 @@
     </w:p>
     <w:p>
       <w:pPr>
+        <w:spacing w:line="480" w:lineRule="auto"/>
         <w:ind w:firstLine="720"/>
+        <w:jc w:val="both"/>
       </w:pPr>
       <w:r>
         <w:t>The coefficient on the CPIA macroeconomic management rating is −4.644 (p&lt;0.01), indicating that higher macroeconomic policy quality is significantly associated with lower inflation rates. Export volume alone has a small, marginally significant negative effect on inflation (p=0.055). Critically, the interaction term between CPIA macro rating and export volume is positive and marginally significant (p=0.055), implying that the deflationary impact of macroeconomic policy quality weakens as export volume increases.</w:t>
@@ -5506,7 +5367,9 @@
     </w:p>
     <w:p>
       <w:pPr>
+        <w:spacing w:line="480" w:lineRule="auto"/>
         <w:ind w:firstLine="720"/>
+        <w:jc w:val="both"/>
       </w:pPr>
       <w:r>
         <w:t xml:space="preserve">Domestic credit to the private sector </w:t>
@@ -5530,22 +5393,21 @@
     </w:p>
     <w:p>
       <w:pPr>
+        <w:spacing w:line="480" w:lineRule="auto"/>
         <w:ind w:firstLine="720"/>
-      </w:pPr>
-      <w:r>
-        <w:t xml:space="preserve">Overall, better macroeconomic management is strongly associated with lower inflation outcomes. However, this effect is moderated by export volumes: countries with larger export sectors experience a weaker inflation-reducing benefit from improvements in macroeconomic policy. Financial development, as proxied by domestic credit to the private sector, also plays a significant role in containing inflation. While broader institutional quality, captured by the CPIA Average Rating, must be </w:t>
-      </w:r>
-      <w:r>
-        <w:t>controlled</w:t>
-      </w:r>
-      <w:r>
-        <w:t xml:space="preserve"> to accurately estimate the impact of macroeconomic management, its direct relationship with inflation is positive and marginally significant. This suggests that improvements in areas such as social inclusion and property rights, while important for overall governance, do not necessarily translate into lower inflation rates in the short to medium </w:t>
+        <w:jc w:val="both"/>
+      </w:pPr>
+      <w:r>
+        <w:t xml:space="preserve">Overall, better macroeconomic management is strongly associated with lower inflation outcomes. However, this effect is moderated by export volumes: countries with larger export sectors experience a weaker inflation-reducing benefit from improvements in macroeconomic policy. Financial development, as proxied by domestic credit to the private sector, also plays a significant role in containing inflation. While broader institutional quality, captured by the CPIA Average Rating, must be controlled to accurately estimate the impact of macroeconomic management, its direct relationship with inflation is positive and marginally significant. This suggests that improvements in areas such as social inclusion and property rights, while important for overall governance, do not necessarily translate into lower inflation rates in the short to medium </w:t>
       </w:r>
       <w:r>
         <w:t>term.</w:t>
       </w:r>
     </w:p>
     <w:p>
+      <w:pPr>
+        <w:jc w:val="center"/>
+      </w:pPr>
       <w:r>
         <w:rPr>
           <w:b/>
@@ -5563,7 +5425,9 @@
     </w:p>
     <w:p>
       <w:pPr>
+        <w:spacing w:line="480" w:lineRule="auto"/>
         <w:ind w:firstLine="720"/>
+        <w:jc w:val="both"/>
       </w:pPr>
       <w:r>
         <w:t>While the models explain some of the variation in inflation outcomes (Adjusted R-squared approximately 5%), a substantial portion remains unexplained. Future research could enhance explanatory power by incorporating additional variables such as fiscal deficits, political stability indices, and more granular trade shock measures.</w:t>
@@ -5571,9 +5435,12 @@
     </w:p>
     <w:p>
       <w:pPr>
+        <w:spacing w:line="480" w:lineRule="auto"/>
         <w:ind w:firstLine="720"/>
-      </w:pPr>
-      <w:r>
+        <w:jc w:val="both"/>
+      </w:pPr>
+      <w:r>
+        <w:lastRenderedPageBreak/>
         <w:t xml:space="preserve">The dataset's temporal limitation (ending in 2016) suggests the need for updates, particularly given major economic disruptions in the late 2010s and early 2020s. Moreover, while CPIA Average Rating serves as a useful control, it introduces some multicollinearity with the macroeconomic management index. Future studies could refine these </w:t>
       </w:r>
       <w:r>
@@ -5585,7 +5452,9 @@
     </w:p>
     <w:p>
       <w:pPr>
+        <w:spacing w:line="480" w:lineRule="auto"/>
         <w:ind w:firstLine="720"/>
+        <w:jc w:val="both"/>
       </w:pPr>
       <w:r>
         <w:t>Finally, moving beyond fixed effects to dynamic panel models or single-country time series analyses could provide richer insights into the causal mechanisms at play</w:t>
@@ -5611,7 +5480,9 @@
     </w:p>
     <w:p>
       <w:pPr>
+        <w:spacing w:line="480" w:lineRule="auto"/>
         <w:ind w:firstLine="720"/>
+        <w:jc w:val="both"/>
       </w:pPr>
       <w:r>
         <w:t>This study finds that the quality of a nation's macroeconomic policy exerts a statistically significant influence on inflation outcomes, but that this relationship is conditioned by export activity levels. Specifically, while improvements in macroeconomic management ratings are associated with reductions in inflation, the marginal benefit of these improvements diminishes as export volumes increase.</w:t>
@@ -5619,18 +5490,22 @@
     </w:p>
     <w:p>
       <w:pPr>
+        <w:spacing w:line="480" w:lineRule="auto"/>
         <w:ind w:firstLine="720"/>
+        <w:jc w:val="both"/>
+      </w:pPr>
+      <w:r>
+        <w:t>Importantly, macroeconomic policy quality only emerges as a significant predictor of inflation once broader structural factors—including domestic financial sector stability, dedication to debt management, social inclusion, and property rights protections—are controlled for. Policymakers seeking to reduce inflation cannot rely solely on macroeconomic fine-tuning; rather, effective policy must be complemented by robust financial sectors, equitable social policies, and strong institutional frameworks.</w:t>
+      </w:r>
+    </w:p>
+    <w:p>
+      <w:pPr>
+        <w:spacing w:line="480" w:lineRule="auto"/>
+        <w:ind w:firstLine="720"/>
+        <w:jc w:val="both"/>
       </w:pPr>
       <w:r>
         <w:lastRenderedPageBreak/>
-        <w:t>Importantly, macroeconomic policy quality only emerges as a significant predictor of inflation once broader structural factors—including domestic financial sector stability, dedication to debt management, social inclusion, and property rights protections—are controlled for. Policymakers seeking to reduce inflation cannot rely solely on macroeconomic fine-tuning; rather, effective policy must be complemented by robust financial sectors, equitable social policies, and strong institutional frameworks.</w:t>
-      </w:r>
-    </w:p>
-    <w:p>
-      <w:pPr>
-        <w:ind w:firstLine="720"/>
-      </w:pPr>
-      <w:r>
         <w:t>Moreover, these findings suggest that informed voter assessments of a government's ability to manage inflation should extend beyond simple evaluations of macroeconomic policies. Given the interconnectedness of inflation outcomes with broader social and institutional structures — including debt management strategies and commitments to social inclusion — citizens and policymakers alike should consider the quality of governance in these areas when forming expectations about future inflation dynamics. A strong macroeconomic framework, while necessary, is insufficient on its own without accompanying institutional strength and inclusive development policies.</w:t>
       </w:r>
     </w:p>
@@ -5663,6 +5538,9 @@
       </w:r>
     </w:p>
     <w:p>
+      <w:pPr>
+        <w:ind w:left="720" w:hanging="720"/>
+      </w:pPr>
       <w:r>
         <w:t xml:space="preserve">Choi, W. G., &amp; Cook, D. (2018). Liability dollarization and the bank balance sheet channel. </w:t>
       </w:r>
@@ -5678,21 +5556,11 @@
       </w:r>
     </w:p>
     <w:p>
-      <w:proofErr w:type="spellStart"/>
-      <w:r>
-        <w:t>Coibion</w:t>
-      </w:r>
-      <w:proofErr w:type="spellEnd"/>
-      <w:r>
-        <w:t xml:space="preserve">, O., &amp; </w:t>
-      </w:r>
-      <w:proofErr w:type="spellStart"/>
-      <w:r>
-        <w:t>Gorodnichenko</w:t>
-      </w:r>
-      <w:proofErr w:type="spellEnd"/>
-      <w:r>
-        <w:t xml:space="preserve">, Y. (2015). Inflation expectations in rising and falling economies. </w:t>
+      <w:pPr>
+        <w:ind w:left="720" w:hanging="720"/>
+      </w:pPr>
+      <w:r>
+        <w:t xml:space="preserve">Coibion, O., &amp; Gorodnichenko, Y. (2015). Inflation expectations in rising and falling economies. </w:t>
       </w:r>
       <w:r>
         <w:rPr>
@@ -5706,6 +5574,9 @@
       </w:r>
     </w:p>
     <w:p>
+      <w:pPr>
+        <w:ind w:left="720" w:hanging="720"/>
+      </w:pPr>
       <w:r>
         <w:t xml:space="preserve">Comin, D., &amp; Johnson, S. (2020). Trade and the disinflation of the 1990s. </w:t>
       </w:r>
@@ -5721,6 +5592,9 @@
       </w:r>
     </w:p>
     <w:p>
+      <w:pPr>
+        <w:ind w:left="720" w:hanging="720"/>
+      </w:pPr>
       <w:r>
         <w:t xml:space="preserve">Friedman, M. (1968). The Role of Monetary Policy. </w:t>
       </w:r>
@@ -5736,16 +5610,11 @@
       </w:r>
     </w:p>
     <w:p>
-      <w:r>
-        <w:t xml:space="preserve">Ha, J., Kose, M. A., &amp; </w:t>
-      </w:r>
-      <w:proofErr w:type="spellStart"/>
-      <w:r>
-        <w:t>Ohnsorge</w:t>
-      </w:r>
-      <w:proofErr w:type="spellEnd"/>
-      <w:r>
-        <w:t xml:space="preserve">, F. (2019). </w:t>
+      <w:pPr>
+        <w:ind w:left="720" w:hanging="720"/>
+      </w:pPr>
+      <w:r>
+        <w:t xml:space="preserve">Ha, J., Kose, M. A., &amp; Ohnsorge, F. (2019). </w:t>
       </w:r>
       <w:r>
         <w:rPr>
@@ -5759,6 +5628,9 @@
       </w:r>
     </w:p>
     <w:p>
+      <w:pPr>
+        <w:ind w:left="720" w:hanging="720"/>
+      </w:pPr>
       <w:r>
         <w:t xml:space="preserve">Mishkin, F. S. (2007). Housing and the monetary transmission mechanism. </w:t>
       </w:r>
@@ -5774,6 +5646,9 @@
       </w:r>
     </w:p>
     <w:p>
+      <w:pPr>
+        <w:ind w:left="720" w:hanging="720"/>
+      </w:pPr>
       <w:r>
         <w:t xml:space="preserve">Mujahid, N. (2021). Institutional quality and inflation volatility: Evidence from panel data. </w:t>
       </w:r>
@@ -5789,6 +5664,9 @@
       </w:r>
     </w:p>
     <w:p>
+      <w:pPr>
+        <w:ind w:left="720" w:hanging="720"/>
+      </w:pPr>
       <w:r>
         <w:t xml:space="preserve">Phillips, A. W. (1958). The Relationship between Unemployment and the Rate of Change of Money Wage Rates in the United Kingdom, 1861–1957. </w:t>
       </w:r>
@@ -5804,6 +5682,9 @@
       </w:r>
     </w:p>
     <w:p>
+      <w:pPr>
+        <w:ind w:left="720" w:hanging="720"/>
+      </w:pPr>
       <w:r>
         <w:t xml:space="preserve">Straub, S. (2011). Infrastructure and development: A critical appraisal of </w:t>
       </w:r>
@@ -5828,9 +5709,12 @@
     </w:p>
     <w:p/>
     <w:sectPr>
+      <w:headerReference w:type="default" r:id="rId11"/>
+      <w:headerReference w:type="first" r:id="rId12"/>
       <w:pgSz w:w="12240" w:h="15840"/>
       <w:pgMar w:top="1440" w:right="1440" w:bottom="1440" w:left="1440" w:header="720" w:footer="720" w:gutter="0"/>
       <w:cols w:space="720"/>
+      <w:titlePg/>
       <w:docGrid w:linePitch="360"/>
     </w:sectPr>
   </w:body>
@@ -5839,7 +5723,7 @@
 
 <file path=word/comments.xml><?xml version="1.0" encoding="utf-8"?>
 <w:comments xmlns:wpc="http://schemas.microsoft.com/office/word/2010/wordprocessingCanvas" xmlns:cx="http://schemas.microsoft.com/office/drawing/2014/chartex" xmlns:cx1="http://schemas.microsoft.com/office/drawing/2015/9/8/chartex" xmlns:cx2="http://schemas.microsoft.com/office/drawing/2015/10/21/chartex" xmlns:cx3="http://schemas.microsoft.com/office/drawing/2016/5/9/chartex" xmlns:cx4="http://schemas.microsoft.com/office/drawing/2016/5/10/chartex" xmlns:cx5="http://schemas.microsoft.com/office/drawing/2016/5/11/chartex" xmlns:cx6="http://schemas.microsoft.com/office/drawing/2016/5/12/chartex" xmlns:cx7="http://schemas.microsoft.com/office/drawing/2016/5/13/chartex" xmlns:cx8="http://schemas.microsoft.com/office/drawing/2016/5/14/chartex" xmlns:mc="http://schemas.openxmlformats.org/markup-compatibility/2006" xmlns:aink="http://schemas.microsoft.com/office/drawing/2016/ink" xmlns:am3d="http://schemas.microsoft.com/office/drawing/2017/model3d" xmlns:o="urn:schemas-microsoft-com:office:office" xmlns:oel="http://schemas.microsoft.com/office/2019/extlst" xmlns:r="http://schemas.openxmlformats.org/officeDocument/2006/relationships" xmlns:m="http://schemas.openxmlformats.org/officeDocument/2006/math" xmlns:v="urn:schemas-microsoft-com:vml" xmlns:wp14="http://schemas.microsoft.com/office/word/2010/wordprocessingDrawing" xmlns:wp="http://schemas.openxmlformats.org/drawingml/2006/wordprocessingDrawing" xmlns:w10="urn:schemas-microsoft-com:office:word" xmlns:w="http://schemas.openxmlformats.org/wordprocessingml/2006/main" xmlns:w14="http://schemas.microsoft.com/office/word/2010/wordml" xmlns:w15="http://schemas.microsoft.com/office/word/2012/wordml" xmlns:w16cex="http://schemas.microsoft.com/office/word/2018/wordml/cex" xmlns:w16cid="http://schemas.microsoft.com/office/word/2016/wordml/cid" xmlns:w16="http://schemas.microsoft.com/office/word/2018/wordml" xmlns:w16du="http://schemas.microsoft.com/office/word/2023/wordml/word16du" xmlns:w16sdtdh="http://schemas.microsoft.com/office/word/2020/wordml/sdtdatahash" xmlns:w16sdtfl="http://schemas.microsoft.com/office/word/2024/wordml/sdtformatlock" xmlns:w16se="http://schemas.microsoft.com/office/word/2015/wordml/symex" xmlns:wpg="http://schemas.microsoft.com/office/word/2010/wordprocessingGroup" xmlns:wpi="http://schemas.microsoft.com/office/word/2010/wordprocessingInk" xmlns:wne="http://schemas.microsoft.com/office/word/2006/wordml" xmlns:wps="http://schemas.microsoft.com/office/word/2010/wordprocessingShape" mc:Ignorable="w14 w15 w16se w16cid w16 w16cex w16sdtdh w16sdtfl w16du wp14">
-  <w:comment w:id="1" w:author="Joseph Russoniello" w:date="2025-04-27T16:12:00Z" w:initials="JR">
+  <w:comment w:id="0" w:author="Joseph Russoniello" w:date="2025-04-27T16:12:00Z" w:initials="JR">
     <w:p>
       <w:pPr>
         <w:pStyle w:val="CommentText"/>
@@ -5874,6 +5758,155 @@
 <w16cid:commentsIds xmlns:wpc="http://schemas.microsoft.com/office/word/2010/wordprocessingCanvas" xmlns:cx="http://schemas.microsoft.com/office/drawing/2014/chartex" xmlns:cx1="http://schemas.microsoft.com/office/drawing/2015/9/8/chartex" xmlns:cx2="http://schemas.microsoft.com/office/drawing/2015/10/21/chartex" xmlns:cx3="http://schemas.microsoft.com/office/drawing/2016/5/9/chartex" xmlns:cx4="http://schemas.microsoft.com/office/drawing/2016/5/10/chartex" xmlns:cx5="http://schemas.microsoft.com/office/drawing/2016/5/11/chartex" xmlns:cx6="http://schemas.microsoft.com/office/drawing/2016/5/12/chartex" xmlns:cx7="http://schemas.microsoft.com/office/drawing/2016/5/13/chartex" xmlns:cx8="http://schemas.microsoft.com/office/drawing/2016/5/14/chartex" xmlns:mc="http://schemas.openxmlformats.org/markup-compatibility/2006" xmlns:aink="http://schemas.microsoft.com/office/drawing/2016/ink" xmlns:am3d="http://schemas.microsoft.com/office/drawing/2017/model3d" xmlns:o="urn:schemas-microsoft-com:office:office" xmlns:oel="http://schemas.microsoft.com/office/2019/extlst" xmlns:r="http://schemas.openxmlformats.org/officeDocument/2006/relationships" xmlns:m="http://schemas.openxmlformats.org/officeDocument/2006/math" xmlns:v="urn:schemas-microsoft-com:vml" xmlns:wp14="http://schemas.microsoft.com/office/word/2010/wordprocessingDrawing" xmlns:wp="http://schemas.openxmlformats.org/drawingml/2006/wordprocessingDrawing" xmlns:w10="urn:schemas-microsoft-com:office:word" xmlns:w="http://schemas.openxmlformats.org/wordprocessingml/2006/main" xmlns:w14="http://schemas.microsoft.com/office/word/2010/wordml" xmlns:w15="http://schemas.microsoft.com/office/word/2012/wordml" xmlns:w16cex="http://schemas.microsoft.com/office/word/2018/wordml/cex" xmlns:w16cid="http://schemas.microsoft.com/office/word/2016/wordml/cid" xmlns:w16="http://schemas.microsoft.com/office/word/2018/wordml" xmlns:w16du="http://schemas.microsoft.com/office/word/2023/wordml/word16du" xmlns:w16sdtdh="http://schemas.microsoft.com/office/word/2020/wordml/sdtdatahash" xmlns:w16sdtfl="http://schemas.microsoft.com/office/word/2024/wordml/sdtformatlock" xmlns:w16se="http://schemas.microsoft.com/office/word/2015/wordml/symex" xmlns:wpg="http://schemas.microsoft.com/office/word/2010/wordprocessingGroup" xmlns:wpi="http://schemas.microsoft.com/office/word/2010/wordprocessingInk" xmlns:wne="http://schemas.microsoft.com/office/word/2006/wordml" xmlns:wps="http://schemas.microsoft.com/office/word/2010/wordprocessingShape" mc:Ignorable="w14 w15 w16se w16cid w16 w16cex w16sdtdh w16sdtfl w16du wp14">
   <w16cid:commentId w16cid:paraId="2CD54EDC" w16cid:durableId="2109F315"/>
 </w16cid:commentsIds>
+</file>
+
+<file path=word/endnotes.xml><?xml version="1.0" encoding="utf-8"?>
+<w:endnotes xmlns:wpc="http://schemas.microsoft.com/office/word/2010/wordprocessingCanvas" xmlns:cx="http://schemas.microsoft.com/office/drawing/2014/chartex" xmlns:cx1="http://schemas.microsoft.com/office/drawing/2015/9/8/chartex" xmlns:cx2="http://schemas.microsoft.com/office/drawing/2015/10/21/chartex" xmlns:cx3="http://schemas.microsoft.com/office/drawing/2016/5/9/chartex" xmlns:cx4="http://schemas.microsoft.com/office/drawing/2016/5/10/chartex" xmlns:cx5="http://schemas.microsoft.com/office/drawing/2016/5/11/chartex" xmlns:cx6="http://schemas.microsoft.com/office/drawing/2016/5/12/chartex" xmlns:cx7="http://schemas.microsoft.com/office/drawing/2016/5/13/chartex" xmlns:cx8="http://schemas.microsoft.com/office/drawing/2016/5/14/chartex" xmlns:mc="http://schemas.openxmlformats.org/markup-compatibility/2006" xmlns:aink="http://schemas.microsoft.com/office/drawing/2016/ink" xmlns:am3d="http://schemas.microsoft.com/office/drawing/2017/model3d" xmlns:o="urn:schemas-microsoft-com:office:office" xmlns:oel="http://schemas.microsoft.com/office/2019/extlst" xmlns:r="http://schemas.openxmlformats.org/officeDocument/2006/relationships" xmlns:m="http://schemas.openxmlformats.org/officeDocument/2006/math" xmlns:v="urn:schemas-microsoft-com:vml" xmlns:wp14="http://schemas.microsoft.com/office/word/2010/wordprocessingDrawing" xmlns:wp="http://schemas.openxmlformats.org/drawingml/2006/wordprocessingDrawing" xmlns:w10="urn:schemas-microsoft-com:office:word" xmlns:w="http://schemas.openxmlformats.org/wordprocessingml/2006/main" xmlns:w14="http://schemas.microsoft.com/office/word/2010/wordml" xmlns:w15="http://schemas.microsoft.com/office/word/2012/wordml" xmlns:w16cex="http://schemas.microsoft.com/office/word/2018/wordml/cex" xmlns:w16cid="http://schemas.microsoft.com/office/word/2016/wordml/cid" xmlns:w16="http://schemas.microsoft.com/office/word/2018/wordml" xmlns:w16du="http://schemas.microsoft.com/office/word/2023/wordml/word16du" xmlns:w16sdtdh="http://schemas.microsoft.com/office/word/2020/wordml/sdtdatahash" xmlns:w16sdtfl="http://schemas.microsoft.com/office/word/2024/wordml/sdtformatlock" xmlns:w16se="http://schemas.microsoft.com/office/word/2015/wordml/symex" xmlns:wpg="http://schemas.microsoft.com/office/word/2010/wordprocessingGroup" xmlns:wpi="http://schemas.microsoft.com/office/word/2010/wordprocessingInk" xmlns:wne="http://schemas.microsoft.com/office/word/2006/wordml" xmlns:wps="http://schemas.microsoft.com/office/word/2010/wordprocessingShape" mc:Ignorable="w14 w15 w16se w16cid w16 w16cex w16sdtdh w16sdtfl w16du wp14">
+  <w:endnote w:type="separator" w:id="-1">
+    <w:p>
+      <w:pPr>
+        <w:spacing w:after="0" w:line="240" w:lineRule="auto"/>
+      </w:pPr>
+      <w:r>
+        <w:separator/>
+      </w:r>
+    </w:p>
+  </w:endnote>
+  <w:endnote w:type="continuationSeparator" w:id="0">
+    <w:p>
+      <w:pPr>
+        <w:spacing w:after="0" w:line="240" w:lineRule="auto"/>
+      </w:pPr>
+      <w:r>
+        <w:continuationSeparator/>
+      </w:r>
+    </w:p>
+  </w:endnote>
+</w:endnotes>
+</file>
+
+<file path=word/footnotes.xml><?xml version="1.0" encoding="utf-8"?>
+<w:footnotes xmlns:wpc="http://schemas.microsoft.com/office/word/2010/wordprocessingCanvas" xmlns:cx="http://schemas.microsoft.com/office/drawing/2014/chartex" xmlns:cx1="http://schemas.microsoft.com/office/drawing/2015/9/8/chartex" xmlns:cx2="http://schemas.microsoft.com/office/drawing/2015/10/21/chartex" xmlns:cx3="http://schemas.microsoft.com/office/drawing/2016/5/9/chartex" xmlns:cx4="http://schemas.microsoft.com/office/drawing/2016/5/10/chartex" xmlns:cx5="http://schemas.microsoft.com/office/drawing/2016/5/11/chartex" xmlns:cx6="http://schemas.microsoft.com/office/drawing/2016/5/12/chartex" xmlns:cx7="http://schemas.microsoft.com/office/drawing/2016/5/13/chartex" xmlns:cx8="http://schemas.microsoft.com/office/drawing/2016/5/14/chartex" xmlns:mc="http://schemas.openxmlformats.org/markup-compatibility/2006" xmlns:aink="http://schemas.microsoft.com/office/drawing/2016/ink" xmlns:am3d="http://schemas.microsoft.com/office/drawing/2017/model3d" xmlns:o="urn:schemas-microsoft-com:office:office" xmlns:oel="http://schemas.microsoft.com/office/2019/extlst" xmlns:r="http://schemas.openxmlformats.org/officeDocument/2006/relationships" xmlns:m="http://schemas.openxmlformats.org/officeDocument/2006/math" xmlns:v="urn:schemas-microsoft-com:vml" xmlns:wp14="http://schemas.microsoft.com/office/word/2010/wordprocessingDrawing" xmlns:wp="http://schemas.openxmlformats.org/drawingml/2006/wordprocessingDrawing" xmlns:w10="urn:schemas-microsoft-com:office:word" xmlns:w="http://schemas.openxmlformats.org/wordprocessingml/2006/main" xmlns:w14="http://schemas.microsoft.com/office/word/2010/wordml" xmlns:w15="http://schemas.microsoft.com/office/word/2012/wordml" xmlns:w16cex="http://schemas.microsoft.com/office/word/2018/wordml/cex" xmlns:w16cid="http://schemas.microsoft.com/office/word/2016/wordml/cid" xmlns:w16="http://schemas.microsoft.com/office/word/2018/wordml" xmlns:w16du="http://schemas.microsoft.com/office/word/2023/wordml/word16du" xmlns:w16sdtdh="http://schemas.microsoft.com/office/word/2020/wordml/sdtdatahash" xmlns:w16sdtfl="http://schemas.microsoft.com/office/word/2024/wordml/sdtformatlock" xmlns:w16se="http://schemas.microsoft.com/office/word/2015/wordml/symex" xmlns:wpg="http://schemas.microsoft.com/office/word/2010/wordprocessingGroup" xmlns:wpi="http://schemas.microsoft.com/office/word/2010/wordprocessingInk" xmlns:wne="http://schemas.microsoft.com/office/word/2006/wordml" xmlns:wps="http://schemas.microsoft.com/office/word/2010/wordprocessingShape" mc:Ignorable="w14 w15 w16se w16cid w16 w16cex w16sdtdh w16sdtfl w16du wp14">
+  <w:footnote w:type="separator" w:id="-1">
+    <w:p>
+      <w:pPr>
+        <w:spacing w:after="0" w:line="240" w:lineRule="auto"/>
+      </w:pPr>
+      <w:r>
+        <w:separator/>
+      </w:r>
+    </w:p>
+  </w:footnote>
+  <w:footnote w:type="continuationSeparator" w:id="0">
+    <w:p>
+      <w:pPr>
+        <w:spacing w:after="0" w:line="240" w:lineRule="auto"/>
+      </w:pPr>
+      <w:r>
+        <w:continuationSeparator/>
+      </w:r>
+    </w:p>
+  </w:footnote>
+</w:footnotes>
+</file>
+
+<file path=word/header1.xml><?xml version="1.0" encoding="utf-8"?>
+<w:hdr xmlns:wpc="http://schemas.microsoft.com/office/word/2010/wordprocessingCanvas" xmlns:cx="http://schemas.microsoft.com/office/drawing/2014/chartex" xmlns:cx1="http://schemas.microsoft.com/office/drawing/2015/9/8/chartex" xmlns:cx2="http://schemas.microsoft.com/office/drawing/2015/10/21/chartex" xmlns:cx3="http://schemas.microsoft.com/office/drawing/2016/5/9/chartex" xmlns:cx4="http://schemas.microsoft.com/office/drawing/2016/5/10/chartex" xmlns:cx5="http://schemas.microsoft.com/office/drawing/2016/5/11/chartex" xmlns:cx6="http://schemas.microsoft.com/office/drawing/2016/5/12/chartex" xmlns:cx7="http://schemas.microsoft.com/office/drawing/2016/5/13/chartex" xmlns:cx8="http://schemas.microsoft.com/office/drawing/2016/5/14/chartex" xmlns:mc="http://schemas.openxmlformats.org/markup-compatibility/2006" xmlns:aink="http://schemas.microsoft.com/office/drawing/2016/ink" xmlns:am3d="http://schemas.microsoft.com/office/drawing/2017/model3d" xmlns:o="urn:schemas-microsoft-com:office:office" xmlns:oel="http://schemas.microsoft.com/office/2019/extlst" xmlns:r="http://schemas.openxmlformats.org/officeDocument/2006/relationships" xmlns:m="http://schemas.openxmlformats.org/officeDocument/2006/math" xmlns:v="urn:schemas-microsoft-com:vml" xmlns:wp14="http://schemas.microsoft.com/office/word/2010/wordprocessingDrawing" xmlns:wp="http://schemas.openxmlformats.org/drawingml/2006/wordprocessingDrawing" xmlns:w10="urn:schemas-microsoft-com:office:word" xmlns:w="http://schemas.openxmlformats.org/wordprocessingml/2006/main" xmlns:w14="http://schemas.microsoft.com/office/word/2010/wordml" xmlns:w15="http://schemas.microsoft.com/office/word/2012/wordml" xmlns:w16cex="http://schemas.microsoft.com/office/word/2018/wordml/cex" xmlns:w16cid="http://schemas.microsoft.com/office/word/2016/wordml/cid" xmlns:w16="http://schemas.microsoft.com/office/word/2018/wordml" xmlns:w16du="http://schemas.microsoft.com/office/word/2023/wordml/word16du" xmlns:w16sdtdh="http://schemas.microsoft.com/office/word/2020/wordml/sdtdatahash" xmlns:w16sdtfl="http://schemas.microsoft.com/office/word/2024/wordml/sdtformatlock" xmlns:w16se="http://schemas.microsoft.com/office/word/2015/wordml/symex" xmlns:wpg="http://schemas.microsoft.com/office/word/2010/wordprocessingGroup" xmlns:wpi="http://schemas.microsoft.com/office/word/2010/wordprocessingInk" xmlns:wne="http://schemas.microsoft.com/office/word/2006/wordml" xmlns:wps="http://schemas.microsoft.com/office/word/2010/wordprocessingShape" mc:Ignorable="w14 w15 w16se w16cid w16 w16cex w16sdtdh w16sdtfl w16du wp14">
+  <w:sdt>
+    <w:sdtPr>
+      <w:rPr>
+        <w:color w:val="000000" w:themeColor="text1"/>
+      </w:rPr>
+      <w:id w:val="-1704862124"/>
+      <w:docPartObj>
+        <w:docPartGallery w:val="Page Numbers (Top of Page)"/>
+        <w:docPartUnique/>
+      </w:docPartObj>
+    </w:sdtPr>
+    <w:sdtEndPr>
+      <w:rPr>
+        <w:noProof/>
+      </w:rPr>
+    </w:sdtEndPr>
+    <w:sdtContent>
+      <w:p>
+        <w:pPr>
+          <w:pStyle w:val="Header"/>
+          <w:jc w:val="right"/>
+          <w:rPr>
+            <w:color w:val="000000" w:themeColor="text1"/>
+          </w:rPr>
+        </w:pPr>
+        <w:r>
+          <w:rPr>
+            <w:color w:val="000000" w:themeColor="text1"/>
+          </w:rPr>
+          <w:t xml:space="preserve">THE NEXUS OF MACROECONOMIC POLICY QUALITY ON INFLATION                                           </w:t>
+        </w:r>
+        <w:r>
+          <w:rPr>
+            <w:color w:val="000000" w:themeColor="text1"/>
+          </w:rPr>
+          <w:fldChar w:fldCharType="begin"/>
+        </w:r>
+        <w:r>
+          <w:rPr>
+            <w:color w:val="000000" w:themeColor="text1"/>
+          </w:rPr>
+          <w:instrText xml:space="preserve"> PAGE   \* MERGEFORMAT </w:instrText>
+        </w:r>
+        <w:r>
+          <w:rPr>
+            <w:color w:val="000000" w:themeColor="text1"/>
+          </w:rPr>
+          <w:fldChar w:fldCharType="separate"/>
+        </w:r>
+        <w:r>
+          <w:rPr>
+            <w:noProof/>
+            <w:color w:val="000000" w:themeColor="text1"/>
+          </w:rPr>
+          <w:t>2</w:t>
+        </w:r>
+        <w:r>
+          <w:rPr>
+            <w:noProof/>
+            <w:color w:val="000000" w:themeColor="text1"/>
+          </w:rPr>
+          <w:fldChar w:fldCharType="end"/>
+        </w:r>
+      </w:p>
+    </w:sdtContent>
+  </w:sdt>
+  <w:p>
+    <w:pPr>
+      <w:pStyle w:val="Header"/>
+      <w:rPr>
+        <w:color w:val="000000" w:themeColor="text1"/>
+      </w:rPr>
+    </w:pPr>
+  </w:p>
+</w:hdr>
+</file>
+
+<file path=word/header2.xml><?xml version="1.0" encoding="utf-8"?>
+<w:hdr xmlns:wpc="http://schemas.microsoft.com/office/word/2010/wordprocessingCanvas" xmlns:cx="http://schemas.microsoft.com/office/drawing/2014/chartex" xmlns:cx1="http://schemas.microsoft.com/office/drawing/2015/9/8/chartex" xmlns:cx2="http://schemas.microsoft.com/office/drawing/2015/10/21/chartex" xmlns:cx3="http://schemas.microsoft.com/office/drawing/2016/5/9/chartex" xmlns:cx4="http://schemas.microsoft.com/office/drawing/2016/5/10/chartex" xmlns:cx5="http://schemas.microsoft.com/office/drawing/2016/5/11/chartex" xmlns:cx6="http://schemas.microsoft.com/office/drawing/2016/5/12/chartex" xmlns:cx7="http://schemas.microsoft.com/office/drawing/2016/5/13/chartex" xmlns:cx8="http://schemas.microsoft.com/office/drawing/2016/5/14/chartex" xmlns:mc="http://schemas.openxmlformats.org/markup-compatibility/2006" xmlns:aink="http://schemas.microsoft.com/office/drawing/2016/ink" xmlns:am3d="http://schemas.microsoft.com/office/drawing/2017/model3d" xmlns:o="urn:schemas-microsoft-com:office:office" xmlns:oel="http://schemas.microsoft.com/office/2019/extlst" xmlns:r="http://schemas.openxmlformats.org/officeDocument/2006/relationships" xmlns:m="http://schemas.openxmlformats.org/officeDocument/2006/math" xmlns:v="urn:schemas-microsoft-com:vml" xmlns:wp14="http://schemas.microsoft.com/office/word/2010/wordprocessingDrawing" xmlns:wp="http://schemas.openxmlformats.org/drawingml/2006/wordprocessingDrawing" xmlns:w10="urn:schemas-microsoft-com:office:word" xmlns:w="http://schemas.openxmlformats.org/wordprocessingml/2006/main" xmlns:w14="http://schemas.microsoft.com/office/word/2010/wordml" xmlns:w15="http://schemas.microsoft.com/office/word/2012/wordml" xmlns:w16cex="http://schemas.microsoft.com/office/word/2018/wordml/cex" xmlns:w16cid="http://schemas.microsoft.com/office/word/2016/wordml/cid" xmlns:w16="http://schemas.microsoft.com/office/word/2018/wordml" xmlns:w16du="http://schemas.microsoft.com/office/word/2023/wordml/word16du" xmlns:w16sdtdh="http://schemas.microsoft.com/office/word/2020/wordml/sdtdatahash" xmlns:w16sdtfl="http://schemas.microsoft.com/office/word/2024/wordml/sdtformatlock" xmlns:w16se="http://schemas.microsoft.com/office/word/2015/wordml/symex" xmlns:wpg="http://schemas.microsoft.com/office/word/2010/wordprocessingGroup" xmlns:wpi="http://schemas.microsoft.com/office/word/2010/wordprocessingInk" xmlns:wne="http://schemas.microsoft.com/office/word/2006/wordml" xmlns:wps="http://schemas.microsoft.com/office/word/2010/wordprocessingShape" mc:Ignorable="w14 w15 w16se w16cid w16 w16cex w16sdtdh w16sdtfl w16du wp14">
+  <w:p>
+    <w:pPr>
+      <w:pStyle w:val="Header"/>
+    </w:pPr>
+    <w:r>
+      <w:t xml:space="preserve">   </w:t>
+    </w:r>
+    <w:r>
+      <w:tab/>
+    </w:r>
+    <w:r>
+      <w:tab/>
+      <w:t xml:space="preserve">     1</w:t>
+    </w:r>
+  </w:p>
+</w:hdr>
 </file>
 
 <file path=word/people.xml><?xml version="1.0" encoding="utf-8"?>
@@ -6487,6 +6520,7 @@
   <w:style w:type="character" w:default="1" w:styleId="DefaultParagraphFont">
     <w:name w:val="Default Paragraph Font"/>
     <w:uiPriority w:val="1"/>
+    <w:semiHidden/>
     <w:unhideWhenUsed/>
   </w:style>
   <w:style w:type="table" w:default="1" w:styleId="TableNormal">
@@ -6886,6 +6920,50 @@
       <w:szCs w:val="20"/>
     </w:rPr>
   </w:style>
+  <w:style w:type="paragraph" w:styleId="Header">
+    <w:name w:val="header"/>
+    <w:basedOn w:val="Normal"/>
+    <w:link w:val="HeaderChar"/>
+    <w:uiPriority w:val="99"/>
+    <w:unhideWhenUsed/>
+    <w:rsid w:val="005F4010"/>
+    <w:pPr>
+      <w:tabs>
+        <w:tab w:val="center" w:pos="4680"/>
+        <w:tab w:val="right" w:pos="9360"/>
+      </w:tabs>
+      <w:spacing w:after="0" w:line="240" w:lineRule="auto"/>
+    </w:pPr>
+  </w:style>
+  <w:style w:type="character" w:customStyle="1" w:styleId="HeaderChar">
+    <w:name w:val="Header Char"/>
+    <w:basedOn w:val="DefaultParagraphFont"/>
+    <w:link w:val="Header"/>
+    <w:uiPriority w:val="99"/>
+    <w:rsid w:val="005F4010"/>
+  </w:style>
+  <w:style w:type="paragraph" w:styleId="Footer">
+    <w:name w:val="footer"/>
+    <w:basedOn w:val="Normal"/>
+    <w:link w:val="FooterChar"/>
+    <w:uiPriority w:val="99"/>
+    <w:unhideWhenUsed/>
+    <w:rsid w:val="005F4010"/>
+    <w:pPr>
+      <w:tabs>
+        <w:tab w:val="center" w:pos="4680"/>
+        <w:tab w:val="right" w:pos="9360"/>
+      </w:tabs>
+      <w:spacing w:after="0" w:line="240" w:lineRule="auto"/>
+    </w:pPr>
+  </w:style>
+  <w:style w:type="character" w:customStyle="1" w:styleId="FooterChar">
+    <w:name w:val="Footer Char"/>
+    <w:basedOn w:val="DefaultParagraphFont"/>
+    <w:link w:val="Footer"/>
+    <w:uiPriority w:val="99"/>
+    <w:rsid w:val="005F4010"/>
+  </w:style>
 </w:styles>
 </file>
 
@@ -7202,4 +7280,16 @@
     </a:ext>
   </a:extLst>
 </a:theme>
+</file>
+
+<file path=customXml/item1.xml><?xml version="1.0" encoding="utf-8"?>
+<b:Sources xmlns:b="http://schemas.openxmlformats.org/officeDocument/2006/bibliography" xmlns="http://schemas.openxmlformats.org/officeDocument/2006/bibliography" SelectedStyle="\APASixthEditionOfficeOnline.xsl" StyleName="APA" Version="6"/>
+</file>
+
+<file path=customXml/itemProps1.xml><?xml version="1.0" encoding="utf-8"?>
+<ds:datastoreItem xmlns:ds="http://schemas.openxmlformats.org/officeDocument/2006/customXml" ds:itemID="{1948ECE9-4E70-4E92-8A16-8F5B83A288B5}">
+  <ds:schemaRefs>
+    <ds:schemaRef ds:uri="http://schemas.openxmlformats.org/officeDocument/2006/bibliography"/>
+  </ds:schemaRefs>
+</ds:datastoreItem>
 </file>
</xml_diff>

<commit_message>
Added Paper Word Doc
</commit_message>
<xml_diff>
--- a/The Nexus of Macroeconomic Policy Quality on Inflation.docx
+++ b/The Nexus of Macroeconomic Policy Quality on Inflation.docx
@@ -104,15 +104,34 @@
         <w:jc w:val="both"/>
       </w:pPr>
       <w:r>
-        <w:t xml:space="preserve">This paper investigates the relationship between the quality of a nation's macroeconomic policy, as measured by the World Bank's CPIA Macroeconomic Management Index, and its annual inflation rate. Using a panel dataset of 75 countries from 2005 to 2016, we estimate several fixed effects models to examine this relationship while </w:t>
-      </w:r>
-      <w:proofErr w:type="gramStart"/>
-      <w:r>
-        <w:t>controlling for</w:t>
-      </w:r>
-      <w:proofErr w:type="gramEnd"/>
-      <w:r>
-        <w:t xml:space="preserve"> credit conditions, export volumes, and broader measures of institutional and financial development. Results indicate that while higher macroeconomic policy ratings are associated with lower inflation rates, this relationship is moderated by a country's export volume. Furthermore, macroeconomic policy quality only achieves statistical significance when accounting for domestic financial sector credit growth and broader structural factors such as social equity, debt management, and property rights protections. These findings suggest that macroeconomic policy effectiveness is deeply intertwined with a nation's financial, social, and institutional development.</w:t>
+        <w:t xml:space="preserve">This paper investigates the relationship between the quality of a nation's macroeconomic policy, as measured by the World Bank's CPIA Macroeconomic Management Index, and its annual inflation rate. Using a panel dataset of 75 countries from 2005 to 2016, we estimate several fixed effects models to examine this relationship while controlling for credit conditions, export volumes, and broader measures of institutional and financial development. </w:t>
+      </w:r>
+      <w:r>
+        <w:t>Our r</w:t>
+      </w:r>
+      <w:r>
+        <w:t xml:space="preserve">esults indicate that while higher macroeconomic policy ratings are associated with lower inflation rates, this relationship is </w:t>
+      </w:r>
+      <w:r>
+        <w:t>dependent on the</w:t>
+      </w:r>
+      <w:r>
+        <w:t xml:space="preserve"> country's export volume. Furthermore, macroeconomic policy quality only achieves statistical significance</w:t>
+      </w:r>
+      <w:r>
+        <w:t xml:space="preserve"> after</w:t>
+      </w:r>
+      <w:r>
+        <w:t xml:space="preserve"> accounting for domestic financial sector credit growth and broader structural factors such as social equity, debt management, and property rights protections. </w:t>
+      </w:r>
+      <w:r>
+        <w:t xml:space="preserve">These </w:t>
+      </w:r>
+      <w:r>
+        <w:t xml:space="preserve">findings indicate that the effectiveness of successful macroeconomic policy is dependent on a nation’s dedication to broader </w:t>
+      </w:r>
+      <w:r>
+        <w:t>social and institutional development.</w:t>
       </w:r>
     </w:p>
     <w:p>
@@ -157,7 +176,52 @@
         <w:jc w:val="both"/>
       </w:pPr>
       <w:r>
-        <w:t>The global economic landscape has recently been shaped by a resurgence of inflation, reaching levels not seen in several decades across many developed nations within the Organization for Economic Co-operation and Development (OECD). This inflationary surge has escalated living costs, disproportionately burdening lower-income populations. Inflation's impact transcends economics, fueling civil unrest and political instability, with significant consequences for national governance. These dynamics necessitate a nuanced understanding of the underlying drivers of inflation, especially the role of macroeconomic management.</w:t>
+        <w:t xml:space="preserve">In the lead-up to the 2024 U.S. presidential election, inflation emerged as a paramount concern among voters. A Pew Research Center survey conducted in May 2024 found that 62% of Americans considered inflation a </w:t>
+      </w:r>
+      <w:r>
+        <w:t>“</w:t>
+      </w:r>
+      <w:r>
+        <w:t>very big</w:t>
+      </w:r>
+      <w:r>
+        <w:t xml:space="preserve">” </w:t>
+      </w:r>
+      <w:r>
+        <w:t>problem for the country</w:t>
+      </w:r>
+      <w:r>
+        <w:t xml:space="preserve"> (Pew Research, 2024)</w:t>
+      </w:r>
+      <w:r>
+        <w:t>.</w:t>
+      </w:r>
+      <w:r>
+        <w:t xml:space="preserve"> </w:t>
+      </w:r>
+      <w:r>
+        <w:t xml:space="preserve">This </w:t>
+      </w:r>
+      <w:r>
+        <w:t>study</w:t>
+      </w:r>
+      <w:r>
+        <w:t xml:space="preserve"> investigates the role of macroeconomic management quality in shaping inflation outcomes, focusing on whether stronger</w:t>
+      </w:r>
+      <w:r>
+        <w:t xml:space="preserve"> macroeconomic policy</w:t>
+      </w:r>
+      <w:r>
+        <w:t xml:space="preserve">, as measured by the World Bank's CPIA Macroeconomic Management Index, reliably </w:t>
+      </w:r>
+      <w:r>
+        <w:t>suppresses</w:t>
+      </w:r>
+      <w:r>
+        <w:t xml:space="preserve"> inflation. In contrast to prior work that often links inflation outcomes to broader governance or monetary policy stances, we explicitly test whether the effectiveness of macroeconomic quality is contingent on external factors such as trade exposure.</w:t>
+      </w:r>
+      <w:r>
+        <w:t xml:space="preserve"> </w:t>
       </w:r>
     </w:p>
     <w:p>
@@ -167,35 +231,52 @@
         <w:jc w:val="both"/>
       </w:pPr>
       <w:r>
-        <w:t xml:space="preserve">Political outcomes are increasingly sensitive to inflationary trends. In countries like the United States, inflation has emerged as a primary concern for voters, influencing electoral outcomes and reshaping policy debates. Voter dissatisfaction linked to sustained inflation, even as rates stabilize, underscores the profound political </w:t>
-      </w:r>
-      <w:r>
-        <w:t xml:space="preserve">and </w:t>
-      </w:r>
-      <w:r>
-        <w:t>economic implications of price instability.</w:t>
-      </w:r>
-    </w:p>
-    <w:p>
-      <w:pPr>
-        <w:spacing w:line="480" w:lineRule="auto"/>
-        <w:ind w:firstLine="720"/>
-        <w:jc w:val="both"/>
-      </w:pPr>
-      <w:r>
-        <w:t>Given inflation's pivotal role in economic and political arenas, this paper examines whether a country's quality of macroeconomic management</w:t>
-      </w:r>
-      <w:r>
-        <w:t xml:space="preserve">, </w:t>
-      </w:r>
-      <w:r>
-        <w:t>as captured by the World Bank's CPIA Macroeconomic Management Index</w:t>
-      </w:r>
-      <w:r>
-        <w:t xml:space="preserve">, </w:t>
-      </w:r>
-      <w:r>
-        <w:t>meaningfully affects inflation outcomes. Preliminary evidence, depicted in Figure 1, suggests a slight negative correlation between policy quality and inflation rates, motivating a deeper econometric investigation.</w:t>
+        <w:t>Though</w:t>
+      </w:r>
+      <w:r>
+        <w:t xml:space="preserve"> stronger macroeconomic management is traditionally expected to stabilize inflation, the substantial spread in inflation outcomes across varying policy quality levels — visualized in Figure </w:t>
+      </w:r>
+      <w:r>
+        <w:t xml:space="preserve">1 </w:t>
+      </w:r>
+      <w:r>
+        <w:t>— indicates that additional factors likely shape inflation dynamics</w:t>
+      </w:r>
+      <w:r>
+        <w:t>, motivating the specific regression techniques used in this report</w:t>
+      </w:r>
+      <w:r>
+        <w:t>.</w:t>
+      </w:r>
+      <w:r>
+        <w:t xml:space="preserve"> T</w:t>
+      </w:r>
+      <w:r>
+        <w:t>his paper examines whether a country's quality of macroeconomic management</w:t>
+      </w:r>
+      <w:r>
+        <w:t xml:space="preserve"> </w:t>
+      </w:r>
+      <w:r>
+        <w:t xml:space="preserve">affects </w:t>
+      </w:r>
+      <w:r>
+        <w:t xml:space="preserve">consumer </w:t>
+      </w:r>
+      <w:r>
+        <w:t xml:space="preserve">inflation outcomes. </w:t>
+      </w:r>
+      <w:r>
+        <w:t xml:space="preserve">Preliminary evidence (Figure </w:t>
+      </w:r>
+      <w:r>
+        <w:t>2</w:t>
+      </w:r>
+      <w:r>
+        <w:t>) reveals a modest negative correlation between macroeconomic quality and inflation</w:t>
+      </w:r>
+      <w:r>
+        <w:t>, aligning with the public perception that better macro policy leads to lower inflation for consumers</w:t>
       </w:r>
     </w:p>
     <w:p>
@@ -217,17 +298,29 @@
         <w:jc w:val="both"/>
       </w:pPr>
       <w:r>
-        <w:t xml:space="preserve">Economic theory and empirical research identify several pathways through which macroeconomic quality shapes inflation. The Phillips curve posits a relationship between </w:t>
+        <w:t xml:space="preserve">There is a major gap in existing research on the isolated effect of macroeconomic management </w:t>
+      </w:r>
+      <w:r>
+        <w:t>on consumer price inflation. Despite this, e</w:t>
+      </w:r>
+      <w:r>
+        <w:t xml:space="preserve">conomic theory and </w:t>
+      </w:r>
+      <w:r>
+        <w:t xml:space="preserve">existing </w:t>
       </w:r>
       <w:r>
         <w:lastRenderedPageBreak/>
-        <w:t xml:space="preserve">output and inflation, with faster GDP growth or lower unemployment leading to upward price pressures (Phillips, 1958; Friedman, 1968). Empirical findings (Coibion &amp; Gorodnichenko, 2015) confirm that demand-side pressures intensify inflation, </w:t>
-      </w:r>
-      <w:r>
-        <w:t xml:space="preserve">potentially </w:t>
-      </w:r>
-      <w:r>
-        <w:t>necessitating GDP controls.</w:t>
+        <w:t>empirical research identify several pathways through which macroeconomic quality shapes inflation</w:t>
+      </w:r>
+      <w:r>
+        <w:t xml:space="preserve">, </w:t>
+      </w:r>
+      <w:r>
+        <w:t>which this study will consider as possible confounding variables</w:t>
+      </w:r>
+      <w:r>
+        <w:t>.</w:t>
       </w:r>
     </w:p>
     <w:p>
@@ -237,7 +330,37 @@
         <w:jc w:val="both"/>
       </w:pPr>
       <w:r>
-        <w:t>Income levels, proxied by GDP per capita, also modulate inflation dynamics. Developed economies tend to exhibit stable, low inflation rates, whereas developing nations often experience greater volatility (Ha, Kose, &amp; Ohnsorge, 2019). Credit growth similarly plays a vital role; rapid financial expansion can fuel demand and thus inflation (Choi &amp; Cook, 2018).</w:t>
+        <w:t>Taken from classical economics, t</w:t>
+      </w:r>
+      <w:r>
+        <w:t>he Phillips curve</w:t>
+      </w:r>
+      <w:r>
+        <w:t xml:space="preserve"> demonstrates the</w:t>
+      </w:r>
+      <w:r>
+        <w:t xml:space="preserve"> relationship between </w:t>
+      </w:r>
+      <w:r>
+        <w:t xml:space="preserve">economic </w:t>
+      </w:r>
+      <w:r>
+        <w:t xml:space="preserve">output and inflation, with faster GDP growth or lower unemployment leading to upward price pressures (Phillips, 1958; Friedman, 1968). </w:t>
+      </w:r>
+      <w:r>
+        <w:t>Modern e</w:t>
+      </w:r>
+      <w:r>
+        <w:t xml:space="preserve">mpirical findings (Coibion &amp; Gorodnichenko, 2015) confirm that demand-side pressures intensify inflation, </w:t>
+      </w:r>
+      <w:r>
+        <w:t xml:space="preserve">potentially </w:t>
+      </w:r>
+      <w:r>
+        <w:t>necessitating GDP controls.</w:t>
+      </w:r>
+      <w:r>
+        <w:t xml:space="preserve"> </w:t>
       </w:r>
     </w:p>
     <w:p>
@@ -247,16 +370,34 @@
         <w:jc w:val="both"/>
       </w:pPr>
       <w:r>
-        <w:t>Lastly, e</w:t>
-      </w:r>
-      <w:r>
-        <w:t xml:space="preserve">xternal trade shocks matter significantly. Export booms or trade price volatility affect domestic inflation via terms-of-trade mechanisms (Comin &amp; Johnson, 2020). Additionally, financial sector quality and governance structures influence monetary policy effectiveness. Strong banking systems and regulatory frameworks </w:t>
+        <w:t>Income levels, proxied by GDP per capita, also modulate inflation dynamics. Developed economies tend to exhibit stable, low inflation rates, whereas developing nations often experience greater volatility (Ha, Kose, &amp; Ohnsorge, 2019). Credit growth similarly plays a vital role; rapid financial expansion can fuel demand and thus inflation (Choi &amp; Cook, 2018).</w:t>
+      </w:r>
+      <w:r>
+        <w:t xml:space="preserve"> Prior research has also found that e</w:t>
+      </w:r>
+      <w:r>
+        <w:t>xport booms or trade price volatility affect domestic inflation via terms-of-trade mechanisms (Comin &amp; Johnson, 2020)</w:t>
+      </w:r>
+      <w:r>
+        <w:t xml:space="preserve">. </w:t>
+      </w:r>
+      <w:r>
+        <w:t xml:space="preserve">Strong banking systems and regulatory frameworks </w:t>
       </w:r>
       <w:r>
         <w:t xml:space="preserve">help </w:t>
       </w:r>
       <w:r>
         <w:t>stabilize inflation (Mishkin, 2007), whereas corruption and weak institutions exacerbate volatility (Mujahid, 2021). Infrastructure deficiencies, by creating supply bottlenecks, can further destabilize prices (Straub, 2011).</w:t>
+      </w:r>
+      <w:r>
+        <w:t xml:space="preserve"> </w:t>
+      </w:r>
+      <w:r>
+        <w:t xml:space="preserve"> </w:t>
+      </w:r>
+      <w:r>
+        <w:t>Together, these factors demonstrate that inflation outcomes are shaped by a complex interplay of economic development, financial conditions, external shocks, and institutional quality. Accordingly, any empirical analysis seeking to isolate the effect of macroeconomic management on inflation must carefully control for these confounding influences.</w:t>
       </w:r>
     </w:p>
     <w:p>
@@ -266,6 +407,7 @@
         <w:jc w:val="both"/>
       </w:pPr>
       <w:r>
+        <w:lastRenderedPageBreak/>
         <w:t xml:space="preserve">Thus, </w:t>
       </w:r>
       <w:r>
@@ -281,15 +423,7 @@
         <w:t>GDP growth, income levels, credit conditions, trade shocks, financial sector depth, governance quality, and infrastructure is critical to isolating the impact of macroeconomic management on inflation.</w:t>
       </w:r>
       <w:r>
-        <w:t xml:space="preserve"> This study </w:t>
-      </w:r>
-      <w:proofErr w:type="gramStart"/>
-      <w:r>
-        <w:t>controls for</w:t>
-      </w:r>
-      <w:proofErr w:type="gramEnd"/>
-      <w:r>
-        <w:t xml:space="preserve"> each of these </w:t>
+        <w:t xml:space="preserve"> This study controls for each of these </w:t>
       </w:r>
       <w:r>
         <w:t>sources</w:t>
@@ -307,7 +441,6 @@
           <w:b/>
           <w:bCs/>
         </w:rPr>
-        <w:lastRenderedPageBreak/>
         <w:t>Data Description</w:t>
       </w:r>
     </w:p>
@@ -316,15 +449,7 @@
         <w:jc w:val="center"/>
       </w:pPr>
       <w:r>
-        <w:t xml:space="preserve">Table </w:t>
-      </w:r>
-      <w:proofErr w:type="gramStart"/>
-      <w:r>
-        <w:t>1:–</w:t>
-      </w:r>
-      <w:proofErr w:type="gramEnd"/>
-      <w:r>
-        <w:t xml:space="preserve"> Variable Descriptions</w:t>
+        <w:t>Table 1:– Variable Descriptions</w:t>
       </w:r>
     </w:p>
     <w:tbl>
@@ -339,13 +464,13 @@
         <w:tblLook w:val="04A0" w:firstRow="1" w:lastRow="0" w:firstColumn="1" w:lastColumn="0" w:noHBand="0" w:noVBand="1"/>
       </w:tblPr>
       <w:tblGrid>
-        <w:gridCol w:w="1185"/>
-        <w:gridCol w:w="8175"/>
+        <w:gridCol w:w="1160"/>
+        <w:gridCol w:w="8200"/>
       </w:tblGrid>
       <w:tr>
         <w:tc>
           <w:tcPr>
-            <w:tcW w:w="0" w:type="auto"/>
+            <w:tcW w:w="1160" w:type="dxa"/>
             <w:tcBorders>
               <w:top w:val="single" w:sz="8" w:space="0" w:color="000000"/>
               <w:left w:val="single" w:sz="8" w:space="0" w:color="000000"/>
@@ -368,7 +493,7 @@
         </w:tc>
         <w:tc>
           <w:tcPr>
-            <w:tcW w:w="0" w:type="auto"/>
+            <w:tcW w:w="8200" w:type="dxa"/>
             <w:tcBorders>
               <w:top w:val="single" w:sz="8" w:space="0" w:color="000000"/>
               <w:left w:val="single" w:sz="8" w:space="0" w:color="000000"/>
@@ -393,7 +518,7 @@
       <w:tr>
         <w:tc>
           <w:tcPr>
-            <w:tcW w:w="0" w:type="auto"/>
+            <w:tcW w:w="1160" w:type="dxa"/>
             <w:tcBorders>
               <w:top w:val="single" w:sz="8" w:space="0" w:color="000000"/>
               <w:left w:val="single" w:sz="8" w:space="0" w:color="000000"/>
@@ -420,7 +545,7 @@
         </w:tc>
         <w:tc>
           <w:tcPr>
-            <w:tcW w:w="0" w:type="auto"/>
+            <w:tcW w:w="8200" w:type="dxa"/>
             <w:tcBorders>
               <w:top w:val="single" w:sz="8" w:space="0" w:color="000000"/>
               <w:left w:val="single" w:sz="8" w:space="0" w:color="000000"/>
@@ -445,7 +570,7 @@
       <w:tr>
         <w:tc>
           <w:tcPr>
-            <w:tcW w:w="0" w:type="auto"/>
+            <w:tcW w:w="1160" w:type="dxa"/>
             <w:tcBorders>
               <w:top w:val="single" w:sz="8" w:space="0" w:color="000000"/>
               <w:left w:val="single" w:sz="8" w:space="0" w:color="000000"/>
@@ -466,13 +591,27 @@
                 <w:i/>
                 <w:iCs/>
               </w:rPr>
-              <w:t>CPIA_Avg</w:t>
-            </w:r>
-          </w:p>
-        </w:tc>
-        <w:tc>
-          <w:tcPr>
-            <w:tcW w:w="0" w:type="auto"/>
+              <w:t>CPIA</w:t>
+            </w:r>
+            <w:r>
+              <w:rPr>
+                <w:i/>
+                <w:iCs/>
+              </w:rPr>
+              <w:t xml:space="preserve"> </w:t>
+            </w:r>
+            <w:r>
+              <w:rPr>
+                <w:i/>
+                <w:iCs/>
+              </w:rPr>
+              <w:t>Avg</w:t>
+            </w:r>
+          </w:p>
+        </w:tc>
+        <w:tc>
+          <w:tcPr>
+            <w:tcW w:w="8200" w:type="dxa"/>
             <w:tcBorders>
               <w:top w:val="single" w:sz="8" w:space="0" w:color="000000"/>
               <w:left w:val="single" w:sz="8" w:space="0" w:color="000000"/>
@@ -489,15 +628,7 @@
           </w:tcPr>
           <w:p>
             <w:r>
-              <w:t xml:space="preserve">A composite index calculated as the </w:t>
-            </w:r>
-            <w:proofErr w:type="gramStart"/>
-            <w:r>
-              <w:t>mean</w:t>
-            </w:r>
-            <w:proofErr w:type="gramEnd"/>
-            <w:r>
-              <w:t xml:space="preserve"> of CPIA ratings for economic management, social inclusion, financial sector development, and property rights</w:t>
+              <w:t>A composite index calculated as the mean of CPIA ratings for economic management, social inclusion, financial sector development, and property rights</w:t>
             </w:r>
           </w:p>
         </w:tc>
@@ -505,7 +636,7 @@
       <w:tr>
         <w:tc>
           <w:tcPr>
-            <w:tcW w:w="0" w:type="auto"/>
+            <w:tcW w:w="1160" w:type="dxa"/>
             <w:tcBorders>
               <w:top w:val="single" w:sz="8" w:space="0" w:color="000000"/>
               <w:left w:val="single" w:sz="8" w:space="0" w:color="000000"/>
@@ -532,7 +663,7 @@
         </w:tc>
         <w:tc>
           <w:tcPr>
-            <w:tcW w:w="0" w:type="auto"/>
+            <w:tcW w:w="8200" w:type="dxa"/>
             <w:tcBorders>
               <w:top w:val="single" w:sz="8" w:space="0" w:color="000000"/>
               <w:left w:val="single" w:sz="8" w:space="0" w:color="000000"/>
@@ -557,7 +688,7 @@
       <w:tr>
         <w:tc>
           <w:tcPr>
-            <w:tcW w:w="0" w:type="auto"/>
+            <w:tcW w:w="1160" w:type="dxa"/>
             <w:tcBorders>
               <w:top w:val="single" w:sz="8" w:space="0" w:color="000000"/>
               <w:left w:val="single" w:sz="8" w:space="0" w:color="000000"/>
@@ -584,7 +715,7 @@
         </w:tc>
         <w:tc>
           <w:tcPr>
-            <w:tcW w:w="0" w:type="auto"/>
+            <w:tcW w:w="8200" w:type="dxa"/>
             <w:tcBorders>
               <w:top w:val="single" w:sz="8" w:space="0" w:color="000000"/>
               <w:left w:val="single" w:sz="8" w:space="0" w:color="000000"/>
@@ -601,15 +732,7 @@
           </w:tcPr>
           <w:p>
             <w:r>
-              <w:t xml:space="preserve">Domestic Credit provided to </w:t>
-            </w:r>
-            <w:proofErr w:type="gramStart"/>
-            <w:r>
-              <w:t>financial</w:t>
-            </w:r>
-            <w:proofErr w:type="gramEnd"/>
-            <w:r>
-              <w:t xml:space="preserve"> sector (% of GDP)</w:t>
+              <w:t>Domestic Credit provided to financial sector (% of GDP)</w:t>
             </w:r>
           </w:p>
         </w:tc>
@@ -633,6 +756,7 @@
         <w:jc w:val="both"/>
       </w:pPr>
       <w:r>
+        <w:lastRenderedPageBreak/>
         <w:t xml:space="preserve">The primary dataset is the World Bank’s Country Policy and Institutional Assessment (CPIA) database. The CPIA provides ratings across several dimensions of governance and economic management. This paper </w:t>
       </w:r>
       <w:r>
@@ -649,7 +773,6 @@
         <w:jc w:val="both"/>
       </w:pPr>
       <w:r>
-        <w:lastRenderedPageBreak/>
         <w:t>In addition to the macroeconomic policy quality measure, several control variables are incorporated to account for potential omitted variable bias. Export volume data, used to capture a country's exposure to global trade shocks, is obtained from the World Bank’s Development Indicators. Domestic credit to the private sector, expressed as a percentage of GDP, is included as a measure of financial sector development and liquidity conditions, drawn from the same source.</w:t>
       </w:r>
     </w:p>
@@ -660,15 +783,7 @@
         <w:jc w:val="both"/>
       </w:pPr>
       <w:r>
-        <w:t xml:space="preserve">A composite indicator, the CPIA Average Rating, is created by calculating the </w:t>
-      </w:r>
-      <w:proofErr w:type="gramStart"/>
-      <w:r>
-        <w:t>mean</w:t>
-      </w:r>
-      <w:proofErr w:type="gramEnd"/>
-      <w:r>
-        <w:t xml:space="preserve"> of five critical CPIA sub-scores: economic management, financial sector development, social inclusion and equity, property rights and rule-based governance, and social protection. This custom variable captures broader institutional quality and policy coherence beyond macroeconomic management alone.</w:t>
+        <w:t>A composite indicator, the CPIA Average Rating, is created by calculating the mean of five critical CPIA sub-scores: economic management, financial sector development, social inclusion and equity, property rights and rule-based governance, and social protection. This custom variable captures broader institutional quality and policy coherence beyond macroeconomic management alone.</w:t>
       </w:r>
     </w:p>
     <w:p>
@@ -678,7 +793,11 @@
         <w:jc w:val="both"/>
       </w:pPr>
       <w:r>
-        <w:t>Together, the dataset integrates key themes such as governance quality, financial market development, trade openness, and social inclusion. These themes reflect the complex, multifaceted drivers of inflation and economic stability across countries. The diversity of the dataset ensures a comprehensive analysis of inflation outcomes across different institutional and economic environments, allowing for nuanced insights into the interplay between macroeconomic management and broader development structures.</w:t>
+        <w:t xml:space="preserve">Together, the dataset integrates key themes such as governance quality, financial market development, trade openness, and social inclusion. These themes reflect the complex, multifaceted drivers of inflation and economic stability across countries. The diversity of the dataset ensures a comprehensive analysis of inflation outcomes across </w:t>
+      </w:r>
+      <w:r>
+        <w:lastRenderedPageBreak/>
+        <w:t>different institutional and economic environments, allowing for nuanced insights into the interplay between macroeconomic management and broader development structures.</w:t>
       </w:r>
     </w:p>
     <w:p>
@@ -686,15 +805,13 @@
         <w:jc w:val="center"/>
       </w:pPr>
       <w:r>
-        <w:t xml:space="preserve">Table </w:t>
-      </w:r>
-      <w:proofErr w:type="gramStart"/>
-      <w:r>
-        <w:t>2:–</w:t>
-      </w:r>
-      <w:proofErr w:type="gramEnd"/>
-      <w:r>
-        <w:t xml:space="preserve"> Summary Statistics</w:t>
+        <w:t>Table 2</w:t>
+      </w:r>
+      <w:r>
+        <w:t xml:space="preserve"> </w:t>
+      </w:r>
+      <w:r>
+        <w:t>– Summary Statistics</w:t>
       </w:r>
     </w:p>
     <w:tbl>
@@ -1054,7 +1171,6 @@
                 <w:i/>
                 <w:iCs/>
               </w:rPr>
-              <w:lastRenderedPageBreak/>
               <w:t>Macro</w:t>
             </w:r>
           </w:p>
@@ -2545,7 +2661,11 @@
         </m:sSub>
       </m:oMath>
       <w:r>
-        <w:t xml:space="preserve">, and  representing the other cluster control variables we use element fixed-effects </w:t>
+        <w:t xml:space="preserve">, and  representing the </w:t>
+      </w:r>
+      <w:r>
+        <w:lastRenderedPageBreak/>
+        <w:t xml:space="preserve">other cluster control variables we use element fixed-effects </w:t>
       </w:r>
       <m:oMath>
         <m:sSub>
@@ -2678,11 +2798,7 @@
         <w:t xml:space="preserve"> to be negative.  </w:t>
       </w:r>
       <w:r>
-        <w:t xml:space="preserve">Effective macroeconomic management strengthens a country's ability to stabilize prices by anchoring inflation expectations, maintaining fiscal discipline, and mitigating demand-side pressures. </w:t>
-      </w:r>
-      <w:r>
-        <w:lastRenderedPageBreak/>
-        <w:t xml:space="preserve">Countries with higher macroeconomic policy ratings are </w:t>
+        <w:t xml:space="preserve">Effective macroeconomic management strengthens a country's ability to stabilize prices by anchoring inflation expectations, maintaining fiscal discipline, and mitigating demand-side pressures. Countries with higher macroeconomic policy ratings are </w:t>
       </w:r>
       <w:r>
         <w:t>characterized</w:t>
@@ -2751,14 +2867,11 @@
           <w:b/>
           <w:bCs/>
         </w:rPr>
+        <w:lastRenderedPageBreak/>
         <w:t>Export Volume</w:t>
       </w:r>
       <w:r>
-        <w:t xml:space="preserve"> (Export) is included both as an independent control and as part of an interaction term with Macro. The rationale stems from the potential influence of external trade shocks on domestic inflation dynamics. While Export alone is marginally significant in the final model (p&lt;0.1), the interaction term (Macro × Export) achieves statistical significance at the 10% level (coefficient = 0.00792; p&lt;0.1). This significance justifies its </w:t>
-      </w:r>
-      <w:r>
-        <w:lastRenderedPageBreak/>
-        <w:t>inclusion, allowing the analysis to capture how macroeconomic policy effectiveness may vary based on a country's degree of integration into global markets.</w:t>
+        <w:t xml:space="preserve"> (Export) is included both as an independent control and as part of an interaction term with Macro. The rationale stems from the potential influence of external trade shocks on domestic inflation dynamics. While Export alone is marginally significant in the final model (p&lt;0.1), the interaction term (Macro × Export) achieves statistical significance at the 10% level (coefficient = 0.00792; p&lt;0.1). This significance justifies its inclusion, allowing the analysis to capture how macroeconomic policy effectiveness may vary based on a country's degree of integration into global markets.</w:t>
       </w:r>
     </w:p>
     <w:p>
@@ -2788,17 +2901,14 @@
         <w:jc w:val="both"/>
       </w:pPr>
       <w:r>
+        <w:lastRenderedPageBreak/>
         <w:t xml:space="preserve">In evaluating potential omitted variables, we systematically tested several additional controls across multiple specifications. These included GDP per capita growth, real GDP levels, depth of credit information systems, electricity access rates (as a proxy for infrastructure quality), and levels of informal payments (as a proxy for corruption). Models including </w:t>
       </w:r>
       <w:r>
         <w:t>GDP growth and GDP constant dollars</w:t>
       </w:r>
       <w:r>
-        <w:t xml:space="preserve"> did not yield any meaningful change in the </w:t>
-      </w:r>
-      <w:r>
-        <w:lastRenderedPageBreak/>
-        <w:t xml:space="preserve">Macro coefficient and were therefore excluded. Including </w:t>
+        <w:t xml:space="preserve"> did not yield any meaningful change in the Macro coefficient and were therefore excluded. Including </w:t>
       </w:r>
       <w:r>
         <w:rPr>
@@ -2839,15 +2949,7 @@
       </w:pPr>
       <w:commentRangeStart w:id="0"/>
       <w:r>
-        <w:t xml:space="preserve">Additionally, the possibility of nonlinearities was considered by estimating models with quadratic terms and log-linear transformations. However, none of these alternative specifications improved model </w:t>
-      </w:r>
-      <w:proofErr w:type="gramStart"/>
-      <w:r>
-        <w:t>fit</w:t>
-      </w:r>
-      <w:proofErr w:type="gramEnd"/>
-      <w:r>
-        <w:t>, as assessed by adjusted R-squared values and statistical significance tests. Consequently, a linear specification with an interaction term between Macro and Export was selected as the most theoretically coherent and empirically robust model for this analysis.</w:t>
+        <w:t>Additionally, the possibility of nonlinearities was considered by estimating models with quadratic terms and log-linear transformations. However, none of these alternative specifications improved model fit, as assessed by adjusted R-squared values and statistical significance tests. Consequently, a linear specification with an interaction term between Macro and Export was selected as the most theoretically coherent and empirically robust model for this analysis.</w:t>
       </w:r>
       <w:commentRangeEnd w:id="0"/>
       <w:r>
@@ -2864,7 +2966,11 @@
         <w:jc w:val="both"/>
       </w:pPr>
       <w:r>
-        <w:t>Overall, the included variables have been carefully selected based on a combination of statistical significance, theoretical justification, and a thorough assessment of potential omitted variable bias. This ensures that the final model provides a rigorous and interpretable estimate of the relationship between macroeconomic policy quality and inflation outcomes across countries.</w:t>
+        <w:t xml:space="preserve">Overall, the included variables have been carefully selected based on a combination of statistical significance, theoretical justification, and a thorough assessment of potential omitted variable bias. This ensures that the final model provides a rigorous and interpretable </w:t>
+      </w:r>
+      <w:r>
+        <w:lastRenderedPageBreak/>
+        <w:t>estimate of the relationship between macroeconomic policy quality and inflation outcomes across countries.</w:t>
       </w:r>
     </w:p>
     <w:p>
@@ -2887,7 +2993,6 @@
         <w:jc w:val="center"/>
       </w:pPr>
       <w:r>
-        <w:lastRenderedPageBreak/>
         <w:t>Table 3: - Estimates of Macroeconomic Rating: Effect on Change in Inflation across countries and time</w:t>
       </w:r>
     </w:p>
@@ -3300,7 +3405,7 @@
                 <w:rFonts w:ascii="Times New Roman" w:hAnsi="Times New Roman" w:cs="Times New Roman"/>
                 <w:kern w:val="0"/>
               </w:rPr>
-              <w:t>cpia_macro_rating</w:t>
+              <w:t>Macro</w:t>
             </w:r>
           </w:p>
         </w:tc>
@@ -3557,7 +3662,7 @@
                 <w:rFonts w:ascii="Times New Roman" w:hAnsi="Times New Roman" w:cs="Times New Roman"/>
                 <w:kern w:val="0"/>
               </w:rPr>
-              <w:t>export_volume</w:t>
+              <w:t>Export</w:t>
             </w:r>
           </w:p>
         </w:tc>
@@ -3814,7 +3919,7 @@
                 <w:rFonts w:ascii="Times New Roman" w:hAnsi="Times New Roman" w:cs="Times New Roman"/>
                 <w:kern w:val="0"/>
               </w:rPr>
-              <w:t>cpia_avg_rating</w:t>
+              <w:t>CPIA Avg</w:t>
             </w:r>
           </w:p>
         </w:tc>
@@ -4057,7 +4162,7 @@
                 <w:rFonts w:ascii="Times New Roman" w:hAnsi="Times New Roman" w:cs="Times New Roman"/>
                 <w:kern w:val="0"/>
               </w:rPr>
-              <w:t>dmstc_crdt_financial</w:t>
+              <w:t>Credit</w:t>
             </w:r>
           </w:p>
         </w:tc>
@@ -4300,23 +4405,7 @@
                 <w:rFonts w:ascii="Times New Roman" w:hAnsi="Times New Roman" w:cs="Times New Roman"/>
                 <w:kern w:val="0"/>
               </w:rPr>
-              <w:t>c.cpia_macro_rating#</w:t>
-            </w:r>
-            <w:proofErr w:type="gramStart"/>
-            <w:r>
-              <w:rPr>
-                <w:rFonts w:ascii="Times New Roman" w:hAnsi="Times New Roman" w:cs="Times New Roman"/>
-                <w:kern w:val="0"/>
-              </w:rPr>
-              <w:t>c.export</w:t>
-            </w:r>
-            <w:proofErr w:type="gramEnd"/>
-            <w:r>
-              <w:rPr>
-                <w:rFonts w:ascii="Times New Roman" w:hAnsi="Times New Roman" w:cs="Times New Roman"/>
-                <w:kern w:val="0"/>
-              </w:rPr>
-              <w:t>_volume</w:t>
+              <w:t>Macro x Export (Interaction Term)</w:t>
             </w:r>
           </w:p>
         </w:tc>
@@ -5052,17 +5141,8 @@
                 <w:rFonts w:ascii="Times New Roman" w:hAnsi="Times New Roman" w:cs="Times New Roman"/>
                 <w:kern w:val="0"/>
               </w:rPr>
-              <w:t xml:space="preserve">Number of </w:t>
-            </w:r>
-            <w:proofErr w:type="gramStart"/>
-            <w:r>
-              <w:rPr>
-                <w:rFonts w:ascii="Times New Roman" w:hAnsi="Times New Roman" w:cs="Times New Roman"/>
-                <w:kern w:val="0"/>
-              </w:rPr>
-              <w:t>country</w:t>
-            </w:r>
-            <w:proofErr w:type="gramEnd"/>
+              <w:t>Number of country</w:t>
+            </w:r>
           </w:p>
         </w:tc>
         <w:tc>
@@ -5362,7 +5442,11 @@
         <w:jc w:val="both"/>
       </w:pPr>
       <w:r>
-        <w:t>The coefficient on the CPIA macroeconomic management rating is −4.644 (p&lt;0.01), indicating that higher macroeconomic policy quality is significantly associated with lower inflation rates. Export volume alone has a small, marginally significant negative effect on inflation (p=0.055). Critically, the interaction term between CPIA macro rating and export volume is positive and marginally significant (p=0.055), implying that the deflationary impact of macroeconomic policy quality weakens as export volume increases.</w:t>
+        <w:t xml:space="preserve">The coefficient on the CPIA macroeconomic management rating is −4.644 (p&lt;0.01), indicating that higher macroeconomic policy quality is significantly associated with lower inflation rates. Export volume alone has a small, marginally significant negative effect on inflation (p=0.055). Critically, the interaction term between CPIA macro rating and export </w:t>
+      </w:r>
+      <w:r>
+        <w:lastRenderedPageBreak/>
+        <w:t>volume is positive and marginally significant (p=0.055), implying that the deflationary impact of macroeconomic policy quality weakens as export volume increases.</w:t>
       </w:r>
     </w:p>
     <w:p>
@@ -5384,11 +5468,7 @@
         <w:t xml:space="preserve"> </w:t>
       </w:r>
       <w:r>
-        <w:t xml:space="preserve">inflation (p&lt;0.01), emphasizing the importance of stable financial sector conditions. CPIA average rating, although only marginally significant (p=0.068), proves essential; without controlling </w:t>
-      </w:r>
-      <w:r>
-        <w:lastRenderedPageBreak/>
-        <w:t>for this broader measure of social, economic, and institutional quality, the relationship between macroeconomic management and inflation loses statistical significance, indicating negative Omitted Variable Bias. Thus, a nation's broader commitment to debt management, social inclusion, and property rights is crucial for macroeconomic policy to effectively curb inflation.</w:t>
+        <w:t>inflation (p&lt;0.01), emphasizing the importance of stable financial sector conditions. CPIA average rating, although only marginally significant (p=0.068), proves essential; without controlling for this broader measure of social, economic, and institutional quality, the relationship between macroeconomic management and inflation loses statistical significance, indicating negative Omitted Variable Bias. Thus, a nation's broader commitment to debt management, social inclusion, and property rights is crucial for macroeconomic policy to effectively curb inflation.</w:t>
       </w:r>
     </w:p>
     <w:p>
@@ -5430,6 +5510,7 @@
         <w:jc w:val="both"/>
       </w:pPr>
       <w:r>
+        <w:lastRenderedPageBreak/>
         <w:t>While the models explain some of the variation in inflation outcomes (Adjusted R-squared approximately 5%), a substantial portion remains unexplained. Future research could enhance explanatory power by incorporating additional variables such as fiscal deficits, political stability indices, and more granular trade shock measures.</w:t>
       </w:r>
     </w:p>
@@ -5440,7 +5521,6 @@
         <w:jc w:val="both"/>
       </w:pPr>
       <w:r>
-        <w:lastRenderedPageBreak/>
         <w:t xml:space="preserve">The dataset's temporal limitation (ending in 2016) suggests the need for updates, particularly given major economic disruptions in the late 2010s and early 2020s. Moreover, while CPIA Average Rating serves as a useful control, it introduces some multicollinearity with the macroeconomic management index. Future studies could refine these </w:t>
       </w:r>
       <w:r>
@@ -5495,7 +5575,11 @@
         <w:jc w:val="both"/>
       </w:pPr>
       <w:r>
-        <w:t>Importantly, macroeconomic policy quality only emerges as a significant predictor of inflation once broader structural factors—including domestic financial sector stability, dedication to debt management, social inclusion, and property rights protections—are controlled for. Policymakers seeking to reduce inflation cannot rely solely on macroeconomic fine-tuning; rather, effective policy must be complemented by robust financial sectors, equitable social policies, and strong institutional frameworks.</w:t>
+        <w:t xml:space="preserve">Importantly, macroeconomic policy quality only emerges as a significant predictor of inflation once broader structural factors—including domestic financial sector stability, dedication to debt management, social inclusion, and property rights protections—are </w:t>
+      </w:r>
+      <w:r>
+        <w:lastRenderedPageBreak/>
+        <w:t>controlled for. Policymakers seeking to reduce inflation cannot rely solely on macroeconomic fine-tuning; rather, effective policy must be complemented by robust financial sectors, equitable social policies, and strong institutional frameworks.</w:t>
       </w:r>
     </w:p>
     <w:p>
@@ -5505,7 +5589,6 @@
         <w:jc w:val="both"/>
       </w:pPr>
       <w:r>
-        <w:lastRenderedPageBreak/>
         <w:t>Moreover, these findings suggest that informed voter assessments of a government's ability to manage inflation should extend beyond simple evaluations of macroeconomic policies. Given the interconnectedness of inflation outcomes with broader social and institutional structures — including debt management strategies and commitments to social inclusion — citizens and policymakers alike should consider the quality of governance in these areas when forming expectations about future inflation dynamics. A strong macroeconomic framework, while necessary, is insufficient on its own without accompanying institutional strength and inclusive development policies.</w:t>
       </w:r>
     </w:p>
@@ -5686,15 +5769,7 @@
         <w:ind w:left="720" w:hanging="720"/>
       </w:pPr>
       <w:r>
-        <w:t xml:space="preserve">Straub, S. (2011). Infrastructure and development: A critical appraisal of </w:t>
-      </w:r>
-      <w:proofErr w:type="gramStart"/>
-      <w:r>
-        <w:t>the macro</w:t>
-      </w:r>
-      <w:proofErr w:type="gramEnd"/>
-      <w:r>
-        <w:t xml:space="preserve">-level literature. </w:t>
+        <w:t xml:space="preserve">Straub, S. (2011). Infrastructure and development: A critical appraisal of the macro-level literature. </w:t>
       </w:r>
       <w:r>
         <w:rPr>
@@ -5708,6 +5783,12 @@
       </w:r>
     </w:p>
     <w:p/>
+    <w:p/>
+    <w:p>
+      <w:r>
+        <w:t>https://www.pewresearch.org/politics/2024/05/23/publics-positive-economic-ratings-slip-inflation-still-widely-viewed-as-major-problem</w:t>
+      </w:r>
+    </w:p>
     <w:sectPr>
       <w:headerReference w:type="default" r:id="rId11"/>
       <w:headerReference w:type="first" r:id="rId12"/>
@@ -6520,7 +6601,6 @@
   <w:style w:type="character" w:default="1" w:styleId="DefaultParagraphFont">
     <w:name w:val="Default Paragraph Font"/>
     <w:uiPriority w:val="1"/>
-    <w:semiHidden/>
     <w:unhideWhenUsed/>
   </w:style>
   <w:style w:type="table" w:default="1" w:styleId="TableNormal">

</xml_diff>

<commit_message>
4/29 Paper Revisions (and relabels)
</commit_message>
<xml_diff>
--- a/The Nexus of Macroeconomic Policy Quality on Inflation.docx
+++ b/The Nexus of Macroeconomic Policy Quality on Inflation.docx
@@ -234,13 +234,22 @@
         <w:t>Though</w:t>
       </w:r>
       <w:r>
-        <w:t xml:space="preserve"> stronger macroeconomic management is traditionally expected to stabilize inflation, the substantial spread in inflation outcomes across varying policy quality levels — visualized in Figure </w:t>
-      </w:r>
-      <w:r>
-        <w:t xml:space="preserve">1 </w:t>
-      </w:r>
-      <w:r>
-        <w:t>— indicates that additional factors likely shape inflation dynamics</w:t>
+        <w:t xml:space="preserve"> stronger macroeconomic management is traditionally expected to stabilize inflation, the substantial spread in inflation outcomes across varying policy quality levels</w:t>
+      </w:r>
+      <w:r>
+        <w:t>,</w:t>
+      </w:r>
+      <w:r>
+        <w:t xml:space="preserve"> visualized in Figure </w:t>
+      </w:r>
+      <w:r>
+        <w:t>1</w:t>
+      </w:r>
+      <w:r>
+        <w:t>,</w:t>
+      </w:r>
+      <w:r>
+        <w:t xml:space="preserve"> indicates that additional factors likely shape inflation dynamics</w:t>
       </w:r>
       <w:r>
         <w:t>, motivating the specific regression techniques used in this report</w:t>
@@ -264,19 +273,61 @@
         <w:t xml:space="preserve">consumer </w:t>
       </w:r>
       <w:r>
-        <w:t xml:space="preserve">inflation outcomes. </w:t>
-      </w:r>
-      <w:r>
-        <w:t xml:space="preserve">Preliminary evidence (Figure </w:t>
-      </w:r>
-      <w:r>
-        <w:t>2</w:t>
-      </w:r>
-      <w:r>
-        <w:t>) reveals a modest negative correlation between macroeconomic quality and inflation</w:t>
-      </w:r>
-      <w:r>
-        <w:t>, aligning with the public perception that better macro policy leads to lower inflation for consumers</w:t>
+        <w:t>inflation outcomes</w:t>
+      </w:r>
+      <w:r>
+        <w:t xml:space="preserve">, and finds that the impact of a nation’s macroeconomic management quality is associated with an expected decrease in inflation, but is dependent on that nation’s export volumes, controlling for broader institutional and financial sector quality. </w:t>
+      </w:r>
+    </w:p>
+    <w:p>
+      <w:pPr>
+        <w:spacing w:line="480" w:lineRule="auto"/>
+        <w:jc w:val="both"/>
+      </w:pPr>
+      <w:r>
+        <w:rPr>
+          <w:i/>
+          <w:iCs/>
+        </w:rPr>
+        <w:lastRenderedPageBreak/>
+        <w:t>Figure 1: Variance of Inflation % with respect to CPIA Macroeconomic Management</w:t>
+      </w:r>
+      <w:r>
+        <w:drawing>
+          <wp:inline distT="0" distB="0" distL="0" distR="0" wp14:anchorId="3D34C245" wp14:editId="01A98F14">
+            <wp:extent cx="5943600" cy="4434205"/>
+            <wp:effectExtent l="0" t="0" r="0" b="4445"/>
+            <wp:docPr id="209009640" name="Picture 1" descr="A graph of a diagram&#10;&#10;AI-generated content may be incorrect."/>
+            <wp:cNvGraphicFramePr>
+              <a:graphicFrameLocks xmlns:a="http://schemas.openxmlformats.org/drawingml/2006/main" noChangeAspect="1"/>
+            </wp:cNvGraphicFramePr>
+            <a:graphic xmlns:a="http://schemas.openxmlformats.org/drawingml/2006/main">
+              <a:graphicData uri="http://schemas.openxmlformats.org/drawingml/2006/picture">
+                <pic:pic xmlns:pic="http://schemas.openxmlformats.org/drawingml/2006/picture">
+                  <pic:nvPicPr>
+                    <pic:cNvPr id="209009640" name="Picture 1" descr="A graph of a diagram&#10;&#10;AI-generated content may be incorrect."/>
+                    <pic:cNvPicPr/>
+                  </pic:nvPicPr>
+                  <pic:blipFill>
+                    <a:blip r:embed="rId7"/>
+                    <a:stretch>
+                      <a:fillRect/>
+                    </a:stretch>
+                  </pic:blipFill>
+                  <pic:spPr>
+                    <a:xfrm>
+                      <a:off x="0" y="0"/>
+                      <a:ext cx="5943600" cy="4434205"/>
+                    </a:xfrm>
+                    <a:prstGeom prst="rect">
+                      <a:avLst/>
+                    </a:prstGeom>
+                  </pic:spPr>
+                </pic:pic>
+              </a:graphicData>
+            </a:graphic>
+          </wp:inline>
+        </w:drawing>
       </w:r>
     </w:p>
     <w:p>
@@ -298,10 +349,10 @@
         <w:jc w:val="both"/>
       </w:pPr>
       <w:r>
-        <w:t xml:space="preserve">There is a major gap in existing research on the isolated effect of macroeconomic management </w:t>
-      </w:r>
-      <w:r>
-        <w:t>on consumer price inflation. Despite this, e</w:t>
+        <w:t>Existing research is lacking in its investigation of the isolated effect of macroeconomic management on consumer price inflation. However</w:t>
+      </w:r>
+      <w:r>
+        <w:t>, e</w:t>
       </w:r>
       <w:r>
         <w:t xml:space="preserve">conomic theory and </w:t>
@@ -310,17 +361,10 @@
         <w:t xml:space="preserve">existing </w:t>
       </w:r>
       <w:r>
-        <w:lastRenderedPageBreak/>
         <w:t>empirical research identify several pathways through which macroeconomic quality shapes inflation</w:t>
       </w:r>
       <w:r>
-        <w:t xml:space="preserve">, </w:t>
-      </w:r>
-      <w:r>
-        <w:t>which this study will consider as possible confounding variables</w:t>
-      </w:r>
-      <w:r>
-        <w:t>.</w:t>
+        <w:t xml:space="preserve">. </w:t>
       </w:r>
     </w:p>
     <w:p>
@@ -351,13 +395,71 @@
         <w:t>Modern e</w:t>
       </w:r>
       <w:r>
-        <w:t xml:space="preserve">mpirical findings (Coibion &amp; Gorodnichenko, 2015) confirm that demand-side pressures intensify inflation, </w:t>
+        <w:t xml:space="preserve">mpirical </w:t>
+      </w:r>
+      <w:r>
+        <w:lastRenderedPageBreak/>
+        <w:t xml:space="preserve">findings (Coibion &amp; Gorodnichenko, 2015) confirm that demand-side pressures intensify inflation, </w:t>
       </w:r>
       <w:r>
         <w:t xml:space="preserve">potentially </w:t>
       </w:r>
       <w:r>
         <w:t>necessitating GDP controls.</w:t>
+      </w:r>
+      <w:r>
+        <w:t xml:space="preserve"> </w:t>
+      </w:r>
+      <w:r>
+        <w:t xml:space="preserve"> </w:t>
+      </w:r>
+      <w:r>
+        <w:t>Income levels, proxied by GDP per capita, also modulate inflation dynamics. Developed economies exhibit stable, low inflation rates, whereas developing nations often experience greater volatility (Ha, Kose, &amp; Ohnsorge, 2019). Credit growth similarly plays a vital role; rapid financial expansion can fuel demand and thus inflation (Choi &amp; Cook, 2018).</w:t>
+      </w:r>
+      <w:r>
+        <w:t xml:space="preserve"> Prior research has also found that e</w:t>
+      </w:r>
+      <w:r>
+        <w:t>xport booms or trade price volatility affect domestic inflation via terms-of-trade mechanisms (Comin &amp; Johnson, 2020)</w:t>
+      </w:r>
+      <w:r>
+        <w:t xml:space="preserve">. </w:t>
+      </w:r>
+      <w:r>
+        <w:t xml:space="preserve">Strong banking systems and regulatory frameworks </w:t>
+      </w:r>
+      <w:r>
+        <w:t xml:space="preserve">help </w:t>
+      </w:r>
+      <w:r>
+        <w:t>stabilize inflation (Mishkin, 2007), whereas corruption and weak institutions exacerbate volatility (Mujahid, 2021).</w:t>
+      </w:r>
+      <w:r>
+        <w:t xml:space="preserve"> Finally, i</w:t>
+      </w:r>
+      <w:r>
+        <w:t>nfrastructure deficiencies</w:t>
+      </w:r>
+      <w:r>
+        <w:t xml:space="preserve"> create </w:t>
+      </w:r>
+      <w:r>
+        <w:t>supply</w:t>
+      </w:r>
+      <w:r>
+        <w:t xml:space="preserve"> </w:t>
+      </w:r>
+      <w:r>
+        <w:t xml:space="preserve">bottlenecks </w:t>
+      </w:r>
+      <w:r>
+        <w:t xml:space="preserve">and </w:t>
+      </w:r>
+      <w:r>
+        <w:t>can further destabilize prices (Straub, 2011).</w:t>
+      </w:r>
+      <w:r>
+        <w:t xml:space="preserve"> </w:t>
       </w:r>
       <w:r>
         <w:t xml:space="preserve"> </w:t>
@@ -370,67 +472,68 @@
         <w:jc w:val="both"/>
       </w:pPr>
       <w:r>
-        <w:t>Income levels, proxied by GDP per capita, also modulate inflation dynamics. Developed economies tend to exhibit stable, low inflation rates, whereas developing nations often experience greater volatility (Ha, Kose, &amp; Ohnsorge, 2019). Credit growth similarly plays a vital role; rapid financial expansion can fuel demand and thus inflation (Choi &amp; Cook, 2018).</w:t>
-      </w:r>
-      <w:r>
-        <w:t xml:space="preserve"> Prior research has also found that e</w:t>
-      </w:r>
-      <w:r>
-        <w:t>xport booms or trade price volatility affect domestic inflation via terms-of-trade mechanisms (Comin &amp; Johnson, 2020)</w:t>
-      </w:r>
-      <w:r>
-        <w:t xml:space="preserve">. </w:t>
-      </w:r>
-      <w:r>
-        <w:t xml:space="preserve">Strong banking systems and regulatory frameworks </w:t>
-      </w:r>
-      <w:r>
-        <w:t xml:space="preserve">help </w:t>
-      </w:r>
-      <w:r>
-        <w:t>stabilize inflation (Mishkin, 2007), whereas corruption and weak institutions exacerbate volatility (Mujahid, 2021). Infrastructure deficiencies, by creating supply bottlenecks, can further destabilize prices (Straub, 2011).</w:t>
+        <w:t>Together, these factors demonstrate that inflation outcomes are shaped by a complex interplay of economic development, financial conditions, external shocks, and institutional quality. Accordingly, any empirical analysis seeking to isolate the effect of macroeconomic management on inflation must carefully control</w:t>
       </w:r>
       <w:r>
         <w:t xml:space="preserve"> </w:t>
       </w:r>
       <w:r>
+        <w:t>for these confounding influences.</w:t>
+      </w:r>
+      <w:r>
+        <w:t xml:space="preserve"> Therefore,</w:t>
+      </w:r>
+      <w:r>
         <w:t xml:space="preserve"> </w:t>
       </w:r>
       <w:r>
-        <w:t>Together, these factors demonstrate that inflation outcomes are shaped by a complex interplay of economic development, financial conditions, external shocks, and institutional quality. Accordingly, any empirical analysis seeking to isolate the effect of macroeconomic management on inflation must carefully control for these confounding influences.</w:t>
+        <w:t>controlling</w:t>
+      </w:r>
+      <w:r>
+        <w:t xml:space="preserve"> </w:t>
+      </w:r>
+      <w:r>
+        <w:t xml:space="preserve">for </w:t>
+      </w:r>
+      <w:r>
+        <w:t>GDP growth, income levels, credit conditions, trade shocks, financial sector depth, governance quality, and infrastructure is critical to isolating the impact of macroeconomic management on inflation.</w:t>
+      </w:r>
+      <w:r>
+        <w:t xml:space="preserve"> This study </w:t>
+      </w:r>
+      <w:r>
+        <w:t xml:space="preserve">investigates </w:t>
+      </w:r>
+      <w:r>
+        <w:t xml:space="preserve">each of these </w:t>
+      </w:r>
+      <w:r>
+        <w:t xml:space="preserve">as potential </w:t>
+      </w:r>
+      <w:r>
+        <w:t>sources</w:t>
+      </w:r>
+      <w:r>
+        <w:t xml:space="preserve"> of bias by including statistically significant variables in the finalized regression model.</w:t>
       </w:r>
     </w:p>
     <w:p>
       <w:pPr>
-        <w:spacing w:line="480" w:lineRule="auto"/>
-        <w:ind w:firstLine="720"/>
-        <w:jc w:val="both"/>
+        <w:jc w:val="center"/>
+        <w:rPr>
+          <w:b/>
+          <w:bCs/>
+        </w:rPr>
       </w:pPr>
-      <w:r>
-        <w:lastRenderedPageBreak/>
-        <w:t xml:space="preserve">Thus, </w:t>
-      </w:r>
-      <w:r>
-        <w:t>controlling</w:t>
-      </w:r>
-      <w:r>
-        <w:t xml:space="preserve"> </w:t>
-      </w:r>
-      <w:r>
-        <w:t xml:space="preserve">for </w:t>
-      </w:r>
-      <w:r>
-        <w:t>GDP growth, income levels, credit conditions, trade shocks, financial sector depth, governance quality, and infrastructure is critical to isolating the impact of macroeconomic management on inflation.</w:t>
-      </w:r>
-      <w:r>
-        <w:t xml:space="preserve"> This study controls for each of these </w:t>
-      </w:r>
-      <w:r>
-        <w:t>sources</w:t>
-      </w:r>
-      <w:r>
-        <w:t xml:space="preserve"> of bias by including statistically significant variables in the finalized regression model.</w:t>
-      </w:r>
+    </w:p>
+    <w:p>
+      <w:pPr>
+        <w:jc w:val="center"/>
+        <w:rPr>
+          <w:b/>
+          <w:bCs/>
+        </w:rPr>
+      </w:pPr>
     </w:p>
     <w:p>
       <w:pPr>
@@ -441,15 +544,38 @@
           <w:b/>
           <w:bCs/>
         </w:rPr>
+        <w:lastRenderedPageBreak/>
         <w:t>Data Description</w:t>
       </w:r>
     </w:p>
     <w:p>
       <w:pPr>
         <w:jc w:val="center"/>
+        <w:rPr>
+          <w:i/>
+          <w:iCs/>
+        </w:rPr>
       </w:pPr>
       <w:r>
-        <w:t>Table 1:– Variable Descriptions</w:t>
+        <w:rPr>
+          <w:i/>
+          <w:iCs/>
+        </w:rPr>
+        <w:t>Table 1</w:t>
+      </w:r>
+      <w:r>
+        <w:rPr>
+          <w:i/>
+          <w:iCs/>
+        </w:rPr>
+        <w:t>:</w:t>
+      </w:r>
+      <w:r>
+        <w:rPr>
+          <w:i/>
+          <w:iCs/>
+        </w:rPr>
+        <w:t xml:space="preserve"> Variable Descriptions</w:t>
       </w:r>
     </w:p>
     <w:tbl>
@@ -746,7 +872,13 @@
         <w:jc w:val="both"/>
       </w:pPr>
       <w:r>
-        <w:t>This research employs panel data collected at the country-year level between 2005 and 2016 to examine the relationship between macroeconomic policy quality and inflation rates. The dataset contains a total of 922 observations, covering 75 countries across a diverse range of economic, institutional, and developmental contexts. Each observation corresponds to a unique country-year pair, ensuring temporal and cross-sectional variability essential for robust fixed-effects analysis.</w:t>
+        <w:t xml:space="preserve">This research employs panel data collected at the country-year level between 2005 and 2016 to examine the relationship between macroeconomic policy quality and inflation rates. The dataset contains </w:t>
+      </w:r>
+      <w:r>
+        <w:t>922 observations, covering 75 countries across a diverse range of economic, institutional, and developmental contexts. One observation</w:t>
+      </w:r>
+      <w:r>
+        <w:t xml:space="preserve"> is taken per country per year.</w:t>
       </w:r>
     </w:p>
     <w:p>
@@ -756,7 +888,6 @@
         <w:jc w:val="both"/>
       </w:pPr>
       <w:r>
-        <w:lastRenderedPageBreak/>
         <w:t xml:space="preserve">The primary dataset is the World Bank’s Country Policy and Institutional Assessment (CPIA) database. The CPIA provides ratings across several dimensions of governance and economic management. This paper </w:t>
       </w:r>
       <w:r>
@@ -773,6 +904,7 @@
         <w:jc w:val="both"/>
       </w:pPr>
       <w:r>
+        <w:lastRenderedPageBreak/>
         <w:t>In addition to the macroeconomic policy quality measure, several control variables are incorporated to account for potential omitted variable bias. Export volume data, used to capture a country's exposure to global trade shocks, is obtained from the World Bank’s Development Indicators. Domestic credit to the private sector, expressed as a percentage of GDP, is included as a measure of financial sector development and liquidity conditions, drawn from the same source.</w:t>
       </w:r>
     </w:p>
@@ -783,7 +915,19 @@
         <w:jc w:val="both"/>
       </w:pPr>
       <w:r>
-        <w:t>A composite indicator, the CPIA Average Rating, is created by calculating the mean of five critical CPIA sub-scores: economic management, financial sector development, social inclusion and equity, property rights and rule-based governance, and social protection. This custom variable captures broader institutional quality and policy coherence beyond macroeconomic management alone.</w:t>
+        <w:t xml:space="preserve">A composite indicator, the CPIA Average Rating, is created by calculating the </w:t>
+      </w:r>
+      <w:r>
+        <w:t>average</w:t>
+      </w:r>
+      <w:r>
+        <w:t xml:space="preserve"> of five </w:t>
+      </w:r>
+      <w:r>
+        <w:tab/>
+      </w:r>
+      <w:r>
+        <w:t>CPIA sub-scores: economic management, financial sector development, social inclusion and equity, property rights and rule-based governance, and social protection. This custom variable captures broader institutional quality and policy coherence beyond macroeconomic management alone.</w:t>
       </w:r>
     </w:p>
     <w:p>
@@ -793,11 +937,7 @@
         <w:jc w:val="both"/>
       </w:pPr>
       <w:r>
-        <w:t xml:space="preserve">Together, the dataset integrates key themes such as governance quality, financial market development, trade openness, and social inclusion. These themes reflect the complex, multifaceted drivers of inflation and economic stability across countries. The diversity of the dataset ensures a comprehensive analysis of inflation outcomes across </w:t>
-      </w:r>
-      <w:r>
-        <w:lastRenderedPageBreak/>
-        <w:t>different institutional and economic environments, allowing for nuanced insights into the interplay between macroeconomic management and broader development structures.</w:t>
+        <w:t>Together, the dataset integrates key themes such as governance quality, financial market development, trade openness, and social inclusion. These themes reflect the complex, multifaceted drivers of inflation and economic stability across countries.</w:t>
       </w:r>
     </w:p>
     <w:p>
@@ -1603,6 +1743,7 @@
                 <w:i/>
                 <w:iCs/>
               </w:rPr>
+              <w:lastRenderedPageBreak/>
               <w:t>Credit</w:t>
             </w:r>
           </w:p>
@@ -2404,6 +2545,9 @@
         <w:t xml:space="preserve"> </w:t>
       </w:r>
       <w:r>
+        <w:t xml:space="preserve">a </w:t>
+      </w:r>
+      <w:r>
         <w:t xml:space="preserve">country </w:t>
       </w:r>
       <m:oMath>
@@ -2661,11 +2805,7 @@
         </m:sSub>
       </m:oMath>
       <w:r>
-        <w:t xml:space="preserve">, and  representing the </w:t>
-      </w:r>
-      <w:r>
-        <w:lastRenderedPageBreak/>
-        <w:t xml:space="preserve">other cluster control variables we use element fixed-effects </w:t>
+        <w:t xml:space="preserve">, and  representing the other cluster control variables we use element fixed-effects </w:t>
       </w:r>
       <m:oMath>
         <m:sSub>
@@ -2795,16 +2935,25 @@
         </m:sSub>
       </m:oMath>
       <w:r>
-        <w:t xml:space="preserve"> to be negative.  </w:t>
-      </w:r>
-      <w:r>
-        <w:t xml:space="preserve">Effective macroeconomic management strengthens a country's ability to stabilize prices by anchoring inflation expectations, maintaining fiscal discipline, and mitigating demand-side pressures. Countries with higher macroeconomic policy ratings are </w:t>
+        <w:t xml:space="preserve"> to be negative</w:t>
+      </w:r>
+      <w:r>
+        <w:t>, as effective macroeconomic management should theoretically curb the impact of inflation on consumers</w:t>
+      </w:r>
+      <w:r>
+        <w:t xml:space="preserve">.  </w:t>
+      </w:r>
+      <w:r>
+        <w:t xml:space="preserve">Countries </w:t>
+      </w:r>
+      <w:r>
+        <w:t xml:space="preserve">with higher macroeconomic policy ratings are </w:t>
       </w:r>
       <w:r>
         <w:t>characterized</w:t>
       </w:r>
       <w:r>
-        <w:t xml:space="preserve"> by stronger institutional frameworks and more credible policy environments, both of which are associated with lower inflation volatility. As well, aligns with public expectation that strong macroeconomic policy can help curb the impacts of inflation.</w:t>
+        <w:t xml:space="preserve"> by stronger institutional frameworks and more credible policy environments, both of which are associated with lower inflation volatility. </w:t>
       </w:r>
     </w:p>
     <w:p>
@@ -2822,12 +2971,22 @@
           <w:bCs/>
         </w:rPr>
       </w:pPr>
-      <w:r>
+    </w:p>
+    <w:p>
+      <w:pPr>
         <w:rPr>
           <w:rFonts w:eastAsiaTheme="minorEastAsia"/>
           <w:b/>
           <w:bCs/>
         </w:rPr>
+      </w:pPr>
+      <w:r>
+        <w:rPr>
+          <w:rFonts w:eastAsiaTheme="minorEastAsia"/>
+          <w:b/>
+          <w:bCs/>
+        </w:rPr>
+        <w:lastRenderedPageBreak/>
         <w:t>Variable Selection Rationale</w:t>
       </w:r>
     </w:p>
@@ -2847,13 +3006,31 @@
         <w:t xml:space="preserve">, </w:t>
       </w:r>
       <w:r>
-        <w:t xml:space="preserve">a continuous measure of macroeconomic policy quality on a standardized 1–6 scale. Its inclusion in the model is based on both theoretical motivation and empirical performance. Across all estimated models, Macro consistently demonstrates strong statistical significance at the 1% level. For instance, in the preferred interaction model (Column 2 of Table </w:t>
+        <w:t>a</w:t>
+      </w:r>
+      <w:r>
+        <w:t xml:space="preserve">n ordinal categorical </w:t>
+      </w:r>
+      <w:r>
+        <w:t>measure of macroeconomic policy quality on a standardized 1–6 scale</w:t>
+      </w:r>
+      <w:r>
+        <w:t>, incremented by 0.5</w:t>
+      </w:r>
+      <w:r>
+        <w:t xml:space="preserve">. Across all estimated models, Macro consistently demonstrates strong statistical significance at the 1% level. For instance, in the preferred interaction model (Column 2 of Table </w:t>
       </w:r>
       <w:r>
         <w:t>3</w:t>
       </w:r>
       <w:r>
-        <w:t>), the coefficient on Macro is -4.644 (p&lt;0.01), supporting the hypothesized negative relationship between improved macroeconomic management and lower inflation rates. Even in the absence of additional interaction terms or controls (Column 1), Macro remains highly significant with a coefficient of -3.222 (p&lt;0.01), underscoring its centrality to the study's research question.</w:t>
+        <w:t>), the coefficient on Macro is -4.644 (p&lt;0.01)</w:t>
+      </w:r>
+      <w:r>
+        <w:t xml:space="preserve">. </w:t>
+      </w:r>
+      <w:r>
+        <w:t>Even in the absence of additional interaction terms or controls (Column 1), Macro remains highly significant with a coefficient of -3.222 (p&lt;0.01), underscoring its centrality to the study's research question.</w:t>
       </w:r>
     </w:p>
     <w:p>
@@ -2863,15 +3040,16 @@
         <w:jc w:val="both"/>
       </w:pPr>
       <w:r>
-        <w:rPr>
-          <w:b/>
-          <w:bCs/>
-        </w:rPr>
-        <w:lastRenderedPageBreak/>
         <w:t>Export Volume</w:t>
       </w:r>
       <w:r>
-        <w:t xml:space="preserve"> (Export) is included both as an independent control and as part of an interaction term with Macro. The rationale stems from the potential influence of external trade shocks on domestic inflation dynamics. While Export alone is marginally significant in the final model (p&lt;0.1), the interaction term (Macro × Export) achieves statistical significance at the 10% level (coefficient = 0.00792; p&lt;0.1). This significance justifies its inclusion, allowing the analysis to capture how macroeconomic policy effectiveness may vary based on a country's degree of integration into global markets.</w:t>
+        <w:t xml:space="preserve"> (Export) is included as an independent control and as part of an interaction term with Macro. The rationale stems from the influence of external trade shocks on domestic inflation dynamics. While Export alone is marginally significant in the final model (p&lt;0.1), the interaction term (Macro × Export) achieves statistical significance at the 10% level (coefficient = 0.00792; p&lt;0.1)</w:t>
+      </w:r>
+      <w:r>
+        <w:t xml:space="preserve">, meaning that the for </w:t>
+      </w:r>
+      <w:r>
+        <w:t xml:space="preserve"> </w:t>
       </w:r>
     </w:p>
     <w:p>
@@ -2881,7 +3059,29 @@
         <w:jc w:val="both"/>
       </w:pPr>
       <w:r>
-        <w:t>CPIA Average Rating (CPIA_Avg), a custom composite measure of broader institutional quality, is included to control for the potential confounding influence of a country’s financial sector development, property rights protections, and social inclusion efforts. Although CPIA_Avg exhibits only marginal statistical significance (p&lt;0.1) in the interaction model, its inclusion is critical. Omitting CPIA_Avg leads to substantial omitted variable bias, shifting the estimated effect of Macro significantly and reducing its interpretability. Its presence ensures that the estimated relationship between macroeconomic management and inflation is not conflated with broader governance quality effects.</w:t>
+        <w:t>CPIA Average Rating (CPIA</w:t>
+      </w:r>
+      <w:r>
+        <w:t xml:space="preserve"> </w:t>
+      </w:r>
+      <w:r>
+        <w:t>Avg), a custom composite measure of broader institutional quality, is included to control for the potential confounding influence of a country’s financial sector development, property rights protections, and social inclusion efforts. Although</w:t>
+      </w:r>
+      <w:r>
+        <w:t xml:space="preserve"> CPIA Average</w:t>
+      </w:r>
+      <w:r>
+        <w:t xml:space="preserve"> exhibits only marginal statistical significance (p&lt;0.1) in the interaction model, its inclusion is critical. Omitting CPIA</w:t>
+      </w:r>
+      <w:r>
+        <w:t xml:space="preserve"> Average</w:t>
+      </w:r>
+      <w:r>
+        <w:t xml:space="preserve"> leads to substantial omitted variable bias, shifting the estimated effect of Macro significantly and reducing its interpretability. Its presence ensures that the estimated relationship between </w:t>
+      </w:r>
+      <w:r>
+        <w:lastRenderedPageBreak/>
+        <w:t>macroeconomic management and inflation is not conflated with broader governance quality effects.</w:t>
       </w:r>
     </w:p>
     <w:p>
@@ -2901,7 +3101,6 @@
         <w:jc w:val="both"/>
       </w:pPr>
       <w:r>
-        <w:lastRenderedPageBreak/>
         <w:t xml:space="preserve">In evaluating potential omitted variables, we systematically tested several additional controls across multiple specifications. These included GDP per capita growth, real GDP levels, depth of credit information systems, electricity access rates (as a proxy for infrastructure quality), and levels of informal payments (as a proxy for corruption). Models including </w:t>
       </w:r>
       <w:r>
@@ -2909,36 +3108,34 @@
       </w:r>
       <w:r>
         <w:t xml:space="preserve"> did not yield any meaningful change in the Macro coefficient and were therefore excluded. Including </w:t>
+      </w:r>
+      <w:r>
+        <w:t>depth of credit</w:t>
+      </w:r>
+      <w:r>
+        <w:t xml:space="preserve"> introduced slight changes but substantially reduced the number of observations, undermining estimation robustness. Similarly, including </w:t>
       </w:r>
       <w:r>
         <w:rPr>
           <w:b/>
           <w:bCs/>
         </w:rPr>
-        <w:t>depth of credit</w:t>
-      </w:r>
-      <w:r>
-        <w:t xml:space="preserve"> introduced slight changes but substantially reduced the number of observations, undermining estimation robustness. Similarly, including </w:t>
-      </w:r>
-      <w:r>
-        <w:rPr>
-          <w:b/>
-          <w:bCs/>
-        </w:rPr>
-        <w:t>electricity access</w:t>
-      </w:r>
-      <w:r>
-        <w:t xml:space="preserve"> and </w:t>
-      </w:r>
-      <w:r>
-        <w:rPr>
-          <w:b/>
-          <w:bCs/>
-        </w:rPr>
-        <w:t>informal payments</w:t>
-      </w:r>
-      <w:r>
-        <w:t xml:space="preserve"> did not produce statistically significant shifts in the key coefficients, nor did they meet the threshold of moving the estimated coefficient on Macro by more than one standard error. As such, these variables were ultimately omitted from the final model to preserve sample size and model parsimony.</w:t>
+        <w:t>e</w:t>
+      </w:r>
+      <w:r>
+        <w:t>lectricity access and informal payments</w:t>
+      </w:r>
+      <w:r>
+        <w:t xml:space="preserve"> did not produce statistically significant shifts in the key coefficients, nor did they meet the threshold of moving the estimated coefficient on Macro by more than one standard error. As such, these variables were ultimately omitted from the final model</w:t>
+      </w:r>
+      <w:r>
+        <w:t>s</w:t>
+      </w:r>
+      <w:r>
+        <w:t xml:space="preserve"> to preserve sample size</w:t>
+      </w:r>
+      <w:r>
+        <w:t xml:space="preserve"> and model parsimony.</w:t>
       </w:r>
     </w:p>
     <w:p>
@@ -2947,9 +3144,37 @@
         <w:ind w:firstLine="720"/>
         <w:jc w:val="both"/>
       </w:pPr>
+      <w:r>
+        <w:t>Estimating quadratic and log-linear models considered the possibility of nonlinearity</w:t>
+      </w:r>
+      <w:r>
+        <w:t xml:space="preserve"> (Columns 2 and 3)</w:t>
+      </w:r>
       <w:commentRangeStart w:id="0"/>
       <w:r>
-        <w:t>Additionally, the possibility of nonlinearities was considered by estimating models with quadratic terms and log-linear transformations. However, none of these alternative specifications improved model fit, as assessed by adjusted R-squared values and statistical significance tests. Consequently, a linear specification with an interaction term between Macro and Export was selected as the most theoretically coherent and empirically robust model for this analysis.</w:t>
+        <w:t>. However, none of these alternative specifications improved model fit</w:t>
+      </w:r>
+      <w:r>
+        <w:t xml:space="preserve"> as </w:t>
+      </w:r>
+      <w:r>
+        <w:lastRenderedPageBreak/>
+        <w:t xml:space="preserve">much as the linear interaction term, </w:t>
+      </w:r>
+      <w:r>
+        <w:t xml:space="preserve">as assessed by adjusted R-squared values and statistical significance tests. Consequently, a linear </w:t>
+      </w:r>
+      <w:r>
+        <w:t xml:space="preserve">model </w:t>
+      </w:r>
+      <w:r>
+        <w:t xml:space="preserve">with an interaction term between Macro and Export </w:t>
+      </w:r>
+      <w:r>
+        <w:t xml:space="preserve">(Column 5) </w:t>
+      </w:r>
+      <w:r>
+        <w:t>was selected as the most theoretically coherent and empirically robust model for this analysis.</w:t>
       </w:r>
       <w:commentRangeEnd w:id="0"/>
       <w:r>
@@ -2958,35 +3183,6 @@
         </w:rPr>
         <w:commentReference w:id="0"/>
       </w:r>
-    </w:p>
-    <w:p>
-      <w:pPr>
-        <w:spacing w:line="480" w:lineRule="auto"/>
-        <w:ind w:firstLine="720"/>
-        <w:jc w:val="both"/>
-      </w:pPr>
-      <w:r>
-        <w:t xml:space="preserve">Overall, the included variables have been carefully selected based on a combination of statistical significance, theoretical justification, and a thorough assessment of potential omitted variable bias. This ensures that the final model provides a rigorous and interpretable </w:t>
-      </w:r>
-      <w:r>
-        <w:lastRenderedPageBreak/>
-        <w:t>estimate of the relationship between macroeconomic policy quality and inflation outcomes across countries.</w:t>
-      </w:r>
-    </w:p>
-    <w:p>
-      <w:pPr>
-        <w:jc w:val="center"/>
-      </w:pPr>
-    </w:p>
-    <w:p>
-      <w:pPr>
-        <w:jc w:val="center"/>
-      </w:pPr>
-    </w:p>
-    <w:p>
-      <w:pPr>
-        <w:jc w:val="center"/>
-      </w:pPr>
     </w:p>
     <w:p>
       <w:pPr>
@@ -3008,18 +3204,26 @@
         <w:tblLook w:val="0000" w:firstRow="0" w:lastRow="0" w:firstColumn="0" w:lastColumn="0" w:noHBand="0" w:noVBand="0"/>
       </w:tblPr>
       <w:tblGrid>
-        <w:gridCol w:w="5259"/>
+        <w:gridCol w:w="2811"/>
+        <w:gridCol w:w="1584"/>
+        <w:gridCol w:w="1584"/>
         <w:gridCol w:w="1584"/>
         <w:gridCol w:w="1440"/>
         <w:gridCol w:w="1584"/>
       </w:tblGrid>
       <w:tr>
+        <w:tblPrEx>
+          <w:tblCellMar>
+            <w:top w:w="0" w:type="dxa"/>
+            <w:bottom w:w="0" w:type="dxa"/>
+          </w:tblCellMar>
+        </w:tblPrEx>
         <w:trPr>
           <w:jc w:val="center"/>
         </w:trPr>
         <w:tc>
           <w:tcPr>
-            <w:tcW w:w="5259" w:type="dxa"/>
+            <w:tcW w:w="2811" w:type="dxa"/>
             <w:tcBorders>
               <w:top w:val="single" w:sz="6" w:space="0" w:color="auto"/>
               <w:left w:val="nil"/>
@@ -3075,6 +3279,70 @@
         </w:tc>
         <w:tc>
           <w:tcPr>
+            <w:tcW w:w="1584" w:type="dxa"/>
+            <w:tcBorders>
+              <w:top w:val="single" w:sz="6" w:space="0" w:color="auto"/>
+              <w:left w:val="nil"/>
+              <w:bottom w:val="nil"/>
+              <w:right w:val="nil"/>
+            </w:tcBorders>
+          </w:tcPr>
+          <w:p>
+            <w:pPr>
+              <w:widowControl w:val="0"/>
+              <w:autoSpaceDE w:val="0"/>
+              <w:autoSpaceDN w:val="0"/>
+              <w:adjustRightInd w:val="0"/>
+              <w:spacing w:after="0" w:line="240" w:lineRule="auto"/>
+              <w:jc w:val="center"/>
+              <w:rPr>
+                <w:rFonts w:ascii="Times New Roman" w:hAnsi="Times New Roman" w:cs="Times New Roman"/>
+                <w:kern w:val="0"/>
+              </w:rPr>
+            </w:pPr>
+            <w:r>
+              <w:rPr>
+                <w:rFonts w:ascii="Times New Roman" w:hAnsi="Times New Roman" w:cs="Times New Roman"/>
+                <w:kern w:val="0"/>
+              </w:rPr>
+              <w:t>(2)</w:t>
+            </w:r>
+          </w:p>
+        </w:tc>
+        <w:tc>
+          <w:tcPr>
+            <w:tcW w:w="1584" w:type="dxa"/>
+            <w:tcBorders>
+              <w:top w:val="single" w:sz="6" w:space="0" w:color="auto"/>
+              <w:left w:val="nil"/>
+              <w:bottom w:val="nil"/>
+              <w:right w:val="nil"/>
+            </w:tcBorders>
+          </w:tcPr>
+          <w:p>
+            <w:pPr>
+              <w:widowControl w:val="0"/>
+              <w:autoSpaceDE w:val="0"/>
+              <w:autoSpaceDN w:val="0"/>
+              <w:adjustRightInd w:val="0"/>
+              <w:spacing w:after="0" w:line="240" w:lineRule="auto"/>
+              <w:jc w:val="center"/>
+              <w:rPr>
+                <w:rFonts w:ascii="Times New Roman" w:hAnsi="Times New Roman" w:cs="Times New Roman"/>
+                <w:kern w:val="0"/>
+              </w:rPr>
+            </w:pPr>
+            <w:r>
+              <w:rPr>
+                <w:rFonts w:ascii="Times New Roman" w:hAnsi="Times New Roman" w:cs="Times New Roman"/>
+                <w:kern w:val="0"/>
+              </w:rPr>
+              <w:t>(3)</w:t>
+            </w:r>
+          </w:p>
+        </w:tc>
+        <w:tc>
+          <w:tcPr>
             <w:tcW w:w="1440" w:type="dxa"/>
             <w:tcBorders>
               <w:top w:val="single" w:sz="6" w:space="0" w:color="auto"/>
@@ -3101,7 +3369,7 @@
                 <w:rFonts w:ascii="Times New Roman" w:hAnsi="Times New Roman" w:cs="Times New Roman"/>
                 <w:kern w:val="0"/>
               </w:rPr>
-              <w:t>(2)</w:t>
+              <w:t>(4)</w:t>
             </w:r>
           </w:p>
         </w:tc>
@@ -3133,18 +3401,24 @@
                 <w:rFonts w:ascii="Times New Roman" w:hAnsi="Times New Roman" w:cs="Times New Roman"/>
                 <w:kern w:val="0"/>
               </w:rPr>
-              <w:t>(3)</w:t>
+              <w:t>(5)</w:t>
             </w:r>
           </w:p>
         </w:tc>
       </w:tr>
       <w:tr>
+        <w:tblPrEx>
+          <w:tblCellMar>
+            <w:top w:w="0" w:type="dxa"/>
+            <w:bottom w:w="0" w:type="dxa"/>
+          </w:tblCellMar>
+        </w:tblPrEx>
         <w:trPr>
           <w:jc w:val="center"/>
         </w:trPr>
         <w:tc>
           <w:tcPr>
-            <w:tcW w:w="5259" w:type="dxa"/>
+            <w:tcW w:w="2811" w:type="dxa"/>
             <w:tcBorders>
               <w:top w:val="nil"/>
               <w:left w:val="nil"/>
@@ -3201,7 +3475,71 @@
                 <w:rFonts w:ascii="Times New Roman" w:hAnsi="Times New Roman" w:cs="Times New Roman"/>
                 <w:kern w:val="0"/>
               </w:rPr>
-              <w:t>inflation</w:t>
+              <w:t>Inflation</w:t>
+            </w:r>
+          </w:p>
+        </w:tc>
+        <w:tc>
+          <w:tcPr>
+            <w:tcW w:w="1584" w:type="dxa"/>
+            <w:tcBorders>
+              <w:top w:val="nil"/>
+              <w:left w:val="nil"/>
+              <w:bottom w:val="single" w:sz="6" w:space="0" w:color="auto"/>
+              <w:right w:val="nil"/>
+            </w:tcBorders>
+          </w:tcPr>
+          <w:p>
+            <w:pPr>
+              <w:widowControl w:val="0"/>
+              <w:autoSpaceDE w:val="0"/>
+              <w:autoSpaceDN w:val="0"/>
+              <w:adjustRightInd w:val="0"/>
+              <w:spacing w:after="0" w:line="240" w:lineRule="auto"/>
+              <w:jc w:val="center"/>
+              <w:rPr>
+                <w:rFonts w:ascii="Times New Roman" w:hAnsi="Times New Roman" w:cs="Times New Roman"/>
+                <w:kern w:val="0"/>
+              </w:rPr>
+            </w:pPr>
+            <w:r>
+              <w:rPr>
+                <w:rFonts w:ascii="Times New Roman" w:hAnsi="Times New Roman" w:cs="Times New Roman"/>
+                <w:kern w:val="0"/>
+              </w:rPr>
+              <w:t>Inflation</w:t>
+            </w:r>
+          </w:p>
+        </w:tc>
+        <w:tc>
+          <w:tcPr>
+            <w:tcW w:w="1584" w:type="dxa"/>
+            <w:tcBorders>
+              <w:top w:val="nil"/>
+              <w:left w:val="nil"/>
+              <w:bottom w:val="single" w:sz="6" w:space="0" w:color="auto"/>
+              <w:right w:val="nil"/>
+            </w:tcBorders>
+          </w:tcPr>
+          <w:p>
+            <w:pPr>
+              <w:widowControl w:val="0"/>
+              <w:autoSpaceDE w:val="0"/>
+              <w:autoSpaceDN w:val="0"/>
+              <w:adjustRightInd w:val="0"/>
+              <w:spacing w:after="0" w:line="240" w:lineRule="auto"/>
+              <w:jc w:val="center"/>
+              <w:rPr>
+                <w:rFonts w:ascii="Times New Roman" w:hAnsi="Times New Roman" w:cs="Times New Roman"/>
+                <w:kern w:val="0"/>
+              </w:rPr>
+            </w:pPr>
+            <w:r>
+              <w:rPr>
+                <w:rFonts w:ascii="Times New Roman" w:hAnsi="Times New Roman" w:cs="Times New Roman"/>
+                <w:kern w:val="0"/>
+              </w:rPr>
+              <w:t>Inflation</w:t>
             </w:r>
           </w:p>
         </w:tc>
@@ -3233,7 +3571,7 @@
                 <w:rFonts w:ascii="Times New Roman" w:hAnsi="Times New Roman" w:cs="Times New Roman"/>
                 <w:kern w:val="0"/>
               </w:rPr>
-              <w:t>inflation</w:t>
+              <w:t>Inflation</w:t>
             </w:r>
           </w:p>
         </w:tc>
@@ -3265,32 +3603,88 @@
                 <w:rFonts w:ascii="Times New Roman" w:hAnsi="Times New Roman" w:cs="Times New Roman"/>
                 <w:kern w:val="0"/>
               </w:rPr>
-              <w:t>inflation</w:t>
+              <w:t>Inflation</w:t>
             </w:r>
           </w:p>
         </w:tc>
       </w:tr>
       <w:tr>
+        <w:tblPrEx>
+          <w:tblCellMar>
+            <w:top w:w="0" w:type="dxa"/>
+            <w:bottom w:w="0" w:type="dxa"/>
+          </w:tblCellMar>
+        </w:tblPrEx>
         <w:trPr>
           <w:jc w:val="center"/>
         </w:trPr>
         <w:tc>
           <w:tcPr>
-            <w:tcW w:w="5259" w:type="dxa"/>
-            <w:tcBorders>
-              <w:top w:val="nil"/>
-              <w:left w:val="nil"/>
-              <w:bottom w:val="nil"/>
-              <w:right w:val="nil"/>
-            </w:tcBorders>
-          </w:tcPr>
-          <w:p>
-            <w:pPr>
-              <w:widowControl w:val="0"/>
-              <w:autoSpaceDE w:val="0"/>
-              <w:autoSpaceDN w:val="0"/>
-              <w:adjustRightInd w:val="0"/>
-              <w:spacing w:after="0" w:line="240" w:lineRule="auto"/>
+            <w:tcW w:w="2811" w:type="dxa"/>
+            <w:tcBorders>
+              <w:top w:val="nil"/>
+              <w:left w:val="nil"/>
+              <w:bottom w:val="nil"/>
+              <w:right w:val="nil"/>
+            </w:tcBorders>
+          </w:tcPr>
+          <w:p>
+            <w:pPr>
+              <w:widowControl w:val="0"/>
+              <w:autoSpaceDE w:val="0"/>
+              <w:autoSpaceDN w:val="0"/>
+              <w:adjustRightInd w:val="0"/>
+              <w:spacing w:after="0" w:line="240" w:lineRule="auto"/>
+              <w:rPr>
+                <w:rFonts w:ascii="Times New Roman" w:hAnsi="Times New Roman" w:cs="Times New Roman"/>
+                <w:kern w:val="0"/>
+              </w:rPr>
+            </w:pPr>
+          </w:p>
+        </w:tc>
+        <w:tc>
+          <w:tcPr>
+            <w:tcW w:w="1584" w:type="dxa"/>
+            <w:tcBorders>
+              <w:top w:val="nil"/>
+              <w:left w:val="nil"/>
+              <w:bottom w:val="nil"/>
+              <w:right w:val="nil"/>
+            </w:tcBorders>
+          </w:tcPr>
+          <w:p>
+            <w:pPr>
+              <w:widowControl w:val="0"/>
+              <w:autoSpaceDE w:val="0"/>
+              <w:autoSpaceDN w:val="0"/>
+              <w:adjustRightInd w:val="0"/>
+              <w:spacing w:after="0" w:line="240" w:lineRule="auto"/>
+              <w:jc w:val="center"/>
+              <w:rPr>
+                <w:rFonts w:ascii="Times New Roman" w:hAnsi="Times New Roman" w:cs="Times New Roman"/>
+                <w:kern w:val="0"/>
+              </w:rPr>
+            </w:pPr>
+          </w:p>
+        </w:tc>
+        <w:tc>
+          <w:tcPr>
+            <w:tcW w:w="1584" w:type="dxa"/>
+            <w:tcBorders>
+              <w:top w:val="nil"/>
+              <w:left w:val="nil"/>
+              <w:bottom w:val="nil"/>
+              <w:right w:val="nil"/>
+            </w:tcBorders>
+          </w:tcPr>
+          <w:p>
+            <w:pPr>
+              <w:widowControl w:val="0"/>
+              <w:autoSpaceDE w:val="0"/>
+              <w:autoSpaceDN w:val="0"/>
+              <w:adjustRightInd w:val="0"/>
+              <w:spacing w:after="0" w:line="240" w:lineRule="auto"/>
+              <w:jc w:val="center"/>
               <w:rPr>
                 <w:rFonts w:ascii="Times New Roman" w:hAnsi="Times New Roman" w:cs="Times New Roman"/>
                 <w:kern w:val="0"/>
@@ -3375,12 +3769,18 @@
         </w:tc>
       </w:tr>
       <w:tr>
+        <w:tblPrEx>
+          <w:tblCellMar>
+            <w:top w:w="0" w:type="dxa"/>
+            <w:bottom w:w="0" w:type="dxa"/>
+          </w:tblCellMar>
+        </w:tblPrEx>
         <w:trPr>
           <w:jc w:val="center"/>
         </w:trPr>
         <w:tc>
           <w:tcPr>
-            <w:tcW w:w="5259" w:type="dxa"/>
+            <w:tcW w:w="2811" w:type="dxa"/>
             <w:tcBorders>
               <w:top w:val="nil"/>
               <w:left w:val="nil"/>
@@ -3439,6 +3839,56 @@
               </w:rPr>
               <w:t>-3.222***</w:t>
             </w:r>
+          </w:p>
+        </w:tc>
+        <w:tc>
+          <w:tcPr>
+            <w:tcW w:w="1584" w:type="dxa"/>
+            <w:tcBorders>
+              <w:top w:val="nil"/>
+              <w:left w:val="nil"/>
+              <w:bottom w:val="nil"/>
+              <w:right w:val="nil"/>
+            </w:tcBorders>
+          </w:tcPr>
+          <w:p>
+            <w:pPr>
+              <w:widowControl w:val="0"/>
+              <w:autoSpaceDE w:val="0"/>
+              <w:autoSpaceDN w:val="0"/>
+              <w:adjustRightInd w:val="0"/>
+              <w:spacing w:after="0" w:line="240" w:lineRule="auto"/>
+              <w:jc w:val="center"/>
+              <w:rPr>
+                <w:rFonts w:ascii="Times New Roman" w:hAnsi="Times New Roman" w:cs="Times New Roman"/>
+                <w:kern w:val="0"/>
+              </w:rPr>
+            </w:pPr>
+          </w:p>
+        </w:tc>
+        <w:tc>
+          <w:tcPr>
+            <w:tcW w:w="1584" w:type="dxa"/>
+            <w:tcBorders>
+              <w:top w:val="nil"/>
+              <w:left w:val="nil"/>
+              <w:bottom w:val="nil"/>
+              <w:right w:val="nil"/>
+            </w:tcBorders>
+          </w:tcPr>
+          <w:p>
+            <w:pPr>
+              <w:widowControl w:val="0"/>
+              <w:autoSpaceDE w:val="0"/>
+              <w:autoSpaceDN w:val="0"/>
+              <w:adjustRightInd w:val="0"/>
+              <w:spacing w:after="0" w:line="240" w:lineRule="auto"/>
+              <w:jc w:val="center"/>
+              <w:rPr>
+                <w:rFonts w:ascii="Times New Roman" w:hAnsi="Times New Roman" w:cs="Times New Roman"/>
+                <w:kern w:val="0"/>
+              </w:rPr>
+            </w:pPr>
           </w:p>
         </w:tc>
         <w:tc>
@@ -3507,12 +3957,18 @@
         </w:tc>
       </w:tr>
       <w:tr>
+        <w:tblPrEx>
+          <w:tblCellMar>
+            <w:top w:w="0" w:type="dxa"/>
+            <w:bottom w:w="0" w:type="dxa"/>
+          </w:tblCellMar>
+        </w:tblPrEx>
         <w:trPr>
           <w:jc w:val="center"/>
         </w:trPr>
         <w:tc>
           <w:tcPr>
-            <w:tcW w:w="5259" w:type="dxa"/>
+            <w:tcW w:w="2811" w:type="dxa"/>
             <w:tcBorders>
               <w:top w:val="nil"/>
               <w:left w:val="nil"/>
@@ -3564,6 +4020,56 @@
               </w:rPr>
               <w:t>(0.691)</w:t>
             </w:r>
+          </w:p>
+        </w:tc>
+        <w:tc>
+          <w:tcPr>
+            <w:tcW w:w="1584" w:type="dxa"/>
+            <w:tcBorders>
+              <w:top w:val="nil"/>
+              <w:left w:val="nil"/>
+              <w:bottom w:val="nil"/>
+              <w:right w:val="nil"/>
+            </w:tcBorders>
+          </w:tcPr>
+          <w:p>
+            <w:pPr>
+              <w:widowControl w:val="0"/>
+              <w:autoSpaceDE w:val="0"/>
+              <w:autoSpaceDN w:val="0"/>
+              <w:adjustRightInd w:val="0"/>
+              <w:spacing w:after="0" w:line="240" w:lineRule="auto"/>
+              <w:jc w:val="center"/>
+              <w:rPr>
+                <w:rFonts w:ascii="Times New Roman" w:hAnsi="Times New Roman" w:cs="Times New Roman"/>
+                <w:kern w:val="0"/>
+              </w:rPr>
+            </w:pPr>
+          </w:p>
+        </w:tc>
+        <w:tc>
+          <w:tcPr>
+            <w:tcW w:w="1584" w:type="dxa"/>
+            <w:tcBorders>
+              <w:top w:val="nil"/>
+              <w:left w:val="nil"/>
+              <w:bottom w:val="nil"/>
+              <w:right w:val="nil"/>
+            </w:tcBorders>
+          </w:tcPr>
+          <w:p>
+            <w:pPr>
+              <w:widowControl w:val="0"/>
+              <w:autoSpaceDE w:val="0"/>
+              <w:autoSpaceDN w:val="0"/>
+              <w:adjustRightInd w:val="0"/>
+              <w:spacing w:after="0" w:line="240" w:lineRule="auto"/>
+              <w:jc w:val="center"/>
+              <w:rPr>
+                <w:rFonts w:ascii="Times New Roman" w:hAnsi="Times New Roman" w:cs="Times New Roman"/>
+                <w:kern w:val="0"/>
+              </w:rPr>
+            </w:pPr>
           </w:p>
         </w:tc>
         <w:tc>
@@ -3632,12 +4138,18 @@
         </w:tc>
       </w:tr>
       <w:tr>
+        <w:tblPrEx>
+          <w:tblCellMar>
+            <w:top w:w="0" w:type="dxa"/>
+            <w:bottom w:w="0" w:type="dxa"/>
+          </w:tblCellMar>
+        </w:tblPrEx>
         <w:trPr>
           <w:jc w:val="center"/>
         </w:trPr>
         <w:tc>
           <w:tcPr>
-            <w:tcW w:w="5259" w:type="dxa"/>
+            <w:tcW w:w="2811" w:type="dxa"/>
             <w:tcBorders>
               <w:top w:val="nil"/>
               <w:left w:val="nil"/>
@@ -3695,6 +4207,70 @@
                 <w:kern w:val="0"/>
               </w:rPr>
               <w:t>4.56e-06</w:t>
+            </w:r>
+          </w:p>
+        </w:tc>
+        <w:tc>
+          <w:tcPr>
+            <w:tcW w:w="1584" w:type="dxa"/>
+            <w:tcBorders>
+              <w:top w:val="nil"/>
+              <w:left w:val="nil"/>
+              <w:bottom w:val="nil"/>
+              <w:right w:val="nil"/>
+            </w:tcBorders>
+          </w:tcPr>
+          <w:p>
+            <w:pPr>
+              <w:widowControl w:val="0"/>
+              <w:autoSpaceDE w:val="0"/>
+              <w:autoSpaceDN w:val="0"/>
+              <w:adjustRightInd w:val="0"/>
+              <w:spacing w:after="0" w:line="240" w:lineRule="auto"/>
+              <w:jc w:val="center"/>
+              <w:rPr>
+                <w:rFonts w:ascii="Times New Roman" w:hAnsi="Times New Roman" w:cs="Times New Roman"/>
+                <w:kern w:val="0"/>
+              </w:rPr>
+            </w:pPr>
+            <w:r>
+              <w:rPr>
+                <w:rFonts w:ascii="Times New Roman" w:hAnsi="Times New Roman" w:cs="Times New Roman"/>
+                <w:kern w:val="0"/>
+              </w:rPr>
+              <w:t>1.02e-05</w:t>
+            </w:r>
+          </w:p>
+        </w:tc>
+        <w:tc>
+          <w:tcPr>
+            <w:tcW w:w="1584" w:type="dxa"/>
+            <w:tcBorders>
+              <w:top w:val="nil"/>
+              <w:left w:val="nil"/>
+              <w:bottom w:val="nil"/>
+              <w:right w:val="nil"/>
+            </w:tcBorders>
+          </w:tcPr>
+          <w:p>
+            <w:pPr>
+              <w:widowControl w:val="0"/>
+              <w:autoSpaceDE w:val="0"/>
+              <w:autoSpaceDN w:val="0"/>
+              <w:adjustRightInd w:val="0"/>
+              <w:spacing w:after="0" w:line="240" w:lineRule="auto"/>
+              <w:jc w:val="center"/>
+              <w:rPr>
+                <w:rFonts w:ascii="Times New Roman" w:hAnsi="Times New Roman" w:cs="Times New Roman"/>
+                <w:kern w:val="0"/>
+              </w:rPr>
+            </w:pPr>
+            <w:r>
+              <w:rPr>
+                <w:rFonts w:ascii="Times New Roman" w:hAnsi="Times New Roman" w:cs="Times New Roman"/>
+                <w:kern w:val="0"/>
+              </w:rPr>
+              <w:t>6.18e-06</w:t>
             </w:r>
           </w:p>
         </w:tc>
@@ -3764,12 +4340,18 @@
         </w:tc>
       </w:tr>
       <w:tr>
+        <w:tblPrEx>
+          <w:tblCellMar>
+            <w:top w:w="0" w:type="dxa"/>
+            <w:bottom w:w="0" w:type="dxa"/>
+          </w:tblCellMar>
+        </w:tblPrEx>
         <w:trPr>
           <w:jc w:val="center"/>
         </w:trPr>
         <w:tc>
           <w:tcPr>
-            <w:tcW w:w="5259" w:type="dxa"/>
+            <w:tcW w:w="2811" w:type="dxa"/>
             <w:tcBorders>
               <w:top w:val="nil"/>
               <w:left w:val="nil"/>
@@ -3820,6 +4402,70 @@
                 <w:kern w:val="0"/>
               </w:rPr>
               <w:t>(0.000260)</w:t>
+            </w:r>
+          </w:p>
+        </w:tc>
+        <w:tc>
+          <w:tcPr>
+            <w:tcW w:w="1584" w:type="dxa"/>
+            <w:tcBorders>
+              <w:top w:val="nil"/>
+              <w:left w:val="nil"/>
+              <w:bottom w:val="nil"/>
+              <w:right w:val="nil"/>
+            </w:tcBorders>
+          </w:tcPr>
+          <w:p>
+            <w:pPr>
+              <w:widowControl w:val="0"/>
+              <w:autoSpaceDE w:val="0"/>
+              <w:autoSpaceDN w:val="0"/>
+              <w:adjustRightInd w:val="0"/>
+              <w:spacing w:after="0" w:line="240" w:lineRule="auto"/>
+              <w:jc w:val="center"/>
+              <w:rPr>
+                <w:rFonts w:ascii="Times New Roman" w:hAnsi="Times New Roman" w:cs="Times New Roman"/>
+                <w:kern w:val="0"/>
+              </w:rPr>
+            </w:pPr>
+            <w:r>
+              <w:rPr>
+                <w:rFonts w:ascii="Times New Roman" w:hAnsi="Times New Roman" w:cs="Times New Roman"/>
+                <w:kern w:val="0"/>
+              </w:rPr>
+              <w:t>(0.000263)</w:t>
+            </w:r>
+          </w:p>
+        </w:tc>
+        <w:tc>
+          <w:tcPr>
+            <w:tcW w:w="1584" w:type="dxa"/>
+            <w:tcBorders>
+              <w:top w:val="nil"/>
+              <w:left w:val="nil"/>
+              <w:bottom w:val="nil"/>
+              <w:right w:val="nil"/>
+            </w:tcBorders>
+          </w:tcPr>
+          <w:p>
+            <w:pPr>
+              <w:widowControl w:val="0"/>
+              <w:autoSpaceDE w:val="0"/>
+              <w:autoSpaceDN w:val="0"/>
+              <w:adjustRightInd w:val="0"/>
+              <w:spacing w:after="0" w:line="240" w:lineRule="auto"/>
+              <w:jc w:val="center"/>
+              <w:rPr>
+                <w:rFonts w:ascii="Times New Roman" w:hAnsi="Times New Roman" w:cs="Times New Roman"/>
+                <w:kern w:val="0"/>
+              </w:rPr>
+            </w:pPr>
+            <w:r>
+              <w:rPr>
+                <w:rFonts w:ascii="Times New Roman" w:hAnsi="Times New Roman" w:cs="Times New Roman"/>
+                <w:kern w:val="0"/>
+              </w:rPr>
+              <w:t>(0.000256)</w:t>
             </w:r>
           </w:p>
         </w:tc>
@@ -3889,37 +4535,43 @@
         </w:tc>
       </w:tr>
       <w:tr>
+        <w:tblPrEx>
+          <w:tblCellMar>
+            <w:top w:w="0" w:type="dxa"/>
+            <w:bottom w:w="0" w:type="dxa"/>
+          </w:tblCellMar>
+        </w:tblPrEx>
         <w:trPr>
           <w:jc w:val="center"/>
         </w:trPr>
         <w:tc>
           <w:tcPr>
-            <w:tcW w:w="5259" w:type="dxa"/>
-            <w:tcBorders>
-              <w:top w:val="nil"/>
-              <w:left w:val="nil"/>
-              <w:bottom w:val="nil"/>
-              <w:right w:val="nil"/>
-            </w:tcBorders>
-          </w:tcPr>
-          <w:p>
-            <w:pPr>
-              <w:widowControl w:val="0"/>
-              <w:autoSpaceDE w:val="0"/>
-              <w:autoSpaceDN w:val="0"/>
-              <w:adjustRightInd w:val="0"/>
-              <w:spacing w:after="0" w:line="240" w:lineRule="auto"/>
-              <w:rPr>
-                <w:rFonts w:ascii="Times New Roman" w:hAnsi="Times New Roman" w:cs="Times New Roman"/>
-                <w:kern w:val="0"/>
-              </w:rPr>
-            </w:pPr>
-            <w:r>
-              <w:rPr>
-                <w:rFonts w:ascii="Times New Roman" w:hAnsi="Times New Roman" w:cs="Times New Roman"/>
-                <w:kern w:val="0"/>
-              </w:rPr>
-              <w:t>CPIA Avg</w:t>
+            <w:tcW w:w="2811" w:type="dxa"/>
+            <w:tcBorders>
+              <w:top w:val="nil"/>
+              <w:left w:val="nil"/>
+              <w:bottom w:val="nil"/>
+              <w:right w:val="nil"/>
+            </w:tcBorders>
+          </w:tcPr>
+          <w:p>
+            <w:pPr>
+              <w:widowControl w:val="0"/>
+              <w:autoSpaceDE w:val="0"/>
+              <w:autoSpaceDN w:val="0"/>
+              <w:adjustRightInd w:val="0"/>
+              <w:spacing w:after="0" w:line="240" w:lineRule="auto"/>
+              <w:rPr>
+                <w:rFonts w:ascii="Times New Roman" w:hAnsi="Times New Roman" w:cs="Times New Roman"/>
+                <w:kern w:val="0"/>
+              </w:rPr>
+            </w:pPr>
+            <w:r>
+              <w:rPr>
+                <w:rFonts w:ascii="Times New Roman" w:hAnsi="Times New Roman" w:cs="Times New Roman"/>
+                <w:kern w:val="0"/>
+              </w:rPr>
+              <w:t>CPIA_Avg</w:t>
             </w:r>
           </w:p>
         </w:tc>
@@ -3952,6 +4604,70 @@
                 <w:kern w:val="0"/>
               </w:rPr>
               <w:t>3.483**</w:t>
+            </w:r>
+          </w:p>
+        </w:tc>
+        <w:tc>
+          <w:tcPr>
+            <w:tcW w:w="1584" w:type="dxa"/>
+            <w:tcBorders>
+              <w:top w:val="nil"/>
+              <w:left w:val="nil"/>
+              <w:bottom w:val="nil"/>
+              <w:right w:val="nil"/>
+            </w:tcBorders>
+          </w:tcPr>
+          <w:p>
+            <w:pPr>
+              <w:widowControl w:val="0"/>
+              <w:autoSpaceDE w:val="0"/>
+              <w:autoSpaceDN w:val="0"/>
+              <w:adjustRightInd w:val="0"/>
+              <w:spacing w:after="0" w:line="240" w:lineRule="auto"/>
+              <w:jc w:val="center"/>
+              <w:rPr>
+                <w:rFonts w:ascii="Times New Roman" w:hAnsi="Times New Roman" w:cs="Times New Roman"/>
+                <w:kern w:val="0"/>
+              </w:rPr>
+            </w:pPr>
+            <w:r>
+              <w:rPr>
+                <w:rFonts w:ascii="Times New Roman" w:hAnsi="Times New Roman" w:cs="Times New Roman"/>
+                <w:kern w:val="0"/>
+              </w:rPr>
+              <w:t>3.119*</w:t>
+            </w:r>
+          </w:p>
+        </w:tc>
+        <w:tc>
+          <w:tcPr>
+            <w:tcW w:w="1584" w:type="dxa"/>
+            <w:tcBorders>
+              <w:top w:val="nil"/>
+              <w:left w:val="nil"/>
+              <w:bottom w:val="nil"/>
+              <w:right w:val="nil"/>
+            </w:tcBorders>
+          </w:tcPr>
+          <w:p>
+            <w:pPr>
+              <w:widowControl w:val="0"/>
+              <w:autoSpaceDE w:val="0"/>
+              <w:autoSpaceDN w:val="0"/>
+              <w:adjustRightInd w:val="0"/>
+              <w:spacing w:after="0" w:line="240" w:lineRule="auto"/>
+              <w:jc w:val="center"/>
+              <w:rPr>
+                <w:rFonts w:ascii="Times New Roman" w:hAnsi="Times New Roman" w:cs="Times New Roman"/>
+                <w:kern w:val="0"/>
+              </w:rPr>
+            </w:pPr>
+            <w:r>
+              <w:rPr>
+                <w:rFonts w:ascii="Times New Roman" w:hAnsi="Times New Roman" w:cs="Times New Roman"/>
+                <w:kern w:val="0"/>
+              </w:rPr>
+              <w:t>3.565**</w:t>
             </w:r>
           </w:p>
         </w:tc>
@@ -4014,12 +4730,18 @@
         </w:tc>
       </w:tr>
       <w:tr>
+        <w:tblPrEx>
+          <w:tblCellMar>
+            <w:top w:w="0" w:type="dxa"/>
+            <w:bottom w:w="0" w:type="dxa"/>
+          </w:tblCellMar>
+        </w:tblPrEx>
         <w:trPr>
           <w:jc w:val="center"/>
         </w:trPr>
         <w:tc>
           <w:tcPr>
-            <w:tcW w:w="5259" w:type="dxa"/>
+            <w:tcW w:w="2811" w:type="dxa"/>
             <w:tcBorders>
               <w:top w:val="nil"/>
               <w:left w:val="nil"/>
@@ -4070,6 +4792,70 @@
                 <w:kern w:val="0"/>
               </w:rPr>
               <w:t>(1.737)</w:t>
+            </w:r>
+          </w:p>
+        </w:tc>
+        <w:tc>
+          <w:tcPr>
+            <w:tcW w:w="1584" w:type="dxa"/>
+            <w:tcBorders>
+              <w:top w:val="nil"/>
+              <w:left w:val="nil"/>
+              <w:bottom w:val="nil"/>
+              <w:right w:val="nil"/>
+            </w:tcBorders>
+          </w:tcPr>
+          <w:p>
+            <w:pPr>
+              <w:widowControl w:val="0"/>
+              <w:autoSpaceDE w:val="0"/>
+              <w:autoSpaceDN w:val="0"/>
+              <w:adjustRightInd w:val="0"/>
+              <w:spacing w:after="0" w:line="240" w:lineRule="auto"/>
+              <w:jc w:val="center"/>
+              <w:rPr>
+                <w:rFonts w:ascii="Times New Roman" w:hAnsi="Times New Roman" w:cs="Times New Roman"/>
+                <w:kern w:val="0"/>
+              </w:rPr>
+            </w:pPr>
+            <w:r>
+              <w:rPr>
+                <w:rFonts w:ascii="Times New Roman" w:hAnsi="Times New Roman" w:cs="Times New Roman"/>
+                <w:kern w:val="0"/>
+              </w:rPr>
+              <w:t>(1.710)</w:t>
+            </w:r>
+          </w:p>
+        </w:tc>
+        <w:tc>
+          <w:tcPr>
+            <w:tcW w:w="1584" w:type="dxa"/>
+            <w:tcBorders>
+              <w:top w:val="nil"/>
+              <w:left w:val="nil"/>
+              <w:bottom w:val="nil"/>
+              <w:right w:val="nil"/>
+            </w:tcBorders>
+          </w:tcPr>
+          <w:p>
+            <w:pPr>
+              <w:widowControl w:val="0"/>
+              <w:autoSpaceDE w:val="0"/>
+              <w:autoSpaceDN w:val="0"/>
+              <w:adjustRightInd w:val="0"/>
+              <w:spacing w:after="0" w:line="240" w:lineRule="auto"/>
+              <w:jc w:val="center"/>
+              <w:rPr>
+                <w:rFonts w:ascii="Times New Roman" w:hAnsi="Times New Roman" w:cs="Times New Roman"/>
+                <w:kern w:val="0"/>
+              </w:rPr>
+            </w:pPr>
+            <w:r>
+              <w:rPr>
+                <w:rFonts w:ascii="Times New Roman" w:hAnsi="Times New Roman" w:cs="Times New Roman"/>
+                <w:kern w:val="0"/>
+              </w:rPr>
+              <w:t>(1.742)</w:t>
             </w:r>
           </w:p>
         </w:tc>
@@ -4132,37 +4918,43 @@
         </w:tc>
       </w:tr>
       <w:tr>
+        <w:tblPrEx>
+          <w:tblCellMar>
+            <w:top w:w="0" w:type="dxa"/>
+            <w:bottom w:w="0" w:type="dxa"/>
+          </w:tblCellMar>
+        </w:tblPrEx>
         <w:trPr>
           <w:jc w:val="center"/>
         </w:trPr>
         <w:tc>
           <w:tcPr>
-            <w:tcW w:w="5259" w:type="dxa"/>
-            <w:tcBorders>
-              <w:top w:val="nil"/>
-              <w:left w:val="nil"/>
-              <w:bottom w:val="nil"/>
-              <w:right w:val="nil"/>
-            </w:tcBorders>
-          </w:tcPr>
-          <w:p>
-            <w:pPr>
-              <w:widowControl w:val="0"/>
-              <w:autoSpaceDE w:val="0"/>
-              <w:autoSpaceDN w:val="0"/>
-              <w:adjustRightInd w:val="0"/>
-              <w:spacing w:after="0" w:line="240" w:lineRule="auto"/>
-              <w:rPr>
-                <w:rFonts w:ascii="Times New Roman" w:hAnsi="Times New Roman" w:cs="Times New Roman"/>
-                <w:kern w:val="0"/>
-              </w:rPr>
-            </w:pPr>
-            <w:r>
-              <w:rPr>
-                <w:rFonts w:ascii="Times New Roman" w:hAnsi="Times New Roman" w:cs="Times New Roman"/>
-                <w:kern w:val="0"/>
-              </w:rPr>
-              <w:t>Credit</w:t>
+            <w:tcW w:w="2811" w:type="dxa"/>
+            <w:tcBorders>
+              <w:top w:val="nil"/>
+              <w:left w:val="nil"/>
+              <w:bottom w:val="nil"/>
+              <w:right w:val="nil"/>
+            </w:tcBorders>
+          </w:tcPr>
+          <w:p>
+            <w:pPr>
+              <w:widowControl w:val="0"/>
+              <w:autoSpaceDE w:val="0"/>
+              <w:autoSpaceDN w:val="0"/>
+              <w:adjustRightInd w:val="0"/>
+              <w:spacing w:after="0" w:line="240" w:lineRule="auto"/>
+              <w:rPr>
+                <w:rFonts w:ascii="Times New Roman" w:hAnsi="Times New Roman" w:cs="Times New Roman"/>
+                <w:kern w:val="0"/>
+              </w:rPr>
+            </w:pPr>
+            <w:r>
+              <w:rPr>
+                <w:rFonts w:ascii="Times New Roman" w:hAnsi="Times New Roman" w:cs="Times New Roman"/>
+                <w:kern w:val="0"/>
+              </w:rPr>
+              <w:t>Credit Financial</w:t>
             </w:r>
           </w:p>
         </w:tc>
@@ -4195,6 +4987,70 @@
                 <w:kern w:val="0"/>
               </w:rPr>
               <w:t>-0.0773***</w:t>
+            </w:r>
+          </w:p>
+        </w:tc>
+        <w:tc>
+          <w:tcPr>
+            <w:tcW w:w="1584" w:type="dxa"/>
+            <w:tcBorders>
+              <w:top w:val="nil"/>
+              <w:left w:val="nil"/>
+              <w:bottom w:val="nil"/>
+              <w:right w:val="nil"/>
+            </w:tcBorders>
+          </w:tcPr>
+          <w:p>
+            <w:pPr>
+              <w:widowControl w:val="0"/>
+              <w:autoSpaceDE w:val="0"/>
+              <w:autoSpaceDN w:val="0"/>
+              <w:adjustRightInd w:val="0"/>
+              <w:spacing w:after="0" w:line="240" w:lineRule="auto"/>
+              <w:jc w:val="center"/>
+              <w:rPr>
+                <w:rFonts w:ascii="Times New Roman" w:hAnsi="Times New Roman" w:cs="Times New Roman"/>
+                <w:kern w:val="0"/>
+              </w:rPr>
+            </w:pPr>
+            <w:r>
+              <w:rPr>
+                <w:rFonts w:ascii="Times New Roman" w:hAnsi="Times New Roman" w:cs="Times New Roman"/>
+                <w:kern w:val="0"/>
+              </w:rPr>
+              <w:t>-0.0784***</w:t>
+            </w:r>
+          </w:p>
+        </w:tc>
+        <w:tc>
+          <w:tcPr>
+            <w:tcW w:w="1584" w:type="dxa"/>
+            <w:tcBorders>
+              <w:top w:val="nil"/>
+              <w:left w:val="nil"/>
+              <w:bottom w:val="nil"/>
+              <w:right w:val="nil"/>
+            </w:tcBorders>
+          </w:tcPr>
+          <w:p>
+            <w:pPr>
+              <w:widowControl w:val="0"/>
+              <w:autoSpaceDE w:val="0"/>
+              <w:autoSpaceDN w:val="0"/>
+              <w:adjustRightInd w:val="0"/>
+              <w:spacing w:after="0" w:line="240" w:lineRule="auto"/>
+              <w:jc w:val="center"/>
+              <w:rPr>
+                <w:rFonts w:ascii="Times New Roman" w:hAnsi="Times New Roman" w:cs="Times New Roman"/>
+                <w:kern w:val="0"/>
+              </w:rPr>
+            </w:pPr>
+            <w:r>
+              <w:rPr>
+                <w:rFonts w:ascii="Times New Roman" w:hAnsi="Times New Roman" w:cs="Times New Roman"/>
+                <w:kern w:val="0"/>
+              </w:rPr>
+              <w:t>-0.0744***</w:t>
             </w:r>
           </w:p>
         </w:tc>
@@ -4257,12 +5113,18 @@
         </w:tc>
       </w:tr>
       <w:tr>
+        <w:tblPrEx>
+          <w:tblCellMar>
+            <w:top w:w="0" w:type="dxa"/>
+            <w:bottom w:w="0" w:type="dxa"/>
+          </w:tblCellMar>
+        </w:tblPrEx>
         <w:trPr>
           <w:jc w:val="center"/>
         </w:trPr>
         <w:tc>
           <w:tcPr>
-            <w:tcW w:w="5259" w:type="dxa"/>
+            <w:tcW w:w="2811" w:type="dxa"/>
             <w:tcBorders>
               <w:top w:val="nil"/>
               <w:left w:val="nil"/>
@@ -4313,6 +5175,70 @@
                 <w:kern w:val="0"/>
               </w:rPr>
               <w:t>(0.0219)</w:t>
+            </w:r>
+          </w:p>
+        </w:tc>
+        <w:tc>
+          <w:tcPr>
+            <w:tcW w:w="1584" w:type="dxa"/>
+            <w:tcBorders>
+              <w:top w:val="nil"/>
+              <w:left w:val="nil"/>
+              <w:bottom w:val="nil"/>
+              <w:right w:val="nil"/>
+            </w:tcBorders>
+          </w:tcPr>
+          <w:p>
+            <w:pPr>
+              <w:widowControl w:val="0"/>
+              <w:autoSpaceDE w:val="0"/>
+              <w:autoSpaceDN w:val="0"/>
+              <w:adjustRightInd w:val="0"/>
+              <w:spacing w:after="0" w:line="240" w:lineRule="auto"/>
+              <w:jc w:val="center"/>
+              <w:rPr>
+                <w:rFonts w:ascii="Times New Roman" w:hAnsi="Times New Roman" w:cs="Times New Roman"/>
+                <w:kern w:val="0"/>
+              </w:rPr>
+            </w:pPr>
+            <w:r>
+              <w:rPr>
+                <w:rFonts w:ascii="Times New Roman" w:hAnsi="Times New Roman" w:cs="Times New Roman"/>
+                <w:kern w:val="0"/>
+              </w:rPr>
+              <w:t>(0.0223)</w:t>
+            </w:r>
+          </w:p>
+        </w:tc>
+        <w:tc>
+          <w:tcPr>
+            <w:tcW w:w="1584" w:type="dxa"/>
+            <w:tcBorders>
+              <w:top w:val="nil"/>
+              <w:left w:val="nil"/>
+              <w:bottom w:val="nil"/>
+              <w:right w:val="nil"/>
+            </w:tcBorders>
+          </w:tcPr>
+          <w:p>
+            <w:pPr>
+              <w:widowControl w:val="0"/>
+              <w:autoSpaceDE w:val="0"/>
+              <w:autoSpaceDN w:val="0"/>
+              <w:adjustRightInd w:val="0"/>
+              <w:spacing w:after="0" w:line="240" w:lineRule="auto"/>
+              <w:jc w:val="center"/>
+              <w:rPr>
+                <w:rFonts w:ascii="Times New Roman" w:hAnsi="Times New Roman" w:cs="Times New Roman"/>
+                <w:kern w:val="0"/>
+              </w:rPr>
+            </w:pPr>
+            <w:r>
+              <w:rPr>
+                <w:rFonts w:ascii="Times New Roman" w:hAnsi="Times New Roman" w:cs="Times New Roman"/>
+                <w:kern w:val="0"/>
+              </w:rPr>
+              <w:t>(0.0214)</w:t>
             </w:r>
           </w:p>
         </w:tc>
@@ -4375,37 +5301,43 @@
         </w:tc>
       </w:tr>
       <w:tr>
+        <w:tblPrEx>
+          <w:tblCellMar>
+            <w:top w:w="0" w:type="dxa"/>
+            <w:bottom w:w="0" w:type="dxa"/>
+          </w:tblCellMar>
+        </w:tblPrEx>
         <w:trPr>
           <w:jc w:val="center"/>
         </w:trPr>
         <w:tc>
           <w:tcPr>
-            <w:tcW w:w="5259" w:type="dxa"/>
-            <w:tcBorders>
-              <w:top w:val="nil"/>
-              <w:left w:val="nil"/>
-              <w:bottom w:val="nil"/>
-              <w:right w:val="nil"/>
-            </w:tcBorders>
-          </w:tcPr>
-          <w:p>
-            <w:pPr>
-              <w:widowControl w:val="0"/>
-              <w:autoSpaceDE w:val="0"/>
-              <w:autoSpaceDN w:val="0"/>
-              <w:adjustRightInd w:val="0"/>
-              <w:spacing w:after="0" w:line="240" w:lineRule="auto"/>
-              <w:rPr>
-                <w:rFonts w:ascii="Times New Roman" w:hAnsi="Times New Roman" w:cs="Times New Roman"/>
-                <w:kern w:val="0"/>
-              </w:rPr>
-            </w:pPr>
-            <w:r>
-              <w:rPr>
-                <w:rFonts w:ascii="Times New Roman" w:hAnsi="Times New Roman" w:cs="Times New Roman"/>
-                <w:kern w:val="0"/>
-              </w:rPr>
-              <w:t>Macro x Export (Interaction Term)</w:t>
+            <w:tcW w:w="2811" w:type="dxa"/>
+            <w:tcBorders>
+              <w:top w:val="nil"/>
+              <w:left w:val="nil"/>
+              <w:bottom w:val="nil"/>
+              <w:right w:val="nil"/>
+            </w:tcBorders>
+          </w:tcPr>
+          <w:p>
+            <w:pPr>
+              <w:widowControl w:val="0"/>
+              <w:autoSpaceDE w:val="0"/>
+              <w:autoSpaceDN w:val="0"/>
+              <w:adjustRightInd w:val="0"/>
+              <w:spacing w:after="0" w:line="240" w:lineRule="auto"/>
+              <w:rPr>
+                <w:rFonts w:ascii="Times New Roman" w:hAnsi="Times New Roman" w:cs="Times New Roman"/>
+                <w:kern w:val="0"/>
+              </w:rPr>
+            </w:pPr>
+            <w:r>
+              <w:rPr>
+                <w:rFonts w:ascii="Times New Roman" w:hAnsi="Times New Roman" w:cs="Times New Roman"/>
+                <w:kern w:val="0"/>
+              </w:rPr>
+              <w:t>Macro^2</w:t>
             </w:r>
           </w:p>
         </w:tc>
@@ -4436,6 +5368,63 @@
         </w:tc>
         <w:tc>
           <w:tcPr>
+            <w:tcW w:w="1584" w:type="dxa"/>
+            <w:tcBorders>
+              <w:top w:val="nil"/>
+              <w:left w:val="nil"/>
+              <w:bottom w:val="nil"/>
+              <w:right w:val="nil"/>
+            </w:tcBorders>
+          </w:tcPr>
+          <w:p>
+            <w:pPr>
+              <w:widowControl w:val="0"/>
+              <w:autoSpaceDE w:val="0"/>
+              <w:autoSpaceDN w:val="0"/>
+              <w:adjustRightInd w:val="0"/>
+              <w:spacing w:after="0" w:line="240" w:lineRule="auto"/>
+              <w:jc w:val="center"/>
+              <w:rPr>
+                <w:rFonts w:ascii="Times New Roman" w:hAnsi="Times New Roman" w:cs="Times New Roman"/>
+                <w:kern w:val="0"/>
+              </w:rPr>
+            </w:pPr>
+            <w:r>
+              <w:rPr>
+                <w:rFonts w:ascii="Times New Roman" w:hAnsi="Times New Roman" w:cs="Times New Roman"/>
+                <w:kern w:val="0"/>
+              </w:rPr>
+              <w:t>-0.408***</w:t>
+            </w:r>
+          </w:p>
+        </w:tc>
+        <w:tc>
+          <w:tcPr>
+            <w:tcW w:w="1584" w:type="dxa"/>
+            <w:tcBorders>
+              <w:top w:val="nil"/>
+              <w:left w:val="nil"/>
+              <w:bottom w:val="nil"/>
+              <w:right w:val="nil"/>
+            </w:tcBorders>
+          </w:tcPr>
+          <w:p>
+            <w:pPr>
+              <w:widowControl w:val="0"/>
+              <w:autoSpaceDE w:val="0"/>
+              <w:autoSpaceDN w:val="0"/>
+              <w:adjustRightInd w:val="0"/>
+              <w:spacing w:after="0" w:line="240" w:lineRule="auto"/>
+              <w:jc w:val="center"/>
+              <w:rPr>
+                <w:rFonts w:ascii="Times New Roman" w:hAnsi="Times New Roman" w:cs="Times New Roman"/>
+                <w:kern w:val="0"/>
+              </w:rPr>
+            </w:pPr>
+          </w:p>
+        </w:tc>
+        <w:tc>
+          <w:tcPr>
             <w:tcW w:w="1440" w:type="dxa"/>
             <w:tcBorders>
               <w:top w:val="nil"/>
@@ -4457,13 +5446,6 @@
                 <w:kern w:val="0"/>
               </w:rPr>
             </w:pPr>
-            <w:r>
-              <w:rPr>
-                <w:rFonts w:ascii="Times New Roman" w:hAnsi="Times New Roman" w:cs="Times New Roman"/>
-                <w:kern w:val="0"/>
-              </w:rPr>
-              <w:t>1.703</w:t>
-            </w:r>
           </w:p>
         </w:tc>
         <w:tc>
@@ -4489,23 +5471,22 @@
                 <w:kern w:val="0"/>
               </w:rPr>
             </w:pPr>
-            <w:r>
-              <w:rPr>
-                <w:rFonts w:ascii="Times New Roman" w:hAnsi="Times New Roman" w:cs="Times New Roman"/>
-                <w:kern w:val="0"/>
-              </w:rPr>
-              <w:t>0.00792*</w:t>
-            </w:r>
           </w:p>
         </w:tc>
       </w:tr>
       <w:tr>
+        <w:tblPrEx>
+          <w:tblCellMar>
+            <w:top w:w="0" w:type="dxa"/>
+            <w:bottom w:w="0" w:type="dxa"/>
+          </w:tblCellMar>
+        </w:tblPrEx>
         <w:trPr>
           <w:jc w:val="center"/>
         </w:trPr>
         <w:tc>
           <w:tcPr>
-            <w:tcW w:w="5259" w:type="dxa"/>
+            <w:tcW w:w="2811" w:type="dxa"/>
             <w:tcBorders>
               <w:top w:val="nil"/>
               <w:left w:val="nil"/>
@@ -4554,6 +5535,63 @@
         </w:tc>
         <w:tc>
           <w:tcPr>
+            <w:tcW w:w="1584" w:type="dxa"/>
+            <w:tcBorders>
+              <w:top w:val="nil"/>
+              <w:left w:val="nil"/>
+              <w:bottom w:val="nil"/>
+              <w:right w:val="nil"/>
+            </w:tcBorders>
+          </w:tcPr>
+          <w:p>
+            <w:pPr>
+              <w:widowControl w:val="0"/>
+              <w:autoSpaceDE w:val="0"/>
+              <w:autoSpaceDN w:val="0"/>
+              <w:adjustRightInd w:val="0"/>
+              <w:spacing w:after="0" w:line="240" w:lineRule="auto"/>
+              <w:jc w:val="center"/>
+              <w:rPr>
+                <w:rFonts w:ascii="Times New Roman" w:hAnsi="Times New Roman" w:cs="Times New Roman"/>
+                <w:kern w:val="0"/>
+              </w:rPr>
+            </w:pPr>
+            <w:r>
+              <w:rPr>
+                <w:rFonts w:ascii="Times New Roman" w:hAnsi="Times New Roman" w:cs="Times New Roman"/>
+                <w:kern w:val="0"/>
+              </w:rPr>
+              <w:t>(0.0890)</w:t>
+            </w:r>
+          </w:p>
+        </w:tc>
+        <w:tc>
+          <w:tcPr>
+            <w:tcW w:w="1584" w:type="dxa"/>
+            <w:tcBorders>
+              <w:top w:val="nil"/>
+              <w:left w:val="nil"/>
+              <w:bottom w:val="nil"/>
+              <w:right w:val="nil"/>
+            </w:tcBorders>
+          </w:tcPr>
+          <w:p>
+            <w:pPr>
+              <w:widowControl w:val="0"/>
+              <w:autoSpaceDE w:val="0"/>
+              <w:autoSpaceDN w:val="0"/>
+              <w:adjustRightInd w:val="0"/>
+              <w:spacing w:after="0" w:line="240" w:lineRule="auto"/>
+              <w:jc w:val="center"/>
+              <w:rPr>
+                <w:rFonts w:ascii="Times New Roman" w:hAnsi="Times New Roman" w:cs="Times New Roman"/>
+                <w:kern w:val="0"/>
+              </w:rPr>
+            </w:pPr>
+          </w:p>
+        </w:tc>
+        <w:tc>
+          <w:tcPr>
             <w:tcW w:w="1440" w:type="dxa"/>
             <w:tcBorders>
               <w:top w:val="nil"/>
@@ -4575,13 +5613,6 @@
                 <w:kern w:val="0"/>
               </w:rPr>
             </w:pPr>
-            <w:r>
-              <w:rPr>
-                <w:rFonts w:ascii="Times New Roman" w:hAnsi="Times New Roman" w:cs="Times New Roman"/>
-                <w:kern w:val="0"/>
-              </w:rPr>
-              <w:t>(1.610)</w:t>
-            </w:r>
           </w:p>
         </w:tc>
         <w:tc>
@@ -4607,48 +5638,47 @@
                 <w:kern w:val="0"/>
               </w:rPr>
             </w:pPr>
-            <w:r>
-              <w:rPr>
-                <w:rFonts w:ascii="Times New Roman" w:hAnsi="Times New Roman" w:cs="Times New Roman"/>
-                <w:kern w:val="0"/>
-              </w:rPr>
-              <w:t>(0.00407)</w:t>
-            </w:r>
           </w:p>
         </w:tc>
       </w:tr>
       <w:tr>
+        <w:tblPrEx>
+          <w:tblCellMar>
+            <w:top w:w="0" w:type="dxa"/>
+            <w:bottom w:w="0" w:type="dxa"/>
+          </w:tblCellMar>
+        </w:tblPrEx>
         <w:trPr>
           <w:jc w:val="center"/>
         </w:trPr>
         <w:tc>
           <w:tcPr>
-            <w:tcW w:w="5259" w:type="dxa"/>
-            <w:tcBorders>
-              <w:top w:val="nil"/>
-              <w:left w:val="nil"/>
-              <w:bottom w:val="nil"/>
-              <w:right w:val="nil"/>
-            </w:tcBorders>
-          </w:tcPr>
-          <w:p>
-            <w:pPr>
-              <w:widowControl w:val="0"/>
-              <w:autoSpaceDE w:val="0"/>
-              <w:autoSpaceDN w:val="0"/>
-              <w:adjustRightInd w:val="0"/>
-              <w:spacing w:after="0" w:line="240" w:lineRule="auto"/>
-              <w:rPr>
-                <w:rFonts w:ascii="Times New Roman" w:hAnsi="Times New Roman" w:cs="Times New Roman"/>
-                <w:kern w:val="0"/>
-              </w:rPr>
-            </w:pPr>
-            <w:r>
-              <w:rPr>
-                <w:rFonts w:ascii="Times New Roman" w:hAnsi="Times New Roman" w:cs="Times New Roman"/>
-                <w:kern w:val="0"/>
-              </w:rPr>
-              <w:t>Constant</w:t>
+            <w:tcW w:w="2811" w:type="dxa"/>
+            <w:tcBorders>
+              <w:top w:val="nil"/>
+              <w:left w:val="nil"/>
+              <w:bottom w:val="nil"/>
+              <w:right w:val="nil"/>
+            </w:tcBorders>
+          </w:tcPr>
+          <w:p>
+            <w:pPr>
+              <w:widowControl w:val="0"/>
+              <w:autoSpaceDE w:val="0"/>
+              <w:autoSpaceDN w:val="0"/>
+              <w:adjustRightInd w:val="0"/>
+              <w:spacing w:after="0" w:line="240" w:lineRule="auto"/>
+              <w:rPr>
+                <w:rFonts w:ascii="Times New Roman" w:hAnsi="Times New Roman" w:cs="Times New Roman"/>
+                <w:kern w:val="0"/>
+              </w:rPr>
+            </w:pPr>
+            <w:r>
+              <w:rPr>
+                <w:rFonts w:ascii="Times New Roman" w:hAnsi="Times New Roman" w:cs="Times New Roman"/>
+                <w:kern w:val="0"/>
+              </w:rPr>
+              <w:t>Log(Macro)</w:t>
             </w:r>
           </w:p>
         </w:tc>
@@ -4675,12 +5705,62 @@
                 <w:kern w:val="0"/>
               </w:rPr>
             </w:pPr>
-            <w:r>
-              <w:rPr>
-                <w:rFonts w:ascii="Times New Roman" w:hAnsi="Times New Roman" w:cs="Times New Roman"/>
-                <w:kern w:val="0"/>
-              </w:rPr>
-              <w:t>10.51**</w:t>
+          </w:p>
+        </w:tc>
+        <w:tc>
+          <w:tcPr>
+            <w:tcW w:w="1584" w:type="dxa"/>
+            <w:tcBorders>
+              <w:top w:val="nil"/>
+              <w:left w:val="nil"/>
+              <w:bottom w:val="nil"/>
+              <w:right w:val="nil"/>
+            </w:tcBorders>
+          </w:tcPr>
+          <w:p>
+            <w:pPr>
+              <w:widowControl w:val="0"/>
+              <w:autoSpaceDE w:val="0"/>
+              <w:autoSpaceDN w:val="0"/>
+              <w:adjustRightInd w:val="0"/>
+              <w:spacing w:after="0" w:line="240" w:lineRule="auto"/>
+              <w:jc w:val="center"/>
+              <w:rPr>
+                <w:rFonts w:ascii="Times New Roman" w:hAnsi="Times New Roman" w:cs="Times New Roman"/>
+                <w:kern w:val="0"/>
+              </w:rPr>
+            </w:pPr>
+          </w:p>
+        </w:tc>
+        <w:tc>
+          <w:tcPr>
+            <w:tcW w:w="1584" w:type="dxa"/>
+            <w:tcBorders>
+              <w:top w:val="nil"/>
+              <w:left w:val="nil"/>
+              <w:bottom w:val="nil"/>
+              <w:right w:val="nil"/>
+            </w:tcBorders>
+          </w:tcPr>
+          <w:p>
+            <w:pPr>
+              <w:widowControl w:val="0"/>
+              <w:autoSpaceDE w:val="0"/>
+              <w:autoSpaceDN w:val="0"/>
+              <w:adjustRightInd w:val="0"/>
+              <w:spacing w:after="0" w:line="240" w:lineRule="auto"/>
+              <w:jc w:val="center"/>
+              <w:rPr>
+                <w:rFonts w:ascii="Times New Roman" w:hAnsi="Times New Roman" w:cs="Times New Roman"/>
+                <w:kern w:val="0"/>
+              </w:rPr>
+            </w:pPr>
+            <w:r>
+              <w:rPr>
+                <w:rFonts w:ascii="Times New Roman" w:hAnsi="Times New Roman" w:cs="Times New Roman"/>
+                <w:kern w:val="0"/>
+              </w:rPr>
+              <w:t>-11.53***</w:t>
             </w:r>
           </w:p>
         </w:tc>
@@ -4707,13 +5787,6 @@
                 <w:kern w:val="0"/>
               </w:rPr>
             </w:pPr>
-            <w:r>
-              <w:rPr>
-                <w:rFonts w:ascii="Times New Roman" w:hAnsi="Times New Roman" w:cs="Times New Roman"/>
-                <w:kern w:val="0"/>
-              </w:rPr>
-              <w:t>2,376</w:t>
-            </w:r>
           </w:p>
         </w:tc>
         <w:tc>
@@ -4739,23 +5812,22 @@
                 <w:kern w:val="0"/>
               </w:rPr>
             </w:pPr>
-            <w:r>
-              <w:rPr>
-                <w:rFonts w:ascii="Times New Roman" w:hAnsi="Times New Roman" w:cs="Times New Roman"/>
-                <w:kern w:val="0"/>
-              </w:rPr>
-              <w:t>16.67**</w:t>
-            </w:r>
           </w:p>
         </w:tc>
       </w:tr>
       <w:tr>
+        <w:tblPrEx>
+          <w:tblCellMar>
+            <w:top w:w="0" w:type="dxa"/>
+            <w:bottom w:w="0" w:type="dxa"/>
+          </w:tblCellMar>
+        </w:tblPrEx>
         <w:trPr>
           <w:jc w:val="center"/>
         </w:trPr>
         <w:tc>
           <w:tcPr>
-            <w:tcW w:w="5259" w:type="dxa"/>
+            <w:tcW w:w="2811" w:type="dxa"/>
             <w:tcBorders>
               <w:top w:val="nil"/>
               <w:left w:val="nil"/>
@@ -4800,12 +5872,62 @@
                 <w:kern w:val="0"/>
               </w:rPr>
             </w:pPr>
-            <w:r>
-              <w:rPr>
-                <w:rFonts w:ascii="Times New Roman" w:hAnsi="Times New Roman" w:cs="Times New Roman"/>
-                <w:kern w:val="0"/>
-              </w:rPr>
-              <w:t>(5.149)</w:t>
+          </w:p>
+        </w:tc>
+        <w:tc>
+          <w:tcPr>
+            <w:tcW w:w="1584" w:type="dxa"/>
+            <w:tcBorders>
+              <w:top w:val="nil"/>
+              <w:left w:val="nil"/>
+              <w:bottom w:val="nil"/>
+              <w:right w:val="nil"/>
+            </w:tcBorders>
+          </w:tcPr>
+          <w:p>
+            <w:pPr>
+              <w:widowControl w:val="0"/>
+              <w:autoSpaceDE w:val="0"/>
+              <w:autoSpaceDN w:val="0"/>
+              <w:adjustRightInd w:val="0"/>
+              <w:spacing w:after="0" w:line="240" w:lineRule="auto"/>
+              <w:jc w:val="center"/>
+              <w:rPr>
+                <w:rFonts w:ascii="Times New Roman" w:hAnsi="Times New Roman" w:cs="Times New Roman"/>
+                <w:kern w:val="0"/>
+              </w:rPr>
+            </w:pPr>
+          </w:p>
+        </w:tc>
+        <w:tc>
+          <w:tcPr>
+            <w:tcW w:w="1584" w:type="dxa"/>
+            <w:tcBorders>
+              <w:top w:val="nil"/>
+              <w:left w:val="nil"/>
+              <w:bottom w:val="nil"/>
+              <w:right w:val="nil"/>
+            </w:tcBorders>
+          </w:tcPr>
+          <w:p>
+            <w:pPr>
+              <w:widowControl w:val="0"/>
+              <w:autoSpaceDE w:val="0"/>
+              <w:autoSpaceDN w:val="0"/>
+              <w:adjustRightInd w:val="0"/>
+              <w:spacing w:after="0" w:line="240" w:lineRule="auto"/>
+              <w:jc w:val="center"/>
+              <w:rPr>
+                <w:rFonts w:ascii="Times New Roman" w:hAnsi="Times New Roman" w:cs="Times New Roman"/>
+                <w:kern w:val="0"/>
+              </w:rPr>
+            </w:pPr>
+            <w:r>
+              <w:rPr>
+                <w:rFonts w:ascii="Times New Roman" w:hAnsi="Times New Roman" w:cs="Times New Roman"/>
+                <w:kern w:val="0"/>
+              </w:rPr>
+              <w:t>(2.462)</w:t>
             </w:r>
           </w:p>
         </w:tc>
@@ -4832,13 +5954,6 @@
                 <w:kern w:val="0"/>
               </w:rPr>
             </w:pPr>
-            <w:r>
-              <w:rPr>
-                <w:rFonts w:ascii="Times New Roman" w:hAnsi="Times New Roman" w:cs="Times New Roman"/>
-                <w:kern w:val="0"/>
-              </w:rPr>
-              <w:t>(2,169)</w:t>
-            </w:r>
           </w:p>
         </w:tc>
         <w:tc>
@@ -4864,42 +5979,48 @@
                 <w:kern w:val="0"/>
               </w:rPr>
             </w:pPr>
-            <w:r>
-              <w:rPr>
-                <w:rFonts w:ascii="Times New Roman" w:hAnsi="Times New Roman" w:cs="Times New Roman"/>
-                <w:kern w:val="0"/>
-              </w:rPr>
-              <w:t>(6.451)</w:t>
-            </w:r>
           </w:p>
         </w:tc>
       </w:tr>
       <w:tr>
+        <w:tblPrEx>
+          <w:tblCellMar>
+            <w:top w:w="0" w:type="dxa"/>
+            <w:bottom w:w="0" w:type="dxa"/>
+          </w:tblCellMar>
+        </w:tblPrEx>
         <w:trPr>
           <w:jc w:val="center"/>
         </w:trPr>
         <w:tc>
           <w:tcPr>
-            <w:tcW w:w="5259" w:type="dxa"/>
-            <w:tcBorders>
-              <w:top w:val="nil"/>
-              <w:left w:val="nil"/>
-              <w:bottom w:val="nil"/>
-              <w:right w:val="nil"/>
-            </w:tcBorders>
-          </w:tcPr>
-          <w:p>
-            <w:pPr>
-              <w:widowControl w:val="0"/>
-              <w:autoSpaceDE w:val="0"/>
-              <w:autoSpaceDN w:val="0"/>
-              <w:adjustRightInd w:val="0"/>
-              <w:spacing w:after="0" w:line="240" w:lineRule="auto"/>
-              <w:rPr>
-                <w:rFonts w:ascii="Times New Roman" w:hAnsi="Times New Roman" w:cs="Times New Roman"/>
-                <w:kern w:val="0"/>
-              </w:rPr>
-            </w:pPr>
+            <w:tcW w:w="2811" w:type="dxa"/>
+            <w:tcBorders>
+              <w:top w:val="nil"/>
+              <w:left w:val="nil"/>
+              <w:bottom w:val="nil"/>
+              <w:right w:val="nil"/>
+            </w:tcBorders>
+          </w:tcPr>
+          <w:p>
+            <w:pPr>
+              <w:widowControl w:val="0"/>
+              <w:autoSpaceDE w:val="0"/>
+              <w:autoSpaceDN w:val="0"/>
+              <w:adjustRightInd w:val="0"/>
+              <w:spacing w:after="0" w:line="240" w:lineRule="auto"/>
+              <w:rPr>
+                <w:rFonts w:ascii="Times New Roman" w:hAnsi="Times New Roman" w:cs="Times New Roman"/>
+                <w:kern w:val="0"/>
+              </w:rPr>
+            </w:pPr>
+            <w:r>
+              <w:rPr>
+                <w:rFonts w:ascii="Times New Roman" w:hAnsi="Times New Roman" w:cs="Times New Roman"/>
+                <w:kern w:val="0"/>
+              </w:rPr>
+              <w:t>Macro x Export</w:t>
+            </w:r>
           </w:p>
         </w:tc>
         <w:tc>
@@ -4929,6 +6050,56 @@
         </w:tc>
         <w:tc>
           <w:tcPr>
+            <w:tcW w:w="1584" w:type="dxa"/>
+            <w:tcBorders>
+              <w:top w:val="nil"/>
+              <w:left w:val="nil"/>
+              <w:bottom w:val="nil"/>
+              <w:right w:val="nil"/>
+            </w:tcBorders>
+          </w:tcPr>
+          <w:p>
+            <w:pPr>
+              <w:widowControl w:val="0"/>
+              <w:autoSpaceDE w:val="0"/>
+              <w:autoSpaceDN w:val="0"/>
+              <w:adjustRightInd w:val="0"/>
+              <w:spacing w:after="0" w:line="240" w:lineRule="auto"/>
+              <w:jc w:val="center"/>
+              <w:rPr>
+                <w:rFonts w:ascii="Times New Roman" w:hAnsi="Times New Roman" w:cs="Times New Roman"/>
+                <w:kern w:val="0"/>
+              </w:rPr>
+            </w:pPr>
+          </w:p>
+        </w:tc>
+        <w:tc>
+          <w:tcPr>
+            <w:tcW w:w="1584" w:type="dxa"/>
+            <w:tcBorders>
+              <w:top w:val="nil"/>
+              <w:left w:val="nil"/>
+              <w:bottom w:val="nil"/>
+              <w:right w:val="nil"/>
+            </w:tcBorders>
+          </w:tcPr>
+          <w:p>
+            <w:pPr>
+              <w:widowControl w:val="0"/>
+              <w:autoSpaceDE w:val="0"/>
+              <w:autoSpaceDN w:val="0"/>
+              <w:adjustRightInd w:val="0"/>
+              <w:spacing w:after="0" w:line="240" w:lineRule="auto"/>
+              <w:jc w:val="center"/>
+              <w:rPr>
+                <w:rFonts w:ascii="Times New Roman" w:hAnsi="Times New Roman" w:cs="Times New Roman"/>
+                <w:kern w:val="0"/>
+              </w:rPr>
+            </w:pPr>
+          </w:p>
+        </w:tc>
+        <w:tc>
+          <w:tcPr>
             <w:tcW w:w="1440" w:type="dxa"/>
             <w:tcBorders>
               <w:top w:val="nil"/>
@@ -4950,6 +6121,13 @@
                 <w:kern w:val="0"/>
               </w:rPr>
             </w:pPr>
+            <w:r>
+              <w:rPr>
+                <w:rFonts w:ascii="Times New Roman" w:hAnsi="Times New Roman" w:cs="Times New Roman"/>
+                <w:kern w:val="0"/>
+              </w:rPr>
+              <w:t>1.703</w:t>
+            </w:r>
           </w:p>
         </w:tc>
         <w:tc>
@@ -4975,42 +6153,48 @@
                 <w:kern w:val="0"/>
               </w:rPr>
             </w:pPr>
+            <w:r>
+              <w:rPr>
+                <w:rFonts w:ascii="Times New Roman" w:hAnsi="Times New Roman" w:cs="Times New Roman"/>
+                <w:kern w:val="0"/>
+              </w:rPr>
+              <w:t>0.00792*</w:t>
+            </w:r>
           </w:p>
         </w:tc>
       </w:tr>
       <w:tr>
+        <w:tblPrEx>
+          <w:tblCellMar>
+            <w:top w:w="0" w:type="dxa"/>
+            <w:bottom w:w="0" w:type="dxa"/>
+          </w:tblCellMar>
+        </w:tblPrEx>
         <w:trPr>
           <w:jc w:val="center"/>
         </w:trPr>
         <w:tc>
           <w:tcPr>
-            <w:tcW w:w="5259" w:type="dxa"/>
-            <w:tcBorders>
-              <w:top w:val="nil"/>
-              <w:left w:val="nil"/>
-              <w:bottom w:val="nil"/>
-              <w:right w:val="nil"/>
-            </w:tcBorders>
-          </w:tcPr>
-          <w:p>
-            <w:pPr>
-              <w:widowControl w:val="0"/>
-              <w:autoSpaceDE w:val="0"/>
-              <w:autoSpaceDN w:val="0"/>
-              <w:adjustRightInd w:val="0"/>
-              <w:spacing w:after="0" w:line="240" w:lineRule="auto"/>
-              <w:rPr>
-                <w:rFonts w:ascii="Times New Roman" w:hAnsi="Times New Roman" w:cs="Times New Roman"/>
-                <w:kern w:val="0"/>
-              </w:rPr>
-            </w:pPr>
-            <w:r>
-              <w:rPr>
-                <w:rFonts w:ascii="Times New Roman" w:hAnsi="Times New Roman" w:cs="Times New Roman"/>
-                <w:kern w:val="0"/>
-              </w:rPr>
-              <w:t>Observations</w:t>
-            </w:r>
+            <w:tcW w:w="2811" w:type="dxa"/>
+            <w:tcBorders>
+              <w:top w:val="nil"/>
+              <w:left w:val="nil"/>
+              <w:bottom w:val="nil"/>
+              <w:right w:val="nil"/>
+            </w:tcBorders>
+          </w:tcPr>
+          <w:p>
+            <w:pPr>
+              <w:widowControl w:val="0"/>
+              <w:autoSpaceDE w:val="0"/>
+              <w:autoSpaceDN w:val="0"/>
+              <w:adjustRightInd w:val="0"/>
+              <w:spacing w:after="0" w:line="240" w:lineRule="auto"/>
+              <w:rPr>
+                <w:rFonts w:ascii="Times New Roman" w:hAnsi="Times New Roman" w:cs="Times New Roman"/>
+                <w:kern w:val="0"/>
+              </w:rPr>
+            </w:pPr>
           </w:p>
         </w:tc>
         <w:tc>
@@ -5036,13 +6220,56 @@
                 <w:kern w:val="0"/>
               </w:rPr>
             </w:pPr>
-            <w:r>
-              <w:rPr>
-                <w:rFonts w:ascii="Times New Roman" w:hAnsi="Times New Roman" w:cs="Times New Roman"/>
-                <w:kern w:val="0"/>
-              </w:rPr>
-              <w:t>794</w:t>
-            </w:r>
+          </w:p>
+        </w:tc>
+        <w:tc>
+          <w:tcPr>
+            <w:tcW w:w="1584" w:type="dxa"/>
+            <w:tcBorders>
+              <w:top w:val="nil"/>
+              <w:left w:val="nil"/>
+              <w:bottom w:val="nil"/>
+              <w:right w:val="nil"/>
+            </w:tcBorders>
+          </w:tcPr>
+          <w:p>
+            <w:pPr>
+              <w:widowControl w:val="0"/>
+              <w:autoSpaceDE w:val="0"/>
+              <w:autoSpaceDN w:val="0"/>
+              <w:adjustRightInd w:val="0"/>
+              <w:spacing w:after="0" w:line="240" w:lineRule="auto"/>
+              <w:jc w:val="center"/>
+              <w:rPr>
+                <w:rFonts w:ascii="Times New Roman" w:hAnsi="Times New Roman" w:cs="Times New Roman"/>
+                <w:kern w:val="0"/>
+              </w:rPr>
+            </w:pPr>
+          </w:p>
+        </w:tc>
+        <w:tc>
+          <w:tcPr>
+            <w:tcW w:w="1584" w:type="dxa"/>
+            <w:tcBorders>
+              <w:top w:val="nil"/>
+              <w:left w:val="nil"/>
+              <w:bottom w:val="nil"/>
+              <w:right w:val="nil"/>
+            </w:tcBorders>
+          </w:tcPr>
+          <w:p>
+            <w:pPr>
+              <w:widowControl w:val="0"/>
+              <w:autoSpaceDE w:val="0"/>
+              <w:autoSpaceDN w:val="0"/>
+              <w:adjustRightInd w:val="0"/>
+              <w:spacing w:after="0" w:line="240" w:lineRule="auto"/>
+              <w:jc w:val="center"/>
+              <w:rPr>
+                <w:rFonts w:ascii="Times New Roman" w:hAnsi="Times New Roman" w:cs="Times New Roman"/>
+                <w:kern w:val="0"/>
+              </w:rPr>
+            </w:pPr>
           </w:p>
         </w:tc>
         <w:tc>
@@ -5073,7 +6300,7 @@
                 <w:rFonts w:ascii="Times New Roman" w:hAnsi="Times New Roman" w:cs="Times New Roman"/>
                 <w:kern w:val="0"/>
               </w:rPr>
-              <w:t>825</w:t>
+              <w:t>(1.610)</w:t>
             </w:r>
           </w:p>
         </w:tc>
@@ -5105,18 +6332,783 @@
                 <w:rFonts w:ascii="Times New Roman" w:hAnsi="Times New Roman" w:cs="Times New Roman"/>
                 <w:kern w:val="0"/>
               </w:rPr>
-              <w:t>794</w:t>
+              <w:t>(0.00407)</w:t>
             </w:r>
           </w:p>
         </w:tc>
       </w:tr>
       <w:tr>
+        <w:tblPrEx>
+          <w:tblCellMar>
+            <w:top w:w="0" w:type="dxa"/>
+            <w:bottom w:w="0" w:type="dxa"/>
+          </w:tblCellMar>
+        </w:tblPrEx>
         <w:trPr>
           <w:jc w:val="center"/>
         </w:trPr>
         <w:tc>
           <w:tcPr>
-            <w:tcW w:w="5259" w:type="dxa"/>
+            <w:tcW w:w="2811" w:type="dxa"/>
+            <w:tcBorders>
+              <w:top w:val="nil"/>
+              <w:left w:val="nil"/>
+              <w:bottom w:val="nil"/>
+              <w:right w:val="nil"/>
+            </w:tcBorders>
+          </w:tcPr>
+          <w:p>
+            <w:pPr>
+              <w:widowControl w:val="0"/>
+              <w:autoSpaceDE w:val="0"/>
+              <w:autoSpaceDN w:val="0"/>
+              <w:adjustRightInd w:val="0"/>
+              <w:spacing w:after="0" w:line="240" w:lineRule="auto"/>
+              <w:rPr>
+                <w:rFonts w:ascii="Times New Roman" w:hAnsi="Times New Roman" w:cs="Times New Roman"/>
+                <w:kern w:val="0"/>
+              </w:rPr>
+            </w:pPr>
+            <w:r>
+              <w:rPr>
+                <w:rFonts w:ascii="Times New Roman" w:hAnsi="Times New Roman" w:cs="Times New Roman"/>
+                <w:kern w:val="0"/>
+              </w:rPr>
+              <w:t>Constant</w:t>
+            </w:r>
+          </w:p>
+        </w:tc>
+        <w:tc>
+          <w:tcPr>
+            <w:tcW w:w="1584" w:type="dxa"/>
+            <w:tcBorders>
+              <w:top w:val="nil"/>
+              <w:left w:val="nil"/>
+              <w:bottom w:val="nil"/>
+              <w:right w:val="nil"/>
+            </w:tcBorders>
+          </w:tcPr>
+          <w:p>
+            <w:pPr>
+              <w:widowControl w:val="0"/>
+              <w:autoSpaceDE w:val="0"/>
+              <w:autoSpaceDN w:val="0"/>
+              <w:adjustRightInd w:val="0"/>
+              <w:spacing w:after="0" w:line="240" w:lineRule="auto"/>
+              <w:jc w:val="center"/>
+              <w:rPr>
+                <w:rFonts w:ascii="Times New Roman" w:hAnsi="Times New Roman" w:cs="Times New Roman"/>
+                <w:kern w:val="0"/>
+              </w:rPr>
+            </w:pPr>
+            <w:r>
+              <w:rPr>
+                <w:rFonts w:ascii="Times New Roman" w:hAnsi="Times New Roman" w:cs="Times New Roman"/>
+                <w:kern w:val="0"/>
+              </w:rPr>
+              <w:t>10.51**</w:t>
+            </w:r>
+          </w:p>
+        </w:tc>
+        <w:tc>
+          <w:tcPr>
+            <w:tcW w:w="1584" w:type="dxa"/>
+            <w:tcBorders>
+              <w:top w:val="nil"/>
+              <w:left w:val="nil"/>
+              <w:bottom w:val="nil"/>
+              <w:right w:val="nil"/>
+            </w:tcBorders>
+          </w:tcPr>
+          <w:p>
+            <w:pPr>
+              <w:widowControl w:val="0"/>
+              <w:autoSpaceDE w:val="0"/>
+              <w:autoSpaceDN w:val="0"/>
+              <w:adjustRightInd w:val="0"/>
+              <w:spacing w:after="0" w:line="240" w:lineRule="auto"/>
+              <w:jc w:val="center"/>
+              <w:rPr>
+                <w:rFonts w:ascii="Times New Roman" w:hAnsi="Times New Roman" w:cs="Times New Roman"/>
+                <w:kern w:val="0"/>
+              </w:rPr>
+            </w:pPr>
+            <w:r>
+              <w:rPr>
+                <w:rFonts w:ascii="Times New Roman" w:hAnsi="Times New Roman" w:cs="Times New Roman"/>
+                <w:kern w:val="0"/>
+              </w:rPr>
+              <w:t>5.516</w:t>
+            </w:r>
+          </w:p>
+        </w:tc>
+        <w:tc>
+          <w:tcPr>
+            <w:tcW w:w="1584" w:type="dxa"/>
+            <w:tcBorders>
+              <w:top w:val="nil"/>
+              <w:left w:val="nil"/>
+              <w:bottom w:val="nil"/>
+              <w:right w:val="nil"/>
+            </w:tcBorders>
+          </w:tcPr>
+          <w:p>
+            <w:pPr>
+              <w:widowControl w:val="0"/>
+              <w:autoSpaceDE w:val="0"/>
+              <w:autoSpaceDN w:val="0"/>
+              <w:adjustRightInd w:val="0"/>
+              <w:spacing w:after="0" w:line="240" w:lineRule="auto"/>
+              <w:jc w:val="center"/>
+              <w:rPr>
+                <w:rFonts w:ascii="Times New Roman" w:hAnsi="Times New Roman" w:cs="Times New Roman"/>
+                <w:kern w:val="0"/>
+              </w:rPr>
+            </w:pPr>
+            <w:r>
+              <w:rPr>
+                <w:rFonts w:ascii="Times New Roman" w:hAnsi="Times New Roman" w:cs="Times New Roman"/>
+                <w:kern w:val="0"/>
+              </w:rPr>
+              <w:t>13.14**</w:t>
+            </w:r>
+          </w:p>
+        </w:tc>
+        <w:tc>
+          <w:tcPr>
+            <w:tcW w:w="1440" w:type="dxa"/>
+            <w:tcBorders>
+              <w:top w:val="nil"/>
+              <w:left w:val="nil"/>
+              <w:bottom w:val="nil"/>
+              <w:right w:val="nil"/>
+            </w:tcBorders>
+          </w:tcPr>
+          <w:p>
+            <w:pPr>
+              <w:widowControl w:val="0"/>
+              <w:autoSpaceDE w:val="0"/>
+              <w:autoSpaceDN w:val="0"/>
+              <w:adjustRightInd w:val="0"/>
+              <w:spacing w:after="0" w:line="240" w:lineRule="auto"/>
+              <w:jc w:val="center"/>
+              <w:rPr>
+                <w:rFonts w:ascii="Times New Roman" w:hAnsi="Times New Roman" w:cs="Times New Roman"/>
+                <w:kern w:val="0"/>
+              </w:rPr>
+            </w:pPr>
+            <w:r>
+              <w:rPr>
+                <w:rFonts w:ascii="Times New Roman" w:hAnsi="Times New Roman" w:cs="Times New Roman"/>
+                <w:kern w:val="0"/>
+              </w:rPr>
+              <w:t>2,376</w:t>
+            </w:r>
+          </w:p>
+        </w:tc>
+        <w:tc>
+          <w:tcPr>
+            <w:tcW w:w="1584" w:type="dxa"/>
+            <w:tcBorders>
+              <w:top w:val="nil"/>
+              <w:left w:val="nil"/>
+              <w:bottom w:val="nil"/>
+              <w:right w:val="nil"/>
+            </w:tcBorders>
+          </w:tcPr>
+          <w:p>
+            <w:pPr>
+              <w:widowControl w:val="0"/>
+              <w:autoSpaceDE w:val="0"/>
+              <w:autoSpaceDN w:val="0"/>
+              <w:adjustRightInd w:val="0"/>
+              <w:spacing w:after="0" w:line="240" w:lineRule="auto"/>
+              <w:jc w:val="center"/>
+              <w:rPr>
+                <w:rFonts w:ascii="Times New Roman" w:hAnsi="Times New Roman" w:cs="Times New Roman"/>
+                <w:kern w:val="0"/>
+              </w:rPr>
+            </w:pPr>
+            <w:r>
+              <w:rPr>
+                <w:rFonts w:ascii="Times New Roman" w:hAnsi="Times New Roman" w:cs="Times New Roman"/>
+                <w:kern w:val="0"/>
+              </w:rPr>
+              <w:t>16.67**</w:t>
+            </w:r>
+          </w:p>
+        </w:tc>
+      </w:tr>
+      <w:tr>
+        <w:tblPrEx>
+          <w:tblCellMar>
+            <w:top w:w="0" w:type="dxa"/>
+            <w:bottom w:w="0" w:type="dxa"/>
+          </w:tblCellMar>
+        </w:tblPrEx>
+        <w:trPr>
+          <w:jc w:val="center"/>
+        </w:trPr>
+        <w:tc>
+          <w:tcPr>
+            <w:tcW w:w="2811" w:type="dxa"/>
+            <w:tcBorders>
+              <w:top w:val="nil"/>
+              <w:left w:val="nil"/>
+              <w:bottom w:val="nil"/>
+              <w:right w:val="nil"/>
+            </w:tcBorders>
+          </w:tcPr>
+          <w:p>
+            <w:pPr>
+              <w:widowControl w:val="0"/>
+              <w:autoSpaceDE w:val="0"/>
+              <w:autoSpaceDN w:val="0"/>
+              <w:adjustRightInd w:val="0"/>
+              <w:spacing w:after="0" w:line="240" w:lineRule="auto"/>
+              <w:rPr>
+                <w:rFonts w:ascii="Times New Roman" w:hAnsi="Times New Roman" w:cs="Times New Roman"/>
+                <w:kern w:val="0"/>
+              </w:rPr>
+            </w:pPr>
+          </w:p>
+        </w:tc>
+        <w:tc>
+          <w:tcPr>
+            <w:tcW w:w="1584" w:type="dxa"/>
+            <w:tcBorders>
+              <w:top w:val="nil"/>
+              <w:left w:val="nil"/>
+              <w:bottom w:val="nil"/>
+              <w:right w:val="nil"/>
+            </w:tcBorders>
+          </w:tcPr>
+          <w:p>
+            <w:pPr>
+              <w:widowControl w:val="0"/>
+              <w:autoSpaceDE w:val="0"/>
+              <w:autoSpaceDN w:val="0"/>
+              <w:adjustRightInd w:val="0"/>
+              <w:spacing w:after="0" w:line="240" w:lineRule="auto"/>
+              <w:jc w:val="center"/>
+              <w:rPr>
+                <w:rFonts w:ascii="Times New Roman" w:hAnsi="Times New Roman" w:cs="Times New Roman"/>
+                <w:kern w:val="0"/>
+              </w:rPr>
+            </w:pPr>
+            <w:r>
+              <w:rPr>
+                <w:rFonts w:ascii="Times New Roman" w:hAnsi="Times New Roman" w:cs="Times New Roman"/>
+                <w:kern w:val="0"/>
+              </w:rPr>
+              <w:t>(5.149)</w:t>
+            </w:r>
+          </w:p>
+        </w:tc>
+        <w:tc>
+          <w:tcPr>
+            <w:tcW w:w="1584" w:type="dxa"/>
+            <w:tcBorders>
+              <w:top w:val="nil"/>
+              <w:left w:val="nil"/>
+              <w:bottom w:val="nil"/>
+              <w:right w:val="nil"/>
+            </w:tcBorders>
+          </w:tcPr>
+          <w:p>
+            <w:pPr>
+              <w:widowControl w:val="0"/>
+              <w:autoSpaceDE w:val="0"/>
+              <w:autoSpaceDN w:val="0"/>
+              <w:adjustRightInd w:val="0"/>
+              <w:spacing w:after="0" w:line="240" w:lineRule="auto"/>
+              <w:jc w:val="center"/>
+              <w:rPr>
+                <w:rFonts w:ascii="Times New Roman" w:hAnsi="Times New Roman" w:cs="Times New Roman"/>
+                <w:kern w:val="0"/>
+              </w:rPr>
+            </w:pPr>
+            <w:r>
+              <w:rPr>
+                <w:rFonts w:ascii="Times New Roman" w:hAnsi="Times New Roman" w:cs="Times New Roman"/>
+                <w:kern w:val="0"/>
+              </w:rPr>
+              <w:t>(5.217)</w:t>
+            </w:r>
+          </w:p>
+        </w:tc>
+        <w:tc>
+          <w:tcPr>
+            <w:tcW w:w="1584" w:type="dxa"/>
+            <w:tcBorders>
+              <w:top w:val="nil"/>
+              <w:left w:val="nil"/>
+              <w:bottom w:val="nil"/>
+              <w:right w:val="nil"/>
+            </w:tcBorders>
+          </w:tcPr>
+          <w:p>
+            <w:pPr>
+              <w:widowControl w:val="0"/>
+              <w:autoSpaceDE w:val="0"/>
+              <w:autoSpaceDN w:val="0"/>
+              <w:adjustRightInd w:val="0"/>
+              <w:spacing w:after="0" w:line="240" w:lineRule="auto"/>
+              <w:jc w:val="center"/>
+              <w:rPr>
+                <w:rFonts w:ascii="Times New Roman" w:hAnsi="Times New Roman" w:cs="Times New Roman"/>
+                <w:kern w:val="0"/>
+              </w:rPr>
+            </w:pPr>
+            <w:r>
+              <w:rPr>
+                <w:rFonts w:ascii="Times New Roman" w:hAnsi="Times New Roman" w:cs="Times New Roman"/>
+                <w:kern w:val="0"/>
+              </w:rPr>
+              <w:t>(5.174)</w:t>
+            </w:r>
+          </w:p>
+        </w:tc>
+        <w:tc>
+          <w:tcPr>
+            <w:tcW w:w="1440" w:type="dxa"/>
+            <w:tcBorders>
+              <w:top w:val="nil"/>
+              <w:left w:val="nil"/>
+              <w:bottom w:val="nil"/>
+              <w:right w:val="nil"/>
+            </w:tcBorders>
+          </w:tcPr>
+          <w:p>
+            <w:pPr>
+              <w:widowControl w:val="0"/>
+              <w:autoSpaceDE w:val="0"/>
+              <w:autoSpaceDN w:val="0"/>
+              <w:adjustRightInd w:val="0"/>
+              <w:spacing w:after="0" w:line="240" w:lineRule="auto"/>
+              <w:jc w:val="center"/>
+              <w:rPr>
+                <w:rFonts w:ascii="Times New Roman" w:hAnsi="Times New Roman" w:cs="Times New Roman"/>
+                <w:kern w:val="0"/>
+              </w:rPr>
+            </w:pPr>
+            <w:r>
+              <w:rPr>
+                <w:rFonts w:ascii="Times New Roman" w:hAnsi="Times New Roman" w:cs="Times New Roman"/>
+                <w:kern w:val="0"/>
+              </w:rPr>
+              <w:t>(2,169)</w:t>
+            </w:r>
+          </w:p>
+        </w:tc>
+        <w:tc>
+          <w:tcPr>
+            <w:tcW w:w="1584" w:type="dxa"/>
+            <w:tcBorders>
+              <w:top w:val="nil"/>
+              <w:left w:val="nil"/>
+              <w:bottom w:val="nil"/>
+              <w:right w:val="nil"/>
+            </w:tcBorders>
+          </w:tcPr>
+          <w:p>
+            <w:pPr>
+              <w:widowControl w:val="0"/>
+              <w:autoSpaceDE w:val="0"/>
+              <w:autoSpaceDN w:val="0"/>
+              <w:adjustRightInd w:val="0"/>
+              <w:spacing w:after="0" w:line="240" w:lineRule="auto"/>
+              <w:jc w:val="center"/>
+              <w:rPr>
+                <w:rFonts w:ascii="Times New Roman" w:hAnsi="Times New Roman" w:cs="Times New Roman"/>
+                <w:kern w:val="0"/>
+              </w:rPr>
+            </w:pPr>
+            <w:r>
+              <w:rPr>
+                <w:rFonts w:ascii="Times New Roman" w:hAnsi="Times New Roman" w:cs="Times New Roman"/>
+                <w:kern w:val="0"/>
+              </w:rPr>
+              <w:t>(6.451)</w:t>
+            </w:r>
+          </w:p>
+        </w:tc>
+      </w:tr>
+      <w:tr>
+        <w:tblPrEx>
+          <w:tblCellMar>
+            <w:top w:w="0" w:type="dxa"/>
+            <w:bottom w:w="0" w:type="dxa"/>
+          </w:tblCellMar>
+        </w:tblPrEx>
+        <w:trPr>
+          <w:jc w:val="center"/>
+        </w:trPr>
+        <w:tc>
+          <w:tcPr>
+            <w:tcW w:w="2811" w:type="dxa"/>
+            <w:tcBorders>
+              <w:top w:val="nil"/>
+              <w:left w:val="nil"/>
+              <w:bottom w:val="nil"/>
+              <w:right w:val="nil"/>
+            </w:tcBorders>
+          </w:tcPr>
+          <w:p>
+            <w:pPr>
+              <w:widowControl w:val="0"/>
+              <w:autoSpaceDE w:val="0"/>
+              <w:autoSpaceDN w:val="0"/>
+              <w:adjustRightInd w:val="0"/>
+              <w:spacing w:after="0" w:line="240" w:lineRule="auto"/>
+              <w:rPr>
+                <w:rFonts w:ascii="Times New Roman" w:hAnsi="Times New Roman" w:cs="Times New Roman"/>
+                <w:kern w:val="0"/>
+              </w:rPr>
+            </w:pPr>
+          </w:p>
+        </w:tc>
+        <w:tc>
+          <w:tcPr>
+            <w:tcW w:w="1584" w:type="dxa"/>
+            <w:tcBorders>
+              <w:top w:val="nil"/>
+              <w:left w:val="nil"/>
+              <w:bottom w:val="nil"/>
+              <w:right w:val="nil"/>
+            </w:tcBorders>
+          </w:tcPr>
+          <w:p>
+            <w:pPr>
+              <w:widowControl w:val="0"/>
+              <w:autoSpaceDE w:val="0"/>
+              <w:autoSpaceDN w:val="0"/>
+              <w:adjustRightInd w:val="0"/>
+              <w:spacing w:after="0" w:line="240" w:lineRule="auto"/>
+              <w:jc w:val="center"/>
+              <w:rPr>
+                <w:rFonts w:ascii="Times New Roman" w:hAnsi="Times New Roman" w:cs="Times New Roman"/>
+                <w:kern w:val="0"/>
+              </w:rPr>
+            </w:pPr>
+          </w:p>
+        </w:tc>
+        <w:tc>
+          <w:tcPr>
+            <w:tcW w:w="1584" w:type="dxa"/>
+            <w:tcBorders>
+              <w:top w:val="nil"/>
+              <w:left w:val="nil"/>
+              <w:bottom w:val="nil"/>
+              <w:right w:val="nil"/>
+            </w:tcBorders>
+          </w:tcPr>
+          <w:p>
+            <w:pPr>
+              <w:widowControl w:val="0"/>
+              <w:autoSpaceDE w:val="0"/>
+              <w:autoSpaceDN w:val="0"/>
+              <w:adjustRightInd w:val="0"/>
+              <w:spacing w:after="0" w:line="240" w:lineRule="auto"/>
+              <w:jc w:val="center"/>
+              <w:rPr>
+                <w:rFonts w:ascii="Times New Roman" w:hAnsi="Times New Roman" w:cs="Times New Roman"/>
+                <w:kern w:val="0"/>
+              </w:rPr>
+            </w:pPr>
+          </w:p>
+        </w:tc>
+        <w:tc>
+          <w:tcPr>
+            <w:tcW w:w="1584" w:type="dxa"/>
+            <w:tcBorders>
+              <w:top w:val="nil"/>
+              <w:left w:val="nil"/>
+              <w:bottom w:val="nil"/>
+              <w:right w:val="nil"/>
+            </w:tcBorders>
+          </w:tcPr>
+          <w:p>
+            <w:pPr>
+              <w:widowControl w:val="0"/>
+              <w:autoSpaceDE w:val="0"/>
+              <w:autoSpaceDN w:val="0"/>
+              <w:adjustRightInd w:val="0"/>
+              <w:spacing w:after="0" w:line="240" w:lineRule="auto"/>
+              <w:jc w:val="center"/>
+              <w:rPr>
+                <w:rFonts w:ascii="Times New Roman" w:hAnsi="Times New Roman" w:cs="Times New Roman"/>
+                <w:kern w:val="0"/>
+              </w:rPr>
+            </w:pPr>
+          </w:p>
+        </w:tc>
+        <w:tc>
+          <w:tcPr>
+            <w:tcW w:w="1440" w:type="dxa"/>
+            <w:tcBorders>
+              <w:top w:val="nil"/>
+              <w:left w:val="nil"/>
+              <w:bottom w:val="nil"/>
+              <w:right w:val="nil"/>
+            </w:tcBorders>
+          </w:tcPr>
+          <w:p>
+            <w:pPr>
+              <w:widowControl w:val="0"/>
+              <w:autoSpaceDE w:val="0"/>
+              <w:autoSpaceDN w:val="0"/>
+              <w:adjustRightInd w:val="0"/>
+              <w:spacing w:after="0" w:line="240" w:lineRule="auto"/>
+              <w:jc w:val="center"/>
+              <w:rPr>
+                <w:rFonts w:ascii="Times New Roman" w:hAnsi="Times New Roman" w:cs="Times New Roman"/>
+                <w:kern w:val="0"/>
+              </w:rPr>
+            </w:pPr>
+          </w:p>
+        </w:tc>
+        <w:tc>
+          <w:tcPr>
+            <w:tcW w:w="1584" w:type="dxa"/>
+            <w:tcBorders>
+              <w:top w:val="nil"/>
+              <w:left w:val="nil"/>
+              <w:bottom w:val="nil"/>
+              <w:right w:val="nil"/>
+            </w:tcBorders>
+          </w:tcPr>
+          <w:p>
+            <w:pPr>
+              <w:widowControl w:val="0"/>
+              <w:autoSpaceDE w:val="0"/>
+              <w:autoSpaceDN w:val="0"/>
+              <w:adjustRightInd w:val="0"/>
+              <w:spacing w:after="0" w:line="240" w:lineRule="auto"/>
+              <w:jc w:val="center"/>
+              <w:rPr>
+                <w:rFonts w:ascii="Times New Roman" w:hAnsi="Times New Roman" w:cs="Times New Roman"/>
+                <w:kern w:val="0"/>
+              </w:rPr>
+            </w:pPr>
+          </w:p>
+        </w:tc>
+      </w:tr>
+      <w:tr>
+        <w:tblPrEx>
+          <w:tblCellMar>
+            <w:top w:w="0" w:type="dxa"/>
+            <w:bottom w:w="0" w:type="dxa"/>
+          </w:tblCellMar>
+        </w:tblPrEx>
+        <w:trPr>
+          <w:jc w:val="center"/>
+        </w:trPr>
+        <w:tc>
+          <w:tcPr>
+            <w:tcW w:w="2811" w:type="dxa"/>
+            <w:tcBorders>
+              <w:top w:val="nil"/>
+              <w:left w:val="nil"/>
+              <w:bottom w:val="nil"/>
+              <w:right w:val="nil"/>
+            </w:tcBorders>
+          </w:tcPr>
+          <w:p>
+            <w:pPr>
+              <w:widowControl w:val="0"/>
+              <w:autoSpaceDE w:val="0"/>
+              <w:autoSpaceDN w:val="0"/>
+              <w:adjustRightInd w:val="0"/>
+              <w:spacing w:after="0" w:line="240" w:lineRule="auto"/>
+              <w:rPr>
+                <w:rFonts w:ascii="Times New Roman" w:hAnsi="Times New Roman" w:cs="Times New Roman"/>
+                <w:kern w:val="0"/>
+              </w:rPr>
+            </w:pPr>
+            <w:r>
+              <w:rPr>
+                <w:rFonts w:ascii="Times New Roman" w:hAnsi="Times New Roman" w:cs="Times New Roman"/>
+                <w:kern w:val="0"/>
+              </w:rPr>
+              <w:t>Observations</w:t>
+            </w:r>
+          </w:p>
+        </w:tc>
+        <w:tc>
+          <w:tcPr>
+            <w:tcW w:w="1584" w:type="dxa"/>
+            <w:tcBorders>
+              <w:top w:val="nil"/>
+              <w:left w:val="nil"/>
+              <w:bottom w:val="nil"/>
+              <w:right w:val="nil"/>
+            </w:tcBorders>
+          </w:tcPr>
+          <w:p>
+            <w:pPr>
+              <w:widowControl w:val="0"/>
+              <w:autoSpaceDE w:val="0"/>
+              <w:autoSpaceDN w:val="0"/>
+              <w:adjustRightInd w:val="0"/>
+              <w:spacing w:after="0" w:line="240" w:lineRule="auto"/>
+              <w:jc w:val="center"/>
+              <w:rPr>
+                <w:rFonts w:ascii="Times New Roman" w:hAnsi="Times New Roman" w:cs="Times New Roman"/>
+                <w:kern w:val="0"/>
+              </w:rPr>
+            </w:pPr>
+            <w:r>
+              <w:rPr>
+                <w:rFonts w:ascii="Times New Roman" w:hAnsi="Times New Roman" w:cs="Times New Roman"/>
+                <w:kern w:val="0"/>
+              </w:rPr>
+              <w:t>794</w:t>
+            </w:r>
+          </w:p>
+        </w:tc>
+        <w:tc>
+          <w:tcPr>
+            <w:tcW w:w="1584" w:type="dxa"/>
+            <w:tcBorders>
+              <w:top w:val="nil"/>
+              <w:left w:val="nil"/>
+              <w:bottom w:val="nil"/>
+              <w:right w:val="nil"/>
+            </w:tcBorders>
+          </w:tcPr>
+          <w:p>
+            <w:pPr>
+              <w:widowControl w:val="0"/>
+              <w:autoSpaceDE w:val="0"/>
+              <w:autoSpaceDN w:val="0"/>
+              <w:adjustRightInd w:val="0"/>
+              <w:spacing w:after="0" w:line="240" w:lineRule="auto"/>
+              <w:jc w:val="center"/>
+              <w:rPr>
+                <w:rFonts w:ascii="Times New Roman" w:hAnsi="Times New Roman" w:cs="Times New Roman"/>
+                <w:kern w:val="0"/>
+              </w:rPr>
+            </w:pPr>
+            <w:r>
+              <w:rPr>
+                <w:rFonts w:ascii="Times New Roman" w:hAnsi="Times New Roman" w:cs="Times New Roman"/>
+                <w:kern w:val="0"/>
+              </w:rPr>
+              <w:t>794</w:t>
+            </w:r>
+          </w:p>
+        </w:tc>
+        <w:tc>
+          <w:tcPr>
+            <w:tcW w:w="1584" w:type="dxa"/>
+            <w:tcBorders>
+              <w:top w:val="nil"/>
+              <w:left w:val="nil"/>
+              <w:bottom w:val="nil"/>
+              <w:right w:val="nil"/>
+            </w:tcBorders>
+          </w:tcPr>
+          <w:p>
+            <w:pPr>
+              <w:widowControl w:val="0"/>
+              <w:autoSpaceDE w:val="0"/>
+              <w:autoSpaceDN w:val="0"/>
+              <w:adjustRightInd w:val="0"/>
+              <w:spacing w:after="0" w:line="240" w:lineRule="auto"/>
+              <w:jc w:val="center"/>
+              <w:rPr>
+                <w:rFonts w:ascii="Times New Roman" w:hAnsi="Times New Roman" w:cs="Times New Roman"/>
+                <w:kern w:val="0"/>
+              </w:rPr>
+            </w:pPr>
+            <w:r>
+              <w:rPr>
+                <w:rFonts w:ascii="Times New Roman" w:hAnsi="Times New Roman" w:cs="Times New Roman"/>
+                <w:kern w:val="0"/>
+              </w:rPr>
+              <w:t>794</w:t>
+            </w:r>
+          </w:p>
+        </w:tc>
+        <w:tc>
+          <w:tcPr>
+            <w:tcW w:w="1440" w:type="dxa"/>
+            <w:tcBorders>
+              <w:top w:val="nil"/>
+              <w:left w:val="nil"/>
+              <w:bottom w:val="nil"/>
+              <w:right w:val="nil"/>
+            </w:tcBorders>
+          </w:tcPr>
+          <w:p>
+            <w:pPr>
+              <w:widowControl w:val="0"/>
+              <w:autoSpaceDE w:val="0"/>
+              <w:autoSpaceDN w:val="0"/>
+              <w:adjustRightInd w:val="0"/>
+              <w:spacing w:after="0" w:line="240" w:lineRule="auto"/>
+              <w:jc w:val="center"/>
+              <w:rPr>
+                <w:rFonts w:ascii="Times New Roman" w:hAnsi="Times New Roman" w:cs="Times New Roman"/>
+                <w:kern w:val="0"/>
+              </w:rPr>
+            </w:pPr>
+            <w:r>
+              <w:rPr>
+                <w:rFonts w:ascii="Times New Roman" w:hAnsi="Times New Roman" w:cs="Times New Roman"/>
+                <w:kern w:val="0"/>
+              </w:rPr>
+              <w:t>825</w:t>
+            </w:r>
+          </w:p>
+        </w:tc>
+        <w:tc>
+          <w:tcPr>
+            <w:tcW w:w="1584" w:type="dxa"/>
+            <w:tcBorders>
+              <w:top w:val="nil"/>
+              <w:left w:val="nil"/>
+              <w:bottom w:val="nil"/>
+              <w:right w:val="nil"/>
+            </w:tcBorders>
+          </w:tcPr>
+          <w:p>
+            <w:pPr>
+              <w:widowControl w:val="0"/>
+              <w:autoSpaceDE w:val="0"/>
+              <w:autoSpaceDN w:val="0"/>
+              <w:adjustRightInd w:val="0"/>
+              <w:spacing w:after="0" w:line="240" w:lineRule="auto"/>
+              <w:jc w:val="center"/>
+              <w:rPr>
+                <w:rFonts w:ascii="Times New Roman" w:hAnsi="Times New Roman" w:cs="Times New Roman"/>
+                <w:kern w:val="0"/>
+              </w:rPr>
+            </w:pPr>
+            <w:r>
+              <w:rPr>
+                <w:rFonts w:ascii="Times New Roman" w:hAnsi="Times New Roman" w:cs="Times New Roman"/>
+                <w:kern w:val="0"/>
+              </w:rPr>
+              <w:t>794</w:t>
+            </w:r>
+          </w:p>
+        </w:tc>
+      </w:tr>
+      <w:tr>
+        <w:tblPrEx>
+          <w:tblCellMar>
+            <w:top w:w="0" w:type="dxa"/>
+            <w:bottom w:w="0" w:type="dxa"/>
+          </w:tblCellMar>
+        </w:tblPrEx>
+        <w:trPr>
+          <w:jc w:val="center"/>
+        </w:trPr>
+        <w:tc>
+          <w:tcPr>
+            <w:tcW w:w="2811" w:type="dxa"/>
             <w:tcBorders>
               <w:top w:val="nil"/>
               <w:left w:val="nil"/>
@@ -5142,6 +7134,70 @@
                 <w:kern w:val="0"/>
               </w:rPr>
               <w:t>Number of country</w:t>
+            </w:r>
+          </w:p>
+        </w:tc>
+        <w:tc>
+          <w:tcPr>
+            <w:tcW w:w="1584" w:type="dxa"/>
+            <w:tcBorders>
+              <w:top w:val="nil"/>
+              <w:left w:val="nil"/>
+              <w:bottom w:val="nil"/>
+              <w:right w:val="nil"/>
+            </w:tcBorders>
+          </w:tcPr>
+          <w:p>
+            <w:pPr>
+              <w:widowControl w:val="0"/>
+              <w:autoSpaceDE w:val="0"/>
+              <w:autoSpaceDN w:val="0"/>
+              <w:adjustRightInd w:val="0"/>
+              <w:spacing w:after="0" w:line="240" w:lineRule="auto"/>
+              <w:jc w:val="center"/>
+              <w:rPr>
+                <w:rFonts w:ascii="Times New Roman" w:hAnsi="Times New Roman" w:cs="Times New Roman"/>
+                <w:kern w:val="0"/>
+              </w:rPr>
+            </w:pPr>
+            <w:r>
+              <w:rPr>
+                <w:rFonts w:ascii="Times New Roman" w:hAnsi="Times New Roman" w:cs="Times New Roman"/>
+                <w:kern w:val="0"/>
+              </w:rPr>
+              <w:t>75</w:t>
+            </w:r>
+          </w:p>
+        </w:tc>
+        <w:tc>
+          <w:tcPr>
+            <w:tcW w:w="1584" w:type="dxa"/>
+            <w:tcBorders>
+              <w:top w:val="nil"/>
+              <w:left w:val="nil"/>
+              <w:bottom w:val="nil"/>
+              <w:right w:val="nil"/>
+            </w:tcBorders>
+          </w:tcPr>
+          <w:p>
+            <w:pPr>
+              <w:widowControl w:val="0"/>
+              <w:autoSpaceDE w:val="0"/>
+              <w:autoSpaceDN w:val="0"/>
+              <w:adjustRightInd w:val="0"/>
+              <w:spacing w:after="0" w:line="240" w:lineRule="auto"/>
+              <w:jc w:val="center"/>
+              <w:rPr>
+                <w:rFonts w:ascii="Times New Roman" w:hAnsi="Times New Roman" w:cs="Times New Roman"/>
+                <w:kern w:val="0"/>
+              </w:rPr>
+            </w:pPr>
+            <w:r>
+              <w:rPr>
+                <w:rFonts w:ascii="Times New Roman" w:hAnsi="Times New Roman" w:cs="Times New Roman"/>
+                <w:kern w:val="0"/>
+              </w:rPr>
+              <w:t>75</w:t>
             </w:r>
           </w:p>
         </w:tc>
@@ -5247,13 +7303,17 @@
           <w:tblBorders>
             <w:bottom w:val="single" w:sz="6" w:space="0" w:color="auto"/>
           </w:tblBorders>
+          <w:tblCellMar>
+            <w:top w:w="0" w:type="dxa"/>
+            <w:bottom w:w="0" w:type="dxa"/>
+          </w:tblCellMar>
         </w:tblPrEx>
         <w:trPr>
           <w:jc w:val="center"/>
         </w:trPr>
         <w:tc>
           <w:tcPr>
-            <w:tcW w:w="5259" w:type="dxa"/>
+            <w:tcW w:w="2811" w:type="dxa"/>
             <w:tcBorders>
               <w:top w:val="nil"/>
               <w:left w:val="nil"/>
@@ -5311,6 +7371,70 @@
                 <w:kern w:val="0"/>
               </w:rPr>
               <w:t>0.039</w:t>
+            </w:r>
+          </w:p>
+        </w:tc>
+        <w:tc>
+          <w:tcPr>
+            <w:tcW w:w="1584" w:type="dxa"/>
+            <w:tcBorders>
+              <w:top w:val="nil"/>
+              <w:left w:val="nil"/>
+              <w:bottom w:val="single" w:sz="6" w:space="0" w:color="auto"/>
+              <w:right w:val="nil"/>
+            </w:tcBorders>
+          </w:tcPr>
+          <w:p>
+            <w:pPr>
+              <w:widowControl w:val="0"/>
+              <w:autoSpaceDE w:val="0"/>
+              <w:autoSpaceDN w:val="0"/>
+              <w:adjustRightInd w:val="0"/>
+              <w:spacing w:after="0" w:line="240" w:lineRule="auto"/>
+              <w:jc w:val="center"/>
+              <w:rPr>
+                <w:rFonts w:ascii="Times New Roman" w:hAnsi="Times New Roman" w:cs="Times New Roman"/>
+                <w:kern w:val="0"/>
+              </w:rPr>
+            </w:pPr>
+            <w:r>
+              <w:rPr>
+                <w:rFonts w:ascii="Times New Roman" w:hAnsi="Times New Roman" w:cs="Times New Roman"/>
+                <w:kern w:val="0"/>
+              </w:rPr>
+              <w:t>0.033</w:t>
+            </w:r>
+          </w:p>
+        </w:tc>
+        <w:tc>
+          <w:tcPr>
+            <w:tcW w:w="1584" w:type="dxa"/>
+            <w:tcBorders>
+              <w:top w:val="nil"/>
+              <w:left w:val="nil"/>
+              <w:bottom w:val="single" w:sz="6" w:space="0" w:color="auto"/>
+              <w:right w:val="nil"/>
+            </w:tcBorders>
+          </w:tcPr>
+          <w:p>
+            <w:pPr>
+              <w:widowControl w:val="0"/>
+              <w:autoSpaceDE w:val="0"/>
+              <w:autoSpaceDN w:val="0"/>
+              <w:adjustRightInd w:val="0"/>
+              <w:spacing w:after="0" w:line="240" w:lineRule="auto"/>
+              <w:jc w:val="center"/>
+              <w:rPr>
+                <w:rFonts w:ascii="Times New Roman" w:hAnsi="Times New Roman" w:cs="Times New Roman"/>
+                <w:kern w:val="0"/>
+              </w:rPr>
+            </w:pPr>
+            <w:r>
+              <w:rPr>
+                <w:rFonts w:ascii="Times New Roman" w:hAnsi="Times New Roman" w:cs="Times New Roman"/>
+                <w:kern w:val="0"/>
+              </w:rPr>
+              <w:t>0.042</w:t>
             </w:r>
           </w:p>
         </w:tc>
@@ -5442,11 +7566,17 @@
         <w:jc w:val="both"/>
       </w:pPr>
       <w:r>
-        <w:t xml:space="preserve">The coefficient on the CPIA macroeconomic management rating is −4.644 (p&lt;0.01), indicating that higher macroeconomic policy quality is significantly associated with lower inflation rates. Export volume alone has a small, marginally significant negative effect on inflation (p=0.055). Critically, the interaction term between CPIA macro rating and export </w:t>
+        <w:t>The coefficient on the CPIA macroeconomic management rating i</w:t>
+      </w:r>
+      <w:r>
+        <w:t>n the final model is</w:t>
+      </w:r>
+      <w:r>
+        <w:t xml:space="preserve"> −4.644 (p&lt;0.01), indicating that higher macroeconomic policy quality is significantly associated with lower inflation rates. Export volume alone has a small, marginally significant </w:t>
       </w:r>
       <w:r>
         <w:lastRenderedPageBreak/>
-        <w:t>volume is positive and marginally significant (p=0.055), implying that the deflationary impact of macroeconomic policy quality weakens as export volume increases.</w:t>
+        <w:t>negative effect on inflation (p=0.055). Critically, the interaction term between CPIA macro rating and export volume is positive and marginally significant (p=0.055), implying that the deflationary impact of macroeconomic policy quality weakens as export volume increases.</w:t>
       </w:r>
     </w:p>
     <w:p>
@@ -5468,7 +7598,13 @@
         <w:t xml:space="preserve"> </w:t>
       </w:r>
       <w:r>
-        <w:t>inflation (p&lt;0.01), emphasizing the importance of stable financial sector conditions. CPIA average rating, although only marginally significant (p=0.068), proves essential; without controlling for this broader measure of social, economic, and institutional quality, the relationship between macroeconomic management and inflation loses statistical significance, indicating negative Omitted Variable Bias. Thus, a nation's broader commitment to debt management, social inclusion, and property rights is crucial for macroeconomic policy to effectively curb inflation.</w:t>
+        <w:t xml:space="preserve">inflation (p&lt;0.01), emphasizing the importance of stable financial sector conditions. CPIA average rating, although only marginally significant (p=0.068), proves essential; without controlling for this broader measure of social, economic, and institutional quality, the relationship between macroeconomic management and inflation loses statistical significance, indicating </w:t>
+      </w:r>
+      <w:r>
+        <w:t>positive</w:t>
+      </w:r>
+      <w:r>
+        <w:t xml:space="preserve"> Omitted Variable Bias. Thus, a nation's broader commitment to debt management, social inclusion, and property rights is crucial for macroeconomic policy to effectively curb inflation.</w:t>
       </w:r>
     </w:p>
     <w:p>
@@ -5478,7 +7614,19 @@
         <w:jc w:val="both"/>
       </w:pPr>
       <w:r>
-        <w:t xml:space="preserve">Overall, better macroeconomic management is strongly associated with lower inflation outcomes. However, this effect is moderated by export volumes: countries with larger export sectors experience a weaker inflation-reducing benefit from improvements in macroeconomic policy. Financial development, as proxied by domestic credit to the private sector, also plays a significant role in containing inflation. While broader institutional quality, captured by the CPIA Average Rating, must be controlled to accurately estimate the impact of macroeconomic management, its direct relationship with inflation is positive and marginally significant. This suggests that improvements in areas such as social inclusion and property rights, while important for overall governance, do not necessarily translate into lower inflation rates in the short to medium </w:t>
+        <w:t>Overall, better macroeconomic management is strongly associated with lower inflatio</w:t>
+      </w:r>
+      <w:r>
+        <w:t>n</w:t>
+      </w:r>
+      <w:r>
+        <w:t xml:space="preserve">. However, this effect is moderated by export volumes: countries with larger export sectors experience a weaker inflation-reducing benefit from improvements in macroeconomic policy. Financial development, as proxied by domestic credit to the private sector, also plays a significant role in containing inflation. </w:t>
+      </w:r>
+      <w:r>
+        <w:t xml:space="preserve"> </w:t>
+      </w:r>
+      <w:r>
+        <w:t xml:space="preserve">While broader institutional quality, captured by the CPIA Average Rating, must be controlled to accurately estimate the impact of macroeconomic management, its direct relationship with inflation is positive and marginally significant. This suggests that improvements in areas such as social inclusion and property rights, while important for overall governance, do not necessarily translate into lower inflation rates in the short to medium </w:t>
       </w:r>
       <w:r>
         <w:t>term.</w:t>
@@ -5493,6 +7641,7 @@
           <w:b/>
           <w:bCs/>
         </w:rPr>
+        <w:lastRenderedPageBreak/>
         <w:t xml:space="preserve">Limitations </w:t>
       </w:r>
       <w:r>
@@ -5510,7 +7659,6 @@
         <w:jc w:val="both"/>
       </w:pPr>
       <w:r>
-        <w:lastRenderedPageBreak/>
         <w:t>While the models explain some of the variation in inflation outcomes (Adjusted R-squared approximately 5%), a substantial portion remains unexplained. Future research could enhance explanatory power by incorporating additional variables such as fiscal deficits, political stability indices, and more granular trade shock measures.</w:t>
       </w:r>
     </w:p>
@@ -5521,7 +7669,10 @@
         <w:jc w:val="both"/>
       </w:pPr>
       <w:r>
-        <w:t xml:space="preserve">The dataset's temporal limitation (ending in 2016) suggests the need for updates, particularly given major economic disruptions in the late 2010s and early 2020s. Moreover, while CPIA Average Rating serves as a useful control, it introduces some multicollinearity with the macroeconomic management index. Future studies could refine these </w:t>
+        <w:t>Also, while the</w:t>
+      </w:r>
+      <w:r>
+        <w:t xml:space="preserve"> CPIA Average Rating serves as a useful control, it introduces some multicollinearity with the macroeconomic management index. Future studies could refine these </w:t>
       </w:r>
       <w:r>
         <w:t>hypotheses</w:t>
@@ -5537,25 +7688,7 @@
         <w:jc w:val="both"/>
       </w:pPr>
       <w:r>
-        <w:t>Finally, moving beyond fixed effects to dynamic panel models or single-country time series analyses could provide richer insights into the causal mechanisms at play</w:t>
-      </w:r>
-      <w:r>
-        <w:t xml:space="preserve"> for specific nations</w:t>
-      </w:r>
-      <w:r>
-        <w:t>.</w:t>
-      </w:r>
-    </w:p>
-    <w:p>
-      <w:pPr>
-        <w:jc w:val="center"/>
-      </w:pPr>
-      <w:r>
-        <w:rPr>
-          <w:b/>
-          <w:bCs/>
-        </w:rPr>
-        <w:t>Conclusion</w:t>
+        <w:t>The results of major nation outliers, namely Zimbabwe, were accounted for in this model by using country-level fixed effects; however, it is possible that extreme outliers may have biased intra-cluster results. Future studies can choose to control for this by either omitting Zimbabwe from the model or using a Mean Absolute Error model instead of Ordinary Least Squares to increase the resistance to outliers.</w:t>
       </w:r>
     </w:p>
     <w:p>
@@ -5565,7 +7698,56 @@
         <w:jc w:val="both"/>
       </w:pPr>
       <w:r>
-        <w:t>This study finds that the quality of a nation's macroeconomic policy exerts a statistically significant influence on inflation outcomes, but that this relationship is conditioned by export activity levels. Specifically, while improvements in macroeconomic management ratings are associated with reductions in inflation, the marginal benefit of these improvements diminishes as export volumes increase.</w:t>
+        <w:t>Lastly, the positive correlation found between the CPIA Average rating and inflation as a primary independent variable is interesting but not strictly interpretable from the results of this study. Further studies should investigate the impacts of CPIA social management and justice indices on inflation as a primary independent variable to further clarify its true relationship with inflation.</w:t>
+      </w:r>
+    </w:p>
+    <w:p>
+      <w:pPr>
+        <w:jc w:val="center"/>
+        <w:rPr>
+          <w:b/>
+          <w:bCs/>
+        </w:rPr>
+      </w:pPr>
+    </w:p>
+    <w:p>
+      <w:pPr>
+        <w:jc w:val="center"/>
+        <w:rPr>
+          <w:b/>
+          <w:bCs/>
+        </w:rPr>
+      </w:pPr>
+    </w:p>
+    <w:p>
+      <w:pPr>
+        <w:jc w:val="center"/>
+        <w:rPr>
+          <w:b/>
+          <w:bCs/>
+        </w:rPr>
+      </w:pPr>
+    </w:p>
+    <w:p>
+      <w:pPr>
+        <w:jc w:val="center"/>
+        <w:rPr>
+          <w:b/>
+          <w:bCs/>
+        </w:rPr>
+      </w:pPr>
+    </w:p>
+    <w:p>
+      <w:pPr>
+        <w:jc w:val="center"/>
+      </w:pPr>
+      <w:r>
+        <w:rPr>
+          <w:b/>
+          <w:bCs/>
+        </w:rPr>
+        <w:lastRenderedPageBreak/>
+        <w:t>Conclusion</w:t>
       </w:r>
     </w:p>
     <w:p>
@@ -5575,11 +7757,49 @@
         <w:jc w:val="both"/>
       </w:pPr>
       <w:r>
-        <w:t xml:space="preserve">Importantly, macroeconomic policy quality only emerges as a significant predictor of inflation once broader structural factors—including domestic financial sector stability, dedication to debt management, social inclusion, and property rights protections—are </w:t>
-      </w:r>
-      <w:r>
-        <w:lastRenderedPageBreak/>
-        <w:t>controlled for. Policymakers seeking to reduce inflation cannot rely solely on macroeconomic fine-tuning; rather, effective policy must be complemented by robust financial sectors, equitable social policies, and strong institutional frameworks.</w:t>
+        <w:t xml:space="preserve">This study finds that the quality of a nation's macroeconomic policy exerts a statistically significant influence on inflation outcomes, but that </w:t>
+      </w:r>
+      <w:r>
+        <w:t>export activity levels condition this relationship</w:t>
+      </w:r>
+      <w:r>
+        <w:t xml:space="preserve">. </w:t>
+      </w:r>
+      <w:r>
+        <w:t>Specifically, a</w:t>
+      </w:r>
+      <w:r>
+        <w:t xml:space="preserve"> one-point increase in the CPIA Macroeconomic Management Rating </w:t>
+      </w:r>
+      <w:r>
+        <w:t xml:space="preserve">is associated with a </w:t>
+      </w:r>
+      <w:r>
+        <w:t xml:space="preserve">4.644 percentage </w:t>
+      </w:r>
+      <w:r>
+        <w:t>point</w:t>
+      </w:r>
+      <w:r>
+        <w:t xml:space="preserve"> </w:t>
+      </w:r>
+      <w:r>
+        <w:t xml:space="preserve">decrease in inflation </w:t>
+      </w:r>
+      <w:r>
+        <w:t>when the export index is 0.</w:t>
+      </w:r>
+      <w:r>
+        <w:t xml:space="preserve"> </w:t>
+      </w:r>
+      <w:r>
+        <w:t>However</w:t>
+      </w:r>
+      <w:r>
+        <w:t>, this inflation-reducing effect weakens by 0.00407 percentage points for each additional point in the export index, normalized around 100</w:t>
+      </w:r>
+      <w:r>
+        <w:t>.</w:t>
       </w:r>
     </w:p>
     <w:p>
@@ -5589,16 +7809,8 @@
         <w:jc w:val="both"/>
       </w:pPr>
       <w:r>
-        <w:t>Moreover, these findings suggest that informed voter assessments of a government's ability to manage inflation should extend beyond simple evaluations of macroeconomic policies. Given the interconnectedness of inflation outcomes with broader social and institutional structures — including debt management strategies and commitments to social inclusion — citizens and policymakers alike should consider the quality of governance in these areas when forming expectations about future inflation dynamics. A strong macroeconomic framework, while necessary, is insufficient on its own without accompanying institutional strength and inclusive development policies.</w:t>
-      </w:r>
-    </w:p>
-    <w:p>
-      <w:pPr>
-        <w:rPr>
-          <w:b/>
-          <w:bCs/>
-        </w:rPr>
-      </w:pPr>
+        <w:t>Importantly, macroeconomic policy quality only emerges as a significant predictor of inflation once broader structural factors—including domestic financial sector stability, dedication to debt management, social inclusion, and property rights protections—are controlled for. Policymakers seeking to reduce inflation cannot rely solely on macroeconomic fine-tuning; rather, effective policy must be complemented by robust financial sectors, equitable social policies, and strong institutional frameworks.</w:t>
+      </w:r>
       <w:r>
         <w:rPr>
           <w:b/>
@@ -5790,8 +8002,8 @@
       </w:r>
     </w:p>
     <w:sectPr>
-      <w:headerReference w:type="default" r:id="rId11"/>
-      <w:headerReference w:type="first" r:id="rId12"/>
+      <w:headerReference w:type="default" r:id="rId12"/>
+      <w:headerReference w:type="first" r:id="rId13"/>
       <w:pgSz w:w="12240" w:h="15840"/>
       <w:pgMar w:top="1440" w:right="1440" w:bottom="1440" w:left="1440" w:header="720" w:footer="720" w:gutter="0"/>
       <w:cols w:space="720"/>
@@ -7044,6 +9256,25 @@
     <w:uiPriority w:val="99"/>
     <w:rsid w:val="005F4010"/>
   </w:style>
+  <w:style w:type="paragraph" w:styleId="Caption">
+    <w:name w:val="caption"/>
+    <w:basedOn w:val="Normal"/>
+    <w:next w:val="Normal"/>
+    <w:uiPriority w:val="35"/>
+    <w:unhideWhenUsed/>
+    <w:qFormat/>
+    <w:rsid w:val="008E67D1"/>
+    <w:pPr>
+      <w:spacing w:after="200" w:line="240" w:lineRule="auto"/>
+    </w:pPr>
+    <w:rPr>
+      <w:i/>
+      <w:iCs/>
+      <w:color w:val="0E2841" w:themeColor="text2"/>
+      <w:sz w:val="18"/>
+      <w:szCs w:val="18"/>
+    </w:rPr>
+  </w:style>
 </w:styles>
 </file>
 

</xml_diff>

<commit_message>
Final submission / Added readme
</commit_message>
<xml_diff>
--- a/The Nexus of Macroeconomic Policy Quality on Inflation.docx
+++ b/The Nexus of Macroeconomic Policy Quality on Inflation.docx
@@ -104,7 +104,10 @@
         <w:jc w:val="both"/>
       </w:pPr>
       <w:r>
-        <w:t xml:space="preserve">This paper investigates the relationship between the quality of a nation's macroeconomic policy, as measured by the World Bank's CPIA Macroeconomic Management Index, and its annual inflation rate. Using a panel dataset of 75 countries from 2005 to 2016, we estimate several fixed effects models to examine this relationship while controlling for credit conditions, export volumes, and broader measures of institutional and financial development. </w:t>
+        <w:t>This paper investigates the relationship between the quality of a nation's macroeconomic policy, as measured by the World Bank's CPIA Macroeconomic Management Index, and its inflation rate. Using a panel dataset of 75 countries from 2005 to 2016, we estimate several fixed effects models to examine this relationship</w:t>
+      </w:r>
+      <w:r>
+        <w:t xml:space="preserve">. </w:t>
       </w:r>
       <w:r>
         <w:t>Our r</w:t>
@@ -116,22 +119,25 @@
         <w:t>dependent on the</w:t>
       </w:r>
       <w:r>
-        <w:t xml:space="preserve"> country's export volume. Furthermore, macroeconomic policy quality only achieves statistical significance</w:t>
+        <w:t xml:space="preserve"> country's export volume. </w:t>
+      </w:r>
+      <w:r>
+        <w:t xml:space="preserve"> </w:t>
+      </w:r>
+      <w:r>
+        <w:t>Furthermore, macroeconomic policy quality only achieves statistical significance</w:t>
       </w:r>
       <w:r>
         <w:t xml:space="preserve"> after</w:t>
       </w:r>
       <w:r>
-        <w:t xml:space="preserve"> accounting for domestic financial sector credit growth and broader structural factors such as social equity, debt management, and property rights protections. </w:t>
-      </w:r>
-      <w:r>
-        <w:t xml:space="preserve">These </w:t>
-      </w:r>
-      <w:r>
-        <w:t xml:space="preserve">findings indicate that the effectiveness of successful macroeconomic policy is dependent on a nation’s dedication to broader </w:t>
-      </w:r>
-      <w:r>
-        <w:t>social and institutional development.</w:t>
+        <w:t xml:space="preserve"> accounting for domestic financial sector credit growth and broader structural factors</w:t>
+      </w:r>
+      <w:r>
+        <w:t>, including</w:t>
+      </w:r>
+      <w:r>
+        <w:t xml:space="preserve"> social equity, debt management, and property rights.</w:t>
       </w:r>
     </w:p>
     <w:p>
@@ -191,7 +197,16 @@
         <w:t>problem for the country</w:t>
       </w:r>
       <w:r>
-        <w:t xml:space="preserve"> (Pew Research, 2024)</w:t>
+        <w:t xml:space="preserve"> (</w:t>
+      </w:r>
+      <w:r>
+        <w:t>Nadeem</w:t>
+      </w:r>
+      <w:r>
+        <w:t>, 2024)</w:t>
+      </w:r>
+      <w:r>
+        <w:t>, and many Americans considered an administration’s proposed economic policy as a key factor in their voting decisions</w:t>
       </w:r>
       <w:r>
         <w:t>.</w:t>
@@ -261,22 +276,13 @@
         <w:t xml:space="preserve"> T</w:t>
       </w:r>
       <w:r>
-        <w:t>his paper examines whether a country's quality of macroeconomic management</w:t>
-      </w:r>
-      <w:r>
-        <w:t xml:space="preserve"> </w:t>
-      </w:r>
-      <w:r>
-        <w:t xml:space="preserve">affects </w:t>
-      </w:r>
-      <w:r>
-        <w:t xml:space="preserve">consumer </w:t>
-      </w:r>
-      <w:r>
-        <w:t>inflation outcomes</w:t>
-      </w:r>
-      <w:r>
-        <w:t xml:space="preserve">, and finds that the impact of a nation’s macroeconomic management quality is associated with an expected decrease in inflation, but is dependent on that nation’s export volumes, controlling for broader institutional and financial sector quality. </w:t>
+        <w:t xml:space="preserve">his paper </w:t>
+      </w:r>
+      <w:r>
+        <w:t xml:space="preserve">finds </w:t>
+      </w:r>
+      <w:r>
+        <w:t xml:space="preserve">that the impact of a nation’s macroeconomic management quality is associated with an expected decrease in inflation, but is dependent on that nation’s export volumes, controlling for broader institutional and financial sector quality. </w:t>
       </w:r>
     </w:p>
     <w:p>
@@ -293,6 +299,9 @@
         <w:t>Figure 1: Variance of Inflation % with respect to CPIA Macroeconomic Management</w:t>
       </w:r>
       <w:r>
+        <w:rPr>
+          <w:noProof/>
+        </w:rPr>
         <w:drawing>
           <wp:inline distT="0" distB="0" distL="0" distR="0" wp14:anchorId="3D34C245" wp14:editId="01A98F14">
             <wp:extent cx="5943600" cy="4434205"/>
@@ -399,7 +408,13 @@
       </w:r>
       <w:r>
         <w:lastRenderedPageBreak/>
-        <w:t xml:space="preserve">findings (Coibion &amp; Gorodnichenko, 2015) confirm that demand-side pressures intensify inflation, </w:t>
+        <w:t>findings</w:t>
+      </w:r>
+      <w:r>
+        <w:t xml:space="preserve"> </w:t>
+      </w:r>
+      <w:r>
+        <w:t xml:space="preserve">confirm that demand-side pressures intensify inflation, </w:t>
       </w:r>
       <w:r>
         <w:t xml:space="preserve">potentially </w:t>
@@ -414,13 +429,25 @@
         <w:t xml:space="preserve"> </w:t>
       </w:r>
       <w:r>
-        <w:t>Income levels, proxied by GDP per capita, also modulate inflation dynamics. Developed economies exhibit stable, low inflation rates, whereas developing nations often experience greater volatility (Ha, Kose, &amp; Ohnsorge, 2019). Credit growth similarly plays a vital role; rapid financial expansion can fuel demand and thus inflation (Choi &amp; Cook, 2018).</w:t>
+        <w:t>Income levels, proxied by GDP per capita, also modulate inflation dynamics. Developed economies exhibit stable, low inflation rates, whereas developing nations often experience greater volatility (Ha, Kose, &amp; Ohnsorge, 2019). Credit growth similarly plays a vital role; rapid financial expansion can fuel demand and thus inflation (Choi &amp; Cook,</w:t>
+      </w:r>
+      <w:r>
+        <w:t xml:space="preserve"> 2002</w:t>
+      </w:r>
+      <w:r>
+        <w:t>).</w:t>
       </w:r>
       <w:r>
         <w:t xml:space="preserve"> Prior research has also found that e</w:t>
       </w:r>
       <w:r>
-        <w:t>xport booms or trade price volatility affect domestic inflation via terms-of-trade mechanisms (Comin &amp; Johnson, 2020)</w:t>
+        <w:t>xport booms or trade price volatility affect domestic inflation via terms-of-trade mechanisms</w:t>
+      </w:r>
+      <w:r>
+        <w:t xml:space="preserve"> </w:t>
+      </w:r>
+      <w:r>
+        <w:t>(Frankel &amp; Orszag, 2001)</w:t>
       </w:r>
       <w:r>
         <w:t xml:space="preserve">. </w:t>
@@ -432,10 +459,16 @@
         <w:t xml:space="preserve">help </w:t>
       </w:r>
       <w:r>
-        <w:t>stabilize inflation (Mishkin, 2007), whereas corruption and weak institutions exacerbate volatility (Mujahid, 2021).</w:t>
-      </w:r>
-      <w:r>
-        <w:t xml:space="preserve"> Finally, i</w:t>
+        <w:t xml:space="preserve">stabilize inflation (Mishkin, 2007), whereas corruption and weak institutions exacerbate volatility </w:t>
+      </w:r>
+      <w:r>
+        <w:t>(Salahodjaev &amp; Chepel, 2014)</w:t>
+      </w:r>
+      <w:r>
+        <w:t xml:space="preserve">. </w:t>
+      </w:r>
+      <w:r>
+        <w:t>Finally, i</w:t>
       </w:r>
       <w:r>
         <w:t>nfrastructure deficiencies</w:t>
@@ -544,7 +577,6 @@
           <w:b/>
           <w:bCs/>
         </w:rPr>
-        <w:lastRenderedPageBreak/>
         <w:t>Data Description</w:t>
       </w:r>
     </w:p>
@@ -561,6 +593,7 @@
           <w:i/>
           <w:iCs/>
         </w:rPr>
+        <w:lastRenderedPageBreak/>
         <w:t>Table 1</w:t>
       </w:r>
       <w:r>
@@ -872,7 +905,7 @@
         <w:jc w:val="both"/>
       </w:pPr>
       <w:r>
-        <w:t xml:space="preserve">This research employs panel data collected at the country-year level between 2005 and 2016 to examine the relationship between macroeconomic policy quality and inflation rates. The dataset contains </w:t>
+        <w:t xml:space="preserve">This research employs panel data collected between 2005 and 2016 to examine the relationship between macroeconomic policy quality and inflation rates. The dataset contains </w:t>
       </w:r>
       <w:r>
         <w:t>922 observations, covering 75 countries across a diverse range of economic, institutional, and developmental contexts. One observation</w:t>
@@ -888,7 +921,13 @@
         <w:jc w:val="both"/>
       </w:pPr>
       <w:r>
-        <w:t xml:space="preserve">The primary dataset is the World Bank’s Country Policy and Institutional Assessment (CPIA) database. The CPIA provides ratings across several dimensions of governance and economic management. This paper </w:t>
+        <w:t>The primary dataset is the World Bank’s Country Policy and Institutional Assessment (CPIA) database</w:t>
+      </w:r>
+      <w:r>
+        <w:t xml:space="preserve"> (World Bank, 2025)</w:t>
+      </w:r>
+      <w:r>
+        <w:t xml:space="preserve">. The CPIA provides ratings across several dimensions of governance and economic management. This paper </w:t>
       </w:r>
       <w:r>
         <w:t>focuses</w:t>
@@ -904,8 +943,11 @@
         <w:jc w:val="both"/>
       </w:pPr>
       <w:r>
+        <w:t xml:space="preserve">In addition to the macroeconomic policy quality measure, several control variables are incorporated to account for potential omitted variable bias. Export volume data, used to capture a country's exposure to global trade shocks, is obtained from the World Bank’s </w:t>
+      </w:r>
+      <w:r>
         <w:lastRenderedPageBreak/>
-        <w:t>In addition to the macroeconomic policy quality measure, several control variables are incorporated to account for potential omitted variable bias. Export volume data, used to capture a country's exposure to global trade shocks, is obtained from the World Bank’s Development Indicators. Domestic credit to the private sector, expressed as a percentage of GDP, is included as a measure of financial sector development and liquidity conditions, drawn from the same source.</w:t>
+        <w:t>Development Indicators. Domestic credit to the private sector, expressed as a percentage of GDP, is included as a measure of financial sector development and liquidity conditions, drawn from the same source.</w:t>
       </w:r>
     </w:p>
     <w:p>
@@ -1743,7 +1785,6 @@
                 <w:i/>
                 <w:iCs/>
               </w:rPr>
-              <w:lastRenderedPageBreak/>
               <w:t>Credit</w:t>
             </w:r>
           </w:p>
@@ -1888,6 +1929,7 @@
           <w:b/>
           <w:bCs/>
         </w:rPr>
+        <w:lastRenderedPageBreak/>
         <w:t>Empirical Model Specification</w:t>
       </w:r>
     </w:p>
@@ -2960,33 +3002,16 @@
       <w:pPr>
         <w:rPr>
           <w:rFonts w:eastAsiaTheme="minorEastAsia"/>
+          <w:b/>
+          <w:bCs/>
         </w:rPr>
       </w:pPr>
-    </w:p>
-    <w:p>
-      <w:pPr>
+      <w:r>
         <w:rPr>
           <w:rFonts w:eastAsiaTheme="minorEastAsia"/>
           <w:b/>
           <w:bCs/>
         </w:rPr>
-      </w:pPr>
-    </w:p>
-    <w:p>
-      <w:pPr>
-        <w:rPr>
-          <w:rFonts w:eastAsiaTheme="minorEastAsia"/>
-          <w:b/>
-          <w:bCs/>
-        </w:rPr>
-      </w:pPr>
-      <w:r>
-        <w:rPr>
-          <w:rFonts w:eastAsiaTheme="minorEastAsia"/>
-          <w:b/>
-          <w:bCs/>
-        </w:rPr>
-        <w:lastRenderedPageBreak/>
         <w:t>Variable Selection Rationale</w:t>
       </w:r>
     </w:p>
@@ -3018,7 +3043,17 @@
         <w:t>, incremented by 0.5</w:t>
       </w:r>
       <w:r>
-        <w:t xml:space="preserve">. Across all estimated models, Macro consistently demonstrates strong statistical significance at the 1% level. For instance, in the preferred interaction model (Column 2 of Table </w:t>
+        <w:t xml:space="preserve">. Across all estimated models, Macro consistently demonstrates strong statistical significance at the 1% level. For instance, in the </w:t>
+      </w:r>
+      <w:r>
+        <w:lastRenderedPageBreak/>
+        <w:t xml:space="preserve">preferred interaction model (Column </w:t>
+      </w:r>
+      <w:r>
+        <w:t>6</w:t>
+      </w:r>
+      <w:r>
+        <w:t xml:space="preserve"> of Table </w:t>
       </w:r>
       <w:r>
         <w:t>3</w:t>
@@ -3043,10 +3078,28 @@
         <w:t>Export Volume</w:t>
       </w:r>
       <w:r>
-        <w:t xml:space="preserve"> (Export) is included as an independent control and as part of an interaction term with Macro. The rationale stems from the influence of external trade shocks on domestic inflation dynamics. While Export alone is marginally significant in the final model (p&lt;0.1), the interaction term (Macro × Export) achieves statistical significance at the 10% level (coefficient = 0.00792; p&lt;0.1)</w:t>
-      </w:r>
-      <w:r>
-        <w:t xml:space="preserve">, meaning that the for </w:t>
+        <w:t xml:space="preserve"> (Export) is included as </w:t>
+      </w:r>
+      <w:r>
+        <w:t xml:space="preserve">an </w:t>
+      </w:r>
+      <w:r>
+        <w:t>independent</w:t>
+      </w:r>
+      <w:r>
+        <w:t xml:space="preserve"> control </w:t>
+      </w:r>
+      <w:r>
+        <w:t xml:space="preserve">variable </w:t>
+      </w:r>
+      <w:r>
+        <w:t>and as part of an interaction term with Macro. The rationale stems from the influence of external trade shocks on domestic inflation dynamics. While Export alone is marginally significant in the final model (p&lt;0.1), the interaction term (Macro × Export) achieves statistical significance at the 10% level (coefficient = 0.00792; p&lt;0.1)</w:t>
+      </w:r>
+      <w:r>
+        <w:t xml:space="preserve">, meaning that </w:t>
+      </w:r>
+      <w:r>
+        <w:t>countries with higher indices are expected to reduce the impact of macroeconomic policy on inflation.</w:t>
       </w:r>
       <w:r>
         <w:t xml:space="preserve"> </w:t>
@@ -3077,11 +3130,7 @@
         <w:t xml:space="preserve"> Average</w:t>
       </w:r>
       <w:r>
-        <w:t xml:space="preserve"> leads to substantial omitted variable bias, shifting the estimated effect of Macro significantly and reducing its interpretability. Its presence ensures that the estimated relationship between </w:t>
-      </w:r>
-      <w:r>
-        <w:lastRenderedPageBreak/>
-        <w:t>macroeconomic management and inflation is not conflated with broader governance quality effects.</w:t>
+        <w:t xml:space="preserve"> leads to substantial omitted variable bias, shifting the estimated effect of Macro significantly and reducing its interpretability. Its presence ensures that the estimated relationship between macroeconomic management and inflation is not conflated with broader governance quality effects.</w:t>
       </w:r>
     </w:p>
     <w:p>
@@ -3091,7 +3140,20 @@
         <w:jc w:val="both"/>
       </w:pPr>
       <w:r>
-        <w:t>Domestic Credit to Private Sector (Credit Financial), expressed as a percentage of GDP, is incorporated to account for liquidity conditions and credit market dynamics, which the literature identifies as important determinants of inflation. This variable demonstrates consistent statistical significance at the 1% level across all specifications (e.g., -0.0741; p&lt;0.01 in Column 2), further validating its inclusion.</w:t>
+        <w:t xml:space="preserve">Domestic Credit to Private Sector (Credit Financial), expressed as a percentage of GDP, is incorporated to account for liquidity conditions and credit market dynamics, which </w:t>
+      </w:r>
+      <w:r>
+        <w:lastRenderedPageBreak/>
+        <w:t xml:space="preserve">existing research </w:t>
+      </w:r>
+      <w:r>
+        <w:t>identifies as important determinants of inflation. This variable demonstrates consistent statistical significance at the 1% level across all specifications</w:t>
+      </w:r>
+      <w:r>
+        <w:t xml:space="preserve">. </w:t>
+      </w:r>
+      <w:r>
+        <w:t>further validating its inclusion.</w:t>
       </w:r>
     </w:p>
     <w:p>
@@ -3148,18 +3210,26 @@
         <w:t>Estimating quadratic and log-linear models considered the possibility of nonlinearity</w:t>
       </w:r>
       <w:r>
-        <w:t xml:space="preserve"> (Columns 2 and 3)</w:t>
+        <w:t xml:space="preserve"> (Columns </w:t>
+      </w:r>
+      <w:r>
+        <w:t>3</w:t>
+      </w:r>
+      <w:r>
+        <w:t xml:space="preserve"> and </w:t>
+      </w:r>
+      <w:r>
+        <w:t>4</w:t>
+      </w:r>
+      <w:r>
+        <w:t>)</w:t>
       </w:r>
       <w:commentRangeStart w:id="0"/>
       <w:r>
         <w:t>. However, none of these alternative specifications improved model fit</w:t>
       </w:r>
       <w:r>
-        <w:t xml:space="preserve"> as </w:t>
-      </w:r>
-      <w:r>
-        <w:lastRenderedPageBreak/>
-        <w:t xml:space="preserve">much as the linear interaction term, </w:t>
+        <w:t xml:space="preserve"> as much as the linear interaction term, </w:t>
       </w:r>
       <w:r>
         <w:t xml:space="preserve">as assessed by adjusted R-squared values and statistical significance tests. Consequently, a linear </w:t>
@@ -3171,10 +3241,28 @@
         <w:t xml:space="preserve">with an interaction term between Macro and Export </w:t>
       </w:r>
       <w:r>
-        <w:t xml:space="preserve">(Column 5) </w:t>
-      </w:r>
-      <w:r>
-        <w:t>was selected as the most theoretically coherent and empirically robust model for this analysis.</w:t>
+        <w:t xml:space="preserve">(Column </w:t>
+      </w:r>
+      <w:r>
+        <w:t>6</w:t>
+      </w:r>
+      <w:r>
+        <w:t xml:space="preserve">) </w:t>
+      </w:r>
+      <w:r>
+        <w:t>was selected as the</w:t>
+      </w:r>
+      <w:r>
+        <w:t xml:space="preserve"> most</w:t>
+      </w:r>
+      <w:r>
+        <w:t xml:space="preserve"> </w:t>
+      </w:r>
+      <w:r>
+        <w:t>theoretically</w:t>
+      </w:r>
+      <w:r>
+        <w:t xml:space="preserve"> coherent and empirically robust model for this analysis.</w:t>
       </w:r>
       <w:commentRangeEnd w:id="0"/>
       <w:r>
@@ -3189,6 +3277,7 @@
         <w:jc w:val="center"/>
       </w:pPr>
       <w:r>
+        <w:lastRenderedPageBreak/>
         <w:t>Table 3: - Estimates of Macroeconomic Rating: Effect on Change in Inflation across countries and time</w:t>
       </w:r>
     </w:p>
@@ -3205,6 +3294,7 @@
       </w:tblPr>
       <w:tblGrid>
         <w:gridCol w:w="2811"/>
+        <w:gridCol w:w="1440"/>
         <w:gridCol w:w="1584"/>
         <w:gridCol w:w="1584"/>
         <w:gridCol w:w="1584"/>
@@ -3212,12 +3302,6 @@
         <w:gridCol w:w="1584"/>
       </w:tblGrid>
       <w:tr>
-        <w:tblPrEx>
-          <w:tblCellMar>
-            <w:top w:w="0" w:type="dxa"/>
-            <w:bottom w:w="0" w:type="dxa"/>
-          </w:tblCellMar>
-        </w:tblPrEx>
         <w:trPr>
           <w:jc w:val="center"/>
         </w:trPr>
@@ -3247,6 +3331,38 @@
         </w:tc>
         <w:tc>
           <w:tcPr>
+            <w:tcW w:w="1440" w:type="dxa"/>
+            <w:tcBorders>
+              <w:top w:val="single" w:sz="6" w:space="0" w:color="auto"/>
+              <w:left w:val="nil"/>
+              <w:bottom w:val="nil"/>
+              <w:right w:val="nil"/>
+            </w:tcBorders>
+          </w:tcPr>
+          <w:p>
+            <w:pPr>
+              <w:widowControl w:val="0"/>
+              <w:autoSpaceDE w:val="0"/>
+              <w:autoSpaceDN w:val="0"/>
+              <w:adjustRightInd w:val="0"/>
+              <w:spacing w:after="0" w:line="240" w:lineRule="auto"/>
+              <w:jc w:val="center"/>
+              <w:rPr>
+                <w:rFonts w:ascii="Times New Roman" w:hAnsi="Times New Roman" w:cs="Times New Roman"/>
+                <w:kern w:val="0"/>
+              </w:rPr>
+            </w:pPr>
+            <w:r>
+              <w:rPr>
+                <w:rFonts w:ascii="Times New Roman" w:hAnsi="Times New Roman" w:cs="Times New Roman"/>
+                <w:kern w:val="0"/>
+              </w:rPr>
+              <w:t>(1)</w:t>
+            </w:r>
+          </w:p>
+        </w:tc>
+        <w:tc>
+          <w:tcPr>
             <w:tcW w:w="1584" w:type="dxa"/>
             <w:tcBorders>
               <w:top w:val="single" w:sz="6" w:space="0" w:color="auto"/>
@@ -3273,7 +3389,7 @@
                 <w:rFonts w:ascii="Times New Roman" w:hAnsi="Times New Roman" w:cs="Times New Roman"/>
                 <w:kern w:val="0"/>
               </w:rPr>
-              <w:t>(1)</w:t>
+              <w:t>(2)</w:t>
             </w:r>
           </w:p>
         </w:tc>
@@ -3305,7 +3421,7 @@
                 <w:rFonts w:ascii="Times New Roman" w:hAnsi="Times New Roman" w:cs="Times New Roman"/>
                 <w:kern w:val="0"/>
               </w:rPr>
-              <w:t>(2)</w:t>
+              <w:t>(3)</w:t>
             </w:r>
           </w:p>
         </w:tc>
@@ -3337,7 +3453,7 @@
                 <w:rFonts w:ascii="Times New Roman" w:hAnsi="Times New Roman" w:cs="Times New Roman"/>
                 <w:kern w:val="0"/>
               </w:rPr>
-              <w:t>(3)</w:t>
+              <w:t>(4)</w:t>
             </w:r>
           </w:p>
         </w:tc>
@@ -3369,7 +3485,7 @@
                 <w:rFonts w:ascii="Times New Roman" w:hAnsi="Times New Roman" w:cs="Times New Roman"/>
                 <w:kern w:val="0"/>
               </w:rPr>
-              <w:t>(4)</w:t>
+              <w:t>(5)</w:t>
             </w:r>
           </w:p>
         </w:tc>
@@ -3401,18 +3517,12 @@
                 <w:rFonts w:ascii="Times New Roman" w:hAnsi="Times New Roman" w:cs="Times New Roman"/>
                 <w:kern w:val="0"/>
               </w:rPr>
-              <w:t>(5)</w:t>
+              <w:t>(6)</w:t>
             </w:r>
           </w:p>
         </w:tc>
       </w:tr>
       <w:tr>
-        <w:tblPrEx>
-          <w:tblCellMar>
-            <w:top w:w="0" w:type="dxa"/>
-            <w:bottom w:w="0" w:type="dxa"/>
-          </w:tblCellMar>
-        </w:tblPrEx>
         <w:trPr>
           <w:jc w:val="center"/>
         </w:trPr>
@@ -3449,6 +3559,38 @@
         </w:tc>
         <w:tc>
           <w:tcPr>
+            <w:tcW w:w="1440" w:type="dxa"/>
+            <w:tcBorders>
+              <w:top w:val="nil"/>
+              <w:left w:val="nil"/>
+              <w:bottom w:val="single" w:sz="6" w:space="0" w:color="auto"/>
+              <w:right w:val="nil"/>
+            </w:tcBorders>
+          </w:tcPr>
+          <w:p>
+            <w:pPr>
+              <w:widowControl w:val="0"/>
+              <w:autoSpaceDE w:val="0"/>
+              <w:autoSpaceDN w:val="0"/>
+              <w:adjustRightInd w:val="0"/>
+              <w:spacing w:after="0" w:line="240" w:lineRule="auto"/>
+              <w:jc w:val="center"/>
+              <w:rPr>
+                <w:rFonts w:ascii="Times New Roman" w:hAnsi="Times New Roman" w:cs="Times New Roman"/>
+                <w:kern w:val="0"/>
+              </w:rPr>
+            </w:pPr>
+            <w:r>
+              <w:rPr>
+                <w:rFonts w:ascii="Times New Roman" w:hAnsi="Times New Roman" w:cs="Times New Roman"/>
+                <w:kern w:val="0"/>
+              </w:rPr>
+              <w:t>Inflation</w:t>
+            </w:r>
+          </w:p>
+        </w:tc>
+        <w:tc>
+          <w:tcPr>
             <w:tcW w:w="1584" w:type="dxa"/>
             <w:tcBorders>
               <w:top w:val="nil"/>
@@ -3609,12 +3751,6 @@
         </w:tc>
       </w:tr>
       <w:tr>
-        <w:tblPrEx>
-          <w:tblCellMar>
-            <w:top w:w="0" w:type="dxa"/>
-            <w:bottom w:w="0" w:type="dxa"/>
-          </w:tblCellMar>
-        </w:tblPrEx>
         <w:trPr>
           <w:jc w:val="center"/>
         </w:trPr>
@@ -3644,6 +3780,31 @@
         </w:tc>
         <w:tc>
           <w:tcPr>
+            <w:tcW w:w="1440" w:type="dxa"/>
+            <w:tcBorders>
+              <w:top w:val="nil"/>
+              <w:left w:val="nil"/>
+              <w:bottom w:val="nil"/>
+              <w:right w:val="nil"/>
+            </w:tcBorders>
+          </w:tcPr>
+          <w:p>
+            <w:pPr>
+              <w:widowControl w:val="0"/>
+              <w:autoSpaceDE w:val="0"/>
+              <w:autoSpaceDN w:val="0"/>
+              <w:adjustRightInd w:val="0"/>
+              <w:spacing w:after="0" w:line="240" w:lineRule="auto"/>
+              <w:jc w:val="center"/>
+              <w:rPr>
+                <w:rFonts w:ascii="Times New Roman" w:hAnsi="Times New Roman" w:cs="Times New Roman"/>
+                <w:kern w:val="0"/>
+              </w:rPr>
+            </w:pPr>
+          </w:p>
+        </w:tc>
+        <w:tc>
+          <w:tcPr>
             <w:tcW w:w="1584" w:type="dxa"/>
             <w:tcBorders>
               <w:top w:val="nil"/>
@@ -3769,12 +3930,6 @@
         </w:tc>
       </w:tr>
       <w:tr>
-        <w:tblPrEx>
-          <w:tblCellMar>
-            <w:top w:w="0" w:type="dxa"/>
-            <w:bottom w:w="0" w:type="dxa"/>
-          </w:tblCellMar>
-        </w:tblPrEx>
         <w:trPr>
           <w:jc w:val="center"/>
         </w:trPr>
@@ -3811,6 +3966,38 @@
         </w:tc>
         <w:tc>
           <w:tcPr>
+            <w:tcW w:w="1440" w:type="dxa"/>
+            <w:tcBorders>
+              <w:top w:val="nil"/>
+              <w:left w:val="nil"/>
+              <w:bottom w:val="nil"/>
+              <w:right w:val="nil"/>
+            </w:tcBorders>
+          </w:tcPr>
+          <w:p>
+            <w:pPr>
+              <w:widowControl w:val="0"/>
+              <w:autoSpaceDE w:val="0"/>
+              <w:autoSpaceDN w:val="0"/>
+              <w:adjustRightInd w:val="0"/>
+              <w:spacing w:after="0" w:line="240" w:lineRule="auto"/>
+              <w:jc w:val="center"/>
+              <w:rPr>
+                <w:rFonts w:ascii="Times New Roman" w:hAnsi="Times New Roman" w:cs="Times New Roman"/>
+                <w:kern w:val="0"/>
+              </w:rPr>
+            </w:pPr>
+            <w:r>
+              <w:rPr>
+                <w:rFonts w:ascii="Times New Roman" w:hAnsi="Times New Roman" w:cs="Times New Roman"/>
+                <w:kern w:val="0"/>
+              </w:rPr>
+              <w:t>-269.0</w:t>
+            </w:r>
+          </w:p>
+        </w:tc>
+        <w:tc>
+          <w:tcPr>
             <w:tcW w:w="1584" w:type="dxa"/>
             <w:tcBorders>
               <w:top w:val="nil"/>
@@ -3864,6 +4051,13 @@
                 <w:kern w:val="0"/>
               </w:rPr>
             </w:pPr>
+            <w:r>
+              <w:rPr>
+                <w:rFonts w:ascii="Times New Roman" w:hAnsi="Times New Roman" w:cs="Times New Roman"/>
+                <w:kern w:val="0"/>
+              </w:rPr>
+              <w:t>-10.14**</w:t>
+            </w:r>
           </w:p>
         </w:tc>
         <w:tc>
@@ -3889,6 +4083,13 @@
                 <w:kern w:val="0"/>
               </w:rPr>
             </w:pPr>
+            <w:r>
+              <w:rPr>
+                <w:rFonts w:ascii="Times New Roman" w:hAnsi="Times New Roman" w:cs="Times New Roman"/>
+                <w:kern w:val="0"/>
+              </w:rPr>
+              <w:t>3.869</w:t>
+            </w:r>
           </w:p>
         </w:tc>
         <w:tc>
@@ -3957,12 +4158,6 @@
         </w:tc>
       </w:tr>
       <w:tr>
-        <w:tblPrEx>
-          <w:tblCellMar>
-            <w:top w:w="0" w:type="dxa"/>
-            <w:bottom w:w="0" w:type="dxa"/>
-          </w:tblCellMar>
-        </w:tblPrEx>
         <w:trPr>
           <w:jc w:val="center"/>
         </w:trPr>
@@ -3992,6 +4187,38 @@
         </w:tc>
         <w:tc>
           <w:tcPr>
+            <w:tcW w:w="1440" w:type="dxa"/>
+            <w:tcBorders>
+              <w:top w:val="nil"/>
+              <w:left w:val="nil"/>
+              <w:bottom w:val="nil"/>
+              <w:right w:val="nil"/>
+            </w:tcBorders>
+          </w:tcPr>
+          <w:p>
+            <w:pPr>
+              <w:widowControl w:val="0"/>
+              <w:autoSpaceDE w:val="0"/>
+              <w:autoSpaceDN w:val="0"/>
+              <w:adjustRightInd w:val="0"/>
+              <w:spacing w:after="0" w:line="240" w:lineRule="auto"/>
+              <w:jc w:val="center"/>
+              <w:rPr>
+                <w:rFonts w:ascii="Times New Roman" w:hAnsi="Times New Roman" w:cs="Times New Roman"/>
+                <w:kern w:val="0"/>
+              </w:rPr>
+            </w:pPr>
+            <w:r>
+              <w:rPr>
+                <w:rFonts w:ascii="Times New Roman" w:hAnsi="Times New Roman" w:cs="Times New Roman"/>
+                <w:kern w:val="0"/>
+              </w:rPr>
+              <w:t>(255.7)</w:t>
+            </w:r>
+          </w:p>
+        </w:tc>
+        <w:tc>
+          <w:tcPr>
             <w:tcW w:w="1584" w:type="dxa"/>
             <w:tcBorders>
               <w:top w:val="nil"/>
@@ -4045,6 +4272,13 @@
                 <w:kern w:val="0"/>
               </w:rPr>
             </w:pPr>
+            <w:r>
+              <w:rPr>
+                <w:rFonts w:ascii="Times New Roman" w:hAnsi="Times New Roman" w:cs="Times New Roman"/>
+                <w:kern w:val="0"/>
+              </w:rPr>
+              <w:t>(4.106)</w:t>
+            </w:r>
           </w:p>
         </w:tc>
         <w:tc>
@@ -4070,6 +4304,13 @@
                 <w:kern w:val="0"/>
               </w:rPr>
             </w:pPr>
+            <w:r>
+              <w:rPr>
+                <w:rFonts w:ascii="Times New Roman" w:hAnsi="Times New Roman" w:cs="Times New Roman"/>
+                <w:kern w:val="0"/>
+              </w:rPr>
+              <w:t>(3.375)</w:t>
+            </w:r>
           </w:p>
         </w:tc>
         <w:tc>
@@ -4138,12 +4379,6 @@
         </w:tc>
       </w:tr>
       <w:tr>
-        <w:tblPrEx>
-          <w:tblCellMar>
-            <w:top w:w="0" w:type="dxa"/>
-            <w:bottom w:w="0" w:type="dxa"/>
-          </w:tblCellMar>
-        </w:tblPrEx>
         <w:trPr>
           <w:jc w:val="center"/>
         </w:trPr>
@@ -4174,8 +4409,33 @@
                 <w:rFonts w:ascii="Times New Roman" w:hAnsi="Times New Roman" w:cs="Times New Roman"/>
                 <w:kern w:val="0"/>
               </w:rPr>
-              <w:t>Export</w:t>
-            </w:r>
+              <w:t>Macro^2</w:t>
+            </w:r>
+          </w:p>
+        </w:tc>
+        <w:tc>
+          <w:tcPr>
+            <w:tcW w:w="1440" w:type="dxa"/>
+            <w:tcBorders>
+              <w:top w:val="nil"/>
+              <w:left w:val="nil"/>
+              <w:bottom w:val="nil"/>
+              <w:right w:val="nil"/>
+            </w:tcBorders>
+          </w:tcPr>
+          <w:p>
+            <w:pPr>
+              <w:widowControl w:val="0"/>
+              <w:autoSpaceDE w:val="0"/>
+              <w:autoSpaceDN w:val="0"/>
+              <w:adjustRightInd w:val="0"/>
+              <w:spacing w:after="0" w:line="240" w:lineRule="auto"/>
+              <w:jc w:val="center"/>
+              <w:rPr>
+                <w:rFonts w:ascii="Times New Roman" w:hAnsi="Times New Roman" w:cs="Times New Roman"/>
+                <w:kern w:val="0"/>
+              </w:rPr>
+            </w:pPr>
           </w:p>
         </w:tc>
         <w:tc>
@@ -4201,13 +4461,6 @@
                 <w:kern w:val="0"/>
               </w:rPr>
             </w:pPr>
-            <w:r>
-              <w:rPr>
-                <w:rFonts w:ascii="Times New Roman" w:hAnsi="Times New Roman" w:cs="Times New Roman"/>
-                <w:kern w:val="0"/>
-              </w:rPr>
-              <w:t>4.56e-06</w:t>
-            </w:r>
           </w:p>
         </w:tc>
         <w:tc>
@@ -4238,7 +4491,7 @@
                 <w:rFonts w:ascii="Times New Roman" w:hAnsi="Times New Roman" w:cs="Times New Roman"/>
                 <w:kern w:val="0"/>
               </w:rPr>
-              <w:t>1.02e-05</w:t>
+              <w:t>0.970*</w:t>
             </w:r>
           </w:p>
         </w:tc>
@@ -4265,13 +4518,6 @@
                 <w:kern w:val="0"/>
               </w:rPr>
             </w:pPr>
-            <w:r>
-              <w:rPr>
-                <w:rFonts w:ascii="Times New Roman" w:hAnsi="Times New Roman" w:cs="Times New Roman"/>
-                <w:kern w:val="0"/>
-              </w:rPr>
-              <w:t>6.18e-06</w:t>
-            </w:r>
           </w:p>
         </w:tc>
         <w:tc>
@@ -4297,13 +4543,6 @@
                 <w:kern w:val="0"/>
               </w:rPr>
             </w:pPr>
-            <w:r>
-              <w:rPr>
-                <w:rFonts w:ascii="Times New Roman" w:hAnsi="Times New Roman" w:cs="Times New Roman"/>
-                <w:kern w:val="0"/>
-              </w:rPr>
-              <w:t>-6.812</w:t>
-            </w:r>
           </w:p>
         </w:tc>
         <w:tc>
@@ -4329,23 +4568,10 @@
                 <w:kern w:val="0"/>
               </w:rPr>
             </w:pPr>
-            <w:r>
-              <w:rPr>
-                <w:rFonts w:ascii="Times New Roman" w:hAnsi="Times New Roman" w:cs="Times New Roman"/>
-                <w:kern w:val="0"/>
-              </w:rPr>
-              <w:t>-0.0317*</w:t>
-            </w:r>
           </w:p>
         </w:tc>
       </w:tr>
       <w:tr>
-        <w:tblPrEx>
-          <w:tblCellMar>
-            <w:top w:w="0" w:type="dxa"/>
-            <w:bottom w:w="0" w:type="dxa"/>
-          </w:tblCellMar>
-        </w:tblPrEx>
         <w:trPr>
           <w:jc w:val="center"/>
         </w:trPr>
@@ -4375,6 +4601,31 @@
         </w:tc>
         <w:tc>
           <w:tcPr>
+            <w:tcW w:w="1440" w:type="dxa"/>
+            <w:tcBorders>
+              <w:top w:val="nil"/>
+              <w:left w:val="nil"/>
+              <w:bottom w:val="nil"/>
+              <w:right w:val="nil"/>
+            </w:tcBorders>
+          </w:tcPr>
+          <w:p>
+            <w:pPr>
+              <w:widowControl w:val="0"/>
+              <w:autoSpaceDE w:val="0"/>
+              <w:autoSpaceDN w:val="0"/>
+              <w:adjustRightInd w:val="0"/>
+              <w:spacing w:after="0" w:line="240" w:lineRule="auto"/>
+              <w:jc w:val="center"/>
+              <w:rPr>
+                <w:rFonts w:ascii="Times New Roman" w:hAnsi="Times New Roman" w:cs="Times New Roman"/>
+                <w:kern w:val="0"/>
+              </w:rPr>
+            </w:pPr>
+          </w:p>
+        </w:tc>
+        <w:tc>
+          <w:tcPr>
             <w:tcW w:w="1584" w:type="dxa"/>
             <w:tcBorders>
               <w:top w:val="nil"/>
@@ -4396,13 +4647,6 @@
                 <w:kern w:val="0"/>
               </w:rPr>
             </w:pPr>
-            <w:r>
-              <w:rPr>
-                <w:rFonts w:ascii="Times New Roman" w:hAnsi="Times New Roman" w:cs="Times New Roman"/>
-                <w:kern w:val="0"/>
-              </w:rPr>
-              <w:t>(0.000260)</w:t>
-            </w:r>
           </w:p>
         </w:tc>
         <w:tc>
@@ -4433,7 +4677,7 @@
                 <w:rFonts w:ascii="Times New Roman" w:hAnsi="Times New Roman" w:cs="Times New Roman"/>
                 <w:kern w:val="0"/>
               </w:rPr>
-              <w:t>(0.000263)</w:t>
+              <w:t>(0.534)</w:t>
             </w:r>
           </w:p>
         </w:tc>
@@ -4460,13 +4704,6 @@
                 <w:kern w:val="0"/>
               </w:rPr>
             </w:pPr>
-            <w:r>
-              <w:rPr>
-                <w:rFonts w:ascii="Times New Roman" w:hAnsi="Times New Roman" w:cs="Times New Roman"/>
-                <w:kern w:val="0"/>
-              </w:rPr>
-              <w:t>(0.000256)</w:t>
-            </w:r>
           </w:p>
         </w:tc>
         <w:tc>
@@ -4492,13 +4729,6 @@
                 <w:kern w:val="0"/>
               </w:rPr>
             </w:pPr>
-            <w:r>
-              <w:rPr>
-                <w:rFonts w:ascii="Times New Roman" w:hAnsi="Times New Roman" w:cs="Times New Roman"/>
-                <w:kern w:val="0"/>
-              </w:rPr>
-              <w:t>(6.438)</w:t>
-            </w:r>
           </w:p>
         </w:tc>
         <w:tc>
@@ -4524,23 +4754,10 @@
                 <w:kern w:val="0"/>
               </w:rPr>
             </w:pPr>
-            <w:r>
-              <w:rPr>
-                <w:rFonts w:ascii="Times New Roman" w:hAnsi="Times New Roman" w:cs="Times New Roman"/>
-                <w:kern w:val="0"/>
-              </w:rPr>
-              <w:t>(0.0163)</w:t>
-            </w:r>
           </w:p>
         </w:tc>
       </w:tr>
       <w:tr>
-        <w:tblPrEx>
-          <w:tblCellMar>
-            <w:top w:w="0" w:type="dxa"/>
-            <w:bottom w:w="0" w:type="dxa"/>
-          </w:tblCellMar>
-        </w:tblPrEx>
         <w:trPr>
           <w:jc w:val="center"/>
         </w:trPr>
@@ -4571,8 +4788,33 @@
                 <w:rFonts w:ascii="Times New Roman" w:hAnsi="Times New Roman" w:cs="Times New Roman"/>
                 <w:kern w:val="0"/>
               </w:rPr>
-              <w:t>CPIA_Avg</w:t>
-            </w:r>
+              <w:t>Export</w:t>
+            </w:r>
+          </w:p>
+        </w:tc>
+        <w:tc>
+          <w:tcPr>
+            <w:tcW w:w="1440" w:type="dxa"/>
+            <w:tcBorders>
+              <w:top w:val="nil"/>
+              <w:left w:val="nil"/>
+              <w:bottom w:val="nil"/>
+              <w:right w:val="nil"/>
+            </w:tcBorders>
+          </w:tcPr>
+          <w:p>
+            <w:pPr>
+              <w:widowControl w:val="0"/>
+              <w:autoSpaceDE w:val="0"/>
+              <w:autoSpaceDN w:val="0"/>
+              <w:adjustRightInd w:val="0"/>
+              <w:spacing w:after="0" w:line="240" w:lineRule="auto"/>
+              <w:jc w:val="center"/>
+              <w:rPr>
+                <w:rFonts w:ascii="Times New Roman" w:hAnsi="Times New Roman" w:cs="Times New Roman"/>
+                <w:kern w:val="0"/>
+              </w:rPr>
+            </w:pPr>
           </w:p>
         </w:tc>
         <w:tc>
@@ -4603,7 +4845,7 @@
                 <w:rFonts w:ascii="Times New Roman" w:hAnsi="Times New Roman" w:cs="Times New Roman"/>
                 <w:kern w:val="0"/>
               </w:rPr>
-              <w:t>3.483**</w:t>
+              <w:t>4.56e-06</w:t>
             </w:r>
           </w:p>
         </w:tc>
@@ -4635,7 +4877,7 @@
                 <w:rFonts w:ascii="Times New Roman" w:hAnsi="Times New Roman" w:cs="Times New Roman"/>
                 <w:kern w:val="0"/>
               </w:rPr>
-              <w:t>3.119*</w:t>
+              <w:t>1.29e-05</w:t>
             </w:r>
           </w:p>
         </w:tc>
@@ -4667,7 +4909,7 @@
                 <w:rFonts w:ascii="Times New Roman" w:hAnsi="Times New Roman" w:cs="Times New Roman"/>
                 <w:kern w:val="0"/>
               </w:rPr>
-              <w:t>3.565**</w:t>
+              <w:t>1.56e-05</w:t>
             </w:r>
           </w:p>
         </w:tc>
@@ -4694,6 +4936,13 @@
                 <w:kern w:val="0"/>
               </w:rPr>
             </w:pPr>
+            <w:r>
+              <w:rPr>
+                <w:rFonts w:ascii="Times New Roman" w:hAnsi="Times New Roman" w:cs="Times New Roman"/>
+                <w:kern w:val="0"/>
+              </w:rPr>
+              <w:t>-6.812</w:t>
+            </w:r>
           </w:p>
         </w:tc>
         <w:tc>
@@ -4724,18 +4973,12 @@
                 <w:rFonts w:ascii="Times New Roman" w:hAnsi="Times New Roman" w:cs="Times New Roman"/>
                 <w:kern w:val="0"/>
               </w:rPr>
-              <w:t>3.284*</w:t>
+              <w:t>-0.0317*</w:t>
             </w:r>
           </w:p>
         </w:tc>
       </w:tr>
       <w:tr>
-        <w:tblPrEx>
-          <w:tblCellMar>
-            <w:top w:w="0" w:type="dxa"/>
-            <w:bottom w:w="0" w:type="dxa"/>
-          </w:tblCellMar>
-        </w:tblPrEx>
         <w:trPr>
           <w:jc w:val="center"/>
         </w:trPr>
@@ -4765,6 +5008,31 @@
         </w:tc>
         <w:tc>
           <w:tcPr>
+            <w:tcW w:w="1440" w:type="dxa"/>
+            <w:tcBorders>
+              <w:top w:val="nil"/>
+              <w:left w:val="nil"/>
+              <w:bottom w:val="nil"/>
+              <w:right w:val="nil"/>
+            </w:tcBorders>
+          </w:tcPr>
+          <w:p>
+            <w:pPr>
+              <w:widowControl w:val="0"/>
+              <w:autoSpaceDE w:val="0"/>
+              <w:autoSpaceDN w:val="0"/>
+              <w:adjustRightInd w:val="0"/>
+              <w:spacing w:after="0" w:line="240" w:lineRule="auto"/>
+              <w:jc w:val="center"/>
+              <w:rPr>
+                <w:rFonts w:ascii="Times New Roman" w:hAnsi="Times New Roman" w:cs="Times New Roman"/>
+                <w:kern w:val="0"/>
+              </w:rPr>
+            </w:pPr>
+          </w:p>
+        </w:tc>
+        <w:tc>
+          <w:tcPr>
             <w:tcW w:w="1584" w:type="dxa"/>
             <w:tcBorders>
               <w:top w:val="nil"/>
@@ -4791,7 +5059,7 @@
                 <w:rFonts w:ascii="Times New Roman" w:hAnsi="Times New Roman" w:cs="Times New Roman"/>
                 <w:kern w:val="0"/>
               </w:rPr>
-              <w:t>(1.737)</w:t>
+              <w:t>(0.000260)</w:t>
             </w:r>
           </w:p>
         </w:tc>
@@ -4823,7 +5091,7 @@
                 <w:rFonts w:ascii="Times New Roman" w:hAnsi="Times New Roman" w:cs="Times New Roman"/>
                 <w:kern w:val="0"/>
               </w:rPr>
-              <w:t>(1.710)</w:t>
+              <w:t>(0.000253)</w:t>
             </w:r>
           </w:p>
         </w:tc>
@@ -4855,7 +5123,7 @@
                 <w:rFonts w:ascii="Times New Roman" w:hAnsi="Times New Roman" w:cs="Times New Roman"/>
                 <w:kern w:val="0"/>
               </w:rPr>
-              <w:t>(1.742)</w:t>
+              <w:t>(0.000253)</w:t>
             </w:r>
           </w:p>
         </w:tc>
@@ -4882,6 +5150,13 @@
                 <w:kern w:val="0"/>
               </w:rPr>
             </w:pPr>
+            <w:r>
+              <w:rPr>
+                <w:rFonts w:ascii="Times New Roman" w:hAnsi="Times New Roman" w:cs="Times New Roman"/>
+                <w:kern w:val="0"/>
+              </w:rPr>
+              <w:t>(6.438)</w:t>
+            </w:r>
           </w:p>
         </w:tc>
         <w:tc>
@@ -4912,18 +5187,12 @@
                 <w:rFonts w:ascii="Times New Roman" w:hAnsi="Times New Roman" w:cs="Times New Roman"/>
                 <w:kern w:val="0"/>
               </w:rPr>
-              <w:t>(1.776)</w:t>
+              <w:t>(0.0163)</w:t>
             </w:r>
           </w:p>
         </w:tc>
       </w:tr>
       <w:tr>
-        <w:tblPrEx>
-          <w:tblCellMar>
-            <w:top w:w="0" w:type="dxa"/>
-            <w:bottom w:w="0" w:type="dxa"/>
-          </w:tblCellMar>
-        </w:tblPrEx>
         <w:trPr>
           <w:jc w:val="center"/>
         </w:trPr>
@@ -4954,8 +5223,33 @@
                 <w:rFonts w:ascii="Times New Roman" w:hAnsi="Times New Roman" w:cs="Times New Roman"/>
                 <w:kern w:val="0"/>
               </w:rPr>
-              <w:t>Credit Financial</w:t>
-            </w:r>
+              <w:t>CPIA_Avg</w:t>
+            </w:r>
+          </w:p>
+        </w:tc>
+        <w:tc>
+          <w:tcPr>
+            <w:tcW w:w="1440" w:type="dxa"/>
+            <w:tcBorders>
+              <w:top w:val="nil"/>
+              <w:left w:val="nil"/>
+              <w:bottom w:val="nil"/>
+              <w:right w:val="nil"/>
+            </w:tcBorders>
+          </w:tcPr>
+          <w:p>
+            <w:pPr>
+              <w:widowControl w:val="0"/>
+              <w:autoSpaceDE w:val="0"/>
+              <w:autoSpaceDN w:val="0"/>
+              <w:adjustRightInd w:val="0"/>
+              <w:spacing w:after="0" w:line="240" w:lineRule="auto"/>
+              <w:jc w:val="center"/>
+              <w:rPr>
+                <w:rFonts w:ascii="Times New Roman" w:hAnsi="Times New Roman" w:cs="Times New Roman"/>
+                <w:kern w:val="0"/>
+              </w:rPr>
+            </w:pPr>
           </w:p>
         </w:tc>
         <w:tc>
@@ -4986,7 +5280,7 @@
                 <w:rFonts w:ascii="Times New Roman" w:hAnsi="Times New Roman" w:cs="Times New Roman"/>
                 <w:kern w:val="0"/>
               </w:rPr>
-              <w:t>-0.0773***</w:t>
+              <w:t>3.483**</w:t>
             </w:r>
           </w:p>
         </w:tc>
@@ -5018,7 +5312,7 @@
                 <w:rFonts w:ascii="Times New Roman" w:hAnsi="Times New Roman" w:cs="Times New Roman"/>
                 <w:kern w:val="0"/>
               </w:rPr>
-              <w:t>-0.0784***</w:t>
+              <w:t>3.428**</w:t>
             </w:r>
           </w:p>
         </w:tc>
@@ -5050,7 +5344,7 @@
                 <w:rFonts w:ascii="Times New Roman" w:hAnsi="Times New Roman" w:cs="Times New Roman"/>
                 <w:kern w:val="0"/>
               </w:rPr>
-              <w:t>-0.0744***</w:t>
+              <w:t>3.333*</w:t>
             </w:r>
           </w:p>
         </w:tc>
@@ -5107,18 +5401,12 @@
                 <w:rFonts w:ascii="Times New Roman" w:hAnsi="Times New Roman" w:cs="Times New Roman"/>
                 <w:kern w:val="0"/>
               </w:rPr>
-              <w:t>-0.0741***</w:t>
+              <w:t>3.284*</w:t>
             </w:r>
           </w:p>
         </w:tc>
       </w:tr>
       <w:tr>
-        <w:tblPrEx>
-          <w:tblCellMar>
-            <w:top w:w="0" w:type="dxa"/>
-            <w:bottom w:w="0" w:type="dxa"/>
-          </w:tblCellMar>
-        </w:tblPrEx>
         <w:trPr>
           <w:jc w:val="center"/>
         </w:trPr>
@@ -5148,6 +5436,31 @@
         </w:tc>
         <w:tc>
           <w:tcPr>
+            <w:tcW w:w="1440" w:type="dxa"/>
+            <w:tcBorders>
+              <w:top w:val="nil"/>
+              <w:left w:val="nil"/>
+              <w:bottom w:val="nil"/>
+              <w:right w:val="nil"/>
+            </w:tcBorders>
+          </w:tcPr>
+          <w:p>
+            <w:pPr>
+              <w:widowControl w:val="0"/>
+              <w:autoSpaceDE w:val="0"/>
+              <w:autoSpaceDN w:val="0"/>
+              <w:adjustRightInd w:val="0"/>
+              <w:spacing w:after="0" w:line="240" w:lineRule="auto"/>
+              <w:jc w:val="center"/>
+              <w:rPr>
+                <w:rFonts w:ascii="Times New Roman" w:hAnsi="Times New Roman" w:cs="Times New Roman"/>
+                <w:kern w:val="0"/>
+              </w:rPr>
+            </w:pPr>
+          </w:p>
+        </w:tc>
+        <w:tc>
+          <w:tcPr>
             <w:tcW w:w="1584" w:type="dxa"/>
             <w:tcBorders>
               <w:top w:val="nil"/>
@@ -5174,7 +5487,7 @@
                 <w:rFonts w:ascii="Times New Roman" w:hAnsi="Times New Roman" w:cs="Times New Roman"/>
                 <w:kern w:val="0"/>
               </w:rPr>
-              <w:t>(0.0219)</w:t>
+              <w:t>(1.737)</w:t>
             </w:r>
           </w:p>
         </w:tc>
@@ -5206,7 +5519,7 @@
                 <w:rFonts w:ascii="Times New Roman" w:hAnsi="Times New Roman" w:cs="Times New Roman"/>
                 <w:kern w:val="0"/>
               </w:rPr>
-              <w:t>(0.0223)</w:t>
+              <w:t>(1.719)</w:t>
             </w:r>
           </w:p>
         </w:tc>
@@ -5238,7 +5551,7 @@
                 <w:rFonts w:ascii="Times New Roman" w:hAnsi="Times New Roman" w:cs="Times New Roman"/>
                 <w:kern w:val="0"/>
               </w:rPr>
-              <w:t>(0.0214)</w:t>
+              <w:t>(1.700)</w:t>
             </w:r>
           </w:p>
         </w:tc>
@@ -5295,18 +5608,12 @@
                 <w:rFonts w:ascii="Times New Roman" w:hAnsi="Times New Roman" w:cs="Times New Roman"/>
                 <w:kern w:val="0"/>
               </w:rPr>
-              <w:t>(0.0215)</w:t>
+              <w:t>(1.776)</w:t>
             </w:r>
           </w:p>
         </w:tc>
       </w:tr>
       <w:tr>
-        <w:tblPrEx>
-          <w:tblCellMar>
-            <w:top w:w="0" w:type="dxa"/>
-            <w:bottom w:w="0" w:type="dxa"/>
-          </w:tblCellMar>
-        </w:tblPrEx>
         <w:trPr>
           <w:jc w:val="center"/>
         </w:trPr>
@@ -5337,8 +5644,33 @@
                 <w:rFonts w:ascii="Times New Roman" w:hAnsi="Times New Roman" w:cs="Times New Roman"/>
                 <w:kern w:val="0"/>
               </w:rPr>
-              <w:t>Macro^2</w:t>
-            </w:r>
+              <w:t>Credit Financial</w:t>
+            </w:r>
+          </w:p>
+        </w:tc>
+        <w:tc>
+          <w:tcPr>
+            <w:tcW w:w="1440" w:type="dxa"/>
+            <w:tcBorders>
+              <w:top w:val="nil"/>
+              <w:left w:val="nil"/>
+              <w:bottom w:val="nil"/>
+              <w:right w:val="nil"/>
+            </w:tcBorders>
+          </w:tcPr>
+          <w:p>
+            <w:pPr>
+              <w:widowControl w:val="0"/>
+              <w:autoSpaceDE w:val="0"/>
+              <w:autoSpaceDN w:val="0"/>
+              <w:adjustRightInd w:val="0"/>
+              <w:spacing w:after="0" w:line="240" w:lineRule="auto"/>
+              <w:jc w:val="center"/>
+              <w:rPr>
+                <w:rFonts w:ascii="Times New Roman" w:hAnsi="Times New Roman" w:cs="Times New Roman"/>
+                <w:kern w:val="0"/>
+              </w:rPr>
+            </w:pPr>
           </w:p>
         </w:tc>
         <w:tc>
@@ -5364,6 +5696,13 @@
                 <w:kern w:val="0"/>
               </w:rPr>
             </w:pPr>
+            <w:r>
+              <w:rPr>
+                <w:rFonts w:ascii="Times New Roman" w:hAnsi="Times New Roman" w:cs="Times New Roman"/>
+                <w:kern w:val="0"/>
+              </w:rPr>
+              <w:t>-0.0773***</w:t>
+            </w:r>
           </w:p>
         </w:tc>
         <w:tc>
@@ -5394,7 +5733,7 @@
                 <w:rFonts w:ascii="Times New Roman" w:hAnsi="Times New Roman" w:cs="Times New Roman"/>
                 <w:kern w:val="0"/>
               </w:rPr>
-              <w:t>-0.408***</w:t>
+              <w:t>-0.0688***</w:t>
             </w:r>
           </w:p>
         </w:tc>
@@ -5421,6 +5760,13 @@
                 <w:kern w:val="0"/>
               </w:rPr>
             </w:pPr>
+            <w:r>
+              <w:rPr>
+                <w:rFonts w:ascii="Times New Roman" w:hAnsi="Times New Roman" w:cs="Times New Roman"/>
+                <w:kern w:val="0"/>
+              </w:rPr>
+              <w:t>-0.0691***</w:t>
+            </w:r>
           </w:p>
         </w:tc>
         <w:tc>
@@ -5471,16 +5817,17 @@
                 <w:kern w:val="0"/>
               </w:rPr>
             </w:pPr>
+            <w:r>
+              <w:rPr>
+                <w:rFonts w:ascii="Times New Roman" w:hAnsi="Times New Roman" w:cs="Times New Roman"/>
+                <w:kern w:val="0"/>
+              </w:rPr>
+              <w:t>-0.0741***</w:t>
+            </w:r>
           </w:p>
         </w:tc>
       </w:tr>
       <w:tr>
-        <w:tblPrEx>
-          <w:tblCellMar>
-            <w:top w:w="0" w:type="dxa"/>
-            <w:bottom w:w="0" w:type="dxa"/>
-          </w:tblCellMar>
-        </w:tblPrEx>
         <w:trPr>
           <w:jc w:val="center"/>
         </w:trPr>
@@ -5510,6 +5857,31 @@
         </w:tc>
         <w:tc>
           <w:tcPr>
+            <w:tcW w:w="1440" w:type="dxa"/>
+            <w:tcBorders>
+              <w:top w:val="nil"/>
+              <w:left w:val="nil"/>
+              <w:bottom w:val="nil"/>
+              <w:right w:val="nil"/>
+            </w:tcBorders>
+          </w:tcPr>
+          <w:p>
+            <w:pPr>
+              <w:widowControl w:val="0"/>
+              <w:autoSpaceDE w:val="0"/>
+              <w:autoSpaceDN w:val="0"/>
+              <w:adjustRightInd w:val="0"/>
+              <w:spacing w:after="0" w:line="240" w:lineRule="auto"/>
+              <w:jc w:val="center"/>
+              <w:rPr>
+                <w:rFonts w:ascii="Times New Roman" w:hAnsi="Times New Roman" w:cs="Times New Roman"/>
+                <w:kern w:val="0"/>
+              </w:rPr>
+            </w:pPr>
+          </w:p>
+        </w:tc>
+        <w:tc>
+          <w:tcPr>
             <w:tcW w:w="1584" w:type="dxa"/>
             <w:tcBorders>
               <w:top w:val="nil"/>
@@ -5531,6 +5903,13 @@
                 <w:kern w:val="0"/>
               </w:rPr>
             </w:pPr>
+            <w:r>
+              <w:rPr>
+                <w:rFonts w:ascii="Times New Roman" w:hAnsi="Times New Roman" w:cs="Times New Roman"/>
+                <w:kern w:val="0"/>
+              </w:rPr>
+              <w:t>(0.0219)</w:t>
+            </w:r>
           </w:p>
         </w:tc>
         <w:tc>
@@ -5561,7 +5940,7 @@
                 <w:rFonts w:ascii="Times New Roman" w:hAnsi="Times New Roman" w:cs="Times New Roman"/>
                 <w:kern w:val="0"/>
               </w:rPr>
-              <w:t>(0.0890)</w:t>
+              <w:t>(0.0222)</w:t>
             </w:r>
           </w:p>
         </w:tc>
@@ -5588,6 +5967,13 @@
                 <w:kern w:val="0"/>
               </w:rPr>
             </w:pPr>
+            <w:r>
+              <w:rPr>
+                <w:rFonts w:ascii="Times New Roman" w:hAnsi="Times New Roman" w:cs="Times New Roman"/>
+                <w:kern w:val="0"/>
+              </w:rPr>
+              <w:t>(0.0219)</w:t>
+            </w:r>
           </w:p>
         </w:tc>
         <w:tc>
@@ -5638,16 +6024,17 @@
                 <w:kern w:val="0"/>
               </w:rPr>
             </w:pPr>
+            <w:r>
+              <w:rPr>
+                <w:rFonts w:ascii="Times New Roman" w:hAnsi="Times New Roman" w:cs="Times New Roman"/>
+                <w:kern w:val="0"/>
+              </w:rPr>
+              <w:t>(0.0215)</w:t>
+            </w:r>
           </w:p>
         </w:tc>
       </w:tr>
       <w:tr>
-        <w:tblPrEx>
-          <w:tblCellMar>
-            <w:top w:w="0" w:type="dxa"/>
-            <w:bottom w:w="0" w:type="dxa"/>
-          </w:tblCellMar>
-        </w:tblPrEx>
         <w:trPr>
           <w:jc w:val="center"/>
         </w:trPr>
@@ -5684,6 +6071,31 @@
         </w:tc>
         <w:tc>
           <w:tcPr>
+            <w:tcW w:w="1440" w:type="dxa"/>
+            <w:tcBorders>
+              <w:top w:val="nil"/>
+              <w:left w:val="nil"/>
+              <w:bottom w:val="nil"/>
+              <w:right w:val="nil"/>
+            </w:tcBorders>
+          </w:tcPr>
+          <w:p>
+            <w:pPr>
+              <w:widowControl w:val="0"/>
+              <w:autoSpaceDE w:val="0"/>
+              <w:autoSpaceDN w:val="0"/>
+              <w:adjustRightInd w:val="0"/>
+              <w:spacing w:after="0" w:line="240" w:lineRule="auto"/>
+              <w:jc w:val="center"/>
+              <w:rPr>
+                <w:rFonts w:ascii="Times New Roman" w:hAnsi="Times New Roman" w:cs="Times New Roman"/>
+                <w:kern w:val="0"/>
+              </w:rPr>
+            </w:pPr>
+          </w:p>
+        </w:tc>
+        <w:tc>
+          <w:tcPr>
             <w:tcW w:w="1584" w:type="dxa"/>
             <w:tcBorders>
               <w:top w:val="nil"/>
@@ -5760,7 +6172,7 @@
                 <w:rFonts w:ascii="Times New Roman" w:hAnsi="Times New Roman" w:cs="Times New Roman"/>
                 <w:kern w:val="0"/>
               </w:rPr>
-              <w:t>-11.53***</w:t>
+              <w:t>-24.44*</w:t>
             </w:r>
           </w:p>
         </w:tc>
@@ -5816,12 +6228,6 @@
         </w:tc>
       </w:tr>
       <w:tr>
-        <w:tblPrEx>
-          <w:tblCellMar>
-            <w:top w:w="0" w:type="dxa"/>
-            <w:bottom w:w="0" w:type="dxa"/>
-          </w:tblCellMar>
-        </w:tblPrEx>
         <w:trPr>
           <w:jc w:val="center"/>
         </w:trPr>
@@ -5851,6 +6257,31 @@
         </w:tc>
         <w:tc>
           <w:tcPr>
+            <w:tcW w:w="1440" w:type="dxa"/>
+            <w:tcBorders>
+              <w:top w:val="nil"/>
+              <w:left w:val="nil"/>
+              <w:bottom w:val="nil"/>
+              <w:right w:val="nil"/>
+            </w:tcBorders>
+          </w:tcPr>
+          <w:p>
+            <w:pPr>
+              <w:widowControl w:val="0"/>
+              <w:autoSpaceDE w:val="0"/>
+              <w:autoSpaceDN w:val="0"/>
+              <w:adjustRightInd w:val="0"/>
+              <w:spacing w:after="0" w:line="240" w:lineRule="auto"/>
+              <w:jc w:val="center"/>
+              <w:rPr>
+                <w:rFonts w:ascii="Times New Roman" w:hAnsi="Times New Roman" w:cs="Times New Roman"/>
+                <w:kern w:val="0"/>
+              </w:rPr>
+            </w:pPr>
+          </w:p>
+        </w:tc>
+        <w:tc>
+          <w:tcPr>
             <w:tcW w:w="1584" w:type="dxa"/>
             <w:tcBorders>
               <w:top w:val="nil"/>
@@ -5927,7 +6358,7 @@
                 <w:rFonts w:ascii="Times New Roman" w:hAnsi="Times New Roman" w:cs="Times New Roman"/>
                 <w:kern w:val="0"/>
               </w:rPr>
-              <w:t>(2.462)</w:t>
+              <w:t>(12.40)</w:t>
             </w:r>
           </w:p>
         </w:tc>
@@ -5983,12 +6414,6 @@
         </w:tc>
       </w:tr>
       <w:tr>
-        <w:tblPrEx>
-          <w:tblCellMar>
-            <w:top w:w="0" w:type="dxa"/>
-            <w:bottom w:w="0" w:type="dxa"/>
-          </w:tblCellMar>
-        </w:tblPrEx>
         <w:trPr>
           <w:jc w:val="center"/>
         </w:trPr>
@@ -6025,6 +6450,31 @@
         </w:tc>
         <w:tc>
           <w:tcPr>
+            <w:tcW w:w="1440" w:type="dxa"/>
+            <w:tcBorders>
+              <w:top w:val="nil"/>
+              <w:left w:val="nil"/>
+              <w:bottom w:val="nil"/>
+              <w:right w:val="nil"/>
+            </w:tcBorders>
+          </w:tcPr>
+          <w:p>
+            <w:pPr>
+              <w:widowControl w:val="0"/>
+              <w:autoSpaceDE w:val="0"/>
+              <w:autoSpaceDN w:val="0"/>
+              <w:adjustRightInd w:val="0"/>
+              <w:spacing w:after="0" w:line="240" w:lineRule="auto"/>
+              <w:jc w:val="center"/>
+              <w:rPr>
+                <w:rFonts w:ascii="Times New Roman" w:hAnsi="Times New Roman" w:cs="Times New Roman"/>
+                <w:kern w:val="0"/>
+              </w:rPr>
+            </w:pPr>
+          </w:p>
+        </w:tc>
+        <w:tc>
+          <w:tcPr>
             <w:tcW w:w="1584" w:type="dxa"/>
             <w:tcBorders>
               <w:top w:val="nil"/>
@@ -6164,12 +6614,6 @@
         </w:tc>
       </w:tr>
       <w:tr>
-        <w:tblPrEx>
-          <w:tblCellMar>
-            <w:top w:w="0" w:type="dxa"/>
-            <w:bottom w:w="0" w:type="dxa"/>
-          </w:tblCellMar>
-        </w:tblPrEx>
         <w:trPr>
           <w:jc w:val="center"/>
         </w:trPr>
@@ -6199,6 +6643,31 @@
         </w:tc>
         <w:tc>
           <w:tcPr>
+            <w:tcW w:w="1440" w:type="dxa"/>
+            <w:tcBorders>
+              <w:top w:val="nil"/>
+              <w:left w:val="nil"/>
+              <w:bottom w:val="nil"/>
+              <w:right w:val="nil"/>
+            </w:tcBorders>
+          </w:tcPr>
+          <w:p>
+            <w:pPr>
+              <w:widowControl w:val="0"/>
+              <w:autoSpaceDE w:val="0"/>
+              <w:autoSpaceDN w:val="0"/>
+              <w:adjustRightInd w:val="0"/>
+              <w:spacing w:after="0" w:line="240" w:lineRule="auto"/>
+              <w:jc w:val="center"/>
+              <w:rPr>
+                <w:rFonts w:ascii="Times New Roman" w:hAnsi="Times New Roman" w:cs="Times New Roman"/>
+                <w:kern w:val="0"/>
+              </w:rPr>
+            </w:pPr>
+          </w:p>
+        </w:tc>
+        <w:tc>
+          <w:tcPr>
             <w:tcW w:w="1584" w:type="dxa"/>
             <w:tcBorders>
               <w:top w:val="nil"/>
@@ -6338,12 +6807,6 @@
         </w:tc>
       </w:tr>
       <w:tr>
-        <w:tblPrEx>
-          <w:tblCellMar>
-            <w:top w:w="0" w:type="dxa"/>
-            <w:bottom w:w="0" w:type="dxa"/>
-          </w:tblCellMar>
-        </w:tblPrEx>
         <w:trPr>
           <w:jc w:val="center"/>
         </w:trPr>
@@ -6380,6 +6843,38 @@
         </w:tc>
         <w:tc>
           <w:tcPr>
+            <w:tcW w:w="1440" w:type="dxa"/>
+            <w:tcBorders>
+              <w:top w:val="nil"/>
+              <w:left w:val="nil"/>
+              <w:bottom w:val="nil"/>
+              <w:right w:val="nil"/>
+            </w:tcBorders>
+          </w:tcPr>
+          <w:p>
+            <w:pPr>
+              <w:widowControl w:val="0"/>
+              <w:autoSpaceDE w:val="0"/>
+              <w:autoSpaceDN w:val="0"/>
+              <w:adjustRightInd w:val="0"/>
+              <w:spacing w:after="0" w:line="240" w:lineRule="auto"/>
+              <w:jc w:val="center"/>
+              <w:rPr>
+                <w:rFonts w:ascii="Times New Roman" w:hAnsi="Times New Roman" w:cs="Times New Roman"/>
+                <w:kern w:val="0"/>
+              </w:rPr>
+            </w:pPr>
+            <w:r>
+              <w:rPr>
+                <w:rFonts w:ascii="Times New Roman" w:hAnsi="Times New Roman" w:cs="Times New Roman"/>
+                <w:kern w:val="0"/>
+              </w:rPr>
+              <w:t>1,030</w:t>
+            </w:r>
+          </w:p>
+        </w:tc>
+        <w:tc>
+          <w:tcPr>
             <w:tcW w:w="1584" w:type="dxa"/>
             <w:tcBorders>
               <w:top w:val="nil"/>
@@ -6438,7 +6933,7 @@
                 <w:rFonts w:ascii="Times New Roman" w:hAnsi="Times New Roman" w:cs="Times New Roman"/>
                 <w:kern w:val="0"/>
               </w:rPr>
-              <w:t>5.516</w:t>
+              <w:t>22.36***</w:t>
             </w:r>
           </w:p>
         </w:tc>
@@ -6470,7 +6965,7 @@
                 <w:rFonts w:ascii="Times New Roman" w:hAnsi="Times New Roman" w:cs="Times New Roman"/>
                 <w:kern w:val="0"/>
               </w:rPr>
-              <w:t>13.14**</w:t>
+              <w:t>16.08***</w:t>
             </w:r>
           </w:p>
         </w:tc>
@@ -6540,12 +7035,6 @@
         </w:tc>
       </w:tr>
       <w:tr>
-        <w:tblPrEx>
-          <w:tblCellMar>
-            <w:top w:w="0" w:type="dxa"/>
-            <w:bottom w:w="0" w:type="dxa"/>
-          </w:tblCellMar>
-        </w:tblPrEx>
         <w:trPr>
           <w:jc w:val="center"/>
         </w:trPr>
@@ -6575,6 +7064,38 @@
         </w:tc>
         <w:tc>
           <w:tcPr>
+            <w:tcW w:w="1440" w:type="dxa"/>
+            <w:tcBorders>
+              <w:top w:val="nil"/>
+              <w:left w:val="nil"/>
+              <w:bottom w:val="nil"/>
+              <w:right w:val="nil"/>
+            </w:tcBorders>
+          </w:tcPr>
+          <w:p>
+            <w:pPr>
+              <w:widowControl w:val="0"/>
+              <w:autoSpaceDE w:val="0"/>
+              <w:autoSpaceDN w:val="0"/>
+              <w:adjustRightInd w:val="0"/>
+              <w:spacing w:after="0" w:line="240" w:lineRule="auto"/>
+              <w:jc w:val="center"/>
+              <w:rPr>
+                <w:rFonts w:ascii="Times New Roman" w:hAnsi="Times New Roman" w:cs="Times New Roman"/>
+                <w:kern w:val="0"/>
+              </w:rPr>
+            </w:pPr>
+            <w:r>
+              <w:rPr>
+                <w:rFonts w:ascii="Times New Roman" w:hAnsi="Times New Roman" w:cs="Times New Roman"/>
+                <w:kern w:val="0"/>
+              </w:rPr>
+              <w:t>(943.6)</w:t>
+            </w:r>
+          </w:p>
+        </w:tc>
+        <w:tc>
+          <w:tcPr>
             <w:tcW w:w="1584" w:type="dxa"/>
             <w:tcBorders>
               <w:top w:val="nil"/>
@@ -6633,7 +7154,7 @@
                 <w:rFonts w:ascii="Times New Roman" w:hAnsi="Times New Roman" w:cs="Times New Roman"/>
                 <w:kern w:val="0"/>
               </w:rPr>
-              <w:t>(5.217)</w:t>
+              <w:t>(8.049)</w:t>
             </w:r>
           </w:p>
         </w:tc>
@@ -6665,7 +7186,7 @@
                 <w:rFonts w:ascii="Times New Roman" w:hAnsi="Times New Roman" w:cs="Times New Roman"/>
                 <w:kern w:val="0"/>
               </w:rPr>
-              <w:t>(5.174)</w:t>
+              <w:t>(5.674)</w:t>
             </w:r>
           </w:p>
         </w:tc>
@@ -6735,12 +7256,6 @@
         </w:tc>
       </w:tr>
       <w:tr>
-        <w:tblPrEx>
-          <w:tblCellMar>
-            <w:top w:w="0" w:type="dxa"/>
-            <w:bottom w:w="0" w:type="dxa"/>
-          </w:tblCellMar>
-        </w:tblPrEx>
         <w:trPr>
           <w:jc w:val="center"/>
         </w:trPr>
@@ -6770,6 +7285,31 @@
         </w:tc>
         <w:tc>
           <w:tcPr>
+            <w:tcW w:w="1440" w:type="dxa"/>
+            <w:tcBorders>
+              <w:top w:val="nil"/>
+              <w:left w:val="nil"/>
+              <w:bottom w:val="nil"/>
+              <w:right w:val="nil"/>
+            </w:tcBorders>
+          </w:tcPr>
+          <w:p>
+            <w:pPr>
+              <w:widowControl w:val="0"/>
+              <w:autoSpaceDE w:val="0"/>
+              <w:autoSpaceDN w:val="0"/>
+              <w:adjustRightInd w:val="0"/>
+              <w:spacing w:after="0" w:line="240" w:lineRule="auto"/>
+              <w:jc w:val="center"/>
+              <w:rPr>
+                <w:rFonts w:ascii="Times New Roman" w:hAnsi="Times New Roman" w:cs="Times New Roman"/>
+                <w:kern w:val="0"/>
+              </w:rPr>
+            </w:pPr>
+          </w:p>
+        </w:tc>
+        <w:tc>
+          <w:tcPr>
             <w:tcW w:w="1584" w:type="dxa"/>
             <w:tcBorders>
               <w:top w:val="nil"/>
@@ -6895,12 +7435,6 @@
         </w:tc>
       </w:tr>
       <w:tr>
-        <w:tblPrEx>
-          <w:tblCellMar>
-            <w:top w:w="0" w:type="dxa"/>
-            <w:bottom w:w="0" w:type="dxa"/>
-          </w:tblCellMar>
-        </w:tblPrEx>
         <w:trPr>
           <w:jc w:val="center"/>
         </w:trPr>
@@ -6937,6 +7471,38 @@
         </w:tc>
         <w:tc>
           <w:tcPr>
+            <w:tcW w:w="1440" w:type="dxa"/>
+            <w:tcBorders>
+              <w:top w:val="nil"/>
+              <w:left w:val="nil"/>
+              <w:bottom w:val="nil"/>
+              <w:right w:val="nil"/>
+            </w:tcBorders>
+          </w:tcPr>
+          <w:p>
+            <w:pPr>
+              <w:widowControl w:val="0"/>
+              <w:autoSpaceDE w:val="0"/>
+              <w:autoSpaceDN w:val="0"/>
+              <w:adjustRightInd w:val="0"/>
+              <w:spacing w:after="0" w:line="240" w:lineRule="auto"/>
+              <w:jc w:val="center"/>
+              <w:rPr>
+                <w:rFonts w:ascii="Times New Roman" w:hAnsi="Times New Roman" w:cs="Times New Roman"/>
+                <w:kern w:val="0"/>
+              </w:rPr>
+            </w:pPr>
+            <w:r>
+              <w:rPr>
+                <w:rFonts w:ascii="Times New Roman" w:hAnsi="Times New Roman" w:cs="Times New Roman"/>
+                <w:kern w:val="0"/>
+              </w:rPr>
+              <w:t>856</w:t>
+            </w:r>
+          </w:p>
+        </w:tc>
+        <w:tc>
+          <w:tcPr>
             <w:tcW w:w="1584" w:type="dxa"/>
             <w:tcBorders>
               <w:top w:val="nil"/>
@@ -7097,12 +7663,6 @@
         </w:tc>
       </w:tr>
       <w:tr>
-        <w:tblPrEx>
-          <w:tblCellMar>
-            <w:top w:w="0" w:type="dxa"/>
-            <w:bottom w:w="0" w:type="dxa"/>
-          </w:tblCellMar>
-        </w:tblPrEx>
         <w:trPr>
           <w:jc w:val="center"/>
         </w:trPr>
@@ -7134,6 +7694,38 @@
                 <w:kern w:val="0"/>
               </w:rPr>
               <w:t>Number of country</w:t>
+            </w:r>
+          </w:p>
+        </w:tc>
+        <w:tc>
+          <w:tcPr>
+            <w:tcW w:w="1440" w:type="dxa"/>
+            <w:tcBorders>
+              <w:top w:val="nil"/>
+              <w:left w:val="nil"/>
+              <w:bottom w:val="nil"/>
+              <w:right w:val="nil"/>
+            </w:tcBorders>
+          </w:tcPr>
+          <w:p>
+            <w:pPr>
+              <w:widowControl w:val="0"/>
+              <w:autoSpaceDE w:val="0"/>
+              <w:autoSpaceDN w:val="0"/>
+              <w:adjustRightInd w:val="0"/>
+              <w:spacing w:after="0" w:line="240" w:lineRule="auto"/>
+              <w:jc w:val="center"/>
+              <w:rPr>
+                <w:rFonts w:ascii="Times New Roman" w:hAnsi="Times New Roman" w:cs="Times New Roman"/>
+                <w:kern w:val="0"/>
+              </w:rPr>
+            </w:pPr>
+            <w:r>
+              <w:rPr>
+                <w:rFonts w:ascii="Times New Roman" w:hAnsi="Times New Roman" w:cs="Times New Roman"/>
+                <w:kern w:val="0"/>
+              </w:rPr>
+              <w:t>79</w:t>
             </w:r>
           </w:p>
         </w:tc>
@@ -7303,10 +7895,6 @@
           <w:tblBorders>
             <w:bottom w:val="single" w:sz="6" w:space="0" w:color="auto"/>
           </w:tblBorders>
-          <w:tblCellMar>
-            <w:top w:w="0" w:type="dxa"/>
-            <w:bottom w:w="0" w:type="dxa"/>
-          </w:tblCellMar>
         </w:tblPrEx>
         <w:trPr>
           <w:jc w:val="center"/>
@@ -7344,6 +7932,38 @@
         </w:tc>
         <w:tc>
           <w:tcPr>
+            <w:tcW w:w="1440" w:type="dxa"/>
+            <w:tcBorders>
+              <w:top w:val="nil"/>
+              <w:left w:val="nil"/>
+              <w:bottom w:val="single" w:sz="6" w:space="0" w:color="auto"/>
+              <w:right w:val="nil"/>
+            </w:tcBorders>
+          </w:tcPr>
+          <w:p>
+            <w:pPr>
+              <w:widowControl w:val="0"/>
+              <w:autoSpaceDE w:val="0"/>
+              <w:autoSpaceDN w:val="0"/>
+              <w:adjustRightInd w:val="0"/>
+              <w:spacing w:after="0" w:line="240" w:lineRule="auto"/>
+              <w:jc w:val="center"/>
+              <w:rPr>
+                <w:rFonts w:ascii="Times New Roman" w:hAnsi="Times New Roman" w:cs="Times New Roman"/>
+                <w:kern w:val="0"/>
+              </w:rPr>
+            </w:pPr>
+            <w:r>
+              <w:rPr>
+                <w:rFonts w:ascii="Times New Roman" w:hAnsi="Times New Roman" w:cs="Times New Roman"/>
+                <w:kern w:val="0"/>
+              </w:rPr>
+              <w:t>0.012</w:t>
+            </w:r>
+          </w:p>
+        </w:tc>
+        <w:tc>
+          <w:tcPr>
             <w:tcW w:w="1584" w:type="dxa"/>
             <w:tcBorders>
               <w:top w:val="nil"/>
@@ -7402,7 +8022,7 @@
                 <w:rFonts w:ascii="Times New Roman" w:hAnsi="Times New Roman" w:cs="Times New Roman"/>
                 <w:kern w:val="0"/>
               </w:rPr>
-              <w:t>0.033</w:t>
+              <w:t>0.042</w:t>
             </w:r>
           </w:p>
         </w:tc>
@@ -7434,7 +8054,7 @@
                 <w:rFonts w:ascii="Times New Roman" w:hAnsi="Times New Roman" w:cs="Times New Roman"/>
                 <w:kern w:val="0"/>
               </w:rPr>
-              <w:t>0.042</w:t>
+              <w:t>0.043</w:t>
             </w:r>
           </w:p>
         </w:tc>
@@ -7572,11 +8192,7 @@
         <w:t>n the final model is</w:t>
       </w:r>
       <w:r>
-        <w:t xml:space="preserve"> −4.644 (p&lt;0.01), indicating that higher macroeconomic policy quality is significantly associated with lower inflation rates. Export volume alone has a small, marginally significant </w:t>
-      </w:r>
-      <w:r>
-        <w:lastRenderedPageBreak/>
-        <w:t>negative effect on inflation (p=0.055). Critically, the interaction term between CPIA macro rating and export volume is positive and marginally significant (p=0.055), implying that the deflationary impact of macroeconomic policy quality weakens as export volume increases.</w:t>
+        <w:t xml:space="preserve"> −4.644 (p&lt;0.01), indicating that higher macroeconomic policy quality is significantly associated with lower inflation rates. Export volume alone has a small, marginally significant negative effect on inflation (p=0.055). Critically, the interaction term between CPIA macro rating and export volume is positive and marginally significant (p=0.055), implying that the deflationary impact of macroeconomic policy quality weakens as export volume increases.</w:t>
       </w:r>
     </w:p>
     <w:p>
@@ -7586,6 +8202,7 @@
         <w:jc w:val="both"/>
       </w:pPr>
       <w:r>
+        <w:lastRenderedPageBreak/>
         <w:t xml:space="preserve">Domestic credit to the private sector </w:t>
       </w:r>
       <w:r>
@@ -7626,10 +8243,10 @@
         <w:t xml:space="preserve"> </w:t>
       </w:r>
       <w:r>
-        <w:t xml:space="preserve">While broader institutional quality, captured by the CPIA Average Rating, must be controlled to accurately estimate the impact of macroeconomic management, its direct relationship with inflation is positive and marginally significant. This suggests that improvements in areas such as social inclusion and property rights, while important for overall governance, do not necessarily translate into lower inflation rates in the short to medium </w:t>
-      </w:r>
-      <w:r>
-        <w:t>term.</w:t>
+        <w:t xml:space="preserve">While broader institutional quality, captured by the CPIA Average Rating, must be controlled to accurately estimate the impact of macroeconomic management, its direct relationship with inflation is positive and marginally significant. </w:t>
+      </w:r>
+      <w:r>
+        <w:t>Importantly, despite its statistical significance, this model only captures around five percent of the total variance in inflation, showing that a nation’s rate of inflation is not solely or primarily controlled by its economic policy, even when controlling for broader institutional differences.</w:t>
       </w:r>
     </w:p>
     <w:p>
@@ -7641,7 +8258,6 @@
           <w:b/>
           <w:bCs/>
         </w:rPr>
-        <w:lastRenderedPageBreak/>
         <w:t xml:space="preserve">Limitations </w:t>
       </w:r>
       <w:r>
@@ -7659,7 +8275,17 @@
         <w:jc w:val="both"/>
       </w:pPr>
       <w:r>
-        <w:t>While the models explain some of the variation in inflation outcomes (Adjusted R-squared approximately 5%), a substantial portion remains unexplained. Future research could enhance explanatory power by incorporating additional variables such as fiscal deficits, political stability indices, and more granular trade shock measures.</w:t>
+        <w:t xml:space="preserve">While the models explain some of the variation in inflation outcomes (Adjusted R-squared approximately 5%), a substantial portion remains unexplained. Future research </w:t>
+      </w:r>
+      <w:r>
+        <w:lastRenderedPageBreak/>
+        <w:t>could enhance explanatory power by incorporating additional variables such as fiscal deficits, political stability indices, and more granular trade shock measures</w:t>
+      </w:r>
+      <w:r>
+        <w:t>, or investigating other primary variables</w:t>
+      </w:r>
+      <w:r>
+        <w:t>.</w:t>
       </w:r>
     </w:p>
     <w:p>
@@ -7698,44 +8324,14 @@
         <w:jc w:val="both"/>
       </w:pPr>
       <w:r>
-        <w:t>Lastly, the positive correlation found between the CPIA Average rating and inflation as a primary independent variable is interesting but not strictly interpretable from the results of this study. Further studies should investigate the impacts of CPIA social management and justice indices on inflation as a primary independent variable to further clarify its true relationship with inflation.</w:t>
-      </w:r>
-    </w:p>
-    <w:p>
-      <w:pPr>
-        <w:jc w:val="center"/>
-        <w:rPr>
-          <w:b/>
-          <w:bCs/>
-        </w:rPr>
-      </w:pPr>
-    </w:p>
-    <w:p>
-      <w:pPr>
-        <w:jc w:val="center"/>
-        <w:rPr>
-          <w:b/>
-          <w:bCs/>
-        </w:rPr>
-      </w:pPr>
-    </w:p>
-    <w:p>
-      <w:pPr>
-        <w:jc w:val="center"/>
-        <w:rPr>
-          <w:b/>
-          <w:bCs/>
-        </w:rPr>
-      </w:pPr>
-    </w:p>
-    <w:p>
-      <w:pPr>
-        <w:jc w:val="center"/>
-        <w:rPr>
-          <w:b/>
-          <w:bCs/>
-        </w:rPr>
-      </w:pPr>
+        <w:t xml:space="preserve">Lastly, the positive correlation found between the CPIA Average rating and inflation as a primary independent variable is interesting but not strictly interpretable from the results of this study. Further studies should investigate the impacts of CPIA social management and justice indices on inflation as a primary independent variable to further clarify </w:t>
+      </w:r>
+      <w:r>
+        <w:t>their</w:t>
+      </w:r>
+      <w:r>
+        <w:t xml:space="preserve"> true relationship with inflation.</w:t>
+      </w:r>
     </w:p>
     <w:p>
       <w:pPr>
@@ -7746,7 +8342,6 @@
           <w:b/>
           <w:bCs/>
         </w:rPr>
-        <w:lastRenderedPageBreak/>
         <w:t>Conclusion</w:t>
       </w:r>
     </w:p>
@@ -7775,28 +8370,26 @@
         <w:t xml:space="preserve">is associated with a </w:t>
       </w:r>
       <w:r>
-        <w:t xml:space="preserve">4.644 percentage </w:t>
-      </w:r>
-      <w:r>
-        <w:t>point</w:t>
+        <w:t xml:space="preserve">4.644 percentage point </w:t>
+      </w:r>
+      <w:r>
+        <w:t xml:space="preserve">decrease in inflation </w:t>
+      </w:r>
+      <w:r>
+        <w:t xml:space="preserve">when </w:t>
+      </w:r>
+      <w:r>
+        <w:lastRenderedPageBreak/>
+        <w:t>the export index is 0.</w:t>
       </w:r>
       <w:r>
         <w:t xml:space="preserve"> </w:t>
       </w:r>
       <w:r>
-        <w:t xml:space="preserve">decrease in inflation </w:t>
-      </w:r>
-      <w:r>
-        <w:t>when the export index is 0.</w:t>
-      </w:r>
-      <w:r>
-        <w:t xml:space="preserve"> </w:t>
-      </w:r>
-      <w:r>
         <w:t>However</w:t>
       </w:r>
       <w:r>
-        <w:t>, this inflation-reducing effect weakens by 0.00407 percentage points for each additional point in the export index, normalized around 100</w:t>
+        <w:t>, this inflation-reducing effect weakens by 0.00407 percentage points for each additional point in the export index</w:t>
       </w:r>
       <w:r>
         <w:t>.</w:t>
@@ -7837,17 +8430,17 @@
         <w:ind w:left="720" w:hanging="720"/>
       </w:pPr>
       <w:r>
-        <w:t xml:space="preserve">Choi, W. G., &amp; Cook, D. (2018). Liability dollarization and the bank balance sheet channel. </w:t>
+        <w:t xml:space="preserve">Cook, D., &amp; Choi, W. (2002, August 1). </w:t>
       </w:r>
       <w:r>
         <w:rPr>
           <w:i/>
           <w:iCs/>
         </w:rPr>
-        <w:t>Journal of International Economics, 114</w:t>
-      </w:r>
-      <w:r>
-        <w:t>, 41-58.</w:t>
+        <w:t>Liability dollarization and the bank balance sheet channel</w:t>
+      </w:r>
+      <w:r>
+        <w:t xml:space="preserve">. IMF. https://www.imf.org/en/Publications/WP/Issues/2016/12/30/Liability-Dollarization-and-the-Bank-Balance-Sheet-Channel-15962 </w:t>
       </w:r>
     </w:p>
     <w:p>
@@ -7855,17 +8448,17 @@
         <w:ind w:left="720" w:hanging="720"/>
       </w:pPr>
       <w:r>
-        <w:t xml:space="preserve">Coibion, O., &amp; Gorodnichenko, Y. (2015). Inflation expectations in rising and falling economies. </w:t>
+        <w:t xml:space="preserve">Frankel, J., &amp; Orszag, P. R. (2001, November 2). Retrospective on american economic policy in the 1990s. </w:t>
       </w:r>
       <w:r>
         <w:rPr>
           <w:i/>
           <w:iCs/>
         </w:rPr>
-        <w:t>Brookings Papers on Economic Activity</w:t>
-      </w:r>
-      <w:r>
-        <w:t>, 2015(1), 1-66.</w:t>
+        <w:t>Brookings</w:t>
+      </w:r>
+      <w:r>
+        <w:t xml:space="preserve">. https://www.brookings.edu/articles/retrospective-on-american-economic-policy-in-the-1990s/ </w:t>
       </w:r>
     </w:p>
     <w:p>
@@ -7873,17 +8466,23 @@
         <w:ind w:left="720" w:hanging="720"/>
       </w:pPr>
       <w:r>
-        <w:t xml:space="preserve">Comin, D., &amp; Johnson, S. (2020). Trade and the disinflation of the 1990s. </w:t>
+        <w:t xml:space="preserve">Friedman, M. (1968). The Role of Monetary Policy. </w:t>
       </w:r>
       <w:r>
         <w:rPr>
           <w:i/>
           <w:iCs/>
         </w:rPr>
-        <w:t>American Economic Review</w:t>
-      </w:r>
-      <w:r>
-        <w:t>, 110(9), 2817-2851.</w:t>
+        <w:t>American Economic Review, 58</w:t>
+      </w:r>
+      <w:r>
+        <w:t>(1), 1-17.</w:t>
+      </w:r>
+      <w:r>
+        <w:t xml:space="preserve"> </w:t>
+      </w:r>
+      <w:r>
+        <w:t>http://www.jstor.org/stable/1831652</w:t>
       </w:r>
     </w:p>
     <w:p>
@@ -7891,17 +8490,59 @@
         <w:ind w:left="720" w:hanging="720"/>
       </w:pPr>
       <w:r>
-        <w:t xml:space="preserve">Friedman, M. (1968). The Role of Monetary Policy. </w:t>
+        <w:t xml:space="preserve">Ha, J., Kose, M. A., &amp; Ohnsorge, F. (2019). </w:t>
       </w:r>
       <w:r>
         <w:rPr>
           <w:i/>
           <w:iCs/>
         </w:rPr>
-        <w:t>American Economic Review, 58</w:t>
-      </w:r>
-      <w:r>
-        <w:t>(1), 1-17.</w:t>
+        <w:t>Inflation in Emerging and Developing Economies: Evolution, Drivers, and Policies</w:t>
+      </w:r>
+      <w:r>
+        <w:t>. World Bank Publications.</w:t>
+      </w:r>
+      <w:r>
+        <w:t xml:space="preserve"> </w:t>
+      </w:r>
+      <w:r>
+        <w:t>https://openknowledge.worldbank.org/entities/publication/4259bb68-3c19-5dc5-b26a-b3000813974b</w:t>
+      </w:r>
+    </w:p>
+    <w:p>
+      <w:pPr>
+        <w:spacing w:line="240" w:lineRule="auto"/>
+        <w:ind w:left="720" w:hanging="720"/>
+        <w:rPr>
+          <w:i/>
+          <w:iCs/>
+        </w:rPr>
+      </w:pPr>
+      <w:r>
+        <w:t xml:space="preserve">Mishkin, F. S. (2007). Housing and the monetary transmission mechanism. </w:t>
+      </w:r>
+      <w:r>
+        <w:rPr>
+          <w:i/>
+          <w:iCs/>
+        </w:rPr>
+        <w:t xml:space="preserve">National Bureau of Economic Research. </w:t>
+      </w:r>
+    </w:p>
+    <w:p>
+      <w:pPr>
+        <w:spacing w:line="240" w:lineRule="auto"/>
+        <w:ind w:left="720"/>
+      </w:pPr>
+      <w:r>
+        <w:rPr>
+          <w:i/>
+          <w:iCs/>
+        </w:rPr>
+        <w:t>https://www.nber.org/papers/w13518</w:t>
+      </w:r>
+      <w:r>
+        <w:t>18</w:t>
       </w:r>
     </w:p>
     <w:p>
@@ -7909,17 +8550,35 @@
         <w:ind w:left="720" w:hanging="720"/>
       </w:pPr>
       <w:r>
-        <w:t xml:space="preserve">Ha, J., Kose, M. A., &amp; Ohnsorge, F. (2019). </w:t>
+        <w:t xml:space="preserve">Salahodjaev, R., &amp; Chepel, S. (2014). Institutional quality and inflation. </w:t>
       </w:r>
       <w:r>
         <w:rPr>
           <w:i/>
           <w:iCs/>
         </w:rPr>
-        <w:t>Inflation in Emerging and Developing Economies: Evolution, Drivers, and Policies</w:t>
-      </w:r>
-      <w:r>
-        <w:t>. World Bank Publications.</w:t>
+        <w:t>Modern Economy</w:t>
+      </w:r>
+      <w:r>
+        <w:t xml:space="preserve">, </w:t>
+      </w:r>
+      <w:r>
+        <w:rPr>
+          <w:i/>
+          <w:iCs/>
+        </w:rPr>
+        <w:t>5</w:t>
+      </w:r>
+      <w:r>
+        <w:t xml:space="preserve">(3), 219–223. </w:t>
+      </w:r>
+    </w:p>
+    <w:p>
+      <w:pPr>
+        <w:ind w:left="720"/>
+      </w:pPr>
+      <w:r>
+        <w:t xml:space="preserve">https://doi.org/10.4236/me.2014.53023 </w:t>
       </w:r>
     </w:p>
     <w:p>
@@ -7927,17 +8586,20 @@
         <w:ind w:left="720" w:hanging="720"/>
       </w:pPr>
       <w:r>
-        <w:t xml:space="preserve">Mishkin, F. S. (2007). Housing and the monetary transmission mechanism. </w:t>
+        <w:t xml:space="preserve">Nadeem, R. (2024, May 23). Public’s positive economic ratings slip; inflation still widely viewed as major problem. </w:t>
       </w:r>
       <w:r>
         <w:rPr>
           <w:i/>
           <w:iCs/>
         </w:rPr>
-        <w:t>Finance and Economics Discussion Series</w:t>
-      </w:r>
-      <w:r>
-        <w:t>.</w:t>
+        <w:t>Pew Research Center</w:t>
+      </w:r>
+      <w:r>
+        <w:t xml:space="preserve">. https://www.pewresearch.org/politics/2024/05/23/publics-positive-economic-ratings-slip-inflation-still-widely-viewed-as-major-problem </w:t>
+      </w:r>
+      <w:r>
+        <w:t xml:space="preserve"> </w:t>
       </w:r>
     </w:p>
     <w:p>
@@ -7945,65 +8607,96 @@
         <w:ind w:left="720" w:hanging="720"/>
       </w:pPr>
       <w:r>
-        <w:t xml:space="preserve">Mujahid, N. (2021). Institutional quality and inflation volatility: Evidence from panel data. </w:t>
+        <w:t xml:space="preserve">Phillips, A. W. (1958). The relation between unemployment and the rate of change of money wage rates in the United Kingdom, 1861-1957. </w:t>
       </w:r>
       <w:r>
         <w:rPr>
           <w:i/>
           <w:iCs/>
         </w:rPr>
-        <w:t>Journal of Economic Studies</w:t>
-      </w:r>
-      <w:r>
-        <w:t>, 48(7), 1367-1385.</w:t>
+        <w:t>Economica</w:t>
+      </w:r>
+      <w:r>
+        <w:t xml:space="preserve">, </w:t>
+      </w:r>
+      <w:r>
+        <w:rPr>
+          <w:i/>
+          <w:iCs/>
+        </w:rPr>
+        <w:t>25</w:t>
+      </w:r>
+      <w:r>
+        <w:t xml:space="preserve">(100), 283. https://doi.org/10.2307/2550759 </w:t>
       </w:r>
     </w:p>
     <w:p>
       <w:pPr>
         <w:ind w:left="720" w:hanging="720"/>
+        <w:rPr>
+          <w:color w:val="000000" w:themeColor="text1"/>
+        </w:rPr>
       </w:pPr>
       <w:r>
-        <w:t xml:space="preserve">Phillips, A. W. (1958). The Relationship between Unemployment and the Rate of Change of Money Wage Rates in the United Kingdom, 1861–1957. </w:t>
+        <w:t>Straub, S. (2011). Infrastructure and Development: A Critical Appraisal of the Macro-level Literature. </w:t>
       </w:r>
       <w:r>
         <w:rPr>
           <w:i/>
           <w:iCs/>
         </w:rPr>
-        <w:t>Economica, 25</w:t>
-      </w:r>
-      <w:r>
-        <w:t>(100), 283-299.</w:t>
-      </w:r>
+        <w:t>The Journal of Development Studies</w:t>
+      </w:r>
+      <w:r>
+        <w:t>, </w:t>
+      </w:r>
+      <w:r>
+        <w:rPr>
+          <w:i/>
+          <w:iCs/>
+        </w:rPr>
+        <w:t>47</w:t>
+      </w:r>
+      <w:r>
+        <w:t xml:space="preserve">(5), 683–708. </w:t>
+      </w:r>
+      <w:hyperlink r:id="rId12" w:history="1">
+        <w:r>
+          <w:rPr>
+            <w:rStyle w:val="Hyperlink"/>
+            <w:color w:val="000000" w:themeColor="text1"/>
+            <w:u w:val="none"/>
+          </w:rPr>
+          <w:t>https://doi.org/10.1080/00220388.2010.509785</w:t>
+        </w:r>
+      </w:hyperlink>
     </w:p>
     <w:p>
       <w:pPr>
         <w:ind w:left="720" w:hanging="720"/>
+        <w:rPr>
+          <w:rPrChange w:id="1" w:author="Joseph Russoniello" w:date="2025-04-30T17:34:00Z" w16du:dateUtc="2025-04-30T21:34:00Z">
+            <w:rPr/>
+          </w:rPrChange>
+        </w:rPr>
       </w:pPr>
       <w:r>
-        <w:t xml:space="preserve">Straub, S. (2011). Infrastructure and development: A critical appraisal of the macro-level literature. </w:t>
+        <w:t xml:space="preserve">World Bank. (2025). </w:t>
       </w:r>
       <w:r>
         <w:rPr>
           <w:i/>
           <w:iCs/>
         </w:rPr>
-        <w:t>The Journal of Development Studies, 47</w:t>
-      </w:r>
-      <w:r>
-        <w:t>(5), 683-708.</w:t>
-      </w:r>
-    </w:p>
-    <w:p/>
-    <w:p/>
-    <w:p>
-      <w:r>
-        <w:t>https://www.pewresearch.org/politics/2024/05/23/publics-positive-economic-ratings-slip-inflation-still-widely-viewed-as-major-problem</w:t>
+        <w:t>Country policy and institutional assessment</w:t>
+      </w:r>
+      <w:r>
+        <w:t xml:space="preserve">. DataBank. https://databank.worldbank.org/source/country-policy-and-institutional-assessment </w:t>
       </w:r>
     </w:p>
     <w:sectPr>
-      <w:headerReference w:type="default" r:id="rId12"/>
-      <w:headerReference w:type="first" r:id="rId13"/>
+      <w:headerReference w:type="default" r:id="rId13"/>
+      <w:headerReference w:type="first" r:id="rId14"/>
       <w:pgSz w:w="12240" w:h="15840"/>
       <w:pgMar w:top="1440" w:right="1440" w:bottom="1440" w:left="1440" w:header="720" w:footer="720" w:gutter="0"/>
       <w:cols w:space="720"/>
@@ -8037,13 +8730,25 @@
 
 <file path=word/commentsExtended.xml><?xml version="1.0" encoding="utf-8"?>
 <w15:commentsEx xmlns:wpc="http://schemas.microsoft.com/office/word/2010/wordprocessingCanvas" xmlns:cx="http://schemas.microsoft.com/office/drawing/2014/chartex" xmlns:cx1="http://schemas.microsoft.com/office/drawing/2015/9/8/chartex" xmlns:cx2="http://schemas.microsoft.com/office/drawing/2015/10/21/chartex" xmlns:cx3="http://schemas.microsoft.com/office/drawing/2016/5/9/chartex" xmlns:cx4="http://schemas.microsoft.com/office/drawing/2016/5/10/chartex" xmlns:cx5="http://schemas.microsoft.com/office/drawing/2016/5/11/chartex" xmlns:cx6="http://schemas.microsoft.com/office/drawing/2016/5/12/chartex" xmlns:cx7="http://schemas.microsoft.com/office/drawing/2016/5/13/chartex" xmlns:cx8="http://schemas.microsoft.com/office/drawing/2016/5/14/chartex" xmlns:mc="http://schemas.openxmlformats.org/markup-compatibility/2006" xmlns:aink="http://schemas.microsoft.com/office/drawing/2016/ink" xmlns:am3d="http://schemas.microsoft.com/office/drawing/2017/model3d" xmlns:o="urn:schemas-microsoft-com:office:office" xmlns:oel="http://schemas.microsoft.com/office/2019/extlst" xmlns:r="http://schemas.openxmlformats.org/officeDocument/2006/relationships" xmlns:m="http://schemas.openxmlformats.org/officeDocument/2006/math" xmlns:v="urn:schemas-microsoft-com:vml" xmlns:wp14="http://schemas.microsoft.com/office/word/2010/wordprocessingDrawing" xmlns:wp="http://schemas.openxmlformats.org/drawingml/2006/wordprocessingDrawing" xmlns:w10="urn:schemas-microsoft-com:office:word" xmlns:w="http://schemas.openxmlformats.org/wordprocessingml/2006/main" xmlns:w14="http://schemas.microsoft.com/office/word/2010/wordml" xmlns:w15="http://schemas.microsoft.com/office/word/2012/wordml" xmlns:w16cex="http://schemas.microsoft.com/office/word/2018/wordml/cex" xmlns:w16cid="http://schemas.microsoft.com/office/word/2016/wordml/cid" xmlns:w16="http://schemas.microsoft.com/office/word/2018/wordml" xmlns:w16du="http://schemas.microsoft.com/office/word/2023/wordml/word16du" xmlns:w16sdtdh="http://schemas.microsoft.com/office/word/2020/wordml/sdtdatahash" xmlns:w16sdtfl="http://schemas.microsoft.com/office/word/2024/wordml/sdtformatlock" xmlns:w16se="http://schemas.microsoft.com/office/word/2015/wordml/symex" xmlns:wpg="http://schemas.microsoft.com/office/word/2010/wordprocessingGroup" xmlns:wpi="http://schemas.microsoft.com/office/word/2010/wordprocessingInk" xmlns:wne="http://schemas.microsoft.com/office/word/2006/wordml" xmlns:wps="http://schemas.microsoft.com/office/word/2010/wordprocessingShape" mc:Ignorable="w14 w15 w16se w16cid w16 w16cex w16sdtdh w16sdtfl w16du wp14">
-  <w15:commentEx w15:paraId="2CD54EDC" w15:done="0"/>
+  <w15:commentEx w15:paraId="2CD54EDC" w15:done="1"/>
 </w15:commentsEx>
 </file>
 
 <file path=word/commentsExtensible.xml><?xml version="1.0" encoding="utf-8"?>
 <w16cex:commentsExtensible xmlns:wpc="http://schemas.microsoft.com/office/word/2010/wordprocessingCanvas" xmlns:cx="http://schemas.microsoft.com/office/drawing/2014/chartex" xmlns:cx1="http://schemas.microsoft.com/office/drawing/2015/9/8/chartex" xmlns:cx2="http://schemas.microsoft.com/office/drawing/2015/10/21/chartex" xmlns:cx3="http://schemas.microsoft.com/office/drawing/2016/5/9/chartex" xmlns:cx4="http://schemas.microsoft.com/office/drawing/2016/5/10/chartex" xmlns:cx5="http://schemas.microsoft.com/office/drawing/2016/5/11/chartex" xmlns:cx6="http://schemas.microsoft.com/office/drawing/2016/5/12/chartex" xmlns:cx7="http://schemas.microsoft.com/office/drawing/2016/5/13/chartex" xmlns:cx8="http://schemas.microsoft.com/office/drawing/2016/5/14/chartex" xmlns:cr="http://schemas.microsoft.com/office/comments/2020/reactions" xmlns:mc="http://schemas.openxmlformats.org/markup-compatibility/2006" xmlns:aink="http://schemas.microsoft.com/office/drawing/2016/ink" xmlns:am3d="http://schemas.microsoft.com/office/drawing/2017/model3d" xmlns:o="urn:schemas-microsoft-com:office:office" xmlns:oel="http://schemas.microsoft.com/office/2019/extlst" xmlns:r="http://schemas.openxmlformats.org/officeDocument/2006/relationships" xmlns:m="http://schemas.openxmlformats.org/officeDocument/2006/math" xmlns:v="urn:schemas-microsoft-com:vml" xmlns:wp14="http://schemas.microsoft.com/office/word/2010/wordprocessingDrawing" xmlns:wp="http://schemas.openxmlformats.org/drawingml/2006/wordprocessingDrawing" xmlns:w10="urn:schemas-microsoft-com:office:word" xmlns:w="http://schemas.openxmlformats.org/wordprocessingml/2006/main" xmlns:w14="http://schemas.microsoft.com/office/word/2010/wordml" xmlns:w15="http://schemas.microsoft.com/office/word/2012/wordml" xmlns:w16cex="http://schemas.microsoft.com/office/word/2018/wordml/cex" xmlns:w16cid="http://schemas.microsoft.com/office/word/2016/wordml/cid" xmlns:w16="http://schemas.microsoft.com/office/word/2018/wordml" xmlns:w16du="http://schemas.microsoft.com/office/word/2023/wordml/word16du" xmlns:w16sdtdh="http://schemas.microsoft.com/office/word/2020/wordml/sdtdatahash" xmlns:w16sdtfl="http://schemas.microsoft.com/office/word/2024/wordml/sdtformatlock" xmlns:w16se="http://schemas.microsoft.com/office/word/2015/wordml/symex" xmlns:wpg="http://schemas.microsoft.com/office/word/2010/wordprocessingGroup" xmlns:wpi="http://schemas.microsoft.com/office/word/2010/wordprocessingInk" xmlns:wne="http://schemas.microsoft.com/office/word/2006/wordml" xmlns:wps="http://schemas.microsoft.com/office/word/2010/wordprocessingShape" mc:Ignorable="w14 w15 w16se w16cid w16 w16cex w16sdtdh w16sdtfl cr w16du wp14">
-  <w16cex:commentExtensible w16cex:durableId="2109F315" w16cex:dateUtc="2025-04-27T20:12:00Z"/>
+  <w16cex:commentExtensible w16cex:durableId="2109F315" w16cex:dateUtc="2025-04-27T20:12:00Z">
+    <w16cex:extLst>
+      <w16:ext w16:uri="{CE6994B0-6A32-4C9F-8C6B-6E91EDA988CE}">
+        <cr:reactions xmlns:cr="http://schemas.microsoft.com/office/comments/2020/reactions">
+          <cr:reaction reactionType="1">
+            <cr:reactionInfo dateUtc="2025-04-30T20:49:16Z">
+              <cr:user userId="S::jrussoniello@highwaywest.com::438fc456-b4ab-4b28-8ce2-933422a82221" userProvider="AD" userName="Joseph Russoniello"/>
+            </cr:reactionInfo>
+          </cr:reaction>
+        </cr:reactions>
+      </w16:ext>
+    </w16cex:extLst>
+  </w16cex:commentExtensible>
 </w16cex:commentsExtensible>
 </file>
 
@@ -8813,6 +9518,7 @@
   <w:style w:type="character" w:default="1" w:styleId="DefaultParagraphFont">
     <w:name w:val="Default Paragraph Font"/>
     <w:uiPriority w:val="1"/>
+    <w:semiHidden/>
     <w:unhideWhenUsed/>
   </w:style>
   <w:style w:type="table" w:default="1" w:styleId="TableNormal">
@@ -9275,6 +9981,29 @@
       <w:szCs w:val="18"/>
     </w:rPr>
   </w:style>
+  <w:style w:type="character" w:styleId="Hyperlink">
+    <w:name w:val="Hyperlink"/>
+    <w:basedOn w:val="DefaultParagraphFont"/>
+    <w:uiPriority w:val="99"/>
+    <w:unhideWhenUsed/>
+    <w:rsid w:val="00A52B96"/>
+    <w:rPr>
+      <w:color w:val="467886" w:themeColor="hyperlink"/>
+      <w:u w:val="single"/>
+    </w:rPr>
+  </w:style>
+  <w:style w:type="character" w:styleId="UnresolvedMention">
+    <w:name w:val="Unresolved Mention"/>
+    <w:basedOn w:val="DefaultParagraphFont"/>
+    <w:uiPriority w:val="99"/>
+    <w:semiHidden/>
+    <w:unhideWhenUsed/>
+    <w:rsid w:val="00A52B96"/>
+    <w:rPr>
+      <w:color w:val="605E5C"/>
+      <w:shd w:val="clear" w:color="auto" w:fill="E1DFDD"/>
+    </w:rPr>
+  </w:style>
 </w:styles>
 </file>
 

</xml_diff>